<commit_message>
feat(diagnostics): add typed DID services
</commit_message>
<xml_diff>
--- a/docs/ATEP_Volume_V_Diagnostics_Engineering_Workbook.docx
+++ b/docs/ATEP_Volume_V_Diagnostics_Engineering_Workbook.docx
@@ -143,7 +143,7 @@
                 <w:color w:val="0B2545"/>
                 <w:sz w:val="19"/>
               </w:rPr>
-              <w:t>0.1.0</w:t>
+              <w:t>0.2.0</w:t>
             </w:r>
           </w:p>
         </w:tc>
@@ -265,7 +265,7 @@
                 <w:color w:val="111827"/>
                 <w:sz w:val="19"/>
               </w:rPr>
-              <w:t>Implemented increment: V-1</w:t>
+              <w:t>Implemented increments: V-1 and V-2</w:t>
             </w:r>
           </w:p>
         </w:tc>
@@ -893,7 +893,7 @@
                 <w:color w:val="111827"/>
                 <w:sz w:val="17"/>
               </w:rPr>
-              <w:t>Increment V-1</w:t>
+              <w:t>Increments V-1 and V-2</w:t>
             </w:r>
           </w:p>
         </w:tc>
@@ -1351,6 +1351,131 @@
           </w:p>
         </w:tc>
       </w:tr>
+      <w:tr>
+        <w:trPr>
+          <w:cantSplit/>
+        </w:trPr>
+        <w:tc>
+          <w:tcPr>
+            <w:tcW w:type="dxa" w:w="1650"/>
+            <w:tcMar>
+              <w:top w:w="80" w:type="dxa"/>
+              <w:start w:w="120" w:type="dxa"/>
+              <w:bottom w:w="80" w:type="dxa"/>
+              <w:end w:w="120" w:type="dxa"/>
+            </w:tcMar>
+            <w:vAlign w:val="center"/>
+            <w:shd w:fill="FFFFFF"/>
+          </w:tcPr>
+          <w:p>
+            <w:pPr>
+              <w:spacing w:before="0" w:after="40" w:line="252" w:lineRule="auto"/>
+              <w:jc w:val="center"/>
+            </w:pPr>
+            <w:r>
+              <w:rPr>
+                <w:rFonts w:ascii="Calibri" w:hAnsi="Calibri"/>
+                <w:b w:val="0"/>
+                <w:color w:val="111827"/>
+                <w:sz w:val="17"/>
+              </w:rPr>
+              <w:t>0.2.0</w:t>
+            </w:r>
+          </w:p>
+        </w:tc>
+        <w:tc>
+          <w:tcPr>
+            <w:tcW w:type="dxa" w:w="4450"/>
+            <w:tcMar>
+              <w:top w:w="80" w:type="dxa"/>
+              <w:start w:w="120" w:type="dxa"/>
+              <w:bottom w:w="80" w:type="dxa"/>
+              <w:end w:w="120" w:type="dxa"/>
+            </w:tcMar>
+            <w:vAlign w:val="center"/>
+            <w:shd w:fill="FFFFFF"/>
+          </w:tcPr>
+          <w:p>
+            <w:pPr>
+              <w:spacing w:before="0" w:after="40" w:line="252" w:lineRule="auto"/>
+              <w:jc w:val="left"/>
+            </w:pPr>
+            <w:r>
+              <w:rPr>
+                <w:rFonts w:ascii="Calibri" w:hAnsi="Calibri"/>
+                <w:b w:val="0"/>
+                <w:color w:val="111827"/>
+                <w:sz w:val="17"/>
+              </w:rPr>
+              <w:t>2026-08-25</w:t>
+            </w:r>
+          </w:p>
+        </w:tc>
+        <w:tc>
+          <w:tcPr>
+            <w:tcW w:type="dxa" w:w="3260"/>
+            <w:tcMar>
+              <w:top w:w="80" w:type="dxa"/>
+              <w:start w:w="120" w:type="dxa"/>
+              <w:bottom w:w="80" w:type="dxa"/>
+              <w:end w:w="120" w:type="dxa"/>
+            </w:tcMar>
+            <w:vAlign w:val="center"/>
+            <w:shd w:fill="FFFFFF"/>
+          </w:tcPr>
+          <w:p>
+            <w:pPr>
+              <w:spacing w:before="0" w:after="40" w:line="252" w:lineRule="auto"/>
+              <w:jc w:val="left"/>
+            </w:pPr>
+            <w:r>
+              <w:rPr>
+                <w:rFonts w:ascii="Calibri" w:hAnsi="Calibri"/>
+                <w:b w:val="0"/>
+                <w:color w:val="111827"/>
+                <w:sz w:val="17"/>
+              </w:rPr>
+              <w:t xml:space="preserve">Added a typed DID catalogue, UDS </w:t>
+            </w:r>
+            <w:r>
+              <w:rPr>
+                <w:rFonts w:ascii="Calibri" w:hAnsi="Calibri"/>
+                <w:b w:val="0"/>
+                <w:color w:val="111827"/>
+                <w:sz w:val="17"/>
+              </w:rPr>
+              <w:t>0x22</w:t>
+            </w:r>
+            <w:r>
+              <w:rPr>
+                <w:rFonts w:ascii="Calibri" w:hAnsi="Calibri"/>
+                <w:b w:val="0"/>
+                <w:color w:val="111827"/>
+                <w:sz w:val="17"/>
+              </w:rPr>
+              <w:t>/</w:t>
+            </w:r>
+            <w:r>
+              <w:rPr>
+                <w:rFonts w:ascii="Calibri" w:hAnsi="Calibri"/>
+                <w:b w:val="0"/>
+                <w:color w:val="111827"/>
+                <w:sz w:val="17"/>
+              </w:rPr>
+              <w:t>0x2E</w:t>
+            </w:r>
+            <w:r>
+              <w:rPr>
+                <w:rFonts w:ascii="Calibri" w:hAnsi="Calibri"/>
+                <w:b w:val="0"/>
+                <w:color w:val="111827"/>
+                <w:sz w:val="17"/>
+              </w:rPr>
+              <w:t>, session authorization, value/version constraints, minimized evidence, migration, APIs, and tests.</w:t>
+            </w:r>
+          </w:p>
+        </w:tc>
+      </w:tr>
     </w:tbl>
     <w:p>
       <w:pPr>
@@ -1532,20 +1657,10 @@
     </w:p>
     <w:p>
       <w:pPr>
-        <w:pStyle w:val="Heading2"/>
-        <w:keepNext/>
-        <w:keepLines/>
-      </w:pPr>
-      <w:r>
-        <w:t>4.2 Deferred</w:t>
-      </w:r>
-    </w:p>
-    <w:p>
-      <w:pPr>
         <w:pStyle w:val="ListBullet"/>
         <w:numPr>
           <w:ilvl w:val="0"/>
-          <w:numId w:val="12"/>
+          <w:numId w:val="11"/>
         </w:numPr>
       </w:pPr>
       <w:r>
@@ -1554,7 +1669,7 @@
           <w:color w:val="111827"/>
           <w:sz w:val="22"/>
         </w:rPr>
-        <w:t>ISO-TP segmentation, CAN transport binding, DoIP, and physical adapters.</w:t>
+        <w:t>ECU-scoped typed DID catalogue with boolean, integer, decimal, and string values.</w:t>
       </w:r>
     </w:p>
     <w:p>
@@ -1562,7 +1677,7 @@
         <w:pStyle w:val="ListBullet"/>
         <w:numPr>
           <w:ilvl w:val="0"/>
-          <w:numId w:val="12"/>
+          <w:numId w:val="11"/>
         </w:numPr>
       </w:pPr>
       <w:r>
@@ -1571,7 +1686,7 @@
           <w:color w:val="111827"/>
           <w:sz w:val="22"/>
         </w:rPr>
-        <w:t xml:space="preserve">DID catalogue and services </w:t>
+        <w:t>Session-authorized UDS Read/Write Data by Identifier (</w:t>
       </w:r>
       <w:r>
         <w:rPr>
@@ -1603,7 +1718,51 @@
           <w:color w:val="111827"/>
           <w:sz w:val="22"/>
         </w:rPr>
-        <w:t>.</w:t>
+        <w:t>).</w:t>
+      </w:r>
+    </w:p>
+    <w:p>
+      <w:pPr>
+        <w:pStyle w:val="ListBullet"/>
+        <w:numPr>
+          <w:ilvl w:val="0"/>
+          <w:numId w:val="11"/>
+        </w:numPr>
+      </w:pPr>
+      <w:r>
+        <w:rPr>
+          <w:rFonts w:ascii="Calibri" w:hAnsi="Calibri"/>
+          <w:color w:val="111827"/>
+          <w:sz w:val="22"/>
+        </w:rPr>
+        <w:t>DID type, range, length, catalogue-size, request-size, and optimistic-version bounds.</w:t>
+      </w:r>
+    </w:p>
+    <w:p>
+      <w:pPr>
+        <w:pStyle w:val="Heading2"/>
+        <w:keepNext/>
+        <w:keepLines/>
+      </w:pPr>
+      <w:r>
+        <w:t>4.2 Deferred</w:t>
+      </w:r>
+    </w:p>
+    <w:p>
+      <w:pPr>
+        <w:pStyle w:val="ListBullet"/>
+        <w:numPr>
+          <w:ilvl w:val="0"/>
+          <w:numId w:val="12"/>
+        </w:numPr>
+      </w:pPr>
+      <w:r>
+        <w:rPr>
+          <w:rFonts w:ascii="Calibri" w:hAnsi="Calibri"/>
+          <w:color w:val="111827"/>
+          <w:sz w:val="22"/>
+        </w:rPr>
+        <w:t>ISO-TP segmentation, CAN transport binding, DoIP, and physical adapters.</w:t>
       </w:r>
     </w:p>
     <w:p>
@@ -1748,6 +1907,24 @@
           <w:sz w:val="22"/>
         </w:rPr>
         <w:t xml:space="preserve"> stores ECU ownership, six-digit hexadecimal code, ISO-style status mask, severity, description, occurrence count, first/last ECU logical time, bounded snapshot, and version.</w:t>
+      </w:r>
+    </w:p>
+    <w:p>
+      <w:r>
+        <w:rPr>
+          <w:rFonts w:ascii="Consolas" w:hAnsi="Consolas"/>
+          <w:color w:val="1F4D78"/>
+          <w:sz w:val="19"/>
+        </w:rPr>
+        <w:t>DiagnosticDataIdentifier</w:t>
+      </w:r>
+      <w:r>
+        <w:rPr>
+          <w:rFonts w:ascii="Calibri" w:hAnsi="Calibri"/>
+          <w:color w:val="111827"/>
+          <w:sz w:val="22"/>
+        </w:rPr>
+        <w:t xml:space="preserve"> stores an ECU-local 16-bit identifier, engineering metadata, declared type, unit, readable/writable sessions, constrained scalar value, and optimistic version. The catalogue is capped at 128 entries per ECU; this is a semantic data surface, not raw memory access.</w:t>
       </w:r>
     </w:p>
     <w:p>
@@ -2674,6 +2851,627 @@
           </w:p>
         </w:tc>
       </w:tr>
+      <w:tr>
+        <w:trPr>
+          <w:cantSplit/>
+        </w:trPr>
+        <w:tc>
+          <w:tcPr>
+            <w:tcW w:type="dxa" w:w="1150"/>
+            <w:tcMar>
+              <w:top w:w="80" w:type="dxa"/>
+              <w:start w:w="120" w:type="dxa"/>
+              <w:bottom w:w="80" w:type="dxa"/>
+              <w:end w:w="120" w:type="dxa"/>
+            </w:tcMar>
+            <w:vAlign w:val="center"/>
+            <w:shd w:fill="FFFFFF"/>
+          </w:tcPr>
+          <w:p>
+            <w:pPr>
+              <w:spacing w:before="0" w:after="40" w:line="252" w:lineRule="auto"/>
+              <w:jc w:val="center"/>
+            </w:pPr>
+            <w:r>
+              <w:rPr>
+                <w:rFonts w:ascii="Calibri" w:hAnsi="Calibri"/>
+                <w:b w:val="0"/>
+                <w:color w:val="111827"/>
+                <w:sz w:val="16"/>
+              </w:rPr>
+              <w:t>POST</w:t>
+            </w:r>
+          </w:p>
+        </w:tc>
+        <w:tc>
+          <w:tcPr>
+            <w:tcW w:type="dxa" w:w="3700"/>
+            <w:tcMar>
+              <w:top w:w="80" w:type="dxa"/>
+              <w:start w:w="120" w:type="dxa"/>
+              <w:bottom w:w="80" w:type="dxa"/>
+              <w:end w:w="120" w:type="dxa"/>
+            </w:tcMar>
+            <w:vAlign w:val="center"/>
+            <w:shd w:fill="FFFFFF"/>
+          </w:tcPr>
+          <w:p>
+            <w:pPr>
+              <w:spacing w:before="0" w:after="40" w:line="252" w:lineRule="auto"/>
+              <w:jc w:val="left"/>
+            </w:pPr>
+            <w:r>
+              <w:rPr>
+                <w:rFonts w:ascii="Calibri" w:hAnsi="Calibri"/>
+                <w:b w:val="0"/>
+                <w:color w:val="111827"/>
+                <w:sz w:val="16"/>
+              </w:rPr>
+              <w:t>/api/v1/vehicles/{vehicle_id}/ecus/{ecu_id}/diagnostics/dids</w:t>
+            </w:r>
+          </w:p>
+        </w:tc>
+        <w:tc>
+          <w:tcPr>
+            <w:tcW w:type="dxa" w:w="3100"/>
+            <w:tcMar>
+              <w:top w:w="80" w:type="dxa"/>
+              <w:start w:w="120" w:type="dxa"/>
+              <w:bottom w:w="80" w:type="dxa"/>
+              <w:end w:w="120" w:type="dxa"/>
+            </w:tcMar>
+            <w:vAlign w:val="center"/>
+            <w:shd w:fill="FFFFFF"/>
+          </w:tcPr>
+          <w:p>
+            <w:pPr>
+              <w:spacing w:before="0" w:after="40" w:line="252" w:lineRule="auto"/>
+              <w:jc w:val="left"/>
+            </w:pPr>
+            <w:r>
+              <w:rPr>
+                <w:rFonts w:ascii="Calibri" w:hAnsi="Calibri"/>
+                <w:b w:val="0"/>
+                <w:color w:val="111827"/>
+                <w:sz w:val="16"/>
+              </w:rPr>
+              <w:t>diagnostics:manage</w:t>
+            </w:r>
+          </w:p>
+        </w:tc>
+        <w:tc>
+          <w:tcPr>
+            <w:tcW w:type="dxa" w:w="1410"/>
+            <w:tcMar>
+              <w:top w:w="80" w:type="dxa"/>
+              <w:start w:w="120" w:type="dxa"/>
+              <w:bottom w:w="80" w:type="dxa"/>
+              <w:end w:w="120" w:type="dxa"/>
+            </w:tcMar>
+            <w:vAlign w:val="center"/>
+            <w:shd w:fill="FFFFFF"/>
+          </w:tcPr>
+          <w:p>
+            <w:pPr>
+              <w:spacing w:before="0" w:after="40" w:line="252" w:lineRule="auto"/>
+              <w:jc w:val="left"/>
+            </w:pPr>
+            <w:r>
+              <w:rPr>
+                <w:rFonts w:ascii="Calibri" w:hAnsi="Calibri"/>
+                <w:b w:val="0"/>
+                <w:color w:val="111827"/>
+                <w:sz w:val="16"/>
+              </w:rPr>
+              <w:t>Define one typed DID.</w:t>
+            </w:r>
+          </w:p>
+        </w:tc>
+      </w:tr>
+      <w:tr>
+        <w:trPr>
+          <w:cantSplit/>
+        </w:trPr>
+        <w:tc>
+          <w:tcPr>
+            <w:tcW w:type="dxa" w:w="1150"/>
+            <w:tcMar>
+              <w:top w:w="80" w:type="dxa"/>
+              <w:start w:w="120" w:type="dxa"/>
+              <w:bottom w:w="80" w:type="dxa"/>
+              <w:end w:w="120" w:type="dxa"/>
+            </w:tcMar>
+            <w:vAlign w:val="center"/>
+            <w:shd w:fill="FFFFFF"/>
+          </w:tcPr>
+          <w:p>
+            <w:pPr>
+              <w:spacing w:before="0" w:after="40" w:line="252" w:lineRule="auto"/>
+              <w:jc w:val="center"/>
+            </w:pPr>
+            <w:r>
+              <w:rPr>
+                <w:rFonts w:ascii="Calibri" w:hAnsi="Calibri"/>
+                <w:b w:val="0"/>
+                <w:color w:val="111827"/>
+                <w:sz w:val="16"/>
+              </w:rPr>
+              <w:t>GET</w:t>
+            </w:r>
+          </w:p>
+        </w:tc>
+        <w:tc>
+          <w:tcPr>
+            <w:tcW w:type="dxa" w:w="3700"/>
+            <w:tcMar>
+              <w:top w:w="80" w:type="dxa"/>
+              <w:start w:w="120" w:type="dxa"/>
+              <w:bottom w:w="80" w:type="dxa"/>
+              <w:end w:w="120" w:type="dxa"/>
+            </w:tcMar>
+            <w:vAlign w:val="center"/>
+            <w:shd w:fill="FFFFFF"/>
+          </w:tcPr>
+          <w:p>
+            <w:pPr>
+              <w:spacing w:before="0" w:after="40" w:line="252" w:lineRule="auto"/>
+              <w:jc w:val="left"/>
+            </w:pPr>
+            <w:r>
+              <w:rPr>
+                <w:rFonts w:ascii="Calibri" w:hAnsi="Calibri"/>
+                <w:b w:val="0"/>
+                <w:color w:val="111827"/>
+                <w:sz w:val="16"/>
+              </w:rPr>
+              <w:t>/api/v1/vehicles/{vehicle_id}/ecus/{ecu_id}/diagnostics/dids</w:t>
+            </w:r>
+          </w:p>
+        </w:tc>
+        <w:tc>
+          <w:tcPr>
+            <w:tcW w:type="dxa" w:w="3100"/>
+            <w:tcMar>
+              <w:top w:w="80" w:type="dxa"/>
+              <w:start w:w="120" w:type="dxa"/>
+              <w:bottom w:w="80" w:type="dxa"/>
+              <w:end w:w="120" w:type="dxa"/>
+            </w:tcMar>
+            <w:vAlign w:val="center"/>
+            <w:shd w:fill="FFFFFF"/>
+          </w:tcPr>
+          <w:p>
+            <w:pPr>
+              <w:spacing w:before="0" w:after="40" w:line="252" w:lineRule="auto"/>
+              <w:jc w:val="left"/>
+            </w:pPr>
+            <w:r>
+              <w:rPr>
+                <w:rFonts w:ascii="Calibri" w:hAnsi="Calibri"/>
+                <w:b w:val="0"/>
+                <w:color w:val="111827"/>
+                <w:sz w:val="16"/>
+              </w:rPr>
+              <w:t>diagnostics:read</w:t>
+            </w:r>
+          </w:p>
+        </w:tc>
+        <w:tc>
+          <w:tcPr>
+            <w:tcW w:type="dxa" w:w="1410"/>
+            <w:tcMar>
+              <w:top w:w="80" w:type="dxa"/>
+              <w:start w:w="120" w:type="dxa"/>
+              <w:bottom w:w="80" w:type="dxa"/>
+              <w:end w:w="120" w:type="dxa"/>
+            </w:tcMar>
+            <w:vAlign w:val="center"/>
+            <w:shd w:fill="FFFFFF"/>
+          </w:tcPr>
+          <w:p>
+            <w:pPr>
+              <w:spacing w:before="0" w:after="40" w:line="252" w:lineRule="auto"/>
+              <w:jc w:val="left"/>
+            </w:pPr>
+            <w:r>
+              <w:rPr>
+                <w:rFonts w:ascii="Calibri" w:hAnsi="Calibri"/>
+                <w:b w:val="0"/>
+                <w:color w:val="111827"/>
+                <w:sz w:val="16"/>
+              </w:rPr>
+              <w:t>List the bounded ECU DID catalogue.</w:t>
+            </w:r>
+          </w:p>
+        </w:tc>
+      </w:tr>
+      <w:tr>
+        <w:trPr>
+          <w:cantSplit/>
+        </w:trPr>
+        <w:tc>
+          <w:tcPr>
+            <w:tcW w:type="dxa" w:w="1150"/>
+            <w:tcMar>
+              <w:top w:w="80" w:type="dxa"/>
+              <w:start w:w="120" w:type="dxa"/>
+              <w:bottom w:w="80" w:type="dxa"/>
+              <w:end w:w="120" w:type="dxa"/>
+            </w:tcMar>
+            <w:vAlign w:val="center"/>
+            <w:shd w:fill="FFFFFF"/>
+          </w:tcPr>
+          <w:p>
+            <w:pPr>
+              <w:spacing w:before="0" w:after="40" w:line="252" w:lineRule="auto"/>
+              <w:jc w:val="center"/>
+            </w:pPr>
+            <w:r>
+              <w:rPr>
+                <w:rFonts w:ascii="Calibri" w:hAnsi="Calibri"/>
+                <w:b w:val="0"/>
+                <w:color w:val="111827"/>
+                <w:sz w:val="16"/>
+              </w:rPr>
+              <w:t>GET</w:t>
+            </w:r>
+          </w:p>
+        </w:tc>
+        <w:tc>
+          <w:tcPr>
+            <w:tcW w:type="dxa" w:w="3700"/>
+            <w:tcMar>
+              <w:top w:w="80" w:type="dxa"/>
+              <w:start w:w="120" w:type="dxa"/>
+              <w:bottom w:w="80" w:type="dxa"/>
+              <w:end w:w="120" w:type="dxa"/>
+            </w:tcMar>
+            <w:vAlign w:val="center"/>
+            <w:shd w:fill="FFFFFF"/>
+          </w:tcPr>
+          <w:p>
+            <w:pPr>
+              <w:spacing w:before="0" w:after="40" w:line="252" w:lineRule="auto"/>
+              <w:jc w:val="left"/>
+            </w:pPr>
+            <w:r>
+              <w:rPr>
+                <w:rFonts w:ascii="Calibri" w:hAnsi="Calibri"/>
+                <w:b w:val="0"/>
+                <w:color w:val="111827"/>
+                <w:sz w:val="16"/>
+              </w:rPr>
+              <w:t>/api/v1/vehicles/{vehicle_id}/ecus/{ecu_id}/diagnostics/dids/{identifier}</w:t>
+            </w:r>
+          </w:p>
+        </w:tc>
+        <w:tc>
+          <w:tcPr>
+            <w:tcW w:type="dxa" w:w="3100"/>
+            <w:tcMar>
+              <w:top w:w="80" w:type="dxa"/>
+              <w:start w:w="120" w:type="dxa"/>
+              <w:bottom w:w="80" w:type="dxa"/>
+              <w:end w:w="120" w:type="dxa"/>
+            </w:tcMar>
+            <w:vAlign w:val="center"/>
+            <w:shd w:fill="FFFFFF"/>
+          </w:tcPr>
+          <w:p>
+            <w:pPr>
+              <w:spacing w:before="0" w:after="40" w:line="252" w:lineRule="auto"/>
+              <w:jc w:val="left"/>
+            </w:pPr>
+            <w:r>
+              <w:rPr>
+                <w:rFonts w:ascii="Calibri" w:hAnsi="Calibri"/>
+                <w:b w:val="0"/>
+                <w:color w:val="111827"/>
+                <w:sz w:val="16"/>
+              </w:rPr>
+              <w:t>diagnostics:read</w:t>
+            </w:r>
+          </w:p>
+        </w:tc>
+        <w:tc>
+          <w:tcPr>
+            <w:tcW w:type="dxa" w:w="1410"/>
+            <w:tcMar>
+              <w:top w:w="80" w:type="dxa"/>
+              <w:start w:w="120" w:type="dxa"/>
+              <w:bottom w:w="80" w:type="dxa"/>
+              <w:end w:w="120" w:type="dxa"/>
+            </w:tcMar>
+            <w:vAlign w:val="center"/>
+            <w:shd w:fill="FFFFFF"/>
+          </w:tcPr>
+          <w:p>
+            <w:pPr>
+              <w:spacing w:before="0" w:after="40" w:line="252" w:lineRule="auto"/>
+              <w:jc w:val="left"/>
+            </w:pPr>
+            <w:r>
+              <w:rPr>
+                <w:rFonts w:ascii="Calibri" w:hAnsi="Calibri"/>
+                <w:b w:val="0"/>
+                <w:color w:val="111827"/>
+                <w:sz w:val="16"/>
+              </w:rPr>
+              <w:t>Retrieve one DID definition and value.</w:t>
+            </w:r>
+          </w:p>
+        </w:tc>
+      </w:tr>
+      <w:tr>
+        <w:trPr>
+          <w:cantSplit/>
+        </w:trPr>
+        <w:tc>
+          <w:tcPr>
+            <w:tcW w:type="dxa" w:w="1150"/>
+            <w:tcMar>
+              <w:top w:w="80" w:type="dxa"/>
+              <w:start w:w="120" w:type="dxa"/>
+              <w:bottom w:w="80" w:type="dxa"/>
+              <w:end w:w="120" w:type="dxa"/>
+            </w:tcMar>
+            <w:vAlign w:val="center"/>
+            <w:shd w:fill="FFFFFF"/>
+          </w:tcPr>
+          <w:p>
+            <w:pPr>
+              <w:spacing w:before="0" w:after="40" w:line="252" w:lineRule="auto"/>
+              <w:jc w:val="center"/>
+            </w:pPr>
+            <w:r>
+              <w:rPr>
+                <w:rFonts w:ascii="Calibri" w:hAnsi="Calibri"/>
+                <w:b w:val="0"/>
+                <w:color w:val="111827"/>
+                <w:sz w:val="16"/>
+              </w:rPr>
+              <w:t>POST</w:t>
+            </w:r>
+          </w:p>
+        </w:tc>
+        <w:tc>
+          <w:tcPr>
+            <w:tcW w:type="dxa" w:w="3700"/>
+            <w:tcMar>
+              <w:top w:w="80" w:type="dxa"/>
+              <w:start w:w="120" w:type="dxa"/>
+              <w:bottom w:w="80" w:type="dxa"/>
+              <w:end w:w="120" w:type="dxa"/>
+            </w:tcMar>
+            <w:vAlign w:val="center"/>
+            <w:shd w:fill="FFFFFF"/>
+          </w:tcPr>
+          <w:p>
+            <w:pPr>
+              <w:spacing w:before="0" w:after="40" w:line="252" w:lineRule="auto"/>
+              <w:jc w:val="left"/>
+            </w:pPr>
+            <w:r>
+              <w:rPr>
+                <w:rFonts w:ascii="Calibri" w:hAnsi="Calibri"/>
+                <w:b w:val="0"/>
+                <w:color w:val="111827"/>
+                <w:sz w:val="16"/>
+              </w:rPr>
+              <w:t>/api/v1/vehicles/{vehicle_id}/ecus/{ecu_id}/diagnostics/dids/read</w:t>
+            </w:r>
+          </w:p>
+        </w:tc>
+        <w:tc>
+          <w:tcPr>
+            <w:tcW w:type="dxa" w:w="3100"/>
+            <w:tcMar>
+              <w:top w:w="80" w:type="dxa"/>
+              <w:start w:w="120" w:type="dxa"/>
+              <w:bottom w:w="80" w:type="dxa"/>
+              <w:end w:w="120" w:type="dxa"/>
+            </w:tcMar>
+            <w:vAlign w:val="center"/>
+            <w:shd w:fill="FFFFFF"/>
+          </w:tcPr>
+          <w:p>
+            <w:pPr>
+              <w:spacing w:before="0" w:after="40" w:line="252" w:lineRule="auto"/>
+              <w:jc w:val="left"/>
+            </w:pPr>
+            <w:r>
+              <w:rPr>
+                <w:rFonts w:ascii="Calibri" w:hAnsi="Calibri"/>
+                <w:b w:val="0"/>
+                <w:color w:val="111827"/>
+                <w:sz w:val="16"/>
+              </w:rPr>
+              <w:t>diagnostics:read</w:t>
+            </w:r>
+          </w:p>
+        </w:tc>
+        <w:tc>
+          <w:tcPr>
+            <w:tcW w:type="dxa" w:w="1410"/>
+            <w:tcMar>
+              <w:top w:w="80" w:type="dxa"/>
+              <w:start w:w="120" w:type="dxa"/>
+              <w:bottom w:w="80" w:type="dxa"/>
+              <w:end w:w="120" w:type="dxa"/>
+            </w:tcMar>
+            <w:vAlign w:val="center"/>
+            <w:shd w:fill="FFFFFF"/>
+          </w:tcPr>
+          <w:p>
+            <w:pPr>
+              <w:spacing w:before="0" w:after="40" w:line="252" w:lineRule="auto"/>
+              <w:jc w:val="left"/>
+            </w:pPr>
+            <w:r>
+              <w:rPr>
+                <w:rFonts w:ascii="Calibri" w:hAnsi="Calibri"/>
+                <w:b w:val="0"/>
+                <w:color w:val="111827"/>
+                <w:sz w:val="16"/>
+              </w:rPr>
+              <w:t xml:space="preserve">Execute UDS </w:t>
+            </w:r>
+            <w:r>
+              <w:rPr>
+                <w:rFonts w:ascii="Calibri" w:hAnsi="Calibri"/>
+                <w:b w:val="0"/>
+                <w:color w:val="111827"/>
+                <w:sz w:val="16"/>
+              </w:rPr>
+              <w:t>0x22</w:t>
+            </w:r>
+            <w:r>
+              <w:rPr>
+                <w:rFonts w:ascii="Calibri" w:hAnsi="Calibri"/>
+                <w:b w:val="0"/>
+                <w:color w:val="111827"/>
+                <w:sz w:val="16"/>
+              </w:rPr>
+              <w:t xml:space="preserve"> for up to 16 DIDs.</w:t>
+            </w:r>
+          </w:p>
+        </w:tc>
+      </w:tr>
+      <w:tr>
+        <w:trPr>
+          <w:cantSplit/>
+        </w:trPr>
+        <w:tc>
+          <w:tcPr>
+            <w:tcW w:type="dxa" w:w="1150"/>
+            <w:tcMar>
+              <w:top w:w="80" w:type="dxa"/>
+              <w:start w:w="120" w:type="dxa"/>
+              <w:bottom w:w="80" w:type="dxa"/>
+              <w:end w:w="120" w:type="dxa"/>
+            </w:tcMar>
+            <w:vAlign w:val="center"/>
+            <w:shd w:fill="FFFFFF"/>
+          </w:tcPr>
+          <w:p>
+            <w:pPr>
+              <w:spacing w:before="0" w:after="40" w:line="252" w:lineRule="auto"/>
+              <w:jc w:val="center"/>
+            </w:pPr>
+            <w:r>
+              <w:rPr>
+                <w:rFonts w:ascii="Calibri" w:hAnsi="Calibri"/>
+                <w:b w:val="0"/>
+                <w:color w:val="111827"/>
+                <w:sz w:val="16"/>
+              </w:rPr>
+              <w:t>POST</w:t>
+            </w:r>
+          </w:p>
+        </w:tc>
+        <w:tc>
+          <w:tcPr>
+            <w:tcW w:type="dxa" w:w="3700"/>
+            <w:tcMar>
+              <w:top w:w="80" w:type="dxa"/>
+              <w:start w:w="120" w:type="dxa"/>
+              <w:bottom w:w="80" w:type="dxa"/>
+              <w:end w:w="120" w:type="dxa"/>
+            </w:tcMar>
+            <w:vAlign w:val="center"/>
+            <w:shd w:fill="FFFFFF"/>
+          </w:tcPr>
+          <w:p>
+            <w:pPr>
+              <w:spacing w:before="0" w:after="40" w:line="252" w:lineRule="auto"/>
+              <w:jc w:val="left"/>
+            </w:pPr>
+            <w:r>
+              <w:rPr>
+                <w:rFonts w:ascii="Calibri" w:hAnsi="Calibri"/>
+                <w:b w:val="0"/>
+                <w:color w:val="111827"/>
+                <w:sz w:val="16"/>
+              </w:rPr>
+              <w:t>/api/v1/vehicles/{vehicle_id}/ecus/{ecu_id}/diagnostics/dids/{identifier}/write</w:t>
+            </w:r>
+          </w:p>
+        </w:tc>
+        <w:tc>
+          <w:tcPr>
+            <w:tcW w:type="dxa" w:w="3100"/>
+            <w:tcMar>
+              <w:top w:w="80" w:type="dxa"/>
+              <w:start w:w="120" w:type="dxa"/>
+              <w:bottom w:w="80" w:type="dxa"/>
+              <w:end w:w="120" w:type="dxa"/>
+            </w:tcMar>
+            <w:vAlign w:val="center"/>
+            <w:shd w:fill="FFFFFF"/>
+          </w:tcPr>
+          <w:p>
+            <w:pPr>
+              <w:spacing w:before="0" w:after="40" w:line="252" w:lineRule="auto"/>
+              <w:jc w:val="left"/>
+            </w:pPr>
+            <w:r>
+              <w:rPr>
+                <w:rFonts w:ascii="Calibri" w:hAnsi="Calibri"/>
+                <w:b w:val="0"/>
+                <w:color w:val="111827"/>
+                <w:sz w:val="16"/>
+              </w:rPr>
+              <w:t>diagnostics:manage</w:t>
+            </w:r>
+          </w:p>
+        </w:tc>
+        <w:tc>
+          <w:tcPr>
+            <w:tcW w:type="dxa" w:w="1410"/>
+            <w:tcMar>
+              <w:top w:w="80" w:type="dxa"/>
+              <w:start w:w="120" w:type="dxa"/>
+              <w:bottom w:w="80" w:type="dxa"/>
+              <w:end w:w="120" w:type="dxa"/>
+            </w:tcMar>
+            <w:vAlign w:val="center"/>
+            <w:shd w:fill="FFFFFF"/>
+          </w:tcPr>
+          <w:p>
+            <w:pPr>
+              <w:spacing w:before="0" w:after="40" w:line="252" w:lineRule="auto"/>
+              <w:jc w:val="left"/>
+            </w:pPr>
+            <w:r>
+              <w:rPr>
+                <w:rFonts w:ascii="Calibri" w:hAnsi="Calibri"/>
+                <w:b w:val="0"/>
+                <w:color w:val="111827"/>
+                <w:sz w:val="16"/>
+              </w:rPr>
+              <w:t xml:space="preserve">Execute session-authorized UDS </w:t>
+            </w:r>
+            <w:r>
+              <w:rPr>
+                <w:rFonts w:ascii="Calibri" w:hAnsi="Calibri"/>
+                <w:b w:val="0"/>
+                <w:color w:val="111827"/>
+                <w:sz w:val="16"/>
+              </w:rPr>
+              <w:t>0x2E</w:t>
+            </w:r>
+            <w:r>
+              <w:rPr>
+                <w:rFonts w:ascii="Calibri" w:hAnsi="Calibri"/>
+                <w:b w:val="0"/>
+                <w:color w:val="111827"/>
+                <w:sz w:val="16"/>
+              </w:rPr>
+              <w:t>.</w:t>
+            </w:r>
+          </w:p>
+        </w:tc>
+      </w:tr>
     </w:tbl>
     <w:p>
       <w:pPr>
@@ -2812,6 +3610,94 @@
           <w:sz w:val="22"/>
         </w:rPr>
         <w:t>.</w:t>
+      </w:r>
+    </w:p>
+    <w:p>
+      <w:pPr>
+        <w:pStyle w:val="Heading2"/>
+        <w:keepNext/>
+        <w:keepLines/>
+      </w:pPr>
+      <w:r>
+        <w:t>8.4 Read Data by Identifier (`0x22`)</w:t>
+      </w:r>
+    </w:p>
+    <w:p>
+      <w:r>
+        <w:rPr>
+          <w:rFonts w:ascii="Calibri" w:hAnsi="Calibri"/>
+          <w:color w:val="111827"/>
+          <w:sz w:val="22"/>
+        </w:rPr>
+        <w:t xml:space="preserve">One command reads one to sixteen unique 16-bit identifiers. Every DID must exist and authorize the active diagnostic session. The result preserves typed values for the client and exact replay; the positive response identity is </w:t>
+      </w:r>
+      <w:r>
+        <w:rPr>
+          <w:rFonts w:ascii="Consolas" w:hAnsi="Consolas"/>
+          <w:color w:val="1F4D78"/>
+          <w:sz w:val="19"/>
+        </w:rPr>
+        <w:t>0x62</w:t>
+      </w:r>
+      <w:r>
+        <w:rPr>
+          <w:rFonts w:ascii="Calibri" w:hAnsi="Calibri"/>
+          <w:color w:val="111827"/>
+          <w:sz w:val="22"/>
+        </w:rPr>
+        <w:t>. Audit and outbox records contain identifiers and versions, not values.</w:t>
+      </w:r>
+    </w:p>
+    <w:p>
+      <w:pPr>
+        <w:pStyle w:val="Heading2"/>
+        <w:keepNext/>
+        <w:keepLines/>
+      </w:pPr>
+      <w:r>
+        <w:t>8.5 Write Data by Identifier (`0x2E`)</w:t>
+      </w:r>
+    </w:p>
+    <w:p>
+      <w:r>
+        <w:rPr>
+          <w:rFonts w:ascii="Calibri" w:hAnsi="Calibri"/>
+          <w:color w:val="111827"/>
+          <w:sz w:val="22"/>
+        </w:rPr>
+        <w:t xml:space="preserve">A write requires </w:t>
+      </w:r>
+      <w:r>
+        <w:rPr>
+          <w:rFonts w:ascii="Consolas" w:hAnsi="Consolas"/>
+          <w:color w:val="1F4D78"/>
+          <w:sz w:val="19"/>
+        </w:rPr>
+        <w:t>diagnostics:manage</w:t>
+      </w:r>
+      <w:r>
+        <w:rPr>
+          <w:rFonts w:ascii="Calibri" w:hAnsi="Calibri"/>
+          <w:color w:val="111827"/>
+          <w:sz w:val="22"/>
+        </w:rPr>
+        <w:t xml:space="preserve">, a writable DID, an allowed active session, matching session and DID versions, and a value satisfying the declared type and constraints. It increments only the DID version and returns </w:t>
+      </w:r>
+      <w:r>
+        <w:rPr>
+          <w:rFonts w:ascii="Consolas" w:hAnsi="Consolas"/>
+          <w:color w:val="1F4D78"/>
+          <w:sz w:val="19"/>
+        </w:rPr>
+        <w:t>0x6E</w:t>
+      </w:r>
+      <w:r>
+        <w:rPr>
+          <w:rFonts w:ascii="Calibri" w:hAnsi="Calibri"/>
+          <w:color w:val="111827"/>
+          <w:sz w:val="22"/>
+        </w:rPr>
+        <w:t xml:space="preserve"> identity. Exact retry returns the persisted result without a second mutation.</w:t>
       </w:r>
     </w:p>
     <w:p>
@@ -3379,6 +4265,411 @@
                 <w:color w:val="111827"/>
                 <w:sz w:val="16"/>
               </w:rPr>
+              <w:t>DID type/range violation</w:t>
+            </w:r>
+          </w:p>
+        </w:tc>
+        <w:tc>
+          <w:tcPr>
+            <w:tcW w:type="dxa" w:w="3700"/>
+            <w:tcMar>
+              <w:top w:w="80" w:type="dxa"/>
+              <w:start w:w="120" w:type="dxa"/>
+              <w:bottom w:w="80" w:type="dxa"/>
+              <w:end w:w="120" w:type="dxa"/>
+            </w:tcMar>
+            <w:vAlign w:val="center"/>
+            <w:shd w:fill="FFFFFF"/>
+          </w:tcPr>
+          <w:p>
+            <w:pPr>
+              <w:spacing w:before="0" w:after="40" w:line="252" w:lineRule="auto"/>
+              <w:jc w:val="left"/>
+            </w:pPr>
+            <w:r>
+              <w:rPr>
+                <w:rFonts w:ascii="Calibri" w:hAnsi="Calibri"/>
+                <w:b w:val="0"/>
+                <w:color w:val="111827"/>
+                <w:sz w:val="16"/>
+              </w:rPr>
+              <w:t>diagnostic_contract_invalid</w:t>
+            </w:r>
+          </w:p>
+        </w:tc>
+        <w:tc>
+          <w:tcPr>
+            <w:tcW w:type="dxa" w:w="3100"/>
+            <w:tcMar>
+              <w:top w:w="80" w:type="dxa"/>
+              <w:start w:w="120" w:type="dxa"/>
+              <w:bottom w:w="80" w:type="dxa"/>
+              <w:end w:w="120" w:type="dxa"/>
+            </w:tcMar>
+            <w:vAlign w:val="center"/>
+            <w:shd w:fill="FFFFFF"/>
+          </w:tcPr>
+          <w:p>
+            <w:pPr>
+              <w:spacing w:before="0" w:after="40" w:line="252" w:lineRule="auto"/>
+              <w:jc w:val="left"/>
+            </w:pPr>
+            <w:r>
+              <w:rPr>
+                <w:rFonts w:ascii="Calibri" w:hAnsi="Calibri"/>
+                <w:b w:val="0"/>
+                <w:color w:val="111827"/>
+                <w:sz w:val="16"/>
+              </w:rPr>
+              <w:t>422</w:t>
+            </w:r>
+          </w:p>
+        </w:tc>
+        <w:tc>
+          <w:tcPr>
+            <w:tcW w:type="dxa" w:w="1410"/>
+            <w:tcMar>
+              <w:top w:w="80" w:type="dxa"/>
+              <w:start w:w="120" w:type="dxa"/>
+              <w:bottom w:w="80" w:type="dxa"/>
+              <w:end w:w="120" w:type="dxa"/>
+            </w:tcMar>
+            <w:vAlign w:val="center"/>
+            <w:shd w:fill="FFFFFF"/>
+          </w:tcPr>
+          <w:p>
+            <w:pPr>
+              <w:spacing w:before="0" w:after="40" w:line="252" w:lineRule="auto"/>
+              <w:jc w:val="left"/>
+            </w:pPr>
+            <w:r>
+              <w:rPr>
+                <w:rFonts w:ascii="Calibri" w:hAnsi="Calibri"/>
+                <w:b w:val="0"/>
+                <w:color w:val="111827"/>
+                <w:sz w:val="16"/>
+              </w:rPr>
+              <w:t xml:space="preserve">NRC </w:t>
+            </w:r>
+            <w:r>
+              <w:rPr>
+                <w:rFonts w:ascii="Calibri" w:hAnsi="Calibri"/>
+                <w:b w:val="0"/>
+                <w:color w:val="111827"/>
+                <w:sz w:val="16"/>
+              </w:rPr>
+              <w:t>0x31</w:t>
+            </w:r>
+            <w:r>
+              <w:rPr>
+                <w:rFonts w:ascii="Calibri" w:hAnsi="Calibri"/>
+                <w:b w:val="0"/>
+                <w:color w:val="111827"/>
+                <w:sz w:val="16"/>
+              </w:rPr>
+              <w:t xml:space="preserve"> request out of range</w:t>
+            </w:r>
+          </w:p>
+        </w:tc>
+      </w:tr>
+      <w:tr>
+        <w:trPr>
+          <w:cantSplit/>
+        </w:trPr>
+        <w:tc>
+          <w:tcPr>
+            <w:tcW w:type="dxa" w:w="1150"/>
+            <w:tcMar>
+              <w:top w:w="80" w:type="dxa"/>
+              <w:start w:w="120" w:type="dxa"/>
+              <w:bottom w:w="80" w:type="dxa"/>
+              <w:end w:w="120" w:type="dxa"/>
+            </w:tcMar>
+            <w:vAlign w:val="center"/>
+            <w:shd w:fill="FFFFFF"/>
+          </w:tcPr>
+          <w:p>
+            <w:pPr>
+              <w:spacing w:before="0" w:after="40" w:line="252" w:lineRule="auto"/>
+              <w:jc w:val="center"/>
+            </w:pPr>
+            <w:r>
+              <w:rPr>
+                <w:rFonts w:ascii="Calibri" w:hAnsi="Calibri"/>
+                <w:b w:val="0"/>
+                <w:color w:val="111827"/>
+                <w:sz w:val="16"/>
+              </w:rPr>
+              <w:t>Stale DID or session version</w:t>
+            </w:r>
+          </w:p>
+        </w:tc>
+        <w:tc>
+          <w:tcPr>
+            <w:tcW w:type="dxa" w:w="3700"/>
+            <w:tcMar>
+              <w:top w:w="80" w:type="dxa"/>
+              <w:start w:w="120" w:type="dxa"/>
+              <w:bottom w:w="80" w:type="dxa"/>
+              <w:end w:w="120" w:type="dxa"/>
+            </w:tcMar>
+            <w:vAlign w:val="center"/>
+            <w:shd w:fill="FFFFFF"/>
+          </w:tcPr>
+          <w:p>
+            <w:pPr>
+              <w:spacing w:before="0" w:after="40" w:line="252" w:lineRule="auto"/>
+              <w:jc w:val="left"/>
+            </w:pPr>
+            <w:r>
+              <w:rPr>
+                <w:rFonts w:ascii="Calibri" w:hAnsi="Calibri"/>
+                <w:b w:val="0"/>
+                <w:color w:val="111827"/>
+                <w:sz w:val="16"/>
+              </w:rPr>
+              <w:t>diagnostic_contract_invalid</w:t>
+            </w:r>
+          </w:p>
+        </w:tc>
+        <w:tc>
+          <w:tcPr>
+            <w:tcW w:type="dxa" w:w="3100"/>
+            <w:tcMar>
+              <w:top w:w="80" w:type="dxa"/>
+              <w:start w:w="120" w:type="dxa"/>
+              <w:bottom w:w="80" w:type="dxa"/>
+              <w:end w:w="120" w:type="dxa"/>
+            </w:tcMar>
+            <w:vAlign w:val="center"/>
+            <w:shd w:fill="FFFFFF"/>
+          </w:tcPr>
+          <w:p>
+            <w:pPr>
+              <w:spacing w:before="0" w:after="40" w:line="252" w:lineRule="auto"/>
+              <w:jc w:val="left"/>
+            </w:pPr>
+            <w:r>
+              <w:rPr>
+                <w:rFonts w:ascii="Calibri" w:hAnsi="Calibri"/>
+                <w:b w:val="0"/>
+                <w:color w:val="111827"/>
+                <w:sz w:val="16"/>
+              </w:rPr>
+              <w:t>422</w:t>
+            </w:r>
+          </w:p>
+        </w:tc>
+        <w:tc>
+          <w:tcPr>
+            <w:tcW w:type="dxa" w:w="1410"/>
+            <w:tcMar>
+              <w:top w:w="80" w:type="dxa"/>
+              <w:start w:w="120" w:type="dxa"/>
+              <w:bottom w:w="80" w:type="dxa"/>
+              <w:end w:w="120" w:type="dxa"/>
+            </w:tcMar>
+            <w:vAlign w:val="center"/>
+            <w:shd w:fill="FFFFFF"/>
+          </w:tcPr>
+          <w:p>
+            <w:pPr>
+              <w:spacing w:before="0" w:after="40" w:line="252" w:lineRule="auto"/>
+              <w:jc w:val="left"/>
+            </w:pPr>
+            <w:r>
+              <w:rPr>
+                <w:rFonts w:ascii="Calibri" w:hAnsi="Calibri"/>
+                <w:b w:val="0"/>
+                <w:color w:val="111827"/>
+                <w:sz w:val="16"/>
+              </w:rPr>
+              <w:t xml:space="preserve">NRC </w:t>
+            </w:r>
+            <w:r>
+              <w:rPr>
+                <w:rFonts w:ascii="Calibri" w:hAnsi="Calibri"/>
+                <w:b w:val="0"/>
+                <w:color w:val="111827"/>
+                <w:sz w:val="16"/>
+              </w:rPr>
+              <w:t>0x22</w:t>
+            </w:r>
+            <w:r>
+              <w:rPr>
+                <w:rFonts w:ascii="Calibri" w:hAnsi="Calibri"/>
+                <w:b w:val="0"/>
+                <w:color w:val="111827"/>
+                <w:sz w:val="16"/>
+              </w:rPr>
+              <w:t xml:space="preserve"> conditions not correct</w:t>
+            </w:r>
+          </w:p>
+        </w:tc>
+      </w:tr>
+      <w:tr>
+        <w:trPr>
+          <w:cantSplit/>
+        </w:trPr>
+        <w:tc>
+          <w:tcPr>
+            <w:tcW w:type="dxa" w:w="1150"/>
+            <w:tcMar>
+              <w:top w:w="80" w:type="dxa"/>
+              <w:start w:w="120" w:type="dxa"/>
+              <w:bottom w:w="80" w:type="dxa"/>
+              <w:end w:w="120" w:type="dxa"/>
+            </w:tcMar>
+            <w:vAlign w:val="center"/>
+            <w:shd w:fill="FFFFFF"/>
+          </w:tcPr>
+          <w:p>
+            <w:pPr>
+              <w:spacing w:before="0" w:after="40" w:line="252" w:lineRule="auto"/>
+              <w:jc w:val="center"/>
+            </w:pPr>
+            <w:r>
+              <w:rPr>
+                <w:rFonts w:ascii="Calibri" w:hAnsi="Calibri"/>
+                <w:b w:val="0"/>
+                <w:color w:val="111827"/>
+                <w:sz w:val="16"/>
+              </w:rPr>
+              <w:t>DID forbidden in active session</w:t>
+            </w:r>
+          </w:p>
+        </w:tc>
+        <w:tc>
+          <w:tcPr>
+            <w:tcW w:type="dxa" w:w="3700"/>
+            <w:tcMar>
+              <w:top w:w="80" w:type="dxa"/>
+              <w:start w:w="120" w:type="dxa"/>
+              <w:bottom w:w="80" w:type="dxa"/>
+              <w:end w:w="120" w:type="dxa"/>
+            </w:tcMar>
+            <w:vAlign w:val="center"/>
+            <w:shd w:fill="FFFFFF"/>
+          </w:tcPr>
+          <w:p>
+            <w:pPr>
+              <w:spacing w:before="0" w:after="40" w:line="252" w:lineRule="auto"/>
+              <w:jc w:val="left"/>
+            </w:pPr>
+            <w:r>
+              <w:rPr>
+                <w:rFonts w:ascii="Calibri" w:hAnsi="Calibri"/>
+                <w:b w:val="0"/>
+                <w:color w:val="111827"/>
+                <w:sz w:val="16"/>
+              </w:rPr>
+              <w:t>diagnostic_contract_invalid</w:t>
+            </w:r>
+          </w:p>
+        </w:tc>
+        <w:tc>
+          <w:tcPr>
+            <w:tcW w:type="dxa" w:w="3100"/>
+            <w:tcMar>
+              <w:top w:w="80" w:type="dxa"/>
+              <w:start w:w="120" w:type="dxa"/>
+              <w:bottom w:w="80" w:type="dxa"/>
+              <w:end w:w="120" w:type="dxa"/>
+            </w:tcMar>
+            <w:vAlign w:val="center"/>
+            <w:shd w:fill="FFFFFF"/>
+          </w:tcPr>
+          <w:p>
+            <w:pPr>
+              <w:spacing w:before="0" w:after="40" w:line="252" w:lineRule="auto"/>
+              <w:jc w:val="left"/>
+            </w:pPr>
+            <w:r>
+              <w:rPr>
+                <w:rFonts w:ascii="Calibri" w:hAnsi="Calibri"/>
+                <w:b w:val="0"/>
+                <w:color w:val="111827"/>
+                <w:sz w:val="16"/>
+              </w:rPr>
+              <w:t>422</w:t>
+            </w:r>
+          </w:p>
+        </w:tc>
+        <w:tc>
+          <w:tcPr>
+            <w:tcW w:type="dxa" w:w="1410"/>
+            <w:tcMar>
+              <w:top w:w="80" w:type="dxa"/>
+              <w:start w:w="120" w:type="dxa"/>
+              <w:bottom w:w="80" w:type="dxa"/>
+              <w:end w:w="120" w:type="dxa"/>
+            </w:tcMar>
+            <w:vAlign w:val="center"/>
+            <w:shd w:fill="FFFFFF"/>
+          </w:tcPr>
+          <w:p>
+            <w:pPr>
+              <w:spacing w:before="0" w:after="40" w:line="252" w:lineRule="auto"/>
+              <w:jc w:val="left"/>
+            </w:pPr>
+            <w:r>
+              <w:rPr>
+                <w:rFonts w:ascii="Calibri" w:hAnsi="Calibri"/>
+                <w:b w:val="0"/>
+                <w:color w:val="111827"/>
+                <w:sz w:val="16"/>
+              </w:rPr>
+              <w:t xml:space="preserve">NRC </w:t>
+            </w:r>
+            <w:r>
+              <w:rPr>
+                <w:rFonts w:ascii="Calibri" w:hAnsi="Calibri"/>
+                <w:b w:val="0"/>
+                <w:color w:val="111827"/>
+                <w:sz w:val="16"/>
+              </w:rPr>
+              <w:t>0x7F</w:t>
+            </w:r>
+            <w:r>
+              <w:rPr>
+                <w:rFonts w:ascii="Calibri" w:hAnsi="Calibri"/>
+                <w:b w:val="0"/>
+                <w:color w:val="111827"/>
+                <w:sz w:val="16"/>
+              </w:rPr>
+              <w:t xml:space="preserve"> service not supported in active session</w:t>
+            </w:r>
+          </w:p>
+        </w:tc>
+      </w:tr>
+      <w:tr>
+        <w:trPr>
+          <w:cantSplit/>
+        </w:trPr>
+        <w:tc>
+          <w:tcPr>
+            <w:tcW w:type="dxa" w:w="1150"/>
+            <w:tcMar>
+              <w:top w:w="80" w:type="dxa"/>
+              <w:start w:w="120" w:type="dxa"/>
+              <w:bottom w:w="80" w:type="dxa"/>
+              <w:end w:w="120" w:type="dxa"/>
+            </w:tcMar>
+            <w:vAlign w:val="center"/>
+            <w:shd w:fill="FFFFFF"/>
+          </w:tcPr>
+          <w:p>
+            <w:pPr>
+              <w:spacing w:before="0" w:after="40" w:line="252" w:lineRule="auto"/>
+              <w:jc w:val="center"/>
+            </w:pPr>
+            <w:r>
+              <w:rPr>
+                <w:rFonts w:ascii="Calibri" w:hAnsi="Calibri"/>
+                <w:b w:val="0"/>
+                <w:color w:val="111827"/>
+                <w:sz w:val="16"/>
+              </w:rPr>
               <w:t>Unknown ECU or DTC</w:t>
             </w:r>
           </w:p>
@@ -3679,6 +4970,46 @@
           <w:sz w:val="22"/>
         </w:rPr>
         <w:t>Snapshots may contain engineering measurements. They remain in protected DTC storage and are not copied into audit or outbox messages; those contain identifiers, status, counters, and versions.</w:t>
+      </w:r>
+    </w:p>
+    <w:p>
+      <w:pPr>
+        <w:pStyle w:val="Heading2"/>
+        <w:keepNext/>
+        <w:keepLines/>
+      </w:pPr>
+      <w:r>
+        <w:t>ADR-DG-005 - Model DIDs as Typed Semantic Data</w:t>
+      </w:r>
+    </w:p>
+    <w:p>
+      <w:r>
+        <w:rPr>
+          <w:rFonts w:ascii="Calibri" w:hAnsi="Calibri"/>
+          <w:color w:val="111827"/>
+          <w:sz w:val="22"/>
+        </w:rPr>
+        <w:t>DIDs describe automotive information explicitly instead of exposing arbitrary ECU memory. This supports stable validation, session policy, OpenAPI contracts, and future VHAL/CAN mappings.</w:t>
+      </w:r>
+    </w:p>
+    <w:p>
+      <w:pPr>
+        <w:pStyle w:val="Heading2"/>
+        <w:keepNext/>
+        <w:keepLines/>
+      </w:pPr>
+      <w:r>
+        <w:t>ADR-DG-006 - Preserve Values for Replay but Minimize Shared Evidence</w:t>
+      </w:r>
+    </w:p>
+    <w:p>
+      <w:r>
+        <w:rPr>
+          <w:rFonts w:ascii="Calibri" w:hAnsi="Calibri"/>
+          <w:color w:val="111827"/>
+          <w:sz w:val="22"/>
+        </w:rPr>
+        <w:t>Command results retain DID values so an exact retry is truthful. Audit and outbox records exclude those values and share only identifiers, counts, service identities, and versions.</w:t>
       </w:r>
     </w:p>
     <w:p>
@@ -5960,7 +7291,7 @@
                 <w:color w:val="111827"/>
                 <w:sz w:val="17"/>
               </w:rPr>
-              <w:t>Upgrade and downgrade all three diagnostic tables.</w:t>
+              <w:t>Upgrade and downgrade all diagnostic tables.</w:t>
             </w:r>
           </w:p>
         </w:tc>
@@ -6082,6 +7413,897 @@
           </w:p>
         </w:tc>
       </w:tr>
+      <w:tr>
+        <w:trPr>
+          <w:cantSplit/>
+        </w:trPr>
+        <w:tc>
+          <w:tcPr>
+            <w:tcW w:type="dxa" w:w="1650"/>
+            <w:tcMar>
+              <w:top w:w="80" w:type="dxa"/>
+              <w:start w:w="120" w:type="dxa"/>
+              <w:bottom w:w="80" w:type="dxa"/>
+              <w:end w:w="120" w:type="dxa"/>
+            </w:tcMar>
+            <w:vAlign w:val="center"/>
+            <w:shd w:fill="FFFFFF"/>
+          </w:tcPr>
+          <w:p>
+            <w:pPr>
+              <w:spacing w:before="0" w:after="40" w:line="252" w:lineRule="auto"/>
+              <w:jc w:val="center"/>
+            </w:pPr>
+            <w:r>
+              <w:rPr>
+                <w:rFonts w:ascii="Calibri" w:hAnsi="Calibri"/>
+                <w:b w:val="0"/>
+                <w:color w:val="111827"/>
+                <w:sz w:val="17"/>
+              </w:rPr>
+              <w:t>DID definition</w:t>
+            </w:r>
+          </w:p>
+        </w:tc>
+        <w:tc>
+          <w:tcPr>
+            <w:tcW w:type="dxa" w:w="4450"/>
+            <w:tcMar>
+              <w:top w:w="80" w:type="dxa"/>
+              <w:start w:w="120" w:type="dxa"/>
+              <w:bottom w:w="80" w:type="dxa"/>
+              <w:end w:w="120" w:type="dxa"/>
+            </w:tcMar>
+            <w:vAlign w:val="center"/>
+            <w:shd w:fill="FFFFFF"/>
+          </w:tcPr>
+          <w:p>
+            <w:pPr>
+              <w:spacing w:before="0" w:after="40" w:line="252" w:lineRule="auto"/>
+              <w:jc w:val="left"/>
+            </w:pPr>
+            <w:r>
+              <w:rPr>
+                <w:rFonts w:ascii="Calibri" w:hAnsi="Calibri"/>
+                <w:b w:val="0"/>
+                <w:color w:val="111827"/>
+                <w:sz w:val="17"/>
+              </w:rPr>
+              <w:t>Accept valid scalar types and reject mismatched initial values.</w:t>
+            </w:r>
+          </w:p>
+        </w:tc>
+        <w:tc>
+          <w:tcPr>
+            <w:tcW w:type="dxa" w:w="3260"/>
+            <w:tcMar>
+              <w:top w:w="80" w:type="dxa"/>
+              <w:start w:w="120" w:type="dxa"/>
+              <w:bottom w:w="80" w:type="dxa"/>
+              <w:end w:w="120" w:type="dxa"/>
+            </w:tcMar>
+            <w:vAlign w:val="center"/>
+            <w:shd w:fill="FFFFFF"/>
+          </w:tcPr>
+          <w:p>
+            <w:pPr>
+              <w:spacing w:before="0" w:after="40" w:line="252" w:lineRule="auto"/>
+              <w:jc w:val="left"/>
+            </w:pPr>
+            <w:r>
+              <w:rPr>
+                <w:rFonts w:ascii="Calibri" w:hAnsi="Calibri"/>
+                <w:b w:val="0"/>
+                <w:color w:val="111827"/>
+                <w:sz w:val="17"/>
+              </w:rPr>
+              <w:t>Schema/service</w:t>
+            </w:r>
+          </w:p>
+        </w:tc>
+      </w:tr>
+      <w:tr>
+        <w:trPr>
+          <w:cantSplit/>
+        </w:trPr>
+        <w:tc>
+          <w:tcPr>
+            <w:tcW w:type="dxa" w:w="1650"/>
+            <w:tcMar>
+              <w:top w:w="80" w:type="dxa"/>
+              <w:start w:w="120" w:type="dxa"/>
+              <w:bottom w:w="80" w:type="dxa"/>
+              <w:end w:w="120" w:type="dxa"/>
+            </w:tcMar>
+            <w:vAlign w:val="center"/>
+            <w:shd w:fill="FFFFFF"/>
+          </w:tcPr>
+          <w:p>
+            <w:pPr>
+              <w:spacing w:before="0" w:after="40" w:line="252" w:lineRule="auto"/>
+              <w:jc w:val="center"/>
+            </w:pPr>
+            <w:r>
+              <w:rPr>
+                <w:rFonts w:ascii="Calibri" w:hAnsi="Calibri"/>
+                <w:b w:val="0"/>
+                <w:color w:val="111827"/>
+                <w:sz w:val="17"/>
+              </w:rPr>
+              <w:t>DID catalogue bound</w:t>
+            </w:r>
+          </w:p>
+        </w:tc>
+        <w:tc>
+          <w:tcPr>
+            <w:tcW w:type="dxa" w:w="4450"/>
+            <w:tcMar>
+              <w:top w:w="80" w:type="dxa"/>
+              <w:start w:w="120" w:type="dxa"/>
+              <w:bottom w:w="80" w:type="dxa"/>
+              <w:end w:w="120" w:type="dxa"/>
+            </w:tcMar>
+            <w:vAlign w:val="center"/>
+            <w:shd w:fill="FFFFFF"/>
+          </w:tcPr>
+          <w:p>
+            <w:pPr>
+              <w:spacing w:before="0" w:after="40" w:line="252" w:lineRule="auto"/>
+              <w:jc w:val="left"/>
+            </w:pPr>
+            <w:r>
+              <w:rPr>
+                <w:rFonts w:ascii="Calibri" w:hAnsi="Calibri"/>
+                <w:b w:val="0"/>
+                <w:color w:val="111827"/>
+                <w:sz w:val="17"/>
+              </w:rPr>
+              <w:t>Reject a 129th DID and enforce page limit 128.</w:t>
+            </w:r>
+          </w:p>
+        </w:tc>
+        <w:tc>
+          <w:tcPr>
+            <w:tcW w:type="dxa" w:w="3260"/>
+            <w:tcMar>
+              <w:top w:w="80" w:type="dxa"/>
+              <w:start w:w="120" w:type="dxa"/>
+              <w:bottom w:w="80" w:type="dxa"/>
+              <w:end w:w="120" w:type="dxa"/>
+            </w:tcMar>
+            <w:vAlign w:val="center"/>
+            <w:shd w:fill="FFFFFF"/>
+          </w:tcPr>
+          <w:p>
+            <w:pPr>
+              <w:spacing w:before="0" w:after="40" w:line="252" w:lineRule="auto"/>
+              <w:jc w:val="left"/>
+            </w:pPr>
+            <w:r>
+              <w:rPr>
+                <w:rFonts w:ascii="Calibri" w:hAnsi="Calibri"/>
+                <w:b w:val="0"/>
+                <w:color w:val="111827"/>
+                <w:sz w:val="17"/>
+              </w:rPr>
+              <w:t>Service/OpenAPI</w:t>
+            </w:r>
+          </w:p>
+        </w:tc>
+      </w:tr>
+      <w:tr>
+        <w:trPr>
+          <w:cantSplit/>
+        </w:trPr>
+        <w:tc>
+          <w:tcPr>
+            <w:tcW w:type="dxa" w:w="1650"/>
+            <w:tcMar>
+              <w:top w:w="80" w:type="dxa"/>
+              <w:start w:w="120" w:type="dxa"/>
+              <w:bottom w:w="80" w:type="dxa"/>
+              <w:end w:w="120" w:type="dxa"/>
+            </w:tcMar>
+            <w:vAlign w:val="center"/>
+            <w:shd w:fill="FFFFFF"/>
+          </w:tcPr>
+          <w:p>
+            <w:pPr>
+              <w:spacing w:before="0" w:after="40" w:line="252" w:lineRule="auto"/>
+              <w:jc w:val="center"/>
+            </w:pPr>
+            <w:r>
+              <w:rPr>
+                <w:rFonts w:ascii="Calibri" w:hAnsi="Calibri"/>
+                <w:b w:val="0"/>
+                <w:color w:val="111827"/>
+                <w:sz w:val="17"/>
+              </w:rPr>
+              <w:t>Multi-DID read</w:t>
+            </w:r>
+          </w:p>
+        </w:tc>
+        <w:tc>
+          <w:tcPr>
+            <w:tcW w:type="dxa" w:w="4450"/>
+            <w:tcMar>
+              <w:top w:w="80" w:type="dxa"/>
+              <w:start w:w="120" w:type="dxa"/>
+              <w:bottom w:w="80" w:type="dxa"/>
+              <w:end w:w="120" w:type="dxa"/>
+            </w:tcMar>
+            <w:vAlign w:val="center"/>
+            <w:shd w:fill="FFFFFF"/>
+          </w:tcPr>
+          <w:p>
+            <w:pPr>
+              <w:spacing w:before="0" w:after="40" w:line="252" w:lineRule="auto"/>
+              <w:jc w:val="left"/>
+            </w:pPr>
+            <w:r>
+              <w:rPr>
+                <w:rFonts w:ascii="Calibri" w:hAnsi="Calibri"/>
+                <w:b w:val="0"/>
+                <w:color w:val="111827"/>
+                <w:sz w:val="17"/>
+              </w:rPr>
+              <w:t>Read one to sixteen unique DIDs in request order.</w:t>
+            </w:r>
+          </w:p>
+        </w:tc>
+        <w:tc>
+          <w:tcPr>
+            <w:tcW w:type="dxa" w:w="3260"/>
+            <w:tcMar>
+              <w:top w:w="80" w:type="dxa"/>
+              <w:start w:w="120" w:type="dxa"/>
+              <w:bottom w:w="80" w:type="dxa"/>
+              <w:end w:w="120" w:type="dxa"/>
+            </w:tcMar>
+            <w:vAlign w:val="center"/>
+            <w:shd w:fill="FFFFFF"/>
+          </w:tcPr>
+          <w:p>
+            <w:pPr>
+              <w:spacing w:before="0" w:after="40" w:line="252" w:lineRule="auto"/>
+              <w:jc w:val="left"/>
+            </w:pPr>
+            <w:r>
+              <w:rPr>
+                <w:rFonts w:ascii="Calibri" w:hAnsi="Calibri"/>
+                <w:b w:val="0"/>
+                <w:color w:val="111827"/>
+                <w:sz w:val="17"/>
+              </w:rPr>
+              <w:t>Service/API</w:t>
+            </w:r>
+          </w:p>
+        </w:tc>
+      </w:tr>
+      <w:tr>
+        <w:trPr>
+          <w:cantSplit/>
+        </w:trPr>
+        <w:tc>
+          <w:tcPr>
+            <w:tcW w:type="dxa" w:w="1650"/>
+            <w:tcMar>
+              <w:top w:w="80" w:type="dxa"/>
+              <w:start w:w="120" w:type="dxa"/>
+              <w:bottom w:w="80" w:type="dxa"/>
+              <w:end w:w="120" w:type="dxa"/>
+            </w:tcMar>
+            <w:vAlign w:val="center"/>
+            <w:shd w:fill="FFFFFF"/>
+          </w:tcPr>
+          <w:p>
+            <w:pPr>
+              <w:spacing w:before="0" w:after="40" w:line="252" w:lineRule="auto"/>
+              <w:jc w:val="center"/>
+            </w:pPr>
+            <w:r>
+              <w:rPr>
+                <w:rFonts w:ascii="Calibri" w:hAnsi="Calibri"/>
+                <w:b w:val="0"/>
+                <w:color w:val="111827"/>
+                <w:sz w:val="17"/>
+              </w:rPr>
+              <w:t>Read session denial</w:t>
+            </w:r>
+          </w:p>
+        </w:tc>
+        <w:tc>
+          <w:tcPr>
+            <w:tcW w:type="dxa" w:w="4450"/>
+            <w:tcMar>
+              <w:top w:w="80" w:type="dxa"/>
+              <w:start w:w="120" w:type="dxa"/>
+              <w:bottom w:w="80" w:type="dxa"/>
+              <w:end w:w="120" w:type="dxa"/>
+            </w:tcMar>
+            <w:vAlign w:val="center"/>
+            <w:shd w:fill="FFFFFF"/>
+          </w:tcPr>
+          <w:p>
+            <w:pPr>
+              <w:spacing w:before="0" w:after="40" w:line="252" w:lineRule="auto"/>
+              <w:jc w:val="left"/>
+            </w:pPr>
+            <w:r>
+              <w:rPr>
+                <w:rFonts w:ascii="Calibri" w:hAnsi="Calibri"/>
+                <w:b w:val="0"/>
+                <w:color w:val="111827"/>
+                <w:sz w:val="17"/>
+              </w:rPr>
+              <w:t xml:space="preserve">Return NRC </w:t>
+            </w:r>
+            <w:r>
+              <w:rPr>
+                <w:rFonts w:ascii="Calibri" w:hAnsi="Calibri"/>
+                <w:b w:val="0"/>
+                <w:color w:val="111827"/>
+                <w:sz w:val="17"/>
+              </w:rPr>
+              <w:t>0x7F</w:t>
+            </w:r>
+            <w:r>
+              <w:rPr>
+                <w:rFonts w:ascii="Calibri" w:hAnsi="Calibri"/>
+                <w:b w:val="0"/>
+                <w:color w:val="111827"/>
+                <w:sz w:val="17"/>
+              </w:rPr>
+              <w:t xml:space="preserve"> when any DID disallows the active session.</w:t>
+            </w:r>
+          </w:p>
+        </w:tc>
+        <w:tc>
+          <w:tcPr>
+            <w:tcW w:type="dxa" w:w="3260"/>
+            <w:tcMar>
+              <w:top w:w="80" w:type="dxa"/>
+              <w:start w:w="120" w:type="dxa"/>
+              <w:bottom w:w="80" w:type="dxa"/>
+              <w:end w:w="120" w:type="dxa"/>
+            </w:tcMar>
+            <w:vAlign w:val="center"/>
+            <w:shd w:fill="FFFFFF"/>
+          </w:tcPr>
+          <w:p>
+            <w:pPr>
+              <w:spacing w:before="0" w:after="40" w:line="252" w:lineRule="auto"/>
+              <w:jc w:val="left"/>
+            </w:pPr>
+            <w:r>
+              <w:rPr>
+                <w:rFonts w:ascii="Calibri" w:hAnsi="Calibri"/>
+                <w:b w:val="0"/>
+                <w:color w:val="111827"/>
+                <w:sz w:val="17"/>
+              </w:rPr>
+              <w:t>Service/API</w:t>
+            </w:r>
+          </w:p>
+        </w:tc>
+      </w:tr>
+      <w:tr>
+        <w:trPr>
+          <w:cantSplit/>
+        </w:trPr>
+        <w:tc>
+          <w:tcPr>
+            <w:tcW w:type="dxa" w:w="1650"/>
+            <w:tcMar>
+              <w:top w:w="80" w:type="dxa"/>
+              <w:start w:w="120" w:type="dxa"/>
+              <w:bottom w:w="80" w:type="dxa"/>
+              <w:end w:w="120" w:type="dxa"/>
+            </w:tcMar>
+            <w:vAlign w:val="center"/>
+            <w:shd w:fill="FFFFFF"/>
+          </w:tcPr>
+          <w:p>
+            <w:pPr>
+              <w:spacing w:before="0" w:after="40" w:line="252" w:lineRule="auto"/>
+              <w:jc w:val="center"/>
+            </w:pPr>
+            <w:r>
+              <w:rPr>
+                <w:rFonts w:ascii="Calibri" w:hAnsi="Calibri"/>
+                <w:b w:val="0"/>
+                <w:color w:val="111827"/>
+                <w:sz w:val="17"/>
+              </w:rPr>
+              <w:t>DID write authorization</w:t>
+            </w:r>
+          </w:p>
+        </w:tc>
+        <w:tc>
+          <w:tcPr>
+            <w:tcW w:type="dxa" w:w="4450"/>
+            <w:tcMar>
+              <w:top w:w="80" w:type="dxa"/>
+              <w:start w:w="120" w:type="dxa"/>
+              <w:bottom w:w="80" w:type="dxa"/>
+              <w:end w:w="120" w:type="dxa"/>
+            </w:tcMar>
+            <w:vAlign w:val="center"/>
+            <w:shd w:fill="FFFFFF"/>
+          </w:tcPr>
+          <w:p>
+            <w:pPr>
+              <w:spacing w:before="0" w:after="40" w:line="252" w:lineRule="auto"/>
+              <w:jc w:val="left"/>
+            </w:pPr>
+            <w:r>
+              <w:rPr>
+                <w:rFonts w:ascii="Calibri" w:hAnsi="Calibri"/>
+                <w:b w:val="0"/>
+                <w:color w:val="111827"/>
+                <w:sz w:val="17"/>
+              </w:rPr>
+              <w:t>Require writable metadata, permitted session, and manage RBAC.</w:t>
+            </w:r>
+          </w:p>
+        </w:tc>
+        <w:tc>
+          <w:tcPr>
+            <w:tcW w:type="dxa" w:w="3260"/>
+            <w:tcMar>
+              <w:top w:w="80" w:type="dxa"/>
+              <w:start w:w="120" w:type="dxa"/>
+              <w:bottom w:w="80" w:type="dxa"/>
+              <w:end w:w="120" w:type="dxa"/>
+            </w:tcMar>
+            <w:vAlign w:val="center"/>
+            <w:shd w:fill="FFFFFF"/>
+          </w:tcPr>
+          <w:p>
+            <w:pPr>
+              <w:spacing w:before="0" w:after="40" w:line="252" w:lineRule="auto"/>
+              <w:jc w:val="left"/>
+            </w:pPr>
+            <w:r>
+              <w:rPr>
+                <w:rFonts w:ascii="Calibri" w:hAnsi="Calibri"/>
+                <w:b w:val="0"/>
+                <w:color w:val="111827"/>
+                <w:sz w:val="17"/>
+              </w:rPr>
+              <w:t>Service/API</w:t>
+            </w:r>
+          </w:p>
+        </w:tc>
+      </w:tr>
+      <w:tr>
+        <w:trPr>
+          <w:cantSplit/>
+        </w:trPr>
+        <w:tc>
+          <w:tcPr>
+            <w:tcW w:type="dxa" w:w="1650"/>
+            <w:tcMar>
+              <w:top w:w="80" w:type="dxa"/>
+              <w:start w:w="120" w:type="dxa"/>
+              <w:bottom w:w="80" w:type="dxa"/>
+              <w:end w:w="120" w:type="dxa"/>
+            </w:tcMar>
+            <w:vAlign w:val="center"/>
+            <w:shd w:fill="FFFFFF"/>
+          </w:tcPr>
+          <w:p>
+            <w:pPr>
+              <w:spacing w:before="0" w:after="40" w:line="252" w:lineRule="auto"/>
+              <w:jc w:val="center"/>
+            </w:pPr>
+            <w:r>
+              <w:rPr>
+                <w:rFonts w:ascii="Calibri" w:hAnsi="Calibri"/>
+                <w:b w:val="0"/>
+                <w:color w:val="111827"/>
+                <w:sz w:val="17"/>
+              </w:rPr>
+              <w:t>DID version concurrency</w:t>
+            </w:r>
+          </w:p>
+        </w:tc>
+        <w:tc>
+          <w:tcPr>
+            <w:tcW w:type="dxa" w:w="4450"/>
+            <w:tcMar>
+              <w:top w:w="80" w:type="dxa"/>
+              <w:start w:w="120" w:type="dxa"/>
+              <w:bottom w:w="80" w:type="dxa"/>
+              <w:end w:w="120" w:type="dxa"/>
+            </w:tcMar>
+            <w:vAlign w:val="center"/>
+            <w:shd w:fill="FFFFFF"/>
+          </w:tcPr>
+          <w:p>
+            <w:pPr>
+              <w:spacing w:before="0" w:after="40" w:line="252" w:lineRule="auto"/>
+              <w:jc w:val="left"/>
+            </w:pPr>
+            <w:r>
+              <w:rPr>
+                <w:rFonts w:ascii="Calibri" w:hAnsi="Calibri"/>
+                <w:b w:val="0"/>
+                <w:color w:val="111827"/>
+                <w:sz w:val="17"/>
+              </w:rPr>
+              <w:t xml:space="preserve">Reject stale session or DID versions with NRC </w:t>
+            </w:r>
+            <w:r>
+              <w:rPr>
+                <w:rFonts w:ascii="Calibri" w:hAnsi="Calibri"/>
+                <w:b w:val="0"/>
+                <w:color w:val="111827"/>
+                <w:sz w:val="17"/>
+              </w:rPr>
+              <w:t>0x22</w:t>
+            </w:r>
+            <w:r>
+              <w:rPr>
+                <w:rFonts w:ascii="Calibri" w:hAnsi="Calibri"/>
+                <w:b w:val="0"/>
+                <w:color w:val="111827"/>
+                <w:sz w:val="17"/>
+              </w:rPr>
+              <w:t>.</w:t>
+            </w:r>
+          </w:p>
+        </w:tc>
+        <w:tc>
+          <w:tcPr>
+            <w:tcW w:type="dxa" w:w="3260"/>
+            <w:tcMar>
+              <w:top w:w="80" w:type="dxa"/>
+              <w:start w:w="120" w:type="dxa"/>
+              <w:bottom w:w="80" w:type="dxa"/>
+              <w:end w:w="120" w:type="dxa"/>
+            </w:tcMar>
+            <w:vAlign w:val="center"/>
+            <w:shd w:fill="FFFFFF"/>
+          </w:tcPr>
+          <w:p>
+            <w:pPr>
+              <w:spacing w:before="0" w:after="40" w:line="252" w:lineRule="auto"/>
+              <w:jc w:val="left"/>
+            </w:pPr>
+            <w:r>
+              <w:rPr>
+                <w:rFonts w:ascii="Calibri" w:hAnsi="Calibri"/>
+                <w:b w:val="0"/>
+                <w:color w:val="111827"/>
+                <w:sz w:val="17"/>
+              </w:rPr>
+              <w:t>Service/integration</w:t>
+            </w:r>
+          </w:p>
+        </w:tc>
+      </w:tr>
+      <w:tr>
+        <w:trPr>
+          <w:cantSplit/>
+        </w:trPr>
+        <w:tc>
+          <w:tcPr>
+            <w:tcW w:type="dxa" w:w="1650"/>
+            <w:tcMar>
+              <w:top w:w="80" w:type="dxa"/>
+              <w:start w:w="120" w:type="dxa"/>
+              <w:bottom w:w="80" w:type="dxa"/>
+              <w:end w:w="120" w:type="dxa"/>
+            </w:tcMar>
+            <w:vAlign w:val="center"/>
+            <w:shd w:fill="FFFFFF"/>
+          </w:tcPr>
+          <w:p>
+            <w:pPr>
+              <w:spacing w:before="0" w:after="40" w:line="252" w:lineRule="auto"/>
+              <w:jc w:val="center"/>
+            </w:pPr>
+            <w:r>
+              <w:rPr>
+                <w:rFonts w:ascii="Calibri" w:hAnsi="Calibri"/>
+                <w:b w:val="0"/>
+                <w:color w:val="111827"/>
+                <w:sz w:val="17"/>
+              </w:rPr>
+              <w:t>DID value constraints</w:t>
+            </w:r>
+          </w:p>
+        </w:tc>
+        <w:tc>
+          <w:tcPr>
+            <w:tcW w:type="dxa" w:w="4450"/>
+            <w:tcMar>
+              <w:top w:w="80" w:type="dxa"/>
+              <w:start w:w="120" w:type="dxa"/>
+              <w:bottom w:w="80" w:type="dxa"/>
+              <w:end w:w="120" w:type="dxa"/>
+            </w:tcMar>
+            <w:vAlign w:val="center"/>
+            <w:shd w:fill="FFFFFF"/>
+          </w:tcPr>
+          <w:p>
+            <w:pPr>
+              <w:spacing w:before="0" w:after="40" w:line="252" w:lineRule="auto"/>
+              <w:jc w:val="left"/>
+            </w:pPr>
+            <w:r>
+              <w:rPr>
+                <w:rFonts w:ascii="Calibri" w:hAnsi="Calibri"/>
+                <w:b w:val="0"/>
+                <w:color w:val="111827"/>
+                <w:sz w:val="17"/>
+              </w:rPr>
+              <w:t xml:space="preserve">Reject type, numeric range, and string-length violations with NRC </w:t>
+            </w:r>
+            <w:r>
+              <w:rPr>
+                <w:rFonts w:ascii="Calibri" w:hAnsi="Calibri"/>
+                <w:b w:val="0"/>
+                <w:color w:val="111827"/>
+                <w:sz w:val="17"/>
+              </w:rPr>
+              <w:t>0x31</w:t>
+            </w:r>
+            <w:r>
+              <w:rPr>
+                <w:rFonts w:ascii="Calibri" w:hAnsi="Calibri"/>
+                <w:b w:val="0"/>
+                <w:color w:val="111827"/>
+                <w:sz w:val="17"/>
+              </w:rPr>
+              <w:t>.</w:t>
+            </w:r>
+          </w:p>
+        </w:tc>
+        <w:tc>
+          <w:tcPr>
+            <w:tcW w:type="dxa" w:w="3260"/>
+            <w:tcMar>
+              <w:top w:w="80" w:type="dxa"/>
+              <w:start w:w="120" w:type="dxa"/>
+              <w:bottom w:w="80" w:type="dxa"/>
+              <w:end w:w="120" w:type="dxa"/>
+            </w:tcMar>
+            <w:vAlign w:val="center"/>
+            <w:shd w:fill="FFFFFF"/>
+          </w:tcPr>
+          <w:p>
+            <w:pPr>
+              <w:spacing w:before="0" w:after="40" w:line="252" w:lineRule="auto"/>
+              <w:jc w:val="left"/>
+            </w:pPr>
+            <w:r>
+              <w:rPr>
+                <w:rFonts w:ascii="Calibri" w:hAnsi="Calibri"/>
+                <w:b w:val="0"/>
+                <w:color w:val="111827"/>
+                <w:sz w:val="17"/>
+              </w:rPr>
+              <w:t>Schema/service</w:t>
+            </w:r>
+          </w:p>
+        </w:tc>
+      </w:tr>
+      <w:tr>
+        <w:trPr>
+          <w:cantSplit/>
+        </w:trPr>
+        <w:tc>
+          <w:tcPr>
+            <w:tcW w:type="dxa" w:w="1650"/>
+            <w:tcMar>
+              <w:top w:w="80" w:type="dxa"/>
+              <w:start w:w="120" w:type="dxa"/>
+              <w:bottom w:w="80" w:type="dxa"/>
+              <w:end w:w="120" w:type="dxa"/>
+            </w:tcMar>
+            <w:vAlign w:val="center"/>
+            <w:shd w:fill="FFFFFF"/>
+          </w:tcPr>
+          <w:p>
+            <w:pPr>
+              <w:spacing w:before="0" w:after="40" w:line="252" w:lineRule="auto"/>
+              <w:jc w:val="center"/>
+            </w:pPr>
+            <w:r>
+              <w:rPr>
+                <w:rFonts w:ascii="Calibri" w:hAnsi="Calibri"/>
+                <w:b w:val="0"/>
+                <w:color w:val="111827"/>
+                <w:sz w:val="17"/>
+              </w:rPr>
+              <w:t>DID replay</w:t>
+            </w:r>
+          </w:p>
+        </w:tc>
+        <w:tc>
+          <w:tcPr>
+            <w:tcW w:type="dxa" w:w="4450"/>
+            <w:tcMar>
+              <w:top w:w="80" w:type="dxa"/>
+              <w:start w:w="120" w:type="dxa"/>
+              <w:bottom w:w="80" w:type="dxa"/>
+              <w:end w:w="120" w:type="dxa"/>
+            </w:tcMar>
+            <w:vAlign w:val="center"/>
+            <w:shd w:fill="FFFFFF"/>
+          </w:tcPr>
+          <w:p>
+            <w:pPr>
+              <w:spacing w:before="0" w:after="40" w:line="252" w:lineRule="auto"/>
+              <w:jc w:val="left"/>
+            </w:pPr>
+            <w:r>
+              <w:rPr>
+                <w:rFonts w:ascii="Calibri" w:hAnsi="Calibri"/>
+                <w:b w:val="0"/>
+                <w:color w:val="111827"/>
+                <w:sz w:val="17"/>
+              </w:rPr>
+              <w:t xml:space="preserve">Return persisted </w:t>
+            </w:r>
+            <w:r>
+              <w:rPr>
+                <w:rFonts w:ascii="Calibri" w:hAnsi="Calibri"/>
+                <w:b w:val="0"/>
+                <w:color w:val="111827"/>
+                <w:sz w:val="17"/>
+              </w:rPr>
+              <w:t>0x22</w:t>
+            </w:r>
+            <w:r>
+              <w:rPr>
+                <w:rFonts w:ascii="Calibri" w:hAnsi="Calibri"/>
+                <w:b w:val="0"/>
+                <w:color w:val="111827"/>
+                <w:sz w:val="17"/>
+              </w:rPr>
+              <w:t>/</w:t>
+            </w:r>
+            <w:r>
+              <w:rPr>
+                <w:rFonts w:ascii="Calibri" w:hAnsi="Calibri"/>
+                <w:b w:val="0"/>
+                <w:color w:val="111827"/>
+                <w:sz w:val="17"/>
+              </w:rPr>
+              <w:t>0x2E</w:t>
+            </w:r>
+            <w:r>
+              <w:rPr>
+                <w:rFonts w:ascii="Calibri" w:hAnsi="Calibri"/>
+                <w:b w:val="0"/>
+                <w:color w:val="111827"/>
+                <w:sz w:val="17"/>
+              </w:rPr>
+              <w:t xml:space="preserve"> evidence without repeated mutation.</w:t>
+            </w:r>
+          </w:p>
+        </w:tc>
+        <w:tc>
+          <w:tcPr>
+            <w:tcW w:type="dxa" w:w="3260"/>
+            <w:tcMar>
+              <w:top w:w="80" w:type="dxa"/>
+              <w:start w:w="120" w:type="dxa"/>
+              <w:bottom w:w="80" w:type="dxa"/>
+              <w:end w:w="120" w:type="dxa"/>
+            </w:tcMar>
+            <w:vAlign w:val="center"/>
+            <w:shd w:fill="FFFFFF"/>
+          </w:tcPr>
+          <w:p>
+            <w:pPr>
+              <w:spacing w:before="0" w:after="40" w:line="252" w:lineRule="auto"/>
+              <w:jc w:val="left"/>
+            </w:pPr>
+            <w:r>
+              <w:rPr>
+                <w:rFonts w:ascii="Calibri" w:hAnsi="Calibri"/>
+                <w:b w:val="0"/>
+                <w:color w:val="111827"/>
+                <w:sz w:val="17"/>
+              </w:rPr>
+              <w:t>Service/integration</w:t>
+            </w:r>
+          </w:p>
+        </w:tc>
+      </w:tr>
+      <w:tr>
+        <w:trPr>
+          <w:cantSplit/>
+        </w:trPr>
+        <w:tc>
+          <w:tcPr>
+            <w:tcW w:type="dxa" w:w="1650"/>
+            <w:tcMar>
+              <w:top w:w="80" w:type="dxa"/>
+              <w:start w:w="120" w:type="dxa"/>
+              <w:bottom w:w="80" w:type="dxa"/>
+              <w:end w:w="120" w:type="dxa"/>
+            </w:tcMar>
+            <w:vAlign w:val="center"/>
+            <w:shd w:fill="FFFFFF"/>
+          </w:tcPr>
+          <w:p>
+            <w:pPr>
+              <w:spacing w:before="0" w:after="40" w:line="252" w:lineRule="auto"/>
+              <w:jc w:val="center"/>
+            </w:pPr>
+            <w:r>
+              <w:rPr>
+                <w:rFonts w:ascii="Calibri" w:hAnsi="Calibri"/>
+                <w:b w:val="0"/>
+                <w:color w:val="111827"/>
+                <w:sz w:val="17"/>
+              </w:rPr>
+              <w:t>DID evidence minimization</w:t>
+            </w:r>
+          </w:p>
+        </w:tc>
+        <w:tc>
+          <w:tcPr>
+            <w:tcW w:type="dxa" w:w="4450"/>
+            <w:tcMar>
+              <w:top w:w="80" w:type="dxa"/>
+              <w:start w:w="120" w:type="dxa"/>
+              <w:bottom w:w="80" w:type="dxa"/>
+              <w:end w:w="120" w:type="dxa"/>
+            </w:tcMar>
+            <w:vAlign w:val="center"/>
+            <w:shd w:fill="FFFFFF"/>
+          </w:tcPr>
+          <w:p>
+            <w:pPr>
+              <w:spacing w:before="0" w:after="40" w:line="252" w:lineRule="auto"/>
+              <w:jc w:val="left"/>
+            </w:pPr>
+            <w:r>
+              <w:rPr>
+                <w:rFonts w:ascii="Calibri" w:hAnsi="Calibri"/>
+                <w:b w:val="0"/>
+                <w:color w:val="111827"/>
+                <w:sz w:val="17"/>
+              </w:rPr>
+              <w:t>Prove audit and outbox never contain DID values.</w:t>
+            </w:r>
+          </w:p>
+        </w:tc>
+        <w:tc>
+          <w:tcPr>
+            <w:tcW w:type="dxa" w:w="3260"/>
+            <w:tcMar>
+              <w:top w:w="80" w:type="dxa"/>
+              <w:start w:w="120" w:type="dxa"/>
+              <w:bottom w:w="80" w:type="dxa"/>
+              <w:end w:w="120" w:type="dxa"/>
+            </w:tcMar>
+            <w:vAlign w:val="center"/>
+            <w:shd w:fill="FFFFFF"/>
+          </w:tcPr>
+          <w:p>
+            <w:pPr>
+              <w:spacing w:before="0" w:after="40" w:line="252" w:lineRule="auto"/>
+              <w:jc w:val="left"/>
+            </w:pPr>
+            <w:r>
+              <w:rPr>
+                <w:rFonts w:ascii="Calibri" w:hAnsi="Calibri"/>
+                <w:b w:val="0"/>
+                <w:color w:val="111827"/>
+                <w:sz w:val="17"/>
+              </w:rPr>
+              <w:t>Service</w:t>
+            </w:r>
+          </w:p>
+        </w:tc>
+      </w:tr>
     </w:tbl>
     <w:p>
       <w:pPr>
@@ -6154,6 +8376,39 @@
           <w:sz w:val="22"/>
         </w:rPr>
         <w:t xml:space="preserve"> owns session, command, and DTC persistence.</w:t>
+      </w:r>
+    </w:p>
+    <w:p>
+      <w:pPr>
+        <w:pStyle w:val="ListBullet"/>
+        <w:numPr>
+          <w:ilvl w:val="0"/>
+          <w:numId w:val="13"/>
+        </w:numPr>
+      </w:pPr>
+      <w:r>
+        <w:rPr>
+          <w:rFonts w:ascii="Calibri" w:hAnsi="Calibri"/>
+          <w:color w:val="111827"/>
+          <w:sz w:val="22"/>
+        </w:rPr>
+        <w:t xml:space="preserve">Migration </w:t>
+      </w:r>
+      <w:r>
+        <w:rPr>
+          <w:rFonts w:ascii="Consolas" w:hAnsi="Consolas"/>
+          <w:color w:val="1F4D78"/>
+          <w:sz w:val="19"/>
+        </w:rPr>
+        <w:t>0032_diagnostic_data_identifiers</w:t>
+      </w:r>
+      <w:r>
+        <w:rPr>
+          <w:rFonts w:ascii="Calibri" w:hAnsi="Calibri"/>
+          <w:color w:val="111827"/>
+          <w:sz w:val="22"/>
+        </w:rPr>
+        <w:t xml:space="preserve"> owns typed DID persistence and versioning.</w:t>
       </w:r>
     </w:p>
     <w:p>
@@ -6314,6 +8569,71 @@
     </w:p>
     <w:p>
       <w:pPr>
+        <w:pStyle w:val="ListBullet"/>
+        <w:numPr>
+          <w:ilvl w:val="0"/>
+          <w:numId w:val="13"/>
+        </w:numPr>
+      </w:pPr>
+      <w:r>
+        <w:rPr>
+          <w:rFonts w:ascii="Calibri" w:hAnsi="Calibri"/>
+          <w:color w:val="111827"/>
+          <w:sz w:val="22"/>
+        </w:rPr>
+        <w:t xml:space="preserve">DID events are </w:t>
+      </w:r>
+      <w:r>
+        <w:rPr>
+          <w:rFonts w:ascii="Consolas" w:hAnsi="Consolas"/>
+          <w:color w:val="1F4D78"/>
+          <w:sz w:val="19"/>
+        </w:rPr>
+        <w:t>atep.diagnostics.did.created.v1</w:t>
+      </w:r>
+      <w:r>
+        <w:rPr>
+          <w:rFonts w:ascii="Calibri" w:hAnsi="Calibri"/>
+          <w:color w:val="111827"/>
+          <w:sz w:val="22"/>
+        </w:rPr>
+        <w:t xml:space="preserve">, </w:t>
+      </w:r>
+      <w:r>
+        <w:rPr>
+          <w:rFonts w:ascii="Consolas" w:hAnsi="Consolas"/>
+          <w:color w:val="1F4D78"/>
+          <w:sz w:val="19"/>
+        </w:rPr>
+        <w:t>atep.diagnostics.did.read.v1</w:t>
+      </w:r>
+      <w:r>
+        <w:rPr>
+          <w:rFonts w:ascii="Calibri" w:hAnsi="Calibri"/>
+          <w:color w:val="111827"/>
+          <w:sz w:val="22"/>
+        </w:rPr>
+        <w:t xml:space="preserve">, and </w:t>
+      </w:r>
+      <w:r>
+        <w:rPr>
+          <w:rFonts w:ascii="Consolas" w:hAnsi="Consolas"/>
+          <w:color w:val="1F4D78"/>
+          <w:sz w:val="19"/>
+        </w:rPr>
+        <w:t>atep.diagnostics.did.written.v1</w:t>
+      </w:r>
+      <w:r>
+        <w:rPr>
+          <w:rFonts w:ascii="Calibri" w:hAnsi="Calibri"/>
+          <w:color w:val="111827"/>
+          <w:sz w:val="22"/>
+        </w:rPr>
+        <w:t>.</w:t>
+      </w:r>
+    </w:p>
+    <w:p>
+      <w:pPr>
         <w:pStyle w:val="Heading1"/>
         <w:keepNext/>
         <w:keepLines/>
@@ -6336,7 +8656,7 @@
           <w:color w:val="111827"/>
           <w:sz w:val="22"/>
         </w:rPr>
-        <w:t>V-1 exposes semantic UDS operations but does not yet encode wire PDUs.</w:t>
+        <w:t>V-1/V-2 expose semantic UDS operations but do not yet encode wire PDUs.</w:t>
       </w:r>
     </w:p>
     <w:p>
@@ -6409,6 +8729,23 @@
     </w:p>
     <w:p>
       <w:pPr>
+        <w:pStyle w:val="ListBullet"/>
+        <w:numPr>
+          <w:ilvl w:val="0"/>
+          <w:numId w:val="14"/>
+        </w:numPr>
+      </w:pPr>
+      <w:r>
+        <w:rPr>
+          <w:rFonts w:ascii="Calibri" w:hAnsi="Calibri"/>
+          <w:color w:val="111827"/>
+          <w:sz w:val="22"/>
+        </w:rPr>
+        <w:t>Exact replay stores DID values in protected command evidence; retention and field-level access controls should be revisited before production telemetry use.</w:t>
+      </w:r>
+    </w:p>
+    <w:p>
+      <w:pPr>
         <w:pStyle w:val="Heading1"/>
         <w:keepNext/>
         <w:keepLines/>
@@ -6424,7 +8761,7 @@
           <w:color w:val="111827"/>
           <w:sz w:val="22"/>
         </w:rPr>
-        <w:t>V-1 is implemented. The recommended next development is V-2: a typed Data Identifier catalogue with Read Data by Identifier (</w:t>
+        <w:t>V-1 and V-2 are implemented. The recommended next development is V-3: Routine Control (</w:t>
       </w:r>
       <w:r>
         <w:rPr>
@@ -6432,7 +8769,7 @@
           <w:color w:val="1F4D78"/>
           <w:sz w:val="19"/>
         </w:rPr>
-        <w:t>0x22</w:t>
+        <w:t>0x31</w:t>
       </w:r>
       <w:r>
         <w:rPr>
@@ -6440,23 +8777,7 @@
           <w:color w:val="111827"/>
           <w:sz w:val="22"/>
         </w:rPr>
-        <w:t>) and session-authorized Write Data by Identifier (</w:t>
-      </w:r>
-      <w:r>
-        <w:rPr>
-          <w:rFonts w:ascii="Consolas" w:hAnsi="Consolas"/>
-          <w:color w:val="1F4D78"/>
-          <w:sz w:val="19"/>
-        </w:rPr>
-        <w:t>0x2E</w:t>
-      </w:r>
-      <w:r>
-        <w:rPr>
-          <w:rFonts w:ascii="Calibri" w:hAnsi="Calibri"/>
-          <w:color w:val="111827"/>
-          <w:sz w:val="22"/>
-        </w:rPr>
-        <w:t>).</w:t>
+        <w:t>) with a typed routine catalogue, deterministic state transitions, bounded execution evidence, and session-aware authorization.</w:t>
       </w:r>
     </w:p>
     <w:p>
@@ -6836,6 +9157,171 @@
         <w:t>Explain why simulation time produces more reproducible diagnostic tests than host time.</w:t>
       </w:r>
     </w:p>
+    <w:p>
+      <w:pPr>
+        <w:pStyle w:val="ListNumber"/>
+        <w:numPr>
+          <w:ilvl w:val="0"/>
+          <w:numId w:val="15"/>
+        </w:numPr>
+      </w:pPr>
+      <w:r>
+        <w:rPr>
+          <w:rFonts w:ascii="Calibri" w:hAnsi="Calibri"/>
+          <w:color w:val="111827"/>
+          <w:sz w:val="22"/>
+        </w:rPr>
+        <w:t xml:space="preserve">Calculate the positive response identities for </w:t>
+      </w:r>
+      <w:r>
+        <w:rPr>
+          <w:rFonts w:ascii="Consolas" w:hAnsi="Consolas"/>
+          <w:color w:val="1F4D78"/>
+          <w:sz w:val="19"/>
+        </w:rPr>
+        <w:t>0x22</w:t>
+      </w:r>
+      <w:r>
+        <w:rPr>
+          <w:rFonts w:ascii="Calibri" w:hAnsi="Calibri"/>
+          <w:color w:val="111827"/>
+          <w:sz w:val="22"/>
+        </w:rPr>
+        <w:t xml:space="preserve"> and </w:t>
+      </w:r>
+      <w:r>
+        <w:rPr>
+          <w:rFonts w:ascii="Consolas" w:hAnsi="Consolas"/>
+          <w:color w:val="1F4D78"/>
+          <w:sz w:val="19"/>
+        </w:rPr>
+        <w:t>0x2E</w:t>
+      </w:r>
+      <w:r>
+        <w:rPr>
+          <w:rFonts w:ascii="Calibri" w:hAnsi="Calibri"/>
+          <w:color w:val="111827"/>
+          <w:sz w:val="22"/>
+        </w:rPr>
+        <w:t>.</w:t>
+      </w:r>
+    </w:p>
+    <w:p>
+      <w:pPr>
+        <w:pStyle w:val="ListNumber"/>
+        <w:numPr>
+          <w:ilvl w:val="0"/>
+          <w:numId w:val="15"/>
+        </w:numPr>
+      </w:pPr>
+      <w:r>
+        <w:rPr>
+          <w:rFonts w:ascii="Calibri" w:hAnsi="Calibri"/>
+          <w:color w:val="111827"/>
+          <w:sz w:val="22"/>
+        </w:rPr>
+        <w:t>Explain why a DID version changes without changing the diagnostic-session version.</w:t>
+      </w:r>
+    </w:p>
+    <w:p>
+      <w:pPr>
+        <w:pStyle w:val="ListNumber"/>
+        <w:numPr>
+          <w:ilvl w:val="0"/>
+          <w:numId w:val="15"/>
+        </w:numPr>
+      </w:pPr>
+      <w:r>
+        <w:rPr>
+          <w:rFonts w:ascii="Calibri" w:hAnsi="Calibri"/>
+          <w:color w:val="111827"/>
+          <w:sz w:val="22"/>
+        </w:rPr>
+        <w:t>Design a string DID with a maximum length and its negative tests.</w:t>
+      </w:r>
+    </w:p>
+    <w:p>
+      <w:pPr>
+        <w:pStyle w:val="ListNumber"/>
+        <w:numPr>
+          <w:ilvl w:val="0"/>
+          <w:numId w:val="15"/>
+        </w:numPr>
+      </w:pPr>
+      <w:r>
+        <w:rPr>
+          <w:rFonts w:ascii="Calibri" w:hAnsi="Calibri"/>
+          <w:color w:val="111827"/>
+          <w:sz w:val="22"/>
+        </w:rPr>
+        <w:t xml:space="preserve">Compare NRC </w:t>
+      </w:r>
+      <w:r>
+        <w:rPr>
+          <w:rFonts w:ascii="Consolas" w:hAnsi="Consolas"/>
+          <w:color w:val="1F4D78"/>
+          <w:sz w:val="19"/>
+        </w:rPr>
+        <w:t>0x31</w:t>
+      </w:r>
+      <w:r>
+        <w:rPr>
+          <w:rFonts w:ascii="Calibri" w:hAnsi="Calibri"/>
+          <w:color w:val="111827"/>
+          <w:sz w:val="22"/>
+        </w:rPr>
+        <w:t xml:space="preserve"> for an invalid value with NRC </w:t>
+      </w:r>
+      <w:r>
+        <w:rPr>
+          <w:rFonts w:ascii="Consolas" w:hAnsi="Consolas"/>
+          <w:color w:val="1F4D78"/>
+          <w:sz w:val="19"/>
+        </w:rPr>
+        <w:t>0x7F</w:t>
+      </w:r>
+      <w:r>
+        <w:rPr>
+          <w:rFonts w:ascii="Calibri" w:hAnsi="Calibri"/>
+          <w:color w:val="111827"/>
+          <w:sz w:val="22"/>
+        </w:rPr>
+        <w:t xml:space="preserve"> for the active session.</w:t>
+      </w:r>
+    </w:p>
+    <w:p>
+      <w:pPr>
+        <w:pStyle w:val="ListNumber"/>
+        <w:numPr>
+          <w:ilvl w:val="0"/>
+          <w:numId w:val="15"/>
+        </w:numPr>
+      </w:pPr>
+      <w:r>
+        <w:rPr>
+          <w:rFonts w:ascii="Calibri" w:hAnsi="Calibri"/>
+          <w:color w:val="111827"/>
+          <w:sz w:val="22"/>
+        </w:rPr>
+        <w:t xml:space="preserve">Trace an exact </w:t>
+      </w:r>
+      <w:r>
+        <w:rPr>
+          <w:rFonts w:ascii="Consolas" w:hAnsi="Consolas"/>
+          <w:color w:val="1F4D78"/>
+          <w:sz w:val="19"/>
+        </w:rPr>
+        <w:t>0x2E</w:t>
+      </w:r>
+      <w:r>
+        <w:rPr>
+          <w:rFonts w:ascii="Calibri" w:hAnsi="Calibri"/>
+          <w:color w:val="111827"/>
+          <w:sz w:val="22"/>
+        </w:rPr>
+        <w:t xml:space="preserve"> retry and prove the DID version increments only once.</w:t>
+      </w:r>
+    </w:p>
     <w:sectPr>
       <w:headerReference w:type="default" r:id="rId9"/>
       <w:footerReference w:type="default" r:id="rId10"/>
@@ -6865,7 +9351,7 @@
         <w:color w:val="667085"/>
         <w:sz w:val="17"/>
       </w:rPr>
-      <w:t>ATEP Volume V Workbook  |  Version 0.1.0</w:t>
+      <w:t>ATEP Volume V Workbook  |  Version 0.2.0</w:t>
     </w:r>
     <w:r>
       <w:rPr>

</xml_diff>

<commit_message>
feat(diagnostics): implement UDS routine control
</commit_message>
<xml_diff>
--- a/docs/ATEP_Volume_V_Diagnostics_Engineering_Workbook.docx
+++ b/docs/ATEP_Volume_V_Diagnostics_Engineering_Workbook.docx
@@ -143,7 +143,7 @@
                 <w:color w:val="0B2545"/>
                 <w:sz w:val="19"/>
               </w:rPr>
-              <w:t>0.2.0</w:t>
+              <w:t>0.3.0</w:t>
             </w:r>
           </w:p>
         </w:tc>
@@ -265,7 +265,7 @@
                 <w:color w:val="111827"/>
                 <w:sz w:val="19"/>
               </w:rPr>
-              <w:t>Implemented increments: V-1 and V-2</w:t>
+              <w:t>Implemented increments: V-1 through V-3</w:t>
             </w:r>
           </w:p>
         </w:tc>
@@ -893,7 +893,7 @@
                 <w:color w:val="111827"/>
                 <w:sz w:val="17"/>
               </w:rPr>
-              <w:t>Increments V-1 and V-2</w:t>
+              <w:t>Increments V-1 through V-3</w:t>
             </w:r>
           </w:p>
         </w:tc>
@@ -1476,6 +1476,113 @@
           </w:p>
         </w:tc>
       </w:tr>
+      <w:tr>
+        <w:trPr>
+          <w:cantSplit/>
+        </w:trPr>
+        <w:tc>
+          <w:tcPr>
+            <w:tcW w:type="dxa" w:w="1650"/>
+            <w:tcMar>
+              <w:top w:w="80" w:type="dxa"/>
+              <w:start w:w="120" w:type="dxa"/>
+              <w:bottom w:w="80" w:type="dxa"/>
+              <w:end w:w="120" w:type="dxa"/>
+            </w:tcMar>
+            <w:vAlign w:val="center"/>
+            <w:shd w:fill="FFFFFF"/>
+          </w:tcPr>
+          <w:p>
+            <w:pPr>
+              <w:spacing w:before="0" w:after="40" w:line="252" w:lineRule="auto"/>
+              <w:jc w:val="center"/>
+            </w:pPr>
+            <w:r>
+              <w:rPr>
+                <w:rFonts w:ascii="Calibri" w:hAnsi="Calibri"/>
+                <w:b w:val="0"/>
+                <w:color w:val="111827"/>
+                <w:sz w:val="17"/>
+              </w:rPr>
+              <w:t>0.3.0</w:t>
+            </w:r>
+          </w:p>
+        </w:tc>
+        <w:tc>
+          <w:tcPr>
+            <w:tcW w:type="dxa" w:w="4450"/>
+            <w:tcMar>
+              <w:top w:w="80" w:type="dxa"/>
+              <w:start w:w="120" w:type="dxa"/>
+              <w:bottom w:w="80" w:type="dxa"/>
+              <w:end w:w="120" w:type="dxa"/>
+            </w:tcMar>
+            <w:vAlign w:val="center"/>
+            <w:shd w:fill="FFFFFF"/>
+          </w:tcPr>
+          <w:p>
+            <w:pPr>
+              <w:spacing w:before="0" w:after="40" w:line="252" w:lineRule="auto"/>
+              <w:jc w:val="left"/>
+            </w:pPr>
+            <w:r>
+              <w:rPr>
+                <w:rFonts w:ascii="Calibri" w:hAnsi="Calibri"/>
+                <w:b w:val="0"/>
+                <w:color w:val="111827"/>
+                <w:sz w:val="17"/>
+              </w:rPr>
+              <w:t>2026-08-25</w:t>
+            </w:r>
+          </w:p>
+        </w:tc>
+        <w:tc>
+          <w:tcPr>
+            <w:tcW w:type="dxa" w:w="3260"/>
+            <w:tcMar>
+              <w:top w:w="80" w:type="dxa"/>
+              <w:start w:w="120" w:type="dxa"/>
+              <w:bottom w:w="80" w:type="dxa"/>
+              <w:end w:w="120" w:type="dxa"/>
+            </w:tcMar>
+            <w:vAlign w:val="center"/>
+            <w:shd w:fill="FFFFFF"/>
+          </w:tcPr>
+          <w:p>
+            <w:pPr>
+              <w:spacing w:before="0" w:after="40" w:line="252" w:lineRule="auto"/>
+              <w:jc w:val="left"/>
+            </w:pPr>
+            <w:r>
+              <w:rPr>
+                <w:rFonts w:ascii="Calibri" w:hAnsi="Calibri"/>
+                <w:b w:val="0"/>
+                <w:color w:val="111827"/>
+                <w:sz w:val="17"/>
+              </w:rPr>
+              <w:t xml:space="preserve">Added a bounded routine catalogue, UDS Routine Control </w:t>
+            </w:r>
+            <w:r>
+              <w:rPr>
+                <w:rFonts w:ascii="Calibri" w:hAnsi="Calibri"/>
+                <w:b w:val="0"/>
+                <w:color w:val="111827"/>
+                <w:sz w:val="17"/>
+              </w:rPr>
+              <w:t>0x31</w:t>
+            </w:r>
+            <w:r>
+              <w:rPr>
+                <w:rFonts w:ascii="Calibri" w:hAnsi="Calibri"/>
+                <w:b w:val="0"/>
+                <w:color w:val="111827"/>
+                <w:sz w:val="17"/>
+              </w:rPr>
+              <w:t>, deterministic logical-time execution, start/stop/result subfunctions, versioned replay, minimized evidence, migration, APIs, and tests.</w:t>
+            </w:r>
+          </w:p>
+        </w:tc>
+      </w:tr>
     </w:tbl>
     <w:p>
       <w:pPr>
@@ -1740,6 +1847,90 @@
     </w:p>
     <w:p>
       <w:pPr>
+        <w:pStyle w:val="ListBullet"/>
+        <w:numPr>
+          <w:ilvl w:val="0"/>
+          <w:numId w:val="11"/>
+        </w:numPr>
+      </w:pPr>
+      <w:r>
+        <w:rPr>
+          <w:rFonts w:ascii="Calibri" w:hAnsi="Calibri"/>
+          <w:color w:val="111827"/>
+          <w:sz w:val="22"/>
+        </w:rPr>
+        <w:t>ECU-scoped routine definitions and independent versioned execution state.</w:t>
+      </w:r>
+    </w:p>
+    <w:p>
+      <w:pPr>
+        <w:pStyle w:val="ListBullet"/>
+        <w:numPr>
+          <w:ilvl w:val="0"/>
+          <w:numId w:val="11"/>
+        </w:numPr>
+      </w:pPr>
+      <w:r>
+        <w:rPr>
+          <w:rFonts w:ascii="Calibri" w:hAnsi="Calibri"/>
+          <w:color w:val="111827"/>
+          <w:sz w:val="22"/>
+        </w:rPr>
+        <w:t>UDS Routine Control (</w:t>
+      </w:r>
+      <w:r>
+        <w:rPr>
+          <w:rFonts w:ascii="Consolas" w:hAnsi="Consolas"/>
+          <w:color w:val="1F4D78"/>
+          <w:sz w:val="19"/>
+        </w:rPr>
+        <w:t>0x31</w:t>
+      </w:r>
+      <w:r>
+        <w:rPr>
+          <w:rFonts w:ascii="Calibri" w:hAnsi="Calibri"/>
+          <w:color w:val="111827"/>
+          <w:sz w:val="22"/>
+        </w:rPr>
+        <w:t>) start, stop, and request-results subfunctions.</w:t>
+      </w:r>
+    </w:p>
+    <w:p>
+      <w:pPr>
+        <w:pStyle w:val="ListBullet"/>
+        <w:numPr>
+          <w:ilvl w:val="0"/>
+          <w:numId w:val="11"/>
+        </w:numPr>
+      </w:pPr>
+      <w:r>
+        <w:rPr>
+          <w:rFonts w:ascii="Calibri" w:hAnsi="Calibri"/>
+          <w:color w:val="111827"/>
+          <w:sz w:val="22"/>
+        </w:rPr>
+        <w:t>Active-session authorization and deterministic completion from ECU logical time.</w:t>
+      </w:r>
+    </w:p>
+    <w:p>
+      <w:pPr>
+        <w:pStyle w:val="ListBullet"/>
+        <w:numPr>
+          <w:ilvl w:val="0"/>
+          <w:numId w:val="11"/>
+        </w:numPr>
+      </w:pPr>
+      <w:r>
+        <w:rPr>
+          <w:rFonts w:ascii="Calibri" w:hAnsi="Calibri"/>
+          <w:color w:val="111827"/>
+          <w:sz w:val="22"/>
+        </w:rPr>
+        <w:t>Bounded parameters, results, duration, catalogue size, and optimistic versions.</w:t>
+      </w:r>
+    </w:p>
+    <w:p>
+      <w:pPr>
         <w:pStyle w:val="Heading2"/>
         <w:keepNext/>
         <w:keepLines/>
@@ -1779,7 +1970,7 @@
           <w:color w:val="111827"/>
           <w:sz w:val="22"/>
         </w:rPr>
-        <w:t>Routine Control, Security Access, ECU Reset, and flash transfer services.</w:t>
+        <w:t>Security Access, ECU Reset, and flash transfer services.</w:t>
       </w:r>
     </w:p>
     <w:p>
@@ -1925,6 +2116,40 @@
           <w:sz w:val="22"/>
         </w:rPr>
         <w:t xml:space="preserve"> stores an ECU-local 16-bit identifier, engineering metadata, declared type, unit, readable/writable sessions, constrained scalar value, and optimistic version. The catalogue is capped at 128 entries per ECU; this is a semantic data surface, not raw memory access.</w:t>
+      </w:r>
+    </w:p>
+    <w:p>
+      <w:r>
+        <w:rPr>
+          <w:rFonts w:ascii="Consolas" w:hAnsi="Consolas"/>
+          <w:color w:val="1F4D78"/>
+          <w:sz w:val="19"/>
+        </w:rPr>
+        <w:t>DiagnosticRoutine</w:t>
+      </w:r>
+      <w:r>
+        <w:rPr>
+          <w:rFonts w:ascii="Calibri" w:hAnsi="Calibri"/>
+          <w:color w:val="111827"/>
+          <w:sz w:val="22"/>
+        </w:rPr>
+        <w:t xml:space="preserve"> stores an ECU-local 16-bit identifier, engineering metadata, allowed sessions, bounded execution duration, stop capability, bounded scalar result template, and definition version. </w:t>
+      </w:r>
+      <w:r>
+        <w:rPr>
+          <w:rFonts w:ascii="Consolas" w:hAnsi="Consolas"/>
+          <w:color w:val="1F4D78"/>
+          <w:sz w:val="19"/>
+        </w:rPr>
+        <w:t>DiagnosticRoutineState</w:t>
+      </w:r>
+      <w:r>
+        <w:rPr>
+          <w:rFonts w:ascii="Calibri" w:hAnsi="Calibri"/>
+          <w:color w:val="111827"/>
+          <w:sz w:val="22"/>
+        </w:rPr>
+        <w:t xml:space="preserve"> independently stores idle/running/completed/stopped status, invocation count, logical timestamps, protected input/result values, and an optimistic version. The catalogue is capped at 64 routines per ECU.</w:t>
       </w:r>
     </w:p>
     <w:p>
@@ -3472,6 +3697,492 @@
           </w:p>
         </w:tc>
       </w:tr>
+      <w:tr>
+        <w:trPr>
+          <w:cantSplit/>
+        </w:trPr>
+        <w:tc>
+          <w:tcPr>
+            <w:tcW w:type="dxa" w:w="1150"/>
+            <w:tcMar>
+              <w:top w:w="80" w:type="dxa"/>
+              <w:start w:w="120" w:type="dxa"/>
+              <w:bottom w:w="80" w:type="dxa"/>
+              <w:end w:w="120" w:type="dxa"/>
+            </w:tcMar>
+            <w:vAlign w:val="center"/>
+            <w:shd w:fill="FFFFFF"/>
+          </w:tcPr>
+          <w:p>
+            <w:pPr>
+              <w:spacing w:before="0" w:after="40" w:line="252" w:lineRule="auto"/>
+              <w:jc w:val="center"/>
+            </w:pPr>
+            <w:r>
+              <w:rPr>
+                <w:rFonts w:ascii="Calibri" w:hAnsi="Calibri"/>
+                <w:b w:val="0"/>
+                <w:color w:val="111827"/>
+                <w:sz w:val="16"/>
+              </w:rPr>
+              <w:t>POST</w:t>
+            </w:r>
+          </w:p>
+        </w:tc>
+        <w:tc>
+          <w:tcPr>
+            <w:tcW w:type="dxa" w:w="3700"/>
+            <w:tcMar>
+              <w:top w:w="80" w:type="dxa"/>
+              <w:start w:w="120" w:type="dxa"/>
+              <w:bottom w:w="80" w:type="dxa"/>
+              <w:end w:w="120" w:type="dxa"/>
+            </w:tcMar>
+            <w:vAlign w:val="center"/>
+            <w:shd w:fill="FFFFFF"/>
+          </w:tcPr>
+          <w:p>
+            <w:pPr>
+              <w:spacing w:before="0" w:after="40" w:line="252" w:lineRule="auto"/>
+              <w:jc w:val="left"/>
+            </w:pPr>
+            <w:r>
+              <w:rPr>
+                <w:rFonts w:ascii="Calibri" w:hAnsi="Calibri"/>
+                <w:b w:val="0"/>
+                <w:color w:val="111827"/>
+                <w:sz w:val="16"/>
+              </w:rPr>
+              <w:t>/api/v1/vehicles/{vehicle_id}/ecus/{ecu_id}/diagnostics/routines</w:t>
+            </w:r>
+          </w:p>
+        </w:tc>
+        <w:tc>
+          <w:tcPr>
+            <w:tcW w:type="dxa" w:w="3100"/>
+            <w:tcMar>
+              <w:top w:w="80" w:type="dxa"/>
+              <w:start w:w="120" w:type="dxa"/>
+              <w:bottom w:w="80" w:type="dxa"/>
+              <w:end w:w="120" w:type="dxa"/>
+            </w:tcMar>
+            <w:vAlign w:val="center"/>
+            <w:shd w:fill="FFFFFF"/>
+          </w:tcPr>
+          <w:p>
+            <w:pPr>
+              <w:spacing w:before="0" w:after="40" w:line="252" w:lineRule="auto"/>
+              <w:jc w:val="left"/>
+            </w:pPr>
+            <w:r>
+              <w:rPr>
+                <w:rFonts w:ascii="Calibri" w:hAnsi="Calibri"/>
+                <w:b w:val="0"/>
+                <w:color w:val="111827"/>
+                <w:sz w:val="16"/>
+              </w:rPr>
+              <w:t>diagnostics:manage</w:t>
+            </w:r>
+          </w:p>
+        </w:tc>
+        <w:tc>
+          <w:tcPr>
+            <w:tcW w:type="dxa" w:w="1410"/>
+            <w:tcMar>
+              <w:top w:w="80" w:type="dxa"/>
+              <w:start w:w="120" w:type="dxa"/>
+              <w:bottom w:w="80" w:type="dxa"/>
+              <w:end w:w="120" w:type="dxa"/>
+            </w:tcMar>
+            <w:vAlign w:val="center"/>
+            <w:shd w:fill="FFFFFF"/>
+          </w:tcPr>
+          <w:p>
+            <w:pPr>
+              <w:spacing w:before="0" w:after="40" w:line="252" w:lineRule="auto"/>
+              <w:jc w:val="left"/>
+            </w:pPr>
+            <w:r>
+              <w:rPr>
+                <w:rFonts w:ascii="Calibri" w:hAnsi="Calibri"/>
+                <w:b w:val="0"/>
+                <w:color w:val="111827"/>
+                <w:sz w:val="16"/>
+              </w:rPr>
+              <w:t>Define one bounded routine.</w:t>
+            </w:r>
+          </w:p>
+        </w:tc>
+      </w:tr>
+      <w:tr>
+        <w:trPr>
+          <w:cantSplit/>
+        </w:trPr>
+        <w:tc>
+          <w:tcPr>
+            <w:tcW w:type="dxa" w:w="1150"/>
+            <w:tcMar>
+              <w:top w:w="80" w:type="dxa"/>
+              <w:start w:w="120" w:type="dxa"/>
+              <w:bottom w:w="80" w:type="dxa"/>
+              <w:end w:w="120" w:type="dxa"/>
+            </w:tcMar>
+            <w:vAlign w:val="center"/>
+            <w:shd w:fill="FFFFFF"/>
+          </w:tcPr>
+          <w:p>
+            <w:pPr>
+              <w:spacing w:before="0" w:after="40" w:line="252" w:lineRule="auto"/>
+              <w:jc w:val="center"/>
+            </w:pPr>
+            <w:r>
+              <w:rPr>
+                <w:rFonts w:ascii="Calibri" w:hAnsi="Calibri"/>
+                <w:b w:val="0"/>
+                <w:color w:val="111827"/>
+                <w:sz w:val="16"/>
+              </w:rPr>
+              <w:t>GET</w:t>
+            </w:r>
+          </w:p>
+        </w:tc>
+        <w:tc>
+          <w:tcPr>
+            <w:tcW w:type="dxa" w:w="3700"/>
+            <w:tcMar>
+              <w:top w:w="80" w:type="dxa"/>
+              <w:start w:w="120" w:type="dxa"/>
+              <w:bottom w:w="80" w:type="dxa"/>
+              <w:end w:w="120" w:type="dxa"/>
+            </w:tcMar>
+            <w:vAlign w:val="center"/>
+            <w:shd w:fill="FFFFFF"/>
+          </w:tcPr>
+          <w:p>
+            <w:pPr>
+              <w:spacing w:before="0" w:after="40" w:line="252" w:lineRule="auto"/>
+              <w:jc w:val="left"/>
+            </w:pPr>
+            <w:r>
+              <w:rPr>
+                <w:rFonts w:ascii="Calibri" w:hAnsi="Calibri"/>
+                <w:b w:val="0"/>
+                <w:color w:val="111827"/>
+                <w:sz w:val="16"/>
+              </w:rPr>
+              <w:t>/api/v1/vehicles/{vehicle_id}/ecus/{ecu_id}/diagnostics/routines</w:t>
+            </w:r>
+          </w:p>
+        </w:tc>
+        <w:tc>
+          <w:tcPr>
+            <w:tcW w:type="dxa" w:w="3100"/>
+            <w:tcMar>
+              <w:top w:w="80" w:type="dxa"/>
+              <w:start w:w="120" w:type="dxa"/>
+              <w:bottom w:w="80" w:type="dxa"/>
+              <w:end w:w="120" w:type="dxa"/>
+            </w:tcMar>
+            <w:vAlign w:val="center"/>
+            <w:shd w:fill="FFFFFF"/>
+          </w:tcPr>
+          <w:p>
+            <w:pPr>
+              <w:spacing w:before="0" w:after="40" w:line="252" w:lineRule="auto"/>
+              <w:jc w:val="left"/>
+            </w:pPr>
+            <w:r>
+              <w:rPr>
+                <w:rFonts w:ascii="Calibri" w:hAnsi="Calibri"/>
+                <w:b w:val="0"/>
+                <w:color w:val="111827"/>
+                <w:sz w:val="16"/>
+              </w:rPr>
+              <w:t>diagnostics:read</w:t>
+            </w:r>
+          </w:p>
+        </w:tc>
+        <w:tc>
+          <w:tcPr>
+            <w:tcW w:type="dxa" w:w="1410"/>
+            <w:tcMar>
+              <w:top w:w="80" w:type="dxa"/>
+              <w:start w:w="120" w:type="dxa"/>
+              <w:bottom w:w="80" w:type="dxa"/>
+              <w:end w:w="120" w:type="dxa"/>
+            </w:tcMar>
+            <w:vAlign w:val="center"/>
+            <w:shd w:fill="FFFFFF"/>
+          </w:tcPr>
+          <w:p>
+            <w:pPr>
+              <w:spacing w:before="0" w:after="40" w:line="252" w:lineRule="auto"/>
+              <w:jc w:val="left"/>
+            </w:pPr>
+            <w:r>
+              <w:rPr>
+                <w:rFonts w:ascii="Calibri" w:hAnsi="Calibri"/>
+                <w:b w:val="0"/>
+                <w:color w:val="111827"/>
+                <w:sz w:val="16"/>
+              </w:rPr>
+              <w:t>List the bounded routine catalogue.</w:t>
+            </w:r>
+          </w:p>
+        </w:tc>
+      </w:tr>
+      <w:tr>
+        <w:trPr>
+          <w:cantSplit/>
+        </w:trPr>
+        <w:tc>
+          <w:tcPr>
+            <w:tcW w:type="dxa" w:w="1150"/>
+            <w:tcMar>
+              <w:top w:w="80" w:type="dxa"/>
+              <w:start w:w="120" w:type="dxa"/>
+              <w:bottom w:w="80" w:type="dxa"/>
+              <w:end w:w="120" w:type="dxa"/>
+            </w:tcMar>
+            <w:vAlign w:val="center"/>
+            <w:shd w:fill="FFFFFF"/>
+          </w:tcPr>
+          <w:p>
+            <w:pPr>
+              <w:spacing w:before="0" w:after="40" w:line="252" w:lineRule="auto"/>
+              <w:jc w:val="center"/>
+            </w:pPr>
+            <w:r>
+              <w:rPr>
+                <w:rFonts w:ascii="Calibri" w:hAnsi="Calibri"/>
+                <w:b w:val="0"/>
+                <w:color w:val="111827"/>
+                <w:sz w:val="16"/>
+              </w:rPr>
+              <w:t>GET</w:t>
+            </w:r>
+          </w:p>
+        </w:tc>
+        <w:tc>
+          <w:tcPr>
+            <w:tcW w:type="dxa" w:w="3700"/>
+            <w:tcMar>
+              <w:top w:w="80" w:type="dxa"/>
+              <w:start w:w="120" w:type="dxa"/>
+              <w:bottom w:w="80" w:type="dxa"/>
+              <w:end w:w="120" w:type="dxa"/>
+            </w:tcMar>
+            <w:vAlign w:val="center"/>
+            <w:shd w:fill="FFFFFF"/>
+          </w:tcPr>
+          <w:p>
+            <w:pPr>
+              <w:spacing w:before="0" w:after="40" w:line="252" w:lineRule="auto"/>
+              <w:jc w:val="left"/>
+            </w:pPr>
+            <w:r>
+              <w:rPr>
+                <w:rFonts w:ascii="Calibri" w:hAnsi="Calibri"/>
+                <w:b w:val="0"/>
+                <w:color w:val="111827"/>
+                <w:sz w:val="16"/>
+              </w:rPr>
+              <w:t>/api/v1/vehicles/{vehicle_id}/ecus/{ecu_id}/diagnostics/routines/{identifier}</w:t>
+            </w:r>
+          </w:p>
+        </w:tc>
+        <w:tc>
+          <w:tcPr>
+            <w:tcW w:type="dxa" w:w="3100"/>
+            <w:tcMar>
+              <w:top w:w="80" w:type="dxa"/>
+              <w:start w:w="120" w:type="dxa"/>
+              <w:bottom w:w="80" w:type="dxa"/>
+              <w:end w:w="120" w:type="dxa"/>
+            </w:tcMar>
+            <w:vAlign w:val="center"/>
+            <w:shd w:fill="FFFFFF"/>
+          </w:tcPr>
+          <w:p>
+            <w:pPr>
+              <w:spacing w:before="0" w:after="40" w:line="252" w:lineRule="auto"/>
+              <w:jc w:val="left"/>
+            </w:pPr>
+            <w:r>
+              <w:rPr>
+                <w:rFonts w:ascii="Calibri" w:hAnsi="Calibri"/>
+                <w:b w:val="0"/>
+                <w:color w:val="111827"/>
+                <w:sz w:val="16"/>
+              </w:rPr>
+              <w:t>diagnostics:read</w:t>
+            </w:r>
+          </w:p>
+        </w:tc>
+        <w:tc>
+          <w:tcPr>
+            <w:tcW w:type="dxa" w:w="1410"/>
+            <w:tcMar>
+              <w:top w:w="80" w:type="dxa"/>
+              <w:start w:w="120" w:type="dxa"/>
+              <w:bottom w:w="80" w:type="dxa"/>
+              <w:end w:w="120" w:type="dxa"/>
+            </w:tcMar>
+            <w:vAlign w:val="center"/>
+            <w:shd w:fill="FFFFFF"/>
+          </w:tcPr>
+          <w:p>
+            <w:pPr>
+              <w:spacing w:before="0" w:after="40" w:line="252" w:lineRule="auto"/>
+              <w:jc w:val="left"/>
+            </w:pPr>
+            <w:r>
+              <w:rPr>
+                <w:rFonts w:ascii="Calibri" w:hAnsi="Calibri"/>
+                <w:b w:val="0"/>
+                <w:color w:val="111827"/>
+                <w:sz w:val="16"/>
+              </w:rPr>
+              <w:t>Retrieve one routine and its state.</w:t>
+            </w:r>
+          </w:p>
+        </w:tc>
+      </w:tr>
+      <w:tr>
+        <w:trPr>
+          <w:cantSplit/>
+        </w:trPr>
+        <w:tc>
+          <w:tcPr>
+            <w:tcW w:type="dxa" w:w="1150"/>
+            <w:tcMar>
+              <w:top w:w="80" w:type="dxa"/>
+              <w:start w:w="120" w:type="dxa"/>
+              <w:bottom w:w="80" w:type="dxa"/>
+              <w:end w:w="120" w:type="dxa"/>
+            </w:tcMar>
+            <w:vAlign w:val="center"/>
+            <w:shd w:fill="FFFFFF"/>
+          </w:tcPr>
+          <w:p>
+            <w:pPr>
+              <w:spacing w:before="0" w:after="40" w:line="252" w:lineRule="auto"/>
+              <w:jc w:val="center"/>
+            </w:pPr>
+            <w:r>
+              <w:rPr>
+                <w:rFonts w:ascii="Calibri" w:hAnsi="Calibri"/>
+                <w:b w:val="0"/>
+                <w:color w:val="111827"/>
+                <w:sz w:val="16"/>
+              </w:rPr>
+              <w:t>POST</w:t>
+            </w:r>
+          </w:p>
+        </w:tc>
+        <w:tc>
+          <w:tcPr>
+            <w:tcW w:type="dxa" w:w="3700"/>
+            <w:tcMar>
+              <w:top w:w="80" w:type="dxa"/>
+              <w:start w:w="120" w:type="dxa"/>
+              <w:bottom w:w="80" w:type="dxa"/>
+              <w:end w:w="120" w:type="dxa"/>
+            </w:tcMar>
+            <w:vAlign w:val="center"/>
+            <w:shd w:fill="FFFFFF"/>
+          </w:tcPr>
+          <w:p>
+            <w:pPr>
+              <w:spacing w:before="0" w:after="40" w:line="252" w:lineRule="auto"/>
+              <w:jc w:val="left"/>
+            </w:pPr>
+            <w:r>
+              <w:rPr>
+                <w:rFonts w:ascii="Calibri" w:hAnsi="Calibri"/>
+                <w:b w:val="0"/>
+                <w:color w:val="111827"/>
+                <w:sz w:val="16"/>
+              </w:rPr>
+              <w:t>/api/v1/vehicles/{vehicle_id}/ecus/{ecu_id}/diagnostics/routines/{identifier}/control</w:t>
+            </w:r>
+          </w:p>
+        </w:tc>
+        <w:tc>
+          <w:tcPr>
+            <w:tcW w:type="dxa" w:w="3100"/>
+            <w:tcMar>
+              <w:top w:w="80" w:type="dxa"/>
+              <w:start w:w="120" w:type="dxa"/>
+              <w:bottom w:w="80" w:type="dxa"/>
+              <w:end w:w="120" w:type="dxa"/>
+            </w:tcMar>
+            <w:vAlign w:val="center"/>
+            <w:shd w:fill="FFFFFF"/>
+          </w:tcPr>
+          <w:p>
+            <w:pPr>
+              <w:spacing w:before="0" w:after="40" w:line="252" w:lineRule="auto"/>
+              <w:jc w:val="left"/>
+            </w:pPr>
+            <w:r>
+              <w:rPr>
+                <w:rFonts w:ascii="Calibri" w:hAnsi="Calibri"/>
+                <w:b w:val="0"/>
+                <w:color w:val="111827"/>
+                <w:sz w:val="16"/>
+              </w:rPr>
+              <w:t>diagnostics:manage</w:t>
+            </w:r>
+          </w:p>
+        </w:tc>
+        <w:tc>
+          <w:tcPr>
+            <w:tcW w:type="dxa" w:w="1410"/>
+            <w:tcMar>
+              <w:top w:w="80" w:type="dxa"/>
+              <w:start w:w="120" w:type="dxa"/>
+              <w:bottom w:w="80" w:type="dxa"/>
+              <w:end w:w="120" w:type="dxa"/>
+            </w:tcMar>
+            <w:vAlign w:val="center"/>
+            <w:shd w:fill="FFFFFF"/>
+          </w:tcPr>
+          <w:p>
+            <w:pPr>
+              <w:spacing w:before="0" w:after="40" w:line="252" w:lineRule="auto"/>
+              <w:jc w:val="left"/>
+            </w:pPr>
+            <w:r>
+              <w:rPr>
+                <w:rFonts w:ascii="Calibri" w:hAnsi="Calibri"/>
+                <w:b w:val="0"/>
+                <w:color w:val="111827"/>
+                <w:sz w:val="16"/>
+              </w:rPr>
+              <w:t xml:space="preserve">Execute UDS </w:t>
+            </w:r>
+            <w:r>
+              <w:rPr>
+                <w:rFonts w:ascii="Calibri" w:hAnsi="Calibri"/>
+                <w:b w:val="0"/>
+                <w:color w:val="111827"/>
+                <w:sz w:val="16"/>
+              </w:rPr>
+              <w:t>0x31</w:t>
+            </w:r>
+            <w:r>
+              <w:rPr>
+                <w:rFonts w:ascii="Calibri" w:hAnsi="Calibri"/>
+                <w:b w:val="0"/>
+                <w:color w:val="111827"/>
+                <w:sz w:val="16"/>
+              </w:rPr>
+              <w:t xml:space="preserve"> start, stop, or result request.</w:t>
+            </w:r>
+          </w:p>
+        </w:tc>
+      </w:tr>
     </w:tbl>
     <w:p>
       <w:pPr>
@@ -3698,6 +4409,90 @@
           <w:sz w:val="22"/>
         </w:rPr>
         <w:t xml:space="preserve"> identity. Exact retry returns the persisted result without a second mutation.</w:t>
+      </w:r>
+    </w:p>
+    <w:p>
+      <w:pPr>
+        <w:pStyle w:val="Heading2"/>
+        <w:keepNext/>
+        <w:keepLines/>
+      </w:pPr>
+      <w:r>
+        <w:t>8.6 Routine Control (`0x31`)</w:t>
+      </w:r>
+    </w:p>
+    <w:p>
+      <w:r>
+        <w:rPr>
+          <w:rFonts w:ascii="Calibri" w:hAnsi="Calibri"/>
+          <w:color w:val="111827"/>
+          <w:sz w:val="22"/>
+        </w:rPr>
+        <w:t xml:space="preserve">Subfunctions </w:t>
+      </w:r>
+      <w:r>
+        <w:rPr>
+          <w:rFonts w:ascii="Consolas" w:hAnsi="Consolas"/>
+          <w:color w:val="1F4D78"/>
+          <w:sz w:val="19"/>
+        </w:rPr>
+        <w:t>0x01</w:t>
+      </w:r>
+      <w:r>
+        <w:rPr>
+          <w:rFonts w:ascii="Calibri" w:hAnsi="Calibri"/>
+          <w:color w:val="111827"/>
+          <w:sz w:val="22"/>
+        </w:rPr>
+        <w:t xml:space="preserve">, </w:t>
+      </w:r>
+      <w:r>
+        <w:rPr>
+          <w:rFonts w:ascii="Consolas" w:hAnsi="Consolas"/>
+          <w:color w:val="1F4D78"/>
+          <w:sz w:val="19"/>
+        </w:rPr>
+        <w:t>0x02</w:t>
+      </w:r>
+      <w:r>
+        <w:rPr>
+          <w:rFonts w:ascii="Calibri" w:hAnsi="Calibri"/>
+          <w:color w:val="111827"/>
+          <w:sz w:val="22"/>
+        </w:rPr>
+        <w:t xml:space="preserve">, and </w:t>
+      </w:r>
+      <w:r>
+        <w:rPr>
+          <w:rFonts w:ascii="Consolas" w:hAnsi="Consolas"/>
+          <w:color w:val="1F4D78"/>
+          <w:sz w:val="19"/>
+        </w:rPr>
+        <w:t>0x03</w:t>
+      </w:r>
+      <w:r>
+        <w:rPr>
+          <w:rFonts w:ascii="Calibri" w:hAnsi="Calibri"/>
+          <w:color w:val="111827"/>
+          <w:sz w:val="22"/>
+        </w:rPr>
+        <w:t xml:space="preserve"> represent startRoutine, stopRoutine, and requestRoutineResults. Every request requires an allowed active session plus matching session and routine-state versions. Start records the ECU logical start/completion timestamps and bounded parameters. Stop is accepted only for a running routine that declares stop support. A result request deterministically promotes a running routine to completed when ECU logical time reaches the target and returns the protected result template. Exact retries replay persisted command evidence without another transition; the positive response identity is </w:t>
+      </w:r>
+      <w:r>
+        <w:rPr>
+          <w:rFonts w:ascii="Consolas" w:hAnsi="Consolas"/>
+          <w:color w:val="1F4D78"/>
+          <w:sz w:val="19"/>
+        </w:rPr>
+        <w:t>0x71</w:t>
+      </w:r>
+      <w:r>
+        <w:rPr>
+          <w:rFonts w:ascii="Calibri" w:hAnsi="Calibri"/>
+          <w:color w:val="111827"/>
+          <w:sz w:val="22"/>
+        </w:rPr>
+        <w:t>.</w:t>
       </w:r>
     </w:p>
     <w:p>
@@ -4670,6 +5465,411 @@
                 <w:color w:val="111827"/>
                 <w:sz w:val="16"/>
               </w:rPr>
+              <w:t>Routine forbidden in active session</w:t>
+            </w:r>
+          </w:p>
+        </w:tc>
+        <w:tc>
+          <w:tcPr>
+            <w:tcW w:type="dxa" w:w="3700"/>
+            <w:tcMar>
+              <w:top w:w="80" w:type="dxa"/>
+              <w:start w:w="120" w:type="dxa"/>
+              <w:bottom w:w="80" w:type="dxa"/>
+              <w:end w:w="120" w:type="dxa"/>
+            </w:tcMar>
+            <w:vAlign w:val="center"/>
+            <w:shd w:fill="FFFFFF"/>
+          </w:tcPr>
+          <w:p>
+            <w:pPr>
+              <w:spacing w:before="0" w:after="40" w:line="252" w:lineRule="auto"/>
+              <w:jc w:val="left"/>
+            </w:pPr>
+            <w:r>
+              <w:rPr>
+                <w:rFonts w:ascii="Calibri" w:hAnsi="Calibri"/>
+                <w:b w:val="0"/>
+                <w:color w:val="111827"/>
+                <w:sz w:val="16"/>
+              </w:rPr>
+              <w:t>diagnostic_contract_invalid</w:t>
+            </w:r>
+          </w:p>
+        </w:tc>
+        <w:tc>
+          <w:tcPr>
+            <w:tcW w:type="dxa" w:w="3100"/>
+            <w:tcMar>
+              <w:top w:w="80" w:type="dxa"/>
+              <w:start w:w="120" w:type="dxa"/>
+              <w:bottom w:w="80" w:type="dxa"/>
+              <w:end w:w="120" w:type="dxa"/>
+            </w:tcMar>
+            <w:vAlign w:val="center"/>
+            <w:shd w:fill="FFFFFF"/>
+          </w:tcPr>
+          <w:p>
+            <w:pPr>
+              <w:spacing w:before="0" w:after="40" w:line="252" w:lineRule="auto"/>
+              <w:jc w:val="left"/>
+            </w:pPr>
+            <w:r>
+              <w:rPr>
+                <w:rFonts w:ascii="Calibri" w:hAnsi="Calibri"/>
+                <w:b w:val="0"/>
+                <w:color w:val="111827"/>
+                <w:sz w:val="16"/>
+              </w:rPr>
+              <w:t>422</w:t>
+            </w:r>
+          </w:p>
+        </w:tc>
+        <w:tc>
+          <w:tcPr>
+            <w:tcW w:type="dxa" w:w="1410"/>
+            <w:tcMar>
+              <w:top w:w="80" w:type="dxa"/>
+              <w:start w:w="120" w:type="dxa"/>
+              <w:bottom w:w="80" w:type="dxa"/>
+              <w:end w:w="120" w:type="dxa"/>
+            </w:tcMar>
+            <w:vAlign w:val="center"/>
+            <w:shd w:fill="FFFFFF"/>
+          </w:tcPr>
+          <w:p>
+            <w:pPr>
+              <w:spacing w:before="0" w:after="40" w:line="252" w:lineRule="auto"/>
+              <w:jc w:val="left"/>
+            </w:pPr>
+            <w:r>
+              <w:rPr>
+                <w:rFonts w:ascii="Calibri" w:hAnsi="Calibri"/>
+                <w:b w:val="0"/>
+                <w:color w:val="111827"/>
+                <w:sz w:val="16"/>
+              </w:rPr>
+              <w:t xml:space="preserve">NRC </w:t>
+            </w:r>
+            <w:r>
+              <w:rPr>
+                <w:rFonts w:ascii="Calibri" w:hAnsi="Calibri"/>
+                <w:b w:val="0"/>
+                <w:color w:val="111827"/>
+                <w:sz w:val="16"/>
+              </w:rPr>
+              <w:t>0x7F</w:t>
+            </w:r>
+            <w:r>
+              <w:rPr>
+                <w:rFonts w:ascii="Calibri" w:hAnsi="Calibri"/>
+                <w:b w:val="0"/>
+                <w:color w:val="111827"/>
+                <w:sz w:val="16"/>
+              </w:rPr>
+              <w:t xml:space="preserve"> service not supported in active session</w:t>
+            </w:r>
+          </w:p>
+        </w:tc>
+      </w:tr>
+      <w:tr>
+        <w:trPr>
+          <w:cantSplit/>
+        </w:trPr>
+        <w:tc>
+          <w:tcPr>
+            <w:tcW w:type="dxa" w:w="1150"/>
+            <w:tcMar>
+              <w:top w:w="80" w:type="dxa"/>
+              <w:start w:w="120" w:type="dxa"/>
+              <w:bottom w:w="80" w:type="dxa"/>
+              <w:end w:w="120" w:type="dxa"/>
+            </w:tcMar>
+            <w:vAlign w:val="center"/>
+            <w:shd w:fill="FFFFFF"/>
+          </w:tcPr>
+          <w:p>
+            <w:pPr>
+              <w:spacing w:before="0" w:after="40" w:line="252" w:lineRule="auto"/>
+              <w:jc w:val="center"/>
+            </w:pPr>
+            <w:r>
+              <w:rPr>
+                <w:rFonts w:ascii="Calibri" w:hAnsi="Calibri"/>
+                <w:b w:val="0"/>
+                <w:color w:val="111827"/>
+                <w:sz w:val="16"/>
+              </w:rPr>
+              <w:t>Stale routine or session version</w:t>
+            </w:r>
+          </w:p>
+        </w:tc>
+        <w:tc>
+          <w:tcPr>
+            <w:tcW w:type="dxa" w:w="3700"/>
+            <w:tcMar>
+              <w:top w:w="80" w:type="dxa"/>
+              <w:start w:w="120" w:type="dxa"/>
+              <w:bottom w:w="80" w:type="dxa"/>
+              <w:end w:w="120" w:type="dxa"/>
+            </w:tcMar>
+            <w:vAlign w:val="center"/>
+            <w:shd w:fill="FFFFFF"/>
+          </w:tcPr>
+          <w:p>
+            <w:pPr>
+              <w:spacing w:before="0" w:after="40" w:line="252" w:lineRule="auto"/>
+              <w:jc w:val="left"/>
+            </w:pPr>
+            <w:r>
+              <w:rPr>
+                <w:rFonts w:ascii="Calibri" w:hAnsi="Calibri"/>
+                <w:b w:val="0"/>
+                <w:color w:val="111827"/>
+                <w:sz w:val="16"/>
+              </w:rPr>
+              <w:t>diagnostic_contract_invalid</w:t>
+            </w:r>
+          </w:p>
+        </w:tc>
+        <w:tc>
+          <w:tcPr>
+            <w:tcW w:type="dxa" w:w="3100"/>
+            <w:tcMar>
+              <w:top w:w="80" w:type="dxa"/>
+              <w:start w:w="120" w:type="dxa"/>
+              <w:bottom w:w="80" w:type="dxa"/>
+              <w:end w:w="120" w:type="dxa"/>
+            </w:tcMar>
+            <w:vAlign w:val="center"/>
+            <w:shd w:fill="FFFFFF"/>
+          </w:tcPr>
+          <w:p>
+            <w:pPr>
+              <w:spacing w:before="0" w:after="40" w:line="252" w:lineRule="auto"/>
+              <w:jc w:val="left"/>
+            </w:pPr>
+            <w:r>
+              <w:rPr>
+                <w:rFonts w:ascii="Calibri" w:hAnsi="Calibri"/>
+                <w:b w:val="0"/>
+                <w:color w:val="111827"/>
+                <w:sz w:val="16"/>
+              </w:rPr>
+              <w:t>422</w:t>
+            </w:r>
+          </w:p>
+        </w:tc>
+        <w:tc>
+          <w:tcPr>
+            <w:tcW w:type="dxa" w:w="1410"/>
+            <w:tcMar>
+              <w:top w:w="80" w:type="dxa"/>
+              <w:start w:w="120" w:type="dxa"/>
+              <w:bottom w:w="80" w:type="dxa"/>
+              <w:end w:w="120" w:type="dxa"/>
+            </w:tcMar>
+            <w:vAlign w:val="center"/>
+            <w:shd w:fill="FFFFFF"/>
+          </w:tcPr>
+          <w:p>
+            <w:pPr>
+              <w:spacing w:before="0" w:after="40" w:line="252" w:lineRule="auto"/>
+              <w:jc w:val="left"/>
+            </w:pPr>
+            <w:r>
+              <w:rPr>
+                <w:rFonts w:ascii="Calibri" w:hAnsi="Calibri"/>
+                <w:b w:val="0"/>
+                <w:color w:val="111827"/>
+                <w:sz w:val="16"/>
+              </w:rPr>
+              <w:t xml:space="preserve">NRC </w:t>
+            </w:r>
+            <w:r>
+              <w:rPr>
+                <w:rFonts w:ascii="Calibri" w:hAnsi="Calibri"/>
+                <w:b w:val="0"/>
+                <w:color w:val="111827"/>
+                <w:sz w:val="16"/>
+              </w:rPr>
+              <w:t>0x22</w:t>
+            </w:r>
+            <w:r>
+              <w:rPr>
+                <w:rFonts w:ascii="Calibri" w:hAnsi="Calibri"/>
+                <w:b w:val="0"/>
+                <w:color w:val="111827"/>
+                <w:sz w:val="16"/>
+              </w:rPr>
+              <w:t xml:space="preserve"> conditions not correct</w:t>
+            </w:r>
+          </w:p>
+        </w:tc>
+      </w:tr>
+      <w:tr>
+        <w:trPr>
+          <w:cantSplit/>
+        </w:trPr>
+        <w:tc>
+          <w:tcPr>
+            <w:tcW w:type="dxa" w:w="1150"/>
+            <w:tcMar>
+              <w:top w:w="80" w:type="dxa"/>
+              <w:start w:w="120" w:type="dxa"/>
+              <w:bottom w:w="80" w:type="dxa"/>
+              <w:end w:w="120" w:type="dxa"/>
+            </w:tcMar>
+            <w:vAlign w:val="center"/>
+            <w:shd w:fill="FFFFFF"/>
+          </w:tcPr>
+          <w:p>
+            <w:pPr>
+              <w:spacing w:before="0" w:after="40" w:line="252" w:lineRule="auto"/>
+              <w:jc w:val="center"/>
+            </w:pPr>
+            <w:r>
+              <w:rPr>
+                <w:rFonts w:ascii="Calibri" w:hAnsi="Calibri"/>
+                <w:b w:val="0"/>
+                <w:color w:val="111827"/>
+                <w:sz w:val="16"/>
+              </w:rPr>
+              <w:t>Unsupported stop or unknown routine identifier</w:t>
+            </w:r>
+          </w:p>
+        </w:tc>
+        <w:tc>
+          <w:tcPr>
+            <w:tcW w:type="dxa" w:w="3700"/>
+            <w:tcMar>
+              <w:top w:w="80" w:type="dxa"/>
+              <w:start w:w="120" w:type="dxa"/>
+              <w:bottom w:w="80" w:type="dxa"/>
+              <w:end w:w="120" w:type="dxa"/>
+            </w:tcMar>
+            <w:vAlign w:val="center"/>
+            <w:shd w:fill="FFFFFF"/>
+          </w:tcPr>
+          <w:p>
+            <w:pPr>
+              <w:spacing w:before="0" w:after="40" w:line="252" w:lineRule="auto"/>
+              <w:jc w:val="left"/>
+            </w:pPr>
+            <w:r>
+              <w:rPr>
+                <w:rFonts w:ascii="Calibri" w:hAnsi="Calibri"/>
+                <w:b w:val="0"/>
+                <w:color w:val="111827"/>
+                <w:sz w:val="16"/>
+              </w:rPr>
+              <w:t>diagnostic_contract_invalid</w:t>
+            </w:r>
+          </w:p>
+        </w:tc>
+        <w:tc>
+          <w:tcPr>
+            <w:tcW w:type="dxa" w:w="3100"/>
+            <w:tcMar>
+              <w:top w:w="80" w:type="dxa"/>
+              <w:start w:w="120" w:type="dxa"/>
+              <w:bottom w:w="80" w:type="dxa"/>
+              <w:end w:w="120" w:type="dxa"/>
+            </w:tcMar>
+            <w:vAlign w:val="center"/>
+            <w:shd w:fill="FFFFFF"/>
+          </w:tcPr>
+          <w:p>
+            <w:pPr>
+              <w:spacing w:before="0" w:after="40" w:line="252" w:lineRule="auto"/>
+              <w:jc w:val="left"/>
+            </w:pPr>
+            <w:r>
+              <w:rPr>
+                <w:rFonts w:ascii="Calibri" w:hAnsi="Calibri"/>
+                <w:b w:val="0"/>
+                <w:color w:val="111827"/>
+                <w:sz w:val="16"/>
+              </w:rPr>
+              <w:t>422</w:t>
+            </w:r>
+          </w:p>
+        </w:tc>
+        <w:tc>
+          <w:tcPr>
+            <w:tcW w:type="dxa" w:w="1410"/>
+            <w:tcMar>
+              <w:top w:w="80" w:type="dxa"/>
+              <w:start w:w="120" w:type="dxa"/>
+              <w:bottom w:w="80" w:type="dxa"/>
+              <w:end w:w="120" w:type="dxa"/>
+            </w:tcMar>
+            <w:vAlign w:val="center"/>
+            <w:shd w:fill="FFFFFF"/>
+          </w:tcPr>
+          <w:p>
+            <w:pPr>
+              <w:spacing w:before="0" w:after="40" w:line="252" w:lineRule="auto"/>
+              <w:jc w:val="left"/>
+            </w:pPr>
+            <w:r>
+              <w:rPr>
+                <w:rFonts w:ascii="Calibri" w:hAnsi="Calibri"/>
+                <w:b w:val="0"/>
+                <w:color w:val="111827"/>
+                <w:sz w:val="16"/>
+              </w:rPr>
+              <w:t xml:space="preserve">NRC </w:t>
+            </w:r>
+            <w:r>
+              <w:rPr>
+                <w:rFonts w:ascii="Calibri" w:hAnsi="Calibri"/>
+                <w:b w:val="0"/>
+                <w:color w:val="111827"/>
+                <w:sz w:val="16"/>
+              </w:rPr>
+              <w:t>0x31</w:t>
+            </w:r>
+            <w:r>
+              <w:rPr>
+                <w:rFonts w:ascii="Calibri" w:hAnsi="Calibri"/>
+                <w:b w:val="0"/>
+                <w:color w:val="111827"/>
+                <w:sz w:val="16"/>
+              </w:rPr>
+              <w:t xml:space="preserve"> request out of range</w:t>
+            </w:r>
+          </w:p>
+        </w:tc>
+      </w:tr>
+      <w:tr>
+        <w:trPr>
+          <w:cantSplit/>
+        </w:trPr>
+        <w:tc>
+          <w:tcPr>
+            <w:tcW w:type="dxa" w:w="1150"/>
+            <w:tcMar>
+              <w:top w:w="80" w:type="dxa"/>
+              <w:start w:w="120" w:type="dxa"/>
+              <w:bottom w:w="80" w:type="dxa"/>
+              <w:end w:w="120" w:type="dxa"/>
+            </w:tcMar>
+            <w:vAlign w:val="center"/>
+            <w:shd w:fill="FFFFFF"/>
+          </w:tcPr>
+          <w:p>
+            <w:pPr>
+              <w:spacing w:before="0" w:after="40" w:line="252" w:lineRule="auto"/>
+              <w:jc w:val="center"/>
+            </w:pPr>
+            <w:r>
+              <w:rPr>
+                <w:rFonts w:ascii="Calibri" w:hAnsi="Calibri"/>
+                <w:b w:val="0"/>
+                <w:color w:val="111827"/>
+                <w:sz w:val="16"/>
+              </w:rPr>
               <w:t>Unknown ECU or DTC</w:t>
             </w:r>
           </w:p>
@@ -5010,6 +6210,66 @@
           <w:sz w:val="22"/>
         </w:rPr>
         <w:t>Command results retain DID values so an exact retry is truthful. Audit and outbox records exclude those values and share only identifiers, counts, service identities, and versions.</w:t>
+      </w:r>
+    </w:p>
+    <w:p>
+      <w:pPr>
+        <w:pStyle w:val="Heading2"/>
+        <w:keepNext/>
+        <w:keepLines/>
+      </w:pPr>
+      <w:r>
+        <w:t>ADR-DG-007 - Separate Routine Definition from Execution State</w:t>
+      </w:r>
+    </w:p>
+    <w:p>
+      <w:r>
+        <w:rPr>
+          <w:rFonts w:ascii="Calibri" w:hAnsi="Calibri"/>
+          <w:color w:val="111827"/>
+          <w:sz w:val="22"/>
+        </w:rPr>
+        <w:t>Routine engineering metadata changes independently from each execution lifecycle. A one-to-one state record makes concurrency and lifecycle transitions explicit without rewriting definitions.</w:t>
+      </w:r>
+    </w:p>
+    <w:p>
+      <w:pPr>
+        <w:pStyle w:val="Heading2"/>
+        <w:keepNext/>
+        <w:keepLines/>
+      </w:pPr>
+      <w:r>
+        <w:t>ADR-DG-008 - Complete Routines from ECU Logical Time</w:t>
+      </w:r>
+    </w:p>
+    <w:p>
+      <w:r>
+        <w:rPr>
+          <w:rFonts w:ascii="Calibri" w:hAnsi="Calibri"/>
+          <w:color w:val="111827"/>
+          <w:sz w:val="22"/>
+        </w:rPr>
+        <w:t>Routine completion is evaluated against simulation time when the state is observed. No sleeping, host timer, worker loop, GPU, or cloud service is required, which keeps simulation and tests deterministic and inexpensive.</w:t>
+      </w:r>
+    </w:p>
+    <w:p>
+      <w:pPr>
+        <w:pStyle w:val="Heading2"/>
+        <w:keepNext/>
+        <w:keepLines/>
+      </w:pPr>
+      <w:r>
+        <w:t>ADR-DG-009 - Protect Routine Values in Shared Evidence</w:t>
+      </w:r>
+    </w:p>
+    <w:p>
+      <w:r>
+        <w:rPr>
+          <w:rFonts w:ascii="Calibri" w:hAnsi="Calibri"/>
+          <w:color w:val="111827"/>
+          <w:sz w:val="22"/>
+        </w:rPr>
+        <w:t>Parameters and results remain in protected state and command records for faithful replay. Audit and outbox payloads contain only identifiers, subfunctions, status, counters, timestamps, and versions to avoid distributing engineering measurements or sensitive routine inputs.</w:t>
       </w:r>
     </w:p>
     <w:p>
@@ -8304,6 +9564,1057 @@
           </w:p>
         </w:tc>
       </w:tr>
+      <w:tr>
+        <w:trPr>
+          <w:cantSplit/>
+        </w:trPr>
+        <w:tc>
+          <w:tcPr>
+            <w:tcW w:type="dxa" w:w="1650"/>
+            <w:tcMar>
+              <w:top w:w="80" w:type="dxa"/>
+              <w:start w:w="120" w:type="dxa"/>
+              <w:bottom w:w="80" w:type="dxa"/>
+              <w:end w:w="120" w:type="dxa"/>
+            </w:tcMar>
+            <w:vAlign w:val="center"/>
+            <w:shd w:fill="FFFFFF"/>
+          </w:tcPr>
+          <w:p>
+            <w:pPr>
+              <w:spacing w:before="0" w:after="40" w:line="252" w:lineRule="auto"/>
+              <w:jc w:val="center"/>
+            </w:pPr>
+            <w:r>
+              <w:rPr>
+                <w:rFonts w:ascii="Calibri" w:hAnsi="Calibri"/>
+                <w:b w:val="0"/>
+                <w:color w:val="111827"/>
+                <w:sz w:val="17"/>
+              </w:rPr>
+              <w:t>Routine schema bounds</w:t>
+            </w:r>
+          </w:p>
+        </w:tc>
+        <w:tc>
+          <w:tcPr>
+            <w:tcW w:type="dxa" w:w="4450"/>
+            <w:tcMar>
+              <w:top w:w="80" w:type="dxa"/>
+              <w:start w:w="120" w:type="dxa"/>
+              <w:bottom w:w="80" w:type="dxa"/>
+              <w:end w:w="120" w:type="dxa"/>
+            </w:tcMar>
+            <w:vAlign w:val="center"/>
+            <w:shd w:fill="FFFFFF"/>
+          </w:tcPr>
+          <w:p>
+            <w:pPr>
+              <w:spacing w:before="0" w:after="40" w:line="252" w:lineRule="auto"/>
+              <w:jc w:val="left"/>
+            </w:pPr>
+            <w:r>
+              <w:rPr>
+                <w:rFonts w:ascii="Calibri" w:hAnsi="Calibri"/>
+                <w:b w:val="0"/>
+                <w:color w:val="111827"/>
+                <w:sz w:val="17"/>
+              </w:rPr>
+              <w:t>Reject identifiers, durations, parameters, and result templates outside fixed limits.</w:t>
+            </w:r>
+          </w:p>
+        </w:tc>
+        <w:tc>
+          <w:tcPr>
+            <w:tcW w:type="dxa" w:w="3260"/>
+            <w:tcMar>
+              <w:top w:w="80" w:type="dxa"/>
+              <w:start w:w="120" w:type="dxa"/>
+              <w:bottom w:w="80" w:type="dxa"/>
+              <w:end w:w="120" w:type="dxa"/>
+            </w:tcMar>
+            <w:vAlign w:val="center"/>
+            <w:shd w:fill="FFFFFF"/>
+          </w:tcPr>
+          <w:p>
+            <w:pPr>
+              <w:spacing w:before="0" w:after="40" w:line="252" w:lineRule="auto"/>
+              <w:jc w:val="left"/>
+            </w:pPr>
+            <w:r>
+              <w:rPr>
+                <w:rFonts w:ascii="Calibri" w:hAnsi="Calibri"/>
+                <w:b w:val="0"/>
+                <w:color w:val="111827"/>
+                <w:sz w:val="17"/>
+              </w:rPr>
+              <w:t>Schema/OpenAPI</w:t>
+            </w:r>
+          </w:p>
+        </w:tc>
+      </w:tr>
+      <w:tr>
+        <w:trPr>
+          <w:cantSplit/>
+        </w:trPr>
+        <w:tc>
+          <w:tcPr>
+            <w:tcW w:type="dxa" w:w="1650"/>
+            <w:tcMar>
+              <w:top w:w="80" w:type="dxa"/>
+              <w:start w:w="120" w:type="dxa"/>
+              <w:bottom w:w="80" w:type="dxa"/>
+              <w:end w:w="120" w:type="dxa"/>
+            </w:tcMar>
+            <w:vAlign w:val="center"/>
+            <w:shd w:fill="FFFFFF"/>
+          </w:tcPr>
+          <w:p>
+            <w:pPr>
+              <w:spacing w:before="0" w:after="40" w:line="252" w:lineRule="auto"/>
+              <w:jc w:val="center"/>
+            </w:pPr>
+            <w:r>
+              <w:rPr>
+                <w:rFonts w:ascii="Calibri" w:hAnsi="Calibri"/>
+                <w:b w:val="0"/>
+                <w:color w:val="111827"/>
+                <w:sz w:val="17"/>
+              </w:rPr>
+              <w:t>Routine catalogue bound</w:t>
+            </w:r>
+          </w:p>
+        </w:tc>
+        <w:tc>
+          <w:tcPr>
+            <w:tcW w:type="dxa" w:w="4450"/>
+            <w:tcMar>
+              <w:top w:w="80" w:type="dxa"/>
+              <w:start w:w="120" w:type="dxa"/>
+              <w:bottom w:w="80" w:type="dxa"/>
+              <w:end w:w="120" w:type="dxa"/>
+            </w:tcMar>
+            <w:vAlign w:val="center"/>
+            <w:shd w:fill="FFFFFF"/>
+          </w:tcPr>
+          <w:p>
+            <w:pPr>
+              <w:spacing w:before="0" w:after="40" w:line="252" w:lineRule="auto"/>
+              <w:jc w:val="left"/>
+            </w:pPr>
+            <w:r>
+              <w:rPr>
+                <w:rFonts w:ascii="Calibri" w:hAnsi="Calibri"/>
+                <w:b w:val="0"/>
+                <w:color w:val="111827"/>
+                <w:sz w:val="17"/>
+              </w:rPr>
+              <w:t>Reject a 65th routine and enforce page limit 64.</w:t>
+            </w:r>
+          </w:p>
+        </w:tc>
+        <w:tc>
+          <w:tcPr>
+            <w:tcW w:type="dxa" w:w="3260"/>
+            <w:tcMar>
+              <w:top w:w="80" w:type="dxa"/>
+              <w:start w:w="120" w:type="dxa"/>
+              <w:bottom w:w="80" w:type="dxa"/>
+              <w:end w:w="120" w:type="dxa"/>
+            </w:tcMar>
+            <w:vAlign w:val="center"/>
+            <w:shd w:fill="FFFFFF"/>
+          </w:tcPr>
+          <w:p>
+            <w:pPr>
+              <w:spacing w:before="0" w:after="40" w:line="252" w:lineRule="auto"/>
+              <w:jc w:val="left"/>
+            </w:pPr>
+            <w:r>
+              <w:rPr>
+                <w:rFonts w:ascii="Calibri" w:hAnsi="Calibri"/>
+                <w:b w:val="0"/>
+                <w:color w:val="111827"/>
+                <w:sz w:val="17"/>
+              </w:rPr>
+              <w:t>Service/OpenAPI</w:t>
+            </w:r>
+          </w:p>
+        </w:tc>
+      </w:tr>
+      <w:tr>
+        <w:trPr>
+          <w:cantSplit/>
+        </w:trPr>
+        <w:tc>
+          <w:tcPr>
+            <w:tcW w:type="dxa" w:w="1650"/>
+            <w:tcMar>
+              <w:top w:w="80" w:type="dxa"/>
+              <w:start w:w="120" w:type="dxa"/>
+              <w:bottom w:w="80" w:type="dxa"/>
+              <w:end w:w="120" w:type="dxa"/>
+            </w:tcMar>
+            <w:vAlign w:val="center"/>
+            <w:shd w:fill="FFFFFF"/>
+          </w:tcPr>
+          <w:p>
+            <w:pPr>
+              <w:spacing w:before="0" w:after="40" w:line="252" w:lineRule="auto"/>
+              <w:jc w:val="center"/>
+            </w:pPr>
+            <w:r>
+              <w:rPr>
+                <w:rFonts w:ascii="Calibri" w:hAnsi="Calibri"/>
+                <w:b w:val="0"/>
+                <w:color w:val="111827"/>
+                <w:sz w:val="17"/>
+              </w:rPr>
+              <w:t>Routine start</w:t>
+            </w:r>
+          </w:p>
+        </w:tc>
+        <w:tc>
+          <w:tcPr>
+            <w:tcW w:type="dxa" w:w="4450"/>
+            <w:tcMar>
+              <w:top w:w="80" w:type="dxa"/>
+              <w:start w:w="120" w:type="dxa"/>
+              <w:bottom w:w="80" w:type="dxa"/>
+              <w:end w:w="120" w:type="dxa"/>
+            </w:tcMar>
+            <w:vAlign w:val="center"/>
+            <w:shd w:fill="FFFFFF"/>
+          </w:tcPr>
+          <w:p>
+            <w:pPr>
+              <w:spacing w:before="0" w:after="40" w:line="252" w:lineRule="auto"/>
+              <w:jc w:val="left"/>
+            </w:pPr>
+            <w:r>
+              <w:rPr>
+                <w:rFonts w:ascii="Calibri" w:hAnsi="Calibri"/>
+                <w:b w:val="0"/>
+                <w:color w:val="111827"/>
+                <w:sz w:val="17"/>
+              </w:rPr>
+              <w:t>Move idle state to running with ECU logical timestamps and incremented version.</w:t>
+            </w:r>
+          </w:p>
+        </w:tc>
+        <w:tc>
+          <w:tcPr>
+            <w:tcW w:type="dxa" w:w="3260"/>
+            <w:tcMar>
+              <w:top w:w="80" w:type="dxa"/>
+              <w:start w:w="120" w:type="dxa"/>
+              <w:bottom w:w="80" w:type="dxa"/>
+              <w:end w:w="120" w:type="dxa"/>
+            </w:tcMar>
+            <w:vAlign w:val="center"/>
+            <w:shd w:fill="FFFFFF"/>
+          </w:tcPr>
+          <w:p>
+            <w:pPr>
+              <w:spacing w:before="0" w:after="40" w:line="252" w:lineRule="auto"/>
+              <w:jc w:val="left"/>
+            </w:pPr>
+            <w:r>
+              <w:rPr>
+                <w:rFonts w:ascii="Calibri" w:hAnsi="Calibri"/>
+                <w:b w:val="0"/>
+                <w:color w:val="111827"/>
+                <w:sz w:val="17"/>
+              </w:rPr>
+              <w:t>Service/integration</w:t>
+            </w:r>
+          </w:p>
+        </w:tc>
+      </w:tr>
+      <w:tr>
+        <w:trPr>
+          <w:cantSplit/>
+        </w:trPr>
+        <w:tc>
+          <w:tcPr>
+            <w:tcW w:type="dxa" w:w="1650"/>
+            <w:tcMar>
+              <w:top w:w="80" w:type="dxa"/>
+              <w:start w:w="120" w:type="dxa"/>
+              <w:bottom w:w="80" w:type="dxa"/>
+              <w:end w:w="120" w:type="dxa"/>
+            </w:tcMar>
+            <w:vAlign w:val="center"/>
+            <w:shd w:fill="FFFFFF"/>
+          </w:tcPr>
+          <w:p>
+            <w:pPr>
+              <w:spacing w:before="0" w:after="40" w:line="252" w:lineRule="auto"/>
+              <w:jc w:val="center"/>
+            </w:pPr>
+            <w:r>
+              <w:rPr>
+                <w:rFonts w:ascii="Calibri" w:hAnsi="Calibri"/>
+                <w:b w:val="0"/>
+                <w:color w:val="111827"/>
+                <w:sz w:val="17"/>
+              </w:rPr>
+              <w:t>Routine session policy</w:t>
+            </w:r>
+          </w:p>
+        </w:tc>
+        <w:tc>
+          <w:tcPr>
+            <w:tcW w:type="dxa" w:w="4450"/>
+            <w:tcMar>
+              <w:top w:w="80" w:type="dxa"/>
+              <w:start w:w="120" w:type="dxa"/>
+              <w:bottom w:w="80" w:type="dxa"/>
+              <w:end w:w="120" w:type="dxa"/>
+            </w:tcMar>
+            <w:vAlign w:val="center"/>
+            <w:shd w:fill="FFFFFF"/>
+          </w:tcPr>
+          <w:p>
+            <w:pPr>
+              <w:spacing w:before="0" w:after="40" w:line="252" w:lineRule="auto"/>
+              <w:jc w:val="left"/>
+            </w:pPr>
+            <w:r>
+              <w:rPr>
+                <w:rFonts w:ascii="Calibri" w:hAnsi="Calibri"/>
+                <w:b w:val="0"/>
+                <w:color w:val="111827"/>
+                <w:sz w:val="17"/>
+              </w:rPr>
+              <w:t xml:space="preserve">Return NRC </w:t>
+            </w:r>
+            <w:r>
+              <w:rPr>
+                <w:rFonts w:ascii="Calibri" w:hAnsi="Calibri"/>
+                <w:b w:val="0"/>
+                <w:color w:val="111827"/>
+                <w:sz w:val="17"/>
+              </w:rPr>
+              <w:t>0x7F</w:t>
+            </w:r>
+            <w:r>
+              <w:rPr>
+                <w:rFonts w:ascii="Calibri" w:hAnsi="Calibri"/>
+                <w:b w:val="0"/>
+                <w:color w:val="111827"/>
+                <w:sz w:val="17"/>
+              </w:rPr>
+              <w:t xml:space="preserve"> when the active session is not allowed.</w:t>
+            </w:r>
+          </w:p>
+        </w:tc>
+        <w:tc>
+          <w:tcPr>
+            <w:tcW w:type="dxa" w:w="3260"/>
+            <w:tcMar>
+              <w:top w:w="80" w:type="dxa"/>
+              <w:start w:w="120" w:type="dxa"/>
+              <w:bottom w:w="80" w:type="dxa"/>
+              <w:end w:w="120" w:type="dxa"/>
+            </w:tcMar>
+            <w:vAlign w:val="center"/>
+            <w:shd w:fill="FFFFFF"/>
+          </w:tcPr>
+          <w:p>
+            <w:pPr>
+              <w:spacing w:before="0" w:after="40" w:line="252" w:lineRule="auto"/>
+              <w:jc w:val="left"/>
+            </w:pPr>
+            <w:r>
+              <w:rPr>
+                <w:rFonts w:ascii="Calibri" w:hAnsi="Calibri"/>
+                <w:b w:val="0"/>
+                <w:color w:val="111827"/>
+                <w:sz w:val="17"/>
+              </w:rPr>
+              <w:t>Service/API</w:t>
+            </w:r>
+          </w:p>
+        </w:tc>
+      </w:tr>
+      <w:tr>
+        <w:trPr>
+          <w:cantSplit/>
+        </w:trPr>
+        <w:tc>
+          <w:tcPr>
+            <w:tcW w:type="dxa" w:w="1650"/>
+            <w:tcMar>
+              <w:top w:w="80" w:type="dxa"/>
+              <w:start w:w="120" w:type="dxa"/>
+              <w:bottom w:w="80" w:type="dxa"/>
+              <w:end w:w="120" w:type="dxa"/>
+            </w:tcMar>
+            <w:vAlign w:val="center"/>
+            <w:shd w:fill="FFFFFF"/>
+          </w:tcPr>
+          <w:p>
+            <w:pPr>
+              <w:spacing w:before="0" w:after="40" w:line="252" w:lineRule="auto"/>
+              <w:jc w:val="center"/>
+            </w:pPr>
+            <w:r>
+              <w:rPr>
+                <w:rFonts w:ascii="Calibri" w:hAnsi="Calibri"/>
+                <w:b w:val="0"/>
+                <w:color w:val="111827"/>
+                <w:sz w:val="17"/>
+              </w:rPr>
+              <w:t>Routine stop capability</w:t>
+            </w:r>
+          </w:p>
+        </w:tc>
+        <w:tc>
+          <w:tcPr>
+            <w:tcW w:type="dxa" w:w="4450"/>
+            <w:tcMar>
+              <w:top w:w="80" w:type="dxa"/>
+              <w:start w:w="120" w:type="dxa"/>
+              <w:bottom w:w="80" w:type="dxa"/>
+              <w:end w:w="120" w:type="dxa"/>
+            </w:tcMar>
+            <w:vAlign w:val="center"/>
+            <w:shd w:fill="FFFFFF"/>
+          </w:tcPr>
+          <w:p>
+            <w:pPr>
+              <w:spacing w:before="0" w:after="40" w:line="252" w:lineRule="auto"/>
+              <w:jc w:val="left"/>
+            </w:pPr>
+            <w:r>
+              <w:rPr>
+                <w:rFonts w:ascii="Calibri" w:hAnsi="Calibri"/>
+                <w:b w:val="0"/>
+                <w:color w:val="111827"/>
+                <w:sz w:val="17"/>
+              </w:rPr>
+              <w:t xml:space="preserve">Return NRC </w:t>
+            </w:r>
+            <w:r>
+              <w:rPr>
+                <w:rFonts w:ascii="Calibri" w:hAnsi="Calibri"/>
+                <w:b w:val="0"/>
+                <w:color w:val="111827"/>
+                <w:sz w:val="17"/>
+              </w:rPr>
+              <w:t>0x31</w:t>
+            </w:r>
+            <w:r>
+              <w:rPr>
+                <w:rFonts w:ascii="Calibri" w:hAnsi="Calibri"/>
+                <w:b w:val="0"/>
+                <w:color w:val="111827"/>
+                <w:sz w:val="17"/>
+              </w:rPr>
+              <w:t xml:space="preserve"> when stop is unsupported; otherwise stop at logical time.</w:t>
+            </w:r>
+          </w:p>
+        </w:tc>
+        <w:tc>
+          <w:tcPr>
+            <w:tcW w:type="dxa" w:w="3260"/>
+            <w:tcMar>
+              <w:top w:w="80" w:type="dxa"/>
+              <w:start w:w="120" w:type="dxa"/>
+              <w:bottom w:w="80" w:type="dxa"/>
+              <w:end w:w="120" w:type="dxa"/>
+            </w:tcMar>
+            <w:vAlign w:val="center"/>
+            <w:shd w:fill="FFFFFF"/>
+          </w:tcPr>
+          <w:p>
+            <w:pPr>
+              <w:spacing w:before="0" w:after="40" w:line="252" w:lineRule="auto"/>
+              <w:jc w:val="left"/>
+            </w:pPr>
+            <w:r>
+              <w:rPr>
+                <w:rFonts w:ascii="Calibri" w:hAnsi="Calibri"/>
+                <w:b w:val="0"/>
+                <w:color w:val="111827"/>
+                <w:sz w:val="17"/>
+              </w:rPr>
+              <w:t>Service/API</w:t>
+            </w:r>
+          </w:p>
+        </w:tc>
+      </w:tr>
+      <w:tr>
+        <w:trPr>
+          <w:cantSplit/>
+        </w:trPr>
+        <w:tc>
+          <w:tcPr>
+            <w:tcW w:type="dxa" w:w="1650"/>
+            <w:tcMar>
+              <w:top w:w="80" w:type="dxa"/>
+              <w:start w:w="120" w:type="dxa"/>
+              <w:bottom w:w="80" w:type="dxa"/>
+              <w:end w:w="120" w:type="dxa"/>
+            </w:tcMar>
+            <w:vAlign w:val="center"/>
+            <w:shd w:fill="FFFFFF"/>
+          </w:tcPr>
+          <w:p>
+            <w:pPr>
+              <w:spacing w:before="0" w:after="40" w:line="252" w:lineRule="auto"/>
+              <w:jc w:val="center"/>
+            </w:pPr>
+            <w:r>
+              <w:rPr>
+                <w:rFonts w:ascii="Calibri" w:hAnsi="Calibri"/>
+                <w:b w:val="0"/>
+                <w:color w:val="111827"/>
+                <w:sz w:val="17"/>
+              </w:rPr>
+              <w:t>Routine stale version</w:t>
+            </w:r>
+          </w:p>
+        </w:tc>
+        <w:tc>
+          <w:tcPr>
+            <w:tcW w:type="dxa" w:w="4450"/>
+            <w:tcMar>
+              <w:top w:w="80" w:type="dxa"/>
+              <w:start w:w="120" w:type="dxa"/>
+              <w:bottom w:w="80" w:type="dxa"/>
+              <w:end w:w="120" w:type="dxa"/>
+            </w:tcMar>
+            <w:vAlign w:val="center"/>
+            <w:shd w:fill="FFFFFF"/>
+          </w:tcPr>
+          <w:p>
+            <w:pPr>
+              <w:spacing w:before="0" w:after="40" w:line="252" w:lineRule="auto"/>
+              <w:jc w:val="left"/>
+            </w:pPr>
+            <w:r>
+              <w:rPr>
+                <w:rFonts w:ascii="Calibri" w:hAnsi="Calibri"/>
+                <w:b w:val="0"/>
+                <w:color w:val="111827"/>
+                <w:sz w:val="17"/>
+              </w:rPr>
+              <w:t xml:space="preserve">Return NRC </w:t>
+            </w:r>
+            <w:r>
+              <w:rPr>
+                <w:rFonts w:ascii="Calibri" w:hAnsi="Calibri"/>
+                <w:b w:val="0"/>
+                <w:color w:val="111827"/>
+                <w:sz w:val="17"/>
+              </w:rPr>
+              <w:t>0x22</w:t>
+            </w:r>
+            <w:r>
+              <w:rPr>
+                <w:rFonts w:ascii="Calibri" w:hAnsi="Calibri"/>
+                <w:b w:val="0"/>
+                <w:color w:val="111827"/>
+                <w:sz w:val="17"/>
+              </w:rPr>
+              <w:t xml:space="preserve"> without mutation when the state version does not match.</w:t>
+            </w:r>
+          </w:p>
+        </w:tc>
+        <w:tc>
+          <w:tcPr>
+            <w:tcW w:type="dxa" w:w="3260"/>
+            <w:tcMar>
+              <w:top w:w="80" w:type="dxa"/>
+              <w:start w:w="120" w:type="dxa"/>
+              <w:bottom w:w="80" w:type="dxa"/>
+              <w:end w:w="120" w:type="dxa"/>
+            </w:tcMar>
+            <w:vAlign w:val="center"/>
+            <w:shd w:fill="FFFFFF"/>
+          </w:tcPr>
+          <w:p>
+            <w:pPr>
+              <w:spacing w:before="0" w:after="40" w:line="252" w:lineRule="auto"/>
+              <w:jc w:val="left"/>
+            </w:pPr>
+            <w:r>
+              <w:rPr>
+                <w:rFonts w:ascii="Calibri" w:hAnsi="Calibri"/>
+                <w:b w:val="0"/>
+                <w:color w:val="111827"/>
+                <w:sz w:val="17"/>
+              </w:rPr>
+              <w:t>Service/API</w:t>
+            </w:r>
+          </w:p>
+        </w:tc>
+      </w:tr>
+      <w:tr>
+        <w:trPr>
+          <w:cantSplit/>
+        </w:trPr>
+        <w:tc>
+          <w:tcPr>
+            <w:tcW w:type="dxa" w:w="1650"/>
+            <w:tcMar>
+              <w:top w:w="80" w:type="dxa"/>
+              <w:start w:w="120" w:type="dxa"/>
+              <w:bottom w:w="80" w:type="dxa"/>
+              <w:end w:w="120" w:type="dxa"/>
+            </w:tcMar>
+            <w:vAlign w:val="center"/>
+            <w:shd w:fill="FFFFFF"/>
+          </w:tcPr>
+          <w:p>
+            <w:pPr>
+              <w:spacing w:before="0" w:after="40" w:line="252" w:lineRule="auto"/>
+              <w:jc w:val="center"/>
+            </w:pPr>
+            <w:r>
+              <w:rPr>
+                <w:rFonts w:ascii="Calibri" w:hAnsi="Calibri"/>
+                <w:b w:val="0"/>
+                <w:color w:val="111827"/>
+                <w:sz w:val="17"/>
+              </w:rPr>
+              <w:t>Routine completion</w:t>
+            </w:r>
+          </w:p>
+        </w:tc>
+        <w:tc>
+          <w:tcPr>
+            <w:tcW w:type="dxa" w:w="4450"/>
+            <w:tcMar>
+              <w:top w:w="80" w:type="dxa"/>
+              <w:start w:w="120" w:type="dxa"/>
+              <w:bottom w:w="80" w:type="dxa"/>
+              <w:end w:w="120" w:type="dxa"/>
+            </w:tcMar>
+            <w:vAlign w:val="center"/>
+            <w:shd w:fill="FFFFFF"/>
+          </w:tcPr>
+          <w:p>
+            <w:pPr>
+              <w:spacing w:before="0" w:after="40" w:line="252" w:lineRule="auto"/>
+              <w:jc w:val="left"/>
+            </w:pPr>
+            <w:r>
+              <w:rPr>
+                <w:rFonts w:ascii="Calibri" w:hAnsi="Calibri"/>
+                <w:b w:val="0"/>
+                <w:color w:val="111827"/>
+                <w:sz w:val="17"/>
+              </w:rPr>
+              <w:t>Complete exactly at the declared ECU logical timestamp without sleeping.</w:t>
+            </w:r>
+          </w:p>
+        </w:tc>
+        <w:tc>
+          <w:tcPr>
+            <w:tcW w:type="dxa" w:w="3260"/>
+            <w:tcMar>
+              <w:top w:w="80" w:type="dxa"/>
+              <w:start w:w="120" w:type="dxa"/>
+              <w:bottom w:w="80" w:type="dxa"/>
+              <w:end w:w="120" w:type="dxa"/>
+            </w:tcMar>
+            <w:vAlign w:val="center"/>
+            <w:shd w:fill="FFFFFF"/>
+          </w:tcPr>
+          <w:p>
+            <w:pPr>
+              <w:spacing w:before="0" w:after="40" w:line="252" w:lineRule="auto"/>
+              <w:jc w:val="left"/>
+            </w:pPr>
+            <w:r>
+              <w:rPr>
+                <w:rFonts w:ascii="Calibri" w:hAnsi="Calibri"/>
+                <w:b w:val="0"/>
+                <w:color w:val="111827"/>
+                <w:sz w:val="17"/>
+              </w:rPr>
+              <w:t>Service/integration</w:t>
+            </w:r>
+          </w:p>
+        </w:tc>
+      </w:tr>
+      <w:tr>
+        <w:trPr>
+          <w:cantSplit/>
+        </w:trPr>
+        <w:tc>
+          <w:tcPr>
+            <w:tcW w:type="dxa" w:w="1650"/>
+            <w:tcMar>
+              <w:top w:w="80" w:type="dxa"/>
+              <w:start w:w="120" w:type="dxa"/>
+              <w:bottom w:w="80" w:type="dxa"/>
+              <w:end w:w="120" w:type="dxa"/>
+            </w:tcMar>
+            <w:vAlign w:val="center"/>
+            <w:shd w:fill="FFFFFF"/>
+          </w:tcPr>
+          <w:p>
+            <w:pPr>
+              <w:spacing w:before="0" w:after="40" w:line="252" w:lineRule="auto"/>
+              <w:jc w:val="center"/>
+            </w:pPr>
+            <w:r>
+              <w:rPr>
+                <w:rFonts w:ascii="Calibri" w:hAnsi="Calibri"/>
+                <w:b w:val="0"/>
+                <w:color w:val="111827"/>
+                <w:sz w:val="17"/>
+              </w:rPr>
+              <w:t>Routine result</w:t>
+            </w:r>
+          </w:p>
+        </w:tc>
+        <w:tc>
+          <w:tcPr>
+            <w:tcW w:type="dxa" w:w="4450"/>
+            <w:tcMar>
+              <w:top w:w="80" w:type="dxa"/>
+              <w:start w:w="120" w:type="dxa"/>
+              <w:bottom w:w="80" w:type="dxa"/>
+              <w:end w:w="120" w:type="dxa"/>
+            </w:tcMar>
+            <w:vAlign w:val="center"/>
+            <w:shd w:fill="FFFFFF"/>
+          </w:tcPr>
+          <w:p>
+            <w:pPr>
+              <w:spacing w:before="0" w:after="40" w:line="252" w:lineRule="auto"/>
+              <w:jc w:val="left"/>
+            </w:pPr>
+            <w:r>
+              <w:rPr>
+                <w:rFonts w:ascii="Calibri" w:hAnsi="Calibri"/>
+                <w:b w:val="0"/>
+                <w:color w:val="111827"/>
+                <w:sz w:val="17"/>
+              </w:rPr>
+              <w:t>Return the bounded protected result only through the authorized response.</w:t>
+            </w:r>
+          </w:p>
+        </w:tc>
+        <w:tc>
+          <w:tcPr>
+            <w:tcW w:type="dxa" w:w="3260"/>
+            <w:tcMar>
+              <w:top w:w="80" w:type="dxa"/>
+              <w:start w:w="120" w:type="dxa"/>
+              <w:bottom w:w="80" w:type="dxa"/>
+              <w:end w:w="120" w:type="dxa"/>
+            </w:tcMar>
+            <w:vAlign w:val="center"/>
+            <w:shd w:fill="FFFFFF"/>
+          </w:tcPr>
+          <w:p>
+            <w:pPr>
+              <w:spacing w:before="0" w:after="40" w:line="252" w:lineRule="auto"/>
+              <w:jc w:val="left"/>
+            </w:pPr>
+            <w:r>
+              <w:rPr>
+                <w:rFonts w:ascii="Calibri" w:hAnsi="Calibri"/>
+                <w:b w:val="0"/>
+                <w:color w:val="111827"/>
+                <w:sz w:val="17"/>
+              </w:rPr>
+              <w:t>Service/API</w:t>
+            </w:r>
+          </w:p>
+        </w:tc>
+      </w:tr>
+      <w:tr>
+        <w:trPr>
+          <w:cantSplit/>
+        </w:trPr>
+        <w:tc>
+          <w:tcPr>
+            <w:tcW w:type="dxa" w:w="1650"/>
+            <w:tcMar>
+              <w:top w:w="80" w:type="dxa"/>
+              <w:start w:w="120" w:type="dxa"/>
+              <w:bottom w:w="80" w:type="dxa"/>
+              <w:end w:w="120" w:type="dxa"/>
+            </w:tcMar>
+            <w:vAlign w:val="center"/>
+            <w:shd w:fill="FFFFFF"/>
+          </w:tcPr>
+          <w:p>
+            <w:pPr>
+              <w:spacing w:before="0" w:after="40" w:line="252" w:lineRule="auto"/>
+              <w:jc w:val="center"/>
+            </w:pPr>
+            <w:r>
+              <w:rPr>
+                <w:rFonts w:ascii="Calibri" w:hAnsi="Calibri"/>
+                <w:b w:val="0"/>
+                <w:color w:val="111827"/>
+                <w:sz w:val="17"/>
+              </w:rPr>
+              <w:t>Routine replay</w:t>
+            </w:r>
+          </w:p>
+        </w:tc>
+        <w:tc>
+          <w:tcPr>
+            <w:tcW w:type="dxa" w:w="4450"/>
+            <w:tcMar>
+              <w:top w:w="80" w:type="dxa"/>
+              <w:start w:w="120" w:type="dxa"/>
+              <w:bottom w:w="80" w:type="dxa"/>
+              <w:end w:w="120" w:type="dxa"/>
+            </w:tcMar>
+            <w:vAlign w:val="center"/>
+            <w:shd w:fill="FFFFFF"/>
+          </w:tcPr>
+          <w:p>
+            <w:pPr>
+              <w:spacing w:before="0" w:after="40" w:line="252" w:lineRule="auto"/>
+              <w:jc w:val="left"/>
+            </w:pPr>
+            <w:r>
+              <w:rPr>
+                <w:rFonts w:ascii="Calibri" w:hAnsi="Calibri"/>
+                <w:b w:val="0"/>
+                <w:color w:val="111827"/>
+                <w:sz w:val="17"/>
+              </w:rPr>
+              <w:t xml:space="preserve">Return persisted </w:t>
+            </w:r>
+            <w:r>
+              <w:rPr>
+                <w:rFonts w:ascii="Calibri" w:hAnsi="Calibri"/>
+                <w:b w:val="0"/>
+                <w:color w:val="111827"/>
+                <w:sz w:val="17"/>
+              </w:rPr>
+              <w:t>0x31</w:t>
+            </w:r>
+            <w:r>
+              <w:rPr>
+                <w:rFonts w:ascii="Calibri" w:hAnsi="Calibri"/>
+                <w:b w:val="0"/>
+                <w:color w:val="111827"/>
+                <w:sz w:val="17"/>
+              </w:rPr>
+              <w:t xml:space="preserve"> evidence without repeated execution or version change.</w:t>
+            </w:r>
+          </w:p>
+        </w:tc>
+        <w:tc>
+          <w:tcPr>
+            <w:tcW w:type="dxa" w:w="3260"/>
+            <w:tcMar>
+              <w:top w:w="80" w:type="dxa"/>
+              <w:start w:w="120" w:type="dxa"/>
+              <w:bottom w:w="80" w:type="dxa"/>
+              <w:end w:w="120" w:type="dxa"/>
+            </w:tcMar>
+            <w:vAlign w:val="center"/>
+            <w:shd w:fill="FFFFFF"/>
+          </w:tcPr>
+          <w:p>
+            <w:pPr>
+              <w:spacing w:before="0" w:after="40" w:line="252" w:lineRule="auto"/>
+              <w:jc w:val="left"/>
+            </w:pPr>
+            <w:r>
+              <w:rPr>
+                <w:rFonts w:ascii="Calibri" w:hAnsi="Calibri"/>
+                <w:b w:val="0"/>
+                <w:color w:val="111827"/>
+                <w:sz w:val="17"/>
+              </w:rPr>
+              <w:t>Service/integration</w:t>
+            </w:r>
+          </w:p>
+        </w:tc>
+      </w:tr>
+      <w:tr>
+        <w:trPr>
+          <w:cantSplit/>
+        </w:trPr>
+        <w:tc>
+          <w:tcPr>
+            <w:tcW w:type="dxa" w:w="1650"/>
+            <w:tcMar>
+              <w:top w:w="80" w:type="dxa"/>
+              <w:start w:w="120" w:type="dxa"/>
+              <w:bottom w:w="80" w:type="dxa"/>
+              <w:end w:w="120" w:type="dxa"/>
+            </w:tcMar>
+            <w:vAlign w:val="center"/>
+            <w:shd w:fill="FFFFFF"/>
+          </w:tcPr>
+          <w:p>
+            <w:pPr>
+              <w:spacing w:before="0" w:after="40" w:line="252" w:lineRule="auto"/>
+              <w:jc w:val="center"/>
+            </w:pPr>
+            <w:r>
+              <w:rPr>
+                <w:rFonts w:ascii="Calibri" w:hAnsi="Calibri"/>
+                <w:b w:val="0"/>
+                <w:color w:val="111827"/>
+                <w:sz w:val="17"/>
+              </w:rPr>
+              <w:t>Routine evidence minimization</w:t>
+            </w:r>
+          </w:p>
+        </w:tc>
+        <w:tc>
+          <w:tcPr>
+            <w:tcW w:type="dxa" w:w="4450"/>
+            <w:tcMar>
+              <w:top w:w="80" w:type="dxa"/>
+              <w:start w:w="120" w:type="dxa"/>
+              <w:bottom w:w="80" w:type="dxa"/>
+              <w:end w:w="120" w:type="dxa"/>
+            </w:tcMar>
+            <w:vAlign w:val="center"/>
+            <w:shd w:fill="FFFFFF"/>
+          </w:tcPr>
+          <w:p>
+            <w:pPr>
+              <w:spacing w:before="0" w:after="40" w:line="252" w:lineRule="auto"/>
+              <w:jc w:val="left"/>
+            </w:pPr>
+            <w:r>
+              <w:rPr>
+                <w:rFonts w:ascii="Calibri" w:hAnsi="Calibri"/>
+                <w:b w:val="0"/>
+                <w:color w:val="111827"/>
+                <w:sz w:val="17"/>
+              </w:rPr>
+              <w:t>Prove audit and outbox contain neither parameters nor result values.</w:t>
+            </w:r>
+          </w:p>
+        </w:tc>
+        <w:tc>
+          <w:tcPr>
+            <w:tcW w:type="dxa" w:w="3260"/>
+            <w:tcMar>
+              <w:top w:w="80" w:type="dxa"/>
+              <w:start w:w="120" w:type="dxa"/>
+              <w:bottom w:w="80" w:type="dxa"/>
+              <w:end w:w="120" w:type="dxa"/>
+            </w:tcMar>
+            <w:vAlign w:val="center"/>
+            <w:shd w:fill="FFFFFF"/>
+          </w:tcPr>
+          <w:p>
+            <w:pPr>
+              <w:spacing w:before="0" w:after="40" w:line="252" w:lineRule="auto"/>
+              <w:jc w:val="left"/>
+            </w:pPr>
+            <w:r>
+              <w:rPr>
+                <w:rFonts w:ascii="Calibri" w:hAnsi="Calibri"/>
+                <w:b w:val="0"/>
+                <w:color w:val="111827"/>
+                <w:sz w:val="17"/>
+              </w:rPr>
+              <w:t>Service</w:t>
+            </w:r>
+          </w:p>
+        </w:tc>
+      </w:tr>
+      <w:tr>
+        <w:trPr>
+          <w:cantSplit/>
+        </w:trPr>
+        <w:tc>
+          <w:tcPr>
+            <w:tcW w:type="dxa" w:w="1650"/>
+            <w:tcMar>
+              <w:top w:w="80" w:type="dxa"/>
+              <w:start w:w="120" w:type="dxa"/>
+              <w:bottom w:w="80" w:type="dxa"/>
+              <w:end w:w="120" w:type="dxa"/>
+            </w:tcMar>
+            <w:vAlign w:val="center"/>
+            <w:shd w:fill="FFFFFF"/>
+          </w:tcPr>
+          <w:p>
+            <w:pPr>
+              <w:spacing w:before="0" w:after="40" w:line="252" w:lineRule="auto"/>
+              <w:jc w:val="center"/>
+            </w:pPr>
+            <w:r>
+              <w:rPr>
+                <w:rFonts w:ascii="Calibri" w:hAnsi="Calibri"/>
+                <w:b w:val="0"/>
+                <w:color w:val="111827"/>
+                <w:sz w:val="17"/>
+              </w:rPr>
+              <w:t>Routine atomicity</w:t>
+            </w:r>
+          </w:p>
+        </w:tc>
+        <w:tc>
+          <w:tcPr>
+            <w:tcW w:type="dxa" w:w="4450"/>
+            <w:tcMar>
+              <w:top w:w="80" w:type="dxa"/>
+              <w:start w:w="120" w:type="dxa"/>
+              <w:bottom w:w="80" w:type="dxa"/>
+              <w:end w:w="120" w:type="dxa"/>
+            </w:tcMar>
+            <w:vAlign w:val="center"/>
+            <w:shd w:fill="FFFFFF"/>
+          </w:tcPr>
+          <w:p>
+            <w:pPr>
+              <w:spacing w:before="0" w:after="40" w:line="252" w:lineRule="auto"/>
+              <w:jc w:val="left"/>
+            </w:pPr>
+            <w:r>
+              <w:rPr>
+                <w:rFonts w:ascii="Calibri" w:hAnsi="Calibri"/>
+                <w:b w:val="0"/>
+                <w:color w:val="111827"/>
+                <w:sz w:val="17"/>
+              </w:rPr>
+              <w:t>Commit definition/state/control, command, audit, and outbox evidence together.</w:t>
+            </w:r>
+          </w:p>
+        </w:tc>
+        <w:tc>
+          <w:tcPr>
+            <w:tcW w:type="dxa" w:w="3260"/>
+            <w:tcMar>
+              <w:top w:w="80" w:type="dxa"/>
+              <w:start w:w="120" w:type="dxa"/>
+              <w:bottom w:w="80" w:type="dxa"/>
+              <w:end w:w="120" w:type="dxa"/>
+            </w:tcMar>
+            <w:vAlign w:val="center"/>
+            <w:shd w:fill="FFFFFF"/>
+          </w:tcPr>
+          <w:p>
+            <w:pPr>
+              <w:spacing w:before="0" w:after="40" w:line="252" w:lineRule="auto"/>
+              <w:jc w:val="left"/>
+            </w:pPr>
+            <w:r>
+              <w:rPr>
+                <w:rFonts w:ascii="Calibri" w:hAnsi="Calibri"/>
+                <w:b w:val="0"/>
+                <w:color w:val="111827"/>
+                <w:sz w:val="17"/>
+              </w:rPr>
+              <w:t>Integration</w:t>
+            </w:r>
+          </w:p>
+        </w:tc>
+      </w:tr>
     </w:tbl>
     <w:p>
       <w:pPr>
@@ -8409,6 +10720,39 @@
           <w:sz w:val="22"/>
         </w:rPr>
         <w:t xml:space="preserve"> owns typed DID persistence and versioning.</w:t>
+      </w:r>
+    </w:p>
+    <w:p>
+      <w:pPr>
+        <w:pStyle w:val="ListBullet"/>
+        <w:numPr>
+          <w:ilvl w:val="0"/>
+          <w:numId w:val="13"/>
+        </w:numPr>
+      </w:pPr>
+      <w:r>
+        <w:rPr>
+          <w:rFonts w:ascii="Calibri" w:hAnsi="Calibri"/>
+          <w:color w:val="111827"/>
+          <w:sz w:val="22"/>
+        </w:rPr>
+        <w:t xml:space="preserve">Migration </w:t>
+      </w:r>
+      <w:r>
+        <w:rPr>
+          <w:rFonts w:ascii="Consolas" w:hAnsi="Consolas"/>
+          <w:color w:val="1F4D78"/>
+          <w:sz w:val="19"/>
+        </w:rPr>
+        <w:t>0033_diagnostic_routines</w:t>
+      </w:r>
+      <w:r>
+        <w:rPr>
+          <w:rFonts w:ascii="Calibri" w:hAnsi="Calibri"/>
+          <w:color w:val="111827"/>
+          <w:sz w:val="22"/>
+        </w:rPr>
+        <w:t xml:space="preserve"> owns routine definitions and execution states.</w:t>
       </w:r>
     </w:p>
     <w:p>
@@ -8634,6 +10978,55 @@
     </w:p>
     <w:p>
       <w:pPr>
+        <w:pStyle w:val="ListBullet"/>
+        <w:numPr>
+          <w:ilvl w:val="0"/>
+          <w:numId w:val="13"/>
+        </w:numPr>
+      </w:pPr>
+      <w:r>
+        <w:rPr>
+          <w:rFonts w:ascii="Calibri" w:hAnsi="Calibri"/>
+          <w:color w:val="111827"/>
+          <w:sz w:val="22"/>
+        </w:rPr>
+        <w:t xml:space="preserve">Routine events are </w:t>
+      </w:r>
+      <w:r>
+        <w:rPr>
+          <w:rFonts w:ascii="Consolas" w:hAnsi="Consolas"/>
+          <w:color w:val="1F4D78"/>
+          <w:sz w:val="19"/>
+        </w:rPr>
+        <w:t>atep.diagnostics.routine.created.v1</w:t>
+      </w:r>
+      <w:r>
+        <w:rPr>
+          <w:rFonts w:ascii="Calibri" w:hAnsi="Calibri"/>
+          <w:color w:val="111827"/>
+          <w:sz w:val="22"/>
+        </w:rPr>
+        <w:t xml:space="preserve"> and </w:t>
+      </w:r>
+      <w:r>
+        <w:rPr>
+          <w:rFonts w:ascii="Consolas" w:hAnsi="Consolas"/>
+          <w:color w:val="1F4D78"/>
+          <w:sz w:val="19"/>
+        </w:rPr>
+        <w:t>atep.diagnostics.routine.controlled.v1</w:t>
+      </w:r>
+      <w:r>
+        <w:rPr>
+          <w:rFonts w:ascii="Calibri" w:hAnsi="Calibri"/>
+          <w:color w:val="111827"/>
+          <w:sz w:val="22"/>
+        </w:rPr>
+        <w:t>.</w:t>
+      </w:r>
+    </w:p>
+    <w:p>
+      <w:pPr>
         <w:pStyle w:val="Heading1"/>
         <w:keepNext/>
         <w:keepLines/>
@@ -8656,7 +11049,7 @@
           <w:color w:val="111827"/>
           <w:sz w:val="22"/>
         </w:rPr>
-        <w:t>V-1/V-2 expose semantic UDS operations but do not yet encode wire PDUs.</w:t>
+        <w:t>V-1 through V-3 expose semantic UDS operations but do not yet encode wire PDUs.</w:t>
       </w:r>
     </w:p>
     <w:p>
@@ -8746,6 +11139,23 @@
     </w:p>
     <w:p>
       <w:pPr>
+        <w:pStyle w:val="ListBullet"/>
+        <w:numPr>
+          <w:ilvl w:val="0"/>
+          <w:numId w:val="14"/>
+        </w:numPr>
+      </w:pPr>
+      <w:r>
+        <w:rPr>
+          <w:rFonts w:ascii="Calibri" w:hAnsi="Calibri"/>
+          <w:color w:val="111827"/>
+          <w:sz w:val="22"/>
+        </w:rPr>
+        <w:t>Routine result templates are deterministic fixtures; future routines may require pluggable ECU behavior and explicit failure results.</w:t>
+      </w:r>
+    </w:p>
+    <w:p>
+      <w:pPr>
         <w:pStyle w:val="Heading1"/>
         <w:keepNext/>
         <w:keepLines/>
@@ -8761,7 +11171,7 @@
           <w:color w:val="111827"/>
           <w:sz w:val="22"/>
         </w:rPr>
-        <w:t>V-1 and V-2 are implemented. The recommended next development is V-3: Routine Control (</w:t>
+        <w:t>V-1 through V-3 are implemented. The recommended next development is V-4: Security Access (</w:t>
       </w:r>
       <w:r>
         <w:rPr>
@@ -8769,7 +11179,7 @@
           <w:color w:val="1F4D78"/>
           <w:sz w:val="19"/>
         </w:rPr>
-        <w:t>0x31</w:t>
+        <w:t>0x27</w:t>
       </w:r>
       <w:r>
         <w:rPr>
@@ -8777,7 +11187,7 @@
           <w:color w:val="111827"/>
           <w:sz w:val="22"/>
         </w:rPr>
-        <w:t>) with a typed routine catalogue, deterministic state transitions, bounded execution evidence, and session-aware authorization.</w:t>
+        <w:t>) with deterministic seeds, bounded key attempts, logical-time lockout, exact replay, and strict exclusion of secrets from logs, audit, events, and responses beyond the authorized exchange.</w:t>
       </w:r>
     </w:p>
     <w:p>
@@ -9322,6 +11732,158 @@
         <w:t xml:space="preserve"> retry and prove the DID version increments only once.</w:t>
       </w:r>
     </w:p>
+    <w:p>
+      <w:pPr>
+        <w:pStyle w:val="ListNumber"/>
+        <w:numPr>
+          <w:ilvl w:val="0"/>
+          <w:numId w:val="15"/>
+        </w:numPr>
+      </w:pPr>
+      <w:r>
+        <w:rPr>
+          <w:rFonts w:ascii="Calibri" w:hAnsi="Calibri"/>
+          <w:color w:val="111827"/>
+          <w:sz w:val="22"/>
+        </w:rPr>
+        <w:t xml:space="preserve">Calculate the positive response identity for Routine Control </w:t>
+      </w:r>
+      <w:r>
+        <w:rPr>
+          <w:rFonts w:ascii="Consolas" w:hAnsi="Consolas"/>
+          <w:color w:val="1F4D78"/>
+          <w:sz w:val="19"/>
+        </w:rPr>
+        <w:t>0x31</w:t>
+      </w:r>
+      <w:r>
+        <w:rPr>
+          <w:rFonts w:ascii="Calibri" w:hAnsi="Calibri"/>
+          <w:color w:val="111827"/>
+          <w:sz w:val="22"/>
+        </w:rPr>
+        <w:t>.</w:t>
+      </w:r>
+    </w:p>
+    <w:p>
+      <w:pPr>
+        <w:pStyle w:val="ListNumber"/>
+        <w:numPr>
+          <w:ilvl w:val="0"/>
+          <w:numId w:val="15"/>
+        </w:numPr>
+      </w:pPr>
+      <w:r>
+        <w:rPr>
+          <w:rFonts w:ascii="Calibri" w:hAnsi="Calibri"/>
+          <w:color w:val="111827"/>
+          <w:sz w:val="22"/>
+        </w:rPr>
+        <w:t>Trace startRoutine from RBAC through session authorization, version checks, state, audit, and outbox.</w:t>
+      </w:r>
+    </w:p>
+    <w:p>
+      <w:pPr>
+        <w:pStyle w:val="ListNumber"/>
+        <w:numPr>
+          <w:ilvl w:val="0"/>
+          <w:numId w:val="15"/>
+        </w:numPr>
+      </w:pPr>
+      <w:r>
+        <w:rPr>
+          <w:rFonts w:ascii="Calibri" w:hAnsi="Calibri"/>
+          <w:color w:val="111827"/>
+          <w:sz w:val="22"/>
+        </w:rPr>
+        <w:t>Explain why routine completion uses ECU logical time instead of a background timer.</w:t>
+      </w:r>
+    </w:p>
+    <w:p>
+      <w:pPr>
+        <w:pStyle w:val="ListNumber"/>
+        <w:numPr>
+          <w:ilvl w:val="0"/>
+          <w:numId w:val="15"/>
+        </w:numPr>
+      </w:pPr>
+      <w:r>
+        <w:rPr>
+          <w:rFonts w:ascii="Calibri" w:hAnsi="Calibri"/>
+          <w:color w:val="111827"/>
+          <w:sz w:val="22"/>
+        </w:rPr>
+        <w:t>Design tests for stopRoutine when stop is supported, unsupported, or the routine is not running.</w:t>
+      </w:r>
+    </w:p>
+    <w:p>
+      <w:pPr>
+        <w:pStyle w:val="ListNumber"/>
+        <w:numPr>
+          <w:ilvl w:val="0"/>
+          <w:numId w:val="15"/>
+        </w:numPr>
+      </w:pPr>
+      <w:r>
+        <w:rPr>
+          <w:rFonts w:ascii="Calibri" w:hAnsi="Calibri"/>
+          <w:color w:val="111827"/>
+          <w:sz w:val="22"/>
+        </w:rPr>
+        <w:t>Prove that a repeated start command does not increment invocation count twice.</w:t>
+      </w:r>
+    </w:p>
+    <w:p>
+      <w:pPr>
+        <w:pStyle w:val="ListNumber"/>
+        <w:numPr>
+          <w:ilvl w:val="0"/>
+          <w:numId w:val="15"/>
+        </w:numPr>
+      </w:pPr>
+      <w:r>
+        <w:rPr>
+          <w:rFonts w:ascii="Calibri" w:hAnsi="Calibri"/>
+          <w:color w:val="111827"/>
+          <w:sz w:val="22"/>
+        </w:rPr>
+        <w:t>Compare definition version and execution-state version for an ECU routine.</w:t>
+      </w:r>
+    </w:p>
+    <w:p>
+      <w:pPr>
+        <w:pStyle w:val="ListNumber"/>
+        <w:numPr>
+          <w:ilvl w:val="0"/>
+          <w:numId w:val="15"/>
+        </w:numPr>
+      </w:pPr>
+      <w:r>
+        <w:rPr>
+          <w:rFonts w:ascii="Calibri" w:hAnsi="Calibri"/>
+          <w:color w:val="111827"/>
+          <w:sz w:val="22"/>
+        </w:rPr>
+        <w:t>Explain why parameters/results are protected while status/version evidence may be shared.</w:t>
+      </w:r>
+    </w:p>
+    <w:p>
+      <w:pPr>
+        <w:pStyle w:val="ListNumber"/>
+        <w:numPr>
+          <w:ilvl w:val="0"/>
+          <w:numId w:val="15"/>
+        </w:numPr>
+      </w:pPr>
+      <w:r>
+        <w:rPr>
+          <w:rFonts w:ascii="Calibri" w:hAnsi="Calibri"/>
+          <w:color w:val="111827"/>
+          <w:sz w:val="22"/>
+        </w:rPr>
+        <w:t>Design a battery-balancing routine and its allowed diagnostic sessions.</w:t>
+      </w:r>
+    </w:p>
     <w:sectPr>
       <w:headerReference w:type="default" r:id="rId9"/>
       <w:footerReference w:type="default" r:id="rId10"/>
@@ -9351,7 +11913,7 @@
         <w:color w:val="667085"/>
         <w:sz w:val="17"/>
       </w:rPr>
-      <w:t>ATEP Volume V Workbook  |  Version 0.2.0</w:t>
+      <w:t>ATEP Volume V Workbook  |  Version 0.3.0</w:t>
     </w:r>
     <w:r>
       <w:rPr>

</xml_diff>

<commit_message>
feat(diagnostics): implement UDS security access
</commit_message>
<xml_diff>
--- a/docs/ATEP_Volume_V_Diagnostics_Engineering_Workbook.docx
+++ b/docs/ATEP_Volume_V_Diagnostics_Engineering_Workbook.docx
@@ -143,7 +143,7 @@
                 <w:color w:val="0B2545"/>
                 <w:sz w:val="19"/>
               </w:rPr>
-              <w:t>0.3.0</w:t>
+              <w:t>0.4.0</w:t>
             </w:r>
           </w:p>
         </w:tc>
@@ -204,7 +204,7 @@
                 <w:color w:val="111827"/>
                 <w:sz w:val="19"/>
               </w:rPr>
-              <w:t>25 August 2026</w:t>
+              <w:t>28 August 2026</w:t>
             </w:r>
           </w:p>
         </w:tc>
@@ -265,7 +265,7 @@
                 <w:color w:val="111827"/>
                 <w:sz w:val="19"/>
               </w:rPr>
-              <w:t>Implemented increments: V-1 through V-3</w:t>
+              <w:t>Implemented increments: V-1 through V-4</w:t>
             </w:r>
           </w:p>
         </w:tc>
@@ -893,7 +893,7 @@
                 <w:color w:val="111827"/>
                 <w:sz w:val="17"/>
               </w:rPr>
-              <w:t>Increments V-1 through V-3</w:t>
+              <w:t>Increments V-1 through V-4</w:t>
             </w:r>
           </w:p>
         </w:tc>
@@ -1579,6 +1579,113 @@
                 <w:sz w:val="17"/>
               </w:rPr>
               <w:t>, deterministic logical-time execution, start/stop/result subfunctions, versioned replay, minimized evidence, migration, APIs, and tests.</w:t>
+            </w:r>
+          </w:p>
+        </w:tc>
+      </w:tr>
+      <w:tr>
+        <w:trPr>
+          <w:cantSplit/>
+        </w:trPr>
+        <w:tc>
+          <w:tcPr>
+            <w:tcW w:type="dxa" w:w="1650"/>
+            <w:tcMar>
+              <w:top w:w="80" w:type="dxa"/>
+              <w:start w:w="120" w:type="dxa"/>
+              <w:bottom w:w="80" w:type="dxa"/>
+              <w:end w:w="120" w:type="dxa"/>
+            </w:tcMar>
+            <w:vAlign w:val="center"/>
+            <w:shd w:fill="FFFFFF"/>
+          </w:tcPr>
+          <w:p>
+            <w:pPr>
+              <w:spacing w:before="0" w:after="40" w:line="252" w:lineRule="auto"/>
+              <w:jc w:val="center"/>
+            </w:pPr>
+            <w:r>
+              <w:rPr>
+                <w:rFonts w:ascii="Calibri" w:hAnsi="Calibri"/>
+                <w:b w:val="0"/>
+                <w:color w:val="111827"/>
+                <w:sz w:val="17"/>
+              </w:rPr>
+              <w:t>0.4.0</w:t>
+            </w:r>
+          </w:p>
+        </w:tc>
+        <w:tc>
+          <w:tcPr>
+            <w:tcW w:type="dxa" w:w="4450"/>
+            <w:tcMar>
+              <w:top w:w="80" w:type="dxa"/>
+              <w:start w:w="120" w:type="dxa"/>
+              <w:bottom w:w="80" w:type="dxa"/>
+              <w:end w:w="120" w:type="dxa"/>
+            </w:tcMar>
+            <w:vAlign w:val="center"/>
+            <w:shd w:fill="FFFFFF"/>
+          </w:tcPr>
+          <w:p>
+            <w:pPr>
+              <w:spacing w:before="0" w:after="40" w:line="252" w:lineRule="auto"/>
+              <w:jc w:val="left"/>
+            </w:pPr>
+            <w:r>
+              <w:rPr>
+                <w:rFonts w:ascii="Calibri" w:hAnsi="Calibri"/>
+                <w:b w:val="0"/>
+                <w:color w:val="111827"/>
+                <w:sz w:val="17"/>
+              </w:rPr>
+              <w:t>2026-08-28</w:t>
+            </w:r>
+          </w:p>
+        </w:tc>
+        <w:tc>
+          <w:tcPr>
+            <w:tcW w:type="dxa" w:w="3260"/>
+            <w:tcMar>
+              <w:top w:w="80" w:type="dxa"/>
+              <w:start w:w="120" w:type="dxa"/>
+              <w:bottom w:w="80" w:type="dxa"/>
+              <w:end w:w="120" w:type="dxa"/>
+            </w:tcMar>
+            <w:vAlign w:val="center"/>
+            <w:shd w:fill="FFFFFF"/>
+          </w:tcPr>
+          <w:p>
+            <w:pPr>
+              <w:spacing w:before="0" w:after="40" w:line="252" w:lineRule="auto"/>
+              <w:jc w:val="left"/>
+            </w:pPr>
+            <w:r>
+              <w:rPr>
+                <w:rFonts w:ascii="Calibri" w:hAnsi="Calibri"/>
+                <w:b w:val="0"/>
+                <w:color w:val="111827"/>
+                <w:sz w:val="17"/>
+              </w:rPr>
+              <w:t xml:space="preserve">Added UDS Security Access </w:t>
+            </w:r>
+            <w:r>
+              <w:rPr>
+                <w:rFonts w:ascii="Calibri" w:hAnsi="Calibri"/>
+                <w:b w:val="0"/>
+                <w:color w:val="111827"/>
+                <w:sz w:val="17"/>
+              </w:rPr>
+              <w:t>0x27</w:t>
+            </w:r>
+            <w:r>
+              <w:rPr>
+                <w:rFonts w:ascii="Calibri" w:hAnsi="Calibri"/>
+                <w:b w:val="0"/>
+                <w:color w:val="111827"/>
+                <w:sz w:val="17"/>
+              </w:rPr>
+              <w:t>, deterministic level-1 seed/key exchange, logical-time expiry and lockout, idempotent negative evidence, secret minimization, migration, APIs, and tests.</w:t>
             </w:r>
           </w:p>
         </w:tc>
@@ -1931,6 +2038,74 @@
     </w:p>
     <w:p>
       <w:pPr>
+        <w:pStyle w:val="ListBullet"/>
+        <w:numPr>
+          <w:ilvl w:val="0"/>
+          <w:numId w:val="11"/>
+        </w:numPr>
+      </w:pPr>
+      <w:r>
+        <w:rPr>
+          <w:rFonts w:ascii="Calibri" w:hAnsi="Calibri"/>
+          <w:color w:val="111827"/>
+          <w:sz w:val="22"/>
+        </w:rPr>
+        <w:t>Level-1 requestSeed/sendKey Security Access in programming and extended sessions.</w:t>
+      </w:r>
+    </w:p>
+    <w:p>
+      <w:pPr>
+        <w:pStyle w:val="ListBullet"/>
+        <w:numPr>
+          <w:ilvl w:val="0"/>
+          <w:numId w:val="11"/>
+        </w:numPr>
+      </w:pPr>
+      <w:r>
+        <w:rPr>
+          <w:rFonts w:ascii="Calibri" w:hAnsi="Calibri"/>
+          <w:color w:val="111827"/>
+          <w:sz w:val="22"/>
+        </w:rPr>
+        <w:t>Three-attempt lockout, seed expiry, and required delay based on ECU logical time.</w:t>
+      </w:r>
+    </w:p>
+    <w:p>
+      <w:pPr>
+        <w:pStyle w:val="ListBullet"/>
+        <w:numPr>
+          <w:ilvl w:val="0"/>
+          <w:numId w:val="11"/>
+        </w:numPr>
+      </w:pPr>
+      <w:r>
+        <w:rPr>
+          <w:rFonts w:ascii="Calibri" w:hAnsi="Calibri"/>
+          <w:color w:val="111827"/>
+          <w:sz w:val="22"/>
+        </w:rPr>
+        <w:t>Masked raw-key input, digest-only protected state, and seed/key-minimized shared evidence.</w:t>
+      </w:r>
+    </w:p>
+    <w:p>
+      <w:pPr>
+        <w:pStyle w:val="ListBullet"/>
+        <w:numPr>
+          <w:ilvl w:val="0"/>
+          <w:numId w:val="11"/>
+        </w:numPr>
+      </w:pPr>
+      <w:r>
+        <w:rPr>
+          <w:rFonts w:ascii="Calibri" w:hAnsi="Calibri"/>
+          <w:color w:val="111827"/>
+          <w:sz w:val="22"/>
+        </w:rPr>
+        <w:t>Exact replay for accepted and denied Security Access commands.</w:t>
+      </w:r>
+    </w:p>
+    <w:p>
+      <w:pPr>
         <w:pStyle w:val="Heading2"/>
         <w:keepNext/>
         <w:keepLines/>
@@ -1970,7 +2145,7 @@
           <w:color w:val="111827"/>
           <w:sz w:val="22"/>
         </w:rPr>
-        <w:t>Security Access, ECU Reset, and flash transfer services.</w:t>
+        <w:t>ECU Reset and flash transfer services.</w:t>
       </w:r>
     </w:p>
     <w:p>
@@ -2061,7 +2236,7 @@
           <w:color w:val="111827"/>
           <w:sz w:val="22"/>
         </w:rPr>
-        <w:t xml:space="preserve"> stores ECU ownership, current session, security level, optimistic version, and ECU logical time. Security level is zero in V-1 and is reserved for V-4.</w:t>
+        <w:t xml:space="preserve"> stores ECU ownership, current session, security level, optimistic version, and ECU logical time. It started at zero in V-1; V-4 can raise it to level 1 after a successful Security Access exchange, while every session change resets it to zero.</w:t>
       </w:r>
     </w:p>
     <w:p>
@@ -2153,6 +2328,40 @@
       </w:r>
     </w:p>
     <w:p>
+      <w:r>
+        <w:rPr>
+          <w:rFonts w:ascii="Consolas" w:hAnsi="Consolas"/>
+          <w:color w:val="1F4D78"/>
+          <w:sz w:val="19"/>
+        </w:rPr>
+        <w:t>DiagnosticSecurityState</w:t>
+      </w:r>
+      <w:r>
+        <w:rPr>
+          <w:rFonts w:ascii="Calibri" w:hAnsi="Calibri"/>
+          <w:color w:val="111827"/>
+          <w:sz w:val="22"/>
+        </w:rPr>
+        <w:t xml:space="preserve"> stores one ECU-local challenge counter, expected-key digest, seed expiry, invalid-attempt count, logical lockout deadline, target level, and optimistic version. It never stores a raw key. The current unlocked security level remains on </w:t>
+      </w:r>
+      <w:r>
+        <w:rPr>
+          <w:rFonts w:ascii="Consolas" w:hAnsi="Consolas"/>
+          <w:color w:val="1F4D78"/>
+          <w:sz w:val="19"/>
+        </w:rPr>
+        <w:t>DiagnosticSessionState</w:t>
+      </w:r>
+      <w:r>
+        <w:rPr>
+          <w:rFonts w:ascii="Calibri" w:hAnsi="Calibri"/>
+          <w:color w:val="111827"/>
+          <w:sz w:val="22"/>
+        </w:rPr>
+        <w:t>, so a session change can reset authorization without rewriting challenge history.</w:t>
+      </w:r>
+    </w:p>
+    <w:p>
       <w:pPr>
         <w:pStyle w:val="Heading1"/>
         <w:keepNext/>
@@ -4179,6 +4388,258 @@
                 <w:sz w:val="16"/>
               </w:rPr>
               <w:t xml:space="preserve"> start, stop, or result request.</w:t>
+            </w:r>
+          </w:p>
+        </w:tc>
+      </w:tr>
+      <w:tr>
+        <w:trPr>
+          <w:cantSplit/>
+        </w:trPr>
+        <w:tc>
+          <w:tcPr>
+            <w:tcW w:type="dxa" w:w="1150"/>
+            <w:tcMar>
+              <w:top w:w="80" w:type="dxa"/>
+              <w:start w:w="120" w:type="dxa"/>
+              <w:bottom w:w="80" w:type="dxa"/>
+              <w:end w:w="120" w:type="dxa"/>
+            </w:tcMar>
+            <w:vAlign w:val="center"/>
+            <w:shd w:fill="FFFFFF"/>
+          </w:tcPr>
+          <w:p>
+            <w:pPr>
+              <w:spacing w:before="0" w:after="40" w:line="252" w:lineRule="auto"/>
+              <w:jc w:val="center"/>
+            </w:pPr>
+            <w:r>
+              <w:rPr>
+                <w:rFonts w:ascii="Calibri" w:hAnsi="Calibri"/>
+                <w:b w:val="0"/>
+                <w:color w:val="111827"/>
+                <w:sz w:val="16"/>
+              </w:rPr>
+              <w:t>GET</w:t>
+            </w:r>
+          </w:p>
+        </w:tc>
+        <w:tc>
+          <w:tcPr>
+            <w:tcW w:type="dxa" w:w="3700"/>
+            <w:tcMar>
+              <w:top w:w="80" w:type="dxa"/>
+              <w:start w:w="120" w:type="dxa"/>
+              <w:bottom w:w="80" w:type="dxa"/>
+              <w:end w:w="120" w:type="dxa"/>
+            </w:tcMar>
+            <w:vAlign w:val="center"/>
+            <w:shd w:fill="FFFFFF"/>
+          </w:tcPr>
+          <w:p>
+            <w:pPr>
+              <w:spacing w:before="0" w:after="40" w:line="252" w:lineRule="auto"/>
+              <w:jc w:val="left"/>
+            </w:pPr>
+            <w:r>
+              <w:rPr>
+                <w:rFonts w:ascii="Calibri" w:hAnsi="Calibri"/>
+                <w:b w:val="0"/>
+                <w:color w:val="111827"/>
+                <w:sz w:val="16"/>
+              </w:rPr>
+              <w:t>/api/v1/vehicles/{vehicle_id}/ecus/{ecu_id}/diagnostics/security-access/state</w:t>
+            </w:r>
+          </w:p>
+        </w:tc>
+        <w:tc>
+          <w:tcPr>
+            <w:tcW w:type="dxa" w:w="3100"/>
+            <w:tcMar>
+              <w:top w:w="80" w:type="dxa"/>
+              <w:start w:w="120" w:type="dxa"/>
+              <w:bottom w:w="80" w:type="dxa"/>
+              <w:end w:w="120" w:type="dxa"/>
+            </w:tcMar>
+            <w:vAlign w:val="center"/>
+            <w:shd w:fill="FFFFFF"/>
+          </w:tcPr>
+          <w:p>
+            <w:pPr>
+              <w:spacing w:before="0" w:after="40" w:line="252" w:lineRule="auto"/>
+              <w:jc w:val="left"/>
+            </w:pPr>
+            <w:r>
+              <w:rPr>
+                <w:rFonts w:ascii="Calibri" w:hAnsi="Calibri"/>
+                <w:b w:val="0"/>
+                <w:color w:val="111827"/>
+                <w:sz w:val="16"/>
+              </w:rPr>
+              <w:t>diagnostics:read</w:t>
+            </w:r>
+          </w:p>
+        </w:tc>
+        <w:tc>
+          <w:tcPr>
+            <w:tcW w:type="dxa" w:w="1410"/>
+            <w:tcMar>
+              <w:top w:w="80" w:type="dxa"/>
+              <w:start w:w="120" w:type="dxa"/>
+              <w:bottom w:w="80" w:type="dxa"/>
+              <w:end w:w="120" w:type="dxa"/>
+            </w:tcMar>
+            <w:vAlign w:val="center"/>
+            <w:shd w:fill="FFFFFF"/>
+          </w:tcPr>
+          <w:p>
+            <w:pPr>
+              <w:spacing w:before="0" w:after="40" w:line="252" w:lineRule="auto"/>
+              <w:jc w:val="left"/>
+            </w:pPr>
+            <w:r>
+              <w:rPr>
+                <w:rFonts w:ascii="Calibri" w:hAnsi="Calibri"/>
+                <w:b w:val="0"/>
+                <w:color w:val="111827"/>
+                <w:sz w:val="16"/>
+              </w:rPr>
+              <w:t>Retrieve non-secret version, attempt, lockout, and challenge status.</w:t>
+            </w:r>
+          </w:p>
+        </w:tc>
+      </w:tr>
+      <w:tr>
+        <w:trPr>
+          <w:cantSplit/>
+        </w:trPr>
+        <w:tc>
+          <w:tcPr>
+            <w:tcW w:type="dxa" w:w="1150"/>
+            <w:tcMar>
+              <w:top w:w="80" w:type="dxa"/>
+              <w:start w:w="120" w:type="dxa"/>
+              <w:bottom w:w="80" w:type="dxa"/>
+              <w:end w:w="120" w:type="dxa"/>
+            </w:tcMar>
+            <w:vAlign w:val="center"/>
+            <w:shd w:fill="FFFFFF"/>
+          </w:tcPr>
+          <w:p>
+            <w:pPr>
+              <w:spacing w:before="0" w:after="40" w:line="252" w:lineRule="auto"/>
+              <w:jc w:val="center"/>
+            </w:pPr>
+            <w:r>
+              <w:rPr>
+                <w:rFonts w:ascii="Calibri" w:hAnsi="Calibri"/>
+                <w:b w:val="0"/>
+                <w:color w:val="111827"/>
+                <w:sz w:val="16"/>
+              </w:rPr>
+              <w:t>POST</w:t>
+            </w:r>
+          </w:p>
+        </w:tc>
+        <w:tc>
+          <w:tcPr>
+            <w:tcW w:type="dxa" w:w="3700"/>
+            <w:tcMar>
+              <w:top w:w="80" w:type="dxa"/>
+              <w:start w:w="120" w:type="dxa"/>
+              <w:bottom w:w="80" w:type="dxa"/>
+              <w:end w:w="120" w:type="dxa"/>
+            </w:tcMar>
+            <w:vAlign w:val="center"/>
+            <w:shd w:fill="FFFFFF"/>
+          </w:tcPr>
+          <w:p>
+            <w:pPr>
+              <w:spacing w:before="0" w:after="40" w:line="252" w:lineRule="auto"/>
+              <w:jc w:val="left"/>
+            </w:pPr>
+            <w:r>
+              <w:rPr>
+                <w:rFonts w:ascii="Calibri" w:hAnsi="Calibri"/>
+                <w:b w:val="0"/>
+                <w:color w:val="111827"/>
+                <w:sz w:val="16"/>
+              </w:rPr>
+              <w:t>/api/v1/vehicles/{vehicle_id}/ecus/{ecu_id}/diagnostics/security-access</w:t>
+            </w:r>
+          </w:p>
+        </w:tc>
+        <w:tc>
+          <w:tcPr>
+            <w:tcW w:type="dxa" w:w="3100"/>
+            <w:tcMar>
+              <w:top w:w="80" w:type="dxa"/>
+              <w:start w:w="120" w:type="dxa"/>
+              <w:bottom w:w="80" w:type="dxa"/>
+              <w:end w:w="120" w:type="dxa"/>
+            </w:tcMar>
+            <w:vAlign w:val="center"/>
+            <w:shd w:fill="FFFFFF"/>
+          </w:tcPr>
+          <w:p>
+            <w:pPr>
+              <w:spacing w:before="0" w:after="40" w:line="252" w:lineRule="auto"/>
+              <w:jc w:val="left"/>
+            </w:pPr>
+            <w:r>
+              <w:rPr>
+                <w:rFonts w:ascii="Calibri" w:hAnsi="Calibri"/>
+                <w:b w:val="0"/>
+                <w:color w:val="111827"/>
+                <w:sz w:val="16"/>
+              </w:rPr>
+              <w:t>diagnostics:manage</w:t>
+            </w:r>
+          </w:p>
+        </w:tc>
+        <w:tc>
+          <w:tcPr>
+            <w:tcW w:type="dxa" w:w="1410"/>
+            <w:tcMar>
+              <w:top w:w="80" w:type="dxa"/>
+              <w:start w:w="120" w:type="dxa"/>
+              <w:bottom w:w="80" w:type="dxa"/>
+              <w:end w:w="120" w:type="dxa"/>
+            </w:tcMar>
+            <w:vAlign w:val="center"/>
+            <w:shd w:fill="FFFFFF"/>
+          </w:tcPr>
+          <w:p>
+            <w:pPr>
+              <w:spacing w:before="0" w:after="40" w:line="252" w:lineRule="auto"/>
+              <w:jc w:val="left"/>
+            </w:pPr>
+            <w:r>
+              <w:rPr>
+                <w:rFonts w:ascii="Calibri" w:hAnsi="Calibri"/>
+                <w:b w:val="0"/>
+                <w:color w:val="111827"/>
+                <w:sz w:val="16"/>
+              </w:rPr>
+              <w:t xml:space="preserve">Execute UDS </w:t>
+            </w:r>
+            <w:r>
+              <w:rPr>
+                <w:rFonts w:ascii="Calibri" w:hAnsi="Calibri"/>
+                <w:b w:val="0"/>
+                <w:color w:val="111827"/>
+                <w:sz w:val="16"/>
+              </w:rPr>
+              <w:t>0x27</w:t>
+            </w:r>
+            <w:r>
+              <w:rPr>
+                <w:rFonts w:ascii="Calibri" w:hAnsi="Calibri"/>
+                <w:b w:val="0"/>
+                <w:color w:val="111827"/>
+                <w:sz w:val="16"/>
+              </w:rPr>
+              <w:t xml:space="preserve"> requestSeed or sendKey.</w:t>
             </w:r>
           </w:p>
         </w:tc>
@@ -4497,6 +4958,138 @@
     </w:p>
     <w:p>
       <w:pPr>
+        <w:pStyle w:val="Heading2"/>
+        <w:keepNext/>
+        <w:keepLines/>
+      </w:pPr>
+      <w:r>
+        <w:t>8.7 Security Access (`0x27`)</w:t>
+      </w:r>
+    </w:p>
+    <w:p>
+      <w:r>
+        <w:rPr>
+          <w:rFonts w:ascii="Calibri" w:hAnsi="Calibri"/>
+          <w:color w:val="111827"/>
+          <w:sz w:val="22"/>
+        </w:rPr>
+        <w:t>V-4 supports level-1 requestSeed (</w:t>
+      </w:r>
+      <w:r>
+        <w:rPr>
+          <w:rFonts w:ascii="Consolas" w:hAnsi="Consolas"/>
+          <w:color w:val="1F4D78"/>
+          <w:sz w:val="19"/>
+        </w:rPr>
+        <w:t>0x01</w:t>
+      </w:r>
+      <w:r>
+        <w:rPr>
+          <w:rFonts w:ascii="Calibri" w:hAnsi="Calibri"/>
+          <w:color w:val="111827"/>
+          <w:sz w:val="22"/>
+        </w:rPr>
+        <w:t>) and sendKey (</w:t>
+      </w:r>
+      <w:r>
+        <w:rPr>
+          <w:rFonts w:ascii="Consolas" w:hAnsi="Consolas"/>
+          <w:color w:val="1F4D78"/>
+          <w:sz w:val="19"/>
+        </w:rPr>
+        <w:t>0x02</w:t>
+      </w:r>
+      <w:r>
+        <w:rPr>
+          <w:rFonts w:ascii="Calibri" w:hAnsi="Calibri"/>
+          <w:color w:val="111827"/>
+          <w:sz w:val="22"/>
+        </w:rPr>
+        <w:t xml:space="preserve">) in programming and extended sessions. A seed is deterministically generated from ECU identity, challenge counter, logical time, and state version; it expires after 30,000 logical milliseconds. The raw key is accepted as a masked 16-character secret and immediately reduced to SHA-256 for constant-time comparison. Three invalid keys produce NRC </w:t>
+      </w:r>
+      <w:r>
+        <w:rPr>
+          <w:rFonts w:ascii="Consolas" w:hAnsi="Consolas"/>
+          <w:color w:val="1F4D78"/>
+          <w:sz w:val="19"/>
+        </w:rPr>
+        <w:t>0x36</w:t>
+      </w:r>
+      <w:r>
+        <w:rPr>
+          <w:rFonts w:ascii="Calibri" w:hAnsi="Calibri"/>
+          <w:color w:val="111827"/>
+          <w:sz w:val="22"/>
+        </w:rPr>
+        <w:t xml:space="preserve"> and a 10,000 logical-millisecond delay; attempts during that delay return NRC </w:t>
+      </w:r>
+      <w:r>
+        <w:rPr>
+          <w:rFonts w:ascii="Consolas" w:hAnsi="Consolas"/>
+          <w:color w:val="1F4D78"/>
+          <w:sz w:val="19"/>
+        </w:rPr>
+        <w:t>0x37</w:t>
+      </w:r>
+      <w:r>
+        <w:rPr>
+          <w:rFonts w:ascii="Calibri" w:hAnsi="Calibri"/>
+          <w:color w:val="111827"/>
+          <w:sz w:val="22"/>
+        </w:rPr>
+        <w:t xml:space="preserve">. sendKey without a current challenge returns NRC </w:t>
+      </w:r>
+      <w:r>
+        <w:rPr>
+          <w:rFonts w:ascii="Consolas" w:hAnsi="Consolas"/>
+          <w:color w:val="1F4D78"/>
+          <w:sz w:val="19"/>
+        </w:rPr>
+        <w:t>0x24</w:t>
+      </w:r>
+      <w:r>
+        <w:rPr>
+          <w:rFonts w:ascii="Calibri" w:hAnsi="Calibri"/>
+          <w:color w:val="111827"/>
+          <w:sz w:val="22"/>
+        </w:rPr>
+        <w:t xml:space="preserve">, and an ordinary invalid key returns NRC </w:t>
+      </w:r>
+      <w:r>
+        <w:rPr>
+          <w:rFonts w:ascii="Consolas" w:hAnsi="Consolas"/>
+          <w:color w:val="1F4D78"/>
+          <w:sz w:val="19"/>
+        </w:rPr>
+        <w:t>0x35</w:t>
+      </w:r>
+      <w:r>
+        <w:rPr>
+          <w:rFonts w:ascii="Calibri" w:hAnsi="Calibri"/>
+          <w:color w:val="111827"/>
+          <w:sz w:val="22"/>
+        </w:rPr>
+        <w:t xml:space="preserve">. Successful access raises the session security level to 1 and uses positive response identity </w:t>
+      </w:r>
+      <w:r>
+        <w:rPr>
+          <w:rFonts w:ascii="Consolas" w:hAnsi="Consolas"/>
+          <w:color w:val="1F4D78"/>
+          <w:sz w:val="19"/>
+        </w:rPr>
+        <w:t>0x67</w:t>
+      </w:r>
+      <w:r>
+        <w:rPr>
+          <w:rFonts w:ascii="Calibri" w:hAnsi="Calibri"/>
+          <w:color w:val="111827"/>
+          <w:sz w:val="22"/>
+        </w:rPr>
+        <w:t>. The key derivation helper is intentionally a transparent, deterministic simulator fixture and must not be treated as production ECU cryptography.</w:t>
+      </w:r>
+    </w:p>
+    <w:p>
+      <w:pPr>
         <w:pStyle w:val="Heading1"/>
         <w:keepNext/>
         <w:keepLines/>
@@ -5838,6 +6431,546 @@
                 <w:sz w:val="16"/>
               </w:rPr>
               <w:t xml:space="preserve"> request out of range</w:t>
+            </w:r>
+          </w:p>
+        </w:tc>
+      </w:tr>
+      <w:tr>
+        <w:trPr>
+          <w:cantSplit/>
+        </w:trPr>
+        <w:tc>
+          <w:tcPr>
+            <w:tcW w:type="dxa" w:w="1150"/>
+            <w:tcMar>
+              <w:top w:w="80" w:type="dxa"/>
+              <w:start w:w="120" w:type="dxa"/>
+              <w:bottom w:w="80" w:type="dxa"/>
+              <w:end w:w="120" w:type="dxa"/>
+            </w:tcMar>
+            <w:vAlign w:val="center"/>
+            <w:shd w:fill="FFFFFF"/>
+          </w:tcPr>
+          <w:p>
+            <w:pPr>
+              <w:spacing w:before="0" w:after="40" w:line="252" w:lineRule="auto"/>
+              <w:jc w:val="center"/>
+            </w:pPr>
+            <w:r>
+              <w:rPr>
+                <w:rFonts w:ascii="Calibri" w:hAnsi="Calibri"/>
+                <w:b w:val="0"/>
+                <w:color w:val="111827"/>
+                <w:sz w:val="16"/>
+              </w:rPr>
+              <w:t>sendKey without a valid seed</w:t>
+            </w:r>
+          </w:p>
+        </w:tc>
+        <w:tc>
+          <w:tcPr>
+            <w:tcW w:type="dxa" w:w="3700"/>
+            <w:tcMar>
+              <w:top w:w="80" w:type="dxa"/>
+              <w:start w:w="120" w:type="dxa"/>
+              <w:bottom w:w="80" w:type="dxa"/>
+              <w:end w:w="120" w:type="dxa"/>
+            </w:tcMar>
+            <w:vAlign w:val="center"/>
+            <w:shd w:fill="FFFFFF"/>
+          </w:tcPr>
+          <w:p>
+            <w:pPr>
+              <w:spacing w:before="0" w:after="40" w:line="252" w:lineRule="auto"/>
+              <w:jc w:val="left"/>
+            </w:pPr>
+            <w:r>
+              <w:rPr>
+                <w:rFonts w:ascii="Calibri" w:hAnsi="Calibri"/>
+                <w:b w:val="0"/>
+                <w:color w:val="111827"/>
+                <w:sz w:val="16"/>
+              </w:rPr>
+              <w:t>diagnostic_contract_invalid</w:t>
+            </w:r>
+          </w:p>
+        </w:tc>
+        <w:tc>
+          <w:tcPr>
+            <w:tcW w:type="dxa" w:w="3100"/>
+            <w:tcMar>
+              <w:top w:w="80" w:type="dxa"/>
+              <w:start w:w="120" w:type="dxa"/>
+              <w:bottom w:w="80" w:type="dxa"/>
+              <w:end w:w="120" w:type="dxa"/>
+            </w:tcMar>
+            <w:vAlign w:val="center"/>
+            <w:shd w:fill="FFFFFF"/>
+          </w:tcPr>
+          <w:p>
+            <w:pPr>
+              <w:spacing w:before="0" w:after="40" w:line="252" w:lineRule="auto"/>
+              <w:jc w:val="left"/>
+            </w:pPr>
+            <w:r>
+              <w:rPr>
+                <w:rFonts w:ascii="Calibri" w:hAnsi="Calibri"/>
+                <w:b w:val="0"/>
+                <w:color w:val="111827"/>
+                <w:sz w:val="16"/>
+              </w:rPr>
+              <w:t>422</w:t>
+            </w:r>
+          </w:p>
+        </w:tc>
+        <w:tc>
+          <w:tcPr>
+            <w:tcW w:type="dxa" w:w="1410"/>
+            <w:tcMar>
+              <w:top w:w="80" w:type="dxa"/>
+              <w:start w:w="120" w:type="dxa"/>
+              <w:bottom w:w="80" w:type="dxa"/>
+              <w:end w:w="120" w:type="dxa"/>
+            </w:tcMar>
+            <w:vAlign w:val="center"/>
+            <w:shd w:fill="FFFFFF"/>
+          </w:tcPr>
+          <w:p>
+            <w:pPr>
+              <w:spacing w:before="0" w:after="40" w:line="252" w:lineRule="auto"/>
+              <w:jc w:val="left"/>
+            </w:pPr>
+            <w:r>
+              <w:rPr>
+                <w:rFonts w:ascii="Calibri" w:hAnsi="Calibri"/>
+                <w:b w:val="0"/>
+                <w:color w:val="111827"/>
+                <w:sz w:val="16"/>
+              </w:rPr>
+              <w:t xml:space="preserve">NRC </w:t>
+            </w:r>
+            <w:r>
+              <w:rPr>
+                <w:rFonts w:ascii="Calibri" w:hAnsi="Calibri"/>
+                <w:b w:val="0"/>
+                <w:color w:val="111827"/>
+                <w:sz w:val="16"/>
+              </w:rPr>
+              <w:t>0x24</w:t>
+            </w:r>
+            <w:r>
+              <w:rPr>
+                <w:rFonts w:ascii="Calibri" w:hAnsi="Calibri"/>
+                <w:b w:val="0"/>
+                <w:color w:val="111827"/>
+                <w:sz w:val="16"/>
+              </w:rPr>
+              <w:t xml:space="preserve"> request sequence error</w:t>
+            </w:r>
+          </w:p>
+        </w:tc>
+      </w:tr>
+      <w:tr>
+        <w:trPr>
+          <w:cantSplit/>
+        </w:trPr>
+        <w:tc>
+          <w:tcPr>
+            <w:tcW w:type="dxa" w:w="1150"/>
+            <w:tcMar>
+              <w:top w:w="80" w:type="dxa"/>
+              <w:start w:w="120" w:type="dxa"/>
+              <w:bottom w:w="80" w:type="dxa"/>
+              <w:end w:w="120" w:type="dxa"/>
+            </w:tcMar>
+            <w:vAlign w:val="center"/>
+            <w:shd w:fill="FFFFFF"/>
+          </w:tcPr>
+          <w:p>
+            <w:pPr>
+              <w:spacing w:before="0" w:after="40" w:line="252" w:lineRule="auto"/>
+              <w:jc w:val="center"/>
+            </w:pPr>
+            <w:r>
+              <w:rPr>
+                <w:rFonts w:ascii="Calibri" w:hAnsi="Calibri"/>
+                <w:b w:val="0"/>
+                <w:color w:val="111827"/>
+                <w:sz w:val="16"/>
+              </w:rPr>
+              <w:t>Invalid Security Access key</w:t>
+            </w:r>
+          </w:p>
+        </w:tc>
+        <w:tc>
+          <w:tcPr>
+            <w:tcW w:type="dxa" w:w="3700"/>
+            <w:tcMar>
+              <w:top w:w="80" w:type="dxa"/>
+              <w:start w:w="120" w:type="dxa"/>
+              <w:bottom w:w="80" w:type="dxa"/>
+              <w:end w:w="120" w:type="dxa"/>
+            </w:tcMar>
+            <w:vAlign w:val="center"/>
+            <w:shd w:fill="FFFFFF"/>
+          </w:tcPr>
+          <w:p>
+            <w:pPr>
+              <w:spacing w:before="0" w:after="40" w:line="252" w:lineRule="auto"/>
+              <w:jc w:val="left"/>
+            </w:pPr>
+            <w:r>
+              <w:rPr>
+                <w:rFonts w:ascii="Calibri" w:hAnsi="Calibri"/>
+                <w:b w:val="0"/>
+                <w:color w:val="111827"/>
+                <w:sz w:val="16"/>
+              </w:rPr>
+              <w:t>diagnostic_contract_invalid</w:t>
+            </w:r>
+          </w:p>
+        </w:tc>
+        <w:tc>
+          <w:tcPr>
+            <w:tcW w:type="dxa" w:w="3100"/>
+            <w:tcMar>
+              <w:top w:w="80" w:type="dxa"/>
+              <w:start w:w="120" w:type="dxa"/>
+              <w:bottom w:w="80" w:type="dxa"/>
+              <w:end w:w="120" w:type="dxa"/>
+            </w:tcMar>
+            <w:vAlign w:val="center"/>
+            <w:shd w:fill="FFFFFF"/>
+          </w:tcPr>
+          <w:p>
+            <w:pPr>
+              <w:spacing w:before="0" w:after="40" w:line="252" w:lineRule="auto"/>
+              <w:jc w:val="left"/>
+            </w:pPr>
+            <w:r>
+              <w:rPr>
+                <w:rFonts w:ascii="Calibri" w:hAnsi="Calibri"/>
+                <w:b w:val="0"/>
+                <w:color w:val="111827"/>
+                <w:sz w:val="16"/>
+              </w:rPr>
+              <w:t>422</w:t>
+            </w:r>
+          </w:p>
+        </w:tc>
+        <w:tc>
+          <w:tcPr>
+            <w:tcW w:type="dxa" w:w="1410"/>
+            <w:tcMar>
+              <w:top w:w="80" w:type="dxa"/>
+              <w:start w:w="120" w:type="dxa"/>
+              <w:bottom w:w="80" w:type="dxa"/>
+              <w:end w:w="120" w:type="dxa"/>
+            </w:tcMar>
+            <w:vAlign w:val="center"/>
+            <w:shd w:fill="FFFFFF"/>
+          </w:tcPr>
+          <w:p>
+            <w:pPr>
+              <w:spacing w:before="0" w:after="40" w:line="252" w:lineRule="auto"/>
+              <w:jc w:val="left"/>
+            </w:pPr>
+            <w:r>
+              <w:rPr>
+                <w:rFonts w:ascii="Calibri" w:hAnsi="Calibri"/>
+                <w:b w:val="0"/>
+                <w:color w:val="111827"/>
+                <w:sz w:val="16"/>
+              </w:rPr>
+              <w:t xml:space="preserve">NRC </w:t>
+            </w:r>
+            <w:r>
+              <w:rPr>
+                <w:rFonts w:ascii="Calibri" w:hAnsi="Calibri"/>
+                <w:b w:val="0"/>
+                <w:color w:val="111827"/>
+                <w:sz w:val="16"/>
+              </w:rPr>
+              <w:t>0x35</w:t>
+            </w:r>
+            <w:r>
+              <w:rPr>
+                <w:rFonts w:ascii="Calibri" w:hAnsi="Calibri"/>
+                <w:b w:val="0"/>
+                <w:color w:val="111827"/>
+                <w:sz w:val="16"/>
+              </w:rPr>
+              <w:t xml:space="preserve"> invalid key</w:t>
+            </w:r>
+          </w:p>
+        </w:tc>
+      </w:tr>
+      <w:tr>
+        <w:trPr>
+          <w:cantSplit/>
+        </w:trPr>
+        <w:tc>
+          <w:tcPr>
+            <w:tcW w:type="dxa" w:w="1150"/>
+            <w:tcMar>
+              <w:top w:w="80" w:type="dxa"/>
+              <w:start w:w="120" w:type="dxa"/>
+              <w:bottom w:w="80" w:type="dxa"/>
+              <w:end w:w="120" w:type="dxa"/>
+            </w:tcMar>
+            <w:vAlign w:val="center"/>
+            <w:shd w:fill="FFFFFF"/>
+          </w:tcPr>
+          <w:p>
+            <w:pPr>
+              <w:spacing w:before="0" w:after="40" w:line="252" w:lineRule="auto"/>
+              <w:jc w:val="center"/>
+            </w:pPr>
+            <w:r>
+              <w:rPr>
+                <w:rFonts w:ascii="Calibri" w:hAnsi="Calibri"/>
+                <w:b w:val="0"/>
+                <w:color w:val="111827"/>
+                <w:sz w:val="16"/>
+              </w:rPr>
+              <w:t>Third invalid key</w:t>
+            </w:r>
+          </w:p>
+        </w:tc>
+        <w:tc>
+          <w:tcPr>
+            <w:tcW w:type="dxa" w:w="3700"/>
+            <w:tcMar>
+              <w:top w:w="80" w:type="dxa"/>
+              <w:start w:w="120" w:type="dxa"/>
+              <w:bottom w:w="80" w:type="dxa"/>
+              <w:end w:w="120" w:type="dxa"/>
+            </w:tcMar>
+            <w:vAlign w:val="center"/>
+            <w:shd w:fill="FFFFFF"/>
+          </w:tcPr>
+          <w:p>
+            <w:pPr>
+              <w:spacing w:before="0" w:after="40" w:line="252" w:lineRule="auto"/>
+              <w:jc w:val="left"/>
+            </w:pPr>
+            <w:r>
+              <w:rPr>
+                <w:rFonts w:ascii="Calibri" w:hAnsi="Calibri"/>
+                <w:b w:val="0"/>
+                <w:color w:val="111827"/>
+                <w:sz w:val="16"/>
+              </w:rPr>
+              <w:t>diagnostic_contract_invalid</w:t>
+            </w:r>
+          </w:p>
+        </w:tc>
+        <w:tc>
+          <w:tcPr>
+            <w:tcW w:type="dxa" w:w="3100"/>
+            <w:tcMar>
+              <w:top w:w="80" w:type="dxa"/>
+              <w:start w:w="120" w:type="dxa"/>
+              <w:bottom w:w="80" w:type="dxa"/>
+              <w:end w:w="120" w:type="dxa"/>
+            </w:tcMar>
+            <w:vAlign w:val="center"/>
+            <w:shd w:fill="FFFFFF"/>
+          </w:tcPr>
+          <w:p>
+            <w:pPr>
+              <w:spacing w:before="0" w:after="40" w:line="252" w:lineRule="auto"/>
+              <w:jc w:val="left"/>
+            </w:pPr>
+            <w:r>
+              <w:rPr>
+                <w:rFonts w:ascii="Calibri" w:hAnsi="Calibri"/>
+                <w:b w:val="0"/>
+                <w:color w:val="111827"/>
+                <w:sz w:val="16"/>
+              </w:rPr>
+              <w:t>422</w:t>
+            </w:r>
+          </w:p>
+        </w:tc>
+        <w:tc>
+          <w:tcPr>
+            <w:tcW w:type="dxa" w:w="1410"/>
+            <w:tcMar>
+              <w:top w:w="80" w:type="dxa"/>
+              <w:start w:w="120" w:type="dxa"/>
+              <w:bottom w:w="80" w:type="dxa"/>
+              <w:end w:w="120" w:type="dxa"/>
+            </w:tcMar>
+            <w:vAlign w:val="center"/>
+            <w:shd w:fill="FFFFFF"/>
+          </w:tcPr>
+          <w:p>
+            <w:pPr>
+              <w:spacing w:before="0" w:after="40" w:line="252" w:lineRule="auto"/>
+              <w:jc w:val="left"/>
+            </w:pPr>
+            <w:r>
+              <w:rPr>
+                <w:rFonts w:ascii="Calibri" w:hAnsi="Calibri"/>
+                <w:b w:val="0"/>
+                <w:color w:val="111827"/>
+                <w:sz w:val="16"/>
+              </w:rPr>
+              <w:t xml:space="preserve">NRC </w:t>
+            </w:r>
+            <w:r>
+              <w:rPr>
+                <w:rFonts w:ascii="Calibri" w:hAnsi="Calibri"/>
+                <w:b w:val="0"/>
+                <w:color w:val="111827"/>
+                <w:sz w:val="16"/>
+              </w:rPr>
+              <w:t>0x36</w:t>
+            </w:r>
+            <w:r>
+              <w:rPr>
+                <w:rFonts w:ascii="Calibri" w:hAnsi="Calibri"/>
+                <w:b w:val="0"/>
+                <w:color w:val="111827"/>
+                <w:sz w:val="16"/>
+              </w:rPr>
+              <w:t xml:space="preserve"> exceed number of attempts</w:t>
+            </w:r>
+          </w:p>
+        </w:tc>
+      </w:tr>
+      <w:tr>
+        <w:trPr>
+          <w:cantSplit/>
+        </w:trPr>
+        <w:tc>
+          <w:tcPr>
+            <w:tcW w:type="dxa" w:w="1150"/>
+            <w:tcMar>
+              <w:top w:w="80" w:type="dxa"/>
+              <w:start w:w="120" w:type="dxa"/>
+              <w:bottom w:w="80" w:type="dxa"/>
+              <w:end w:w="120" w:type="dxa"/>
+            </w:tcMar>
+            <w:vAlign w:val="center"/>
+            <w:shd w:fill="FFFFFF"/>
+          </w:tcPr>
+          <w:p>
+            <w:pPr>
+              <w:spacing w:before="0" w:after="40" w:line="252" w:lineRule="auto"/>
+              <w:jc w:val="center"/>
+            </w:pPr>
+            <w:r>
+              <w:rPr>
+                <w:rFonts w:ascii="Calibri" w:hAnsi="Calibri"/>
+                <w:b w:val="0"/>
+                <w:color w:val="111827"/>
+                <w:sz w:val="16"/>
+              </w:rPr>
+              <w:t>Access during logical lockout</w:t>
+            </w:r>
+          </w:p>
+        </w:tc>
+        <w:tc>
+          <w:tcPr>
+            <w:tcW w:type="dxa" w:w="3700"/>
+            <w:tcMar>
+              <w:top w:w="80" w:type="dxa"/>
+              <w:start w:w="120" w:type="dxa"/>
+              <w:bottom w:w="80" w:type="dxa"/>
+              <w:end w:w="120" w:type="dxa"/>
+            </w:tcMar>
+            <w:vAlign w:val="center"/>
+            <w:shd w:fill="FFFFFF"/>
+          </w:tcPr>
+          <w:p>
+            <w:pPr>
+              <w:spacing w:before="0" w:after="40" w:line="252" w:lineRule="auto"/>
+              <w:jc w:val="left"/>
+            </w:pPr>
+            <w:r>
+              <w:rPr>
+                <w:rFonts w:ascii="Calibri" w:hAnsi="Calibri"/>
+                <w:b w:val="0"/>
+                <w:color w:val="111827"/>
+                <w:sz w:val="16"/>
+              </w:rPr>
+              <w:t>diagnostic_contract_invalid</w:t>
+            </w:r>
+          </w:p>
+        </w:tc>
+        <w:tc>
+          <w:tcPr>
+            <w:tcW w:type="dxa" w:w="3100"/>
+            <w:tcMar>
+              <w:top w:w="80" w:type="dxa"/>
+              <w:start w:w="120" w:type="dxa"/>
+              <w:bottom w:w="80" w:type="dxa"/>
+              <w:end w:w="120" w:type="dxa"/>
+            </w:tcMar>
+            <w:vAlign w:val="center"/>
+            <w:shd w:fill="FFFFFF"/>
+          </w:tcPr>
+          <w:p>
+            <w:pPr>
+              <w:spacing w:before="0" w:after="40" w:line="252" w:lineRule="auto"/>
+              <w:jc w:val="left"/>
+            </w:pPr>
+            <w:r>
+              <w:rPr>
+                <w:rFonts w:ascii="Calibri" w:hAnsi="Calibri"/>
+                <w:b w:val="0"/>
+                <w:color w:val="111827"/>
+                <w:sz w:val="16"/>
+              </w:rPr>
+              <w:t>422</w:t>
+            </w:r>
+          </w:p>
+        </w:tc>
+        <w:tc>
+          <w:tcPr>
+            <w:tcW w:type="dxa" w:w="1410"/>
+            <w:tcMar>
+              <w:top w:w="80" w:type="dxa"/>
+              <w:start w:w="120" w:type="dxa"/>
+              <w:bottom w:w="80" w:type="dxa"/>
+              <w:end w:w="120" w:type="dxa"/>
+            </w:tcMar>
+            <w:vAlign w:val="center"/>
+            <w:shd w:fill="FFFFFF"/>
+          </w:tcPr>
+          <w:p>
+            <w:pPr>
+              <w:spacing w:before="0" w:after="40" w:line="252" w:lineRule="auto"/>
+              <w:jc w:val="left"/>
+            </w:pPr>
+            <w:r>
+              <w:rPr>
+                <w:rFonts w:ascii="Calibri" w:hAnsi="Calibri"/>
+                <w:b w:val="0"/>
+                <w:color w:val="111827"/>
+                <w:sz w:val="16"/>
+              </w:rPr>
+              <w:t xml:space="preserve">NRC </w:t>
+            </w:r>
+            <w:r>
+              <w:rPr>
+                <w:rFonts w:ascii="Calibri" w:hAnsi="Calibri"/>
+                <w:b w:val="0"/>
+                <w:color w:val="111827"/>
+                <w:sz w:val="16"/>
+              </w:rPr>
+              <w:t>0x37</w:t>
+            </w:r>
+            <w:r>
+              <w:rPr>
+                <w:rFonts w:ascii="Calibri" w:hAnsi="Calibri"/>
+                <w:b w:val="0"/>
+                <w:color w:val="111827"/>
+                <w:sz w:val="16"/>
+              </w:rPr>
+              <w:t xml:space="preserve"> required time delay not expired</w:t>
             </w:r>
           </w:p>
         </w:tc>
@@ -6274,6 +7407,66 @@
     </w:p>
     <w:p>
       <w:pPr>
+        <w:pStyle w:val="Heading2"/>
+        <w:keepNext/>
+        <w:keepLines/>
+      </w:pPr>
+      <w:r>
+        <w:t>ADR-DG-010 - Separate Security Challenge State from Session Authorization</w:t>
+      </w:r>
+    </w:p>
+    <w:p>
+      <w:r>
+        <w:rPr>
+          <w:rFonts w:ascii="Calibri" w:hAnsi="Calibri"/>
+          <w:color w:val="111827"/>
+          <w:sz w:val="22"/>
+        </w:rPr>
+        <w:t>Challenge lifecycle and invalid-attempt policy need their own optimistic version, while the unlocked level belongs to the current diagnostic session. This separation makes concurrency, session reset, and lockout behavior explicit.</w:t>
+      </w:r>
+    </w:p>
+    <w:p>
+      <w:pPr>
+        <w:pStyle w:val="Heading2"/>
+        <w:keepNext/>
+        <w:keepLines/>
+      </w:pPr>
+      <w:r>
+        <w:t>ADR-DG-011 - Persist Negative Attempts Before Returning an Error</w:t>
+      </w:r>
+    </w:p>
+    <w:p>
+      <w:r>
+        <w:rPr>
+          <w:rFonts w:ascii="Calibri" w:hAnsi="Calibri"/>
+          <w:color w:val="111827"/>
+          <w:sz w:val="22"/>
+        </w:rPr>
+        <w:t>Invalid-key attempts are security state changes, not validation-only failures. The service writes versioned command, audit, and outbox evidence atomically, and the endpoint commits that evidence before returning the stable UDS-aware error. Exact retries replay the same denial without another attempt increment.</w:t>
+      </w:r>
+    </w:p>
+    <w:p>
+      <w:pPr>
+        <w:pStyle w:val="Heading2"/>
+        <w:keepNext/>
+        <w:keepLines/>
+      </w:pPr>
+      <w:r>
+        <w:t>ADR-DG-012 - Use Transparent Simulator Cryptography with Strict Secret Hygiene</w:t>
+      </w:r>
+    </w:p>
+    <w:p>
+      <w:r>
+        <w:rPr>
+          <w:rFonts w:ascii="Calibri" w:hAnsi="Calibri"/>
+          <w:color w:val="111827"/>
+          <w:sz w:val="22"/>
+        </w:rPr>
+        <w:t>A deterministic public derivation supports reproducible study and black-box tests without paid services or secret provisioning. It is explicitly non-production. Raw keys are masked and never persisted; seeds and digests stay in protected state/command storage and never enter shared audit or outbox evidence.</w:t>
+      </w:r>
+    </w:p>
+    <w:p>
+      <w:pPr>
         <w:pStyle w:val="Heading1"/>
         <w:keepNext/>
         <w:keepLines/>
@@ -10583,6 +11776,1253 @@
                 <w:sz w:val="17"/>
               </w:rPr>
               <w:t>Commit definition/state/control, command, audit, and outbox evidence together.</w:t>
+            </w:r>
+          </w:p>
+        </w:tc>
+        <w:tc>
+          <w:tcPr>
+            <w:tcW w:type="dxa" w:w="3260"/>
+            <w:tcMar>
+              <w:top w:w="80" w:type="dxa"/>
+              <w:start w:w="120" w:type="dxa"/>
+              <w:bottom w:w="80" w:type="dxa"/>
+              <w:end w:w="120" w:type="dxa"/>
+            </w:tcMar>
+            <w:vAlign w:val="center"/>
+            <w:shd w:fill="FFFFFF"/>
+          </w:tcPr>
+          <w:p>
+            <w:pPr>
+              <w:spacing w:before="0" w:after="40" w:line="252" w:lineRule="auto"/>
+              <w:jc w:val="left"/>
+            </w:pPr>
+            <w:r>
+              <w:rPr>
+                <w:rFonts w:ascii="Calibri" w:hAnsi="Calibri"/>
+                <w:b w:val="0"/>
+                <w:color w:val="111827"/>
+                <w:sz w:val="17"/>
+              </w:rPr>
+              <w:t>Integration</w:t>
+            </w:r>
+          </w:p>
+        </w:tc>
+      </w:tr>
+      <w:tr>
+        <w:trPr>
+          <w:cantSplit/>
+        </w:trPr>
+        <w:tc>
+          <w:tcPr>
+            <w:tcW w:type="dxa" w:w="1650"/>
+            <w:tcMar>
+              <w:top w:w="80" w:type="dxa"/>
+              <w:start w:w="120" w:type="dxa"/>
+              <w:bottom w:w="80" w:type="dxa"/>
+              <w:end w:w="120" w:type="dxa"/>
+            </w:tcMar>
+            <w:vAlign w:val="center"/>
+            <w:shd w:fill="FFFFFF"/>
+          </w:tcPr>
+          <w:p>
+            <w:pPr>
+              <w:spacing w:before="0" w:after="40" w:line="252" w:lineRule="auto"/>
+              <w:jc w:val="center"/>
+            </w:pPr>
+            <w:r>
+              <w:rPr>
+                <w:rFonts w:ascii="Calibri" w:hAnsi="Calibri"/>
+                <w:b w:val="0"/>
+                <w:color w:val="111827"/>
+                <w:sz w:val="17"/>
+              </w:rPr>
+              <w:t>Security command shape</w:t>
+            </w:r>
+          </w:p>
+        </w:tc>
+        <w:tc>
+          <w:tcPr>
+            <w:tcW w:type="dxa" w:w="4450"/>
+            <w:tcMar>
+              <w:top w:w="80" w:type="dxa"/>
+              <w:start w:w="120" w:type="dxa"/>
+              <w:bottom w:w="80" w:type="dxa"/>
+              <w:end w:w="120" w:type="dxa"/>
+            </w:tcMar>
+            <w:vAlign w:val="center"/>
+            <w:shd w:fill="FFFFFF"/>
+          </w:tcPr>
+          <w:p>
+            <w:pPr>
+              <w:spacing w:before="0" w:after="40" w:line="252" w:lineRule="auto"/>
+              <w:jc w:val="left"/>
+            </w:pPr>
+            <w:r>
+              <w:rPr>
+                <w:rFonts w:ascii="Calibri" w:hAnsi="Calibri"/>
+                <w:b w:val="0"/>
+                <w:color w:val="111827"/>
+                <w:sz w:val="17"/>
+              </w:rPr>
+              <w:t>Require a 16-character masked key only for sendKey and reject extra fields.</w:t>
+            </w:r>
+          </w:p>
+        </w:tc>
+        <w:tc>
+          <w:tcPr>
+            <w:tcW w:type="dxa" w:w="3260"/>
+            <w:tcMar>
+              <w:top w:w="80" w:type="dxa"/>
+              <w:start w:w="120" w:type="dxa"/>
+              <w:bottom w:w="80" w:type="dxa"/>
+              <w:end w:w="120" w:type="dxa"/>
+            </w:tcMar>
+            <w:vAlign w:val="center"/>
+            <w:shd w:fill="FFFFFF"/>
+          </w:tcPr>
+          <w:p>
+            <w:pPr>
+              <w:spacing w:before="0" w:after="40" w:line="252" w:lineRule="auto"/>
+              <w:jc w:val="left"/>
+            </w:pPr>
+            <w:r>
+              <w:rPr>
+                <w:rFonts w:ascii="Calibri" w:hAnsi="Calibri"/>
+                <w:b w:val="0"/>
+                <w:color w:val="111827"/>
+                <w:sz w:val="17"/>
+              </w:rPr>
+              <w:t>Schema/OpenAPI</w:t>
+            </w:r>
+          </w:p>
+        </w:tc>
+      </w:tr>
+      <w:tr>
+        <w:trPr>
+          <w:cantSplit/>
+        </w:trPr>
+        <w:tc>
+          <w:tcPr>
+            <w:tcW w:type="dxa" w:w="1650"/>
+            <w:tcMar>
+              <w:top w:w="80" w:type="dxa"/>
+              <w:start w:w="120" w:type="dxa"/>
+              <w:bottom w:w="80" w:type="dxa"/>
+              <w:end w:w="120" w:type="dxa"/>
+            </w:tcMar>
+            <w:vAlign w:val="center"/>
+            <w:shd w:fill="FFFFFF"/>
+          </w:tcPr>
+          <w:p>
+            <w:pPr>
+              <w:spacing w:before="0" w:after="40" w:line="252" w:lineRule="auto"/>
+              <w:jc w:val="center"/>
+            </w:pPr>
+            <w:r>
+              <w:rPr>
+                <w:rFonts w:ascii="Calibri" w:hAnsi="Calibri"/>
+                <w:b w:val="0"/>
+                <w:color w:val="111827"/>
+                <w:sz w:val="17"/>
+              </w:rPr>
+              <w:t>Security session policy</w:t>
+            </w:r>
+          </w:p>
+        </w:tc>
+        <w:tc>
+          <w:tcPr>
+            <w:tcW w:type="dxa" w:w="4450"/>
+            <w:tcMar>
+              <w:top w:w="80" w:type="dxa"/>
+              <w:start w:w="120" w:type="dxa"/>
+              <w:bottom w:w="80" w:type="dxa"/>
+              <w:end w:w="120" w:type="dxa"/>
+            </w:tcMar>
+            <w:vAlign w:val="center"/>
+            <w:shd w:fill="FFFFFF"/>
+          </w:tcPr>
+          <w:p>
+            <w:pPr>
+              <w:spacing w:before="0" w:after="40" w:line="252" w:lineRule="auto"/>
+              <w:jc w:val="left"/>
+            </w:pPr>
+            <w:r>
+              <w:rPr>
+                <w:rFonts w:ascii="Calibri" w:hAnsi="Calibri"/>
+                <w:b w:val="0"/>
+                <w:color w:val="111827"/>
+                <w:sz w:val="17"/>
+              </w:rPr>
+              <w:t xml:space="preserve">Reject Security Access in default session with NRC </w:t>
+            </w:r>
+            <w:r>
+              <w:rPr>
+                <w:rFonts w:ascii="Calibri" w:hAnsi="Calibri"/>
+                <w:b w:val="0"/>
+                <w:color w:val="111827"/>
+                <w:sz w:val="17"/>
+              </w:rPr>
+              <w:t>0x7F</w:t>
+            </w:r>
+            <w:r>
+              <w:rPr>
+                <w:rFonts w:ascii="Calibri" w:hAnsi="Calibri"/>
+                <w:b w:val="0"/>
+                <w:color w:val="111827"/>
+                <w:sz w:val="17"/>
+              </w:rPr>
+              <w:t>.</w:t>
+            </w:r>
+          </w:p>
+        </w:tc>
+        <w:tc>
+          <w:tcPr>
+            <w:tcW w:type="dxa" w:w="3260"/>
+            <w:tcMar>
+              <w:top w:w="80" w:type="dxa"/>
+              <w:start w:w="120" w:type="dxa"/>
+              <w:bottom w:w="80" w:type="dxa"/>
+              <w:end w:w="120" w:type="dxa"/>
+            </w:tcMar>
+            <w:vAlign w:val="center"/>
+            <w:shd w:fill="FFFFFF"/>
+          </w:tcPr>
+          <w:p>
+            <w:pPr>
+              <w:spacing w:before="0" w:after="40" w:line="252" w:lineRule="auto"/>
+              <w:jc w:val="left"/>
+            </w:pPr>
+            <w:r>
+              <w:rPr>
+                <w:rFonts w:ascii="Calibri" w:hAnsi="Calibri"/>
+                <w:b w:val="0"/>
+                <w:color w:val="111827"/>
+                <w:sz w:val="17"/>
+              </w:rPr>
+              <w:t>Service/API</w:t>
+            </w:r>
+          </w:p>
+        </w:tc>
+      </w:tr>
+      <w:tr>
+        <w:trPr>
+          <w:cantSplit/>
+        </w:trPr>
+        <w:tc>
+          <w:tcPr>
+            <w:tcW w:type="dxa" w:w="1650"/>
+            <w:tcMar>
+              <w:top w:w="80" w:type="dxa"/>
+              <w:start w:w="120" w:type="dxa"/>
+              <w:bottom w:w="80" w:type="dxa"/>
+              <w:end w:w="120" w:type="dxa"/>
+            </w:tcMar>
+            <w:vAlign w:val="center"/>
+            <w:shd w:fill="FFFFFF"/>
+          </w:tcPr>
+          <w:p>
+            <w:pPr>
+              <w:spacing w:before="0" w:after="40" w:line="252" w:lineRule="auto"/>
+              <w:jc w:val="center"/>
+            </w:pPr>
+            <w:r>
+              <w:rPr>
+                <w:rFonts w:ascii="Calibri" w:hAnsi="Calibri"/>
+                <w:b w:val="0"/>
+                <w:color w:val="111827"/>
+                <w:sz w:val="17"/>
+              </w:rPr>
+              <w:t>Seed generation</w:t>
+            </w:r>
+          </w:p>
+        </w:tc>
+        <w:tc>
+          <w:tcPr>
+            <w:tcW w:type="dxa" w:w="4450"/>
+            <w:tcMar>
+              <w:top w:w="80" w:type="dxa"/>
+              <w:start w:w="120" w:type="dxa"/>
+              <w:bottom w:w="80" w:type="dxa"/>
+              <w:end w:w="120" w:type="dxa"/>
+            </w:tcMar>
+            <w:vAlign w:val="center"/>
+            <w:shd w:fill="FFFFFF"/>
+          </w:tcPr>
+          <w:p>
+            <w:pPr>
+              <w:spacing w:before="0" w:after="40" w:line="252" w:lineRule="auto"/>
+              <w:jc w:val="left"/>
+            </w:pPr>
+            <w:r>
+              <w:rPr>
+                <w:rFonts w:ascii="Calibri" w:hAnsi="Calibri"/>
+                <w:b w:val="0"/>
+                <w:color w:val="111827"/>
+                <w:sz w:val="17"/>
+              </w:rPr>
+              <w:t>Return a deterministic 16-character seed and 30,000-ms logical expiry.</w:t>
+            </w:r>
+          </w:p>
+        </w:tc>
+        <w:tc>
+          <w:tcPr>
+            <w:tcW w:type="dxa" w:w="3260"/>
+            <w:tcMar>
+              <w:top w:w="80" w:type="dxa"/>
+              <w:start w:w="120" w:type="dxa"/>
+              <w:bottom w:w="80" w:type="dxa"/>
+              <w:end w:w="120" w:type="dxa"/>
+            </w:tcMar>
+            <w:vAlign w:val="center"/>
+            <w:shd w:fill="FFFFFF"/>
+          </w:tcPr>
+          <w:p>
+            <w:pPr>
+              <w:spacing w:before="0" w:after="40" w:line="252" w:lineRule="auto"/>
+              <w:jc w:val="left"/>
+            </w:pPr>
+            <w:r>
+              <w:rPr>
+                <w:rFonts w:ascii="Calibri" w:hAnsi="Calibri"/>
+                <w:b w:val="0"/>
+                <w:color w:val="111827"/>
+                <w:sz w:val="17"/>
+              </w:rPr>
+              <w:t>Service/integration</w:t>
+            </w:r>
+          </w:p>
+        </w:tc>
+      </w:tr>
+      <w:tr>
+        <w:trPr>
+          <w:cantSplit/>
+        </w:trPr>
+        <w:tc>
+          <w:tcPr>
+            <w:tcW w:type="dxa" w:w="1650"/>
+            <w:tcMar>
+              <w:top w:w="80" w:type="dxa"/>
+              <w:start w:w="120" w:type="dxa"/>
+              <w:bottom w:w="80" w:type="dxa"/>
+              <w:end w:w="120" w:type="dxa"/>
+            </w:tcMar>
+            <w:vAlign w:val="center"/>
+            <w:shd w:fill="FFFFFF"/>
+          </w:tcPr>
+          <w:p>
+            <w:pPr>
+              <w:spacing w:before="0" w:after="40" w:line="252" w:lineRule="auto"/>
+              <w:jc w:val="center"/>
+            </w:pPr>
+            <w:r>
+              <w:rPr>
+                <w:rFonts w:ascii="Calibri" w:hAnsi="Calibri"/>
+                <w:b w:val="0"/>
+                <w:color w:val="111827"/>
+                <w:sz w:val="17"/>
+              </w:rPr>
+              <w:t>Seed replay</w:t>
+            </w:r>
+          </w:p>
+        </w:tc>
+        <w:tc>
+          <w:tcPr>
+            <w:tcW w:type="dxa" w:w="4450"/>
+            <w:tcMar>
+              <w:top w:w="80" w:type="dxa"/>
+              <w:start w:w="120" w:type="dxa"/>
+              <w:bottom w:w="80" w:type="dxa"/>
+              <w:end w:w="120" w:type="dxa"/>
+            </w:tcMar>
+            <w:vAlign w:val="center"/>
+            <w:shd w:fill="FFFFFF"/>
+          </w:tcPr>
+          <w:p>
+            <w:pPr>
+              <w:spacing w:before="0" w:after="40" w:line="252" w:lineRule="auto"/>
+              <w:jc w:val="left"/>
+            </w:pPr>
+            <w:r>
+              <w:rPr>
+                <w:rFonts w:ascii="Calibri" w:hAnsi="Calibri"/>
+                <w:b w:val="0"/>
+                <w:color w:val="111827"/>
+                <w:sz w:val="17"/>
+              </w:rPr>
+              <w:t>Return the same protected seed without incrementing challenge or version twice.</w:t>
+            </w:r>
+          </w:p>
+        </w:tc>
+        <w:tc>
+          <w:tcPr>
+            <w:tcW w:type="dxa" w:w="3260"/>
+            <w:tcMar>
+              <w:top w:w="80" w:type="dxa"/>
+              <w:start w:w="120" w:type="dxa"/>
+              <w:bottom w:w="80" w:type="dxa"/>
+              <w:end w:w="120" w:type="dxa"/>
+            </w:tcMar>
+            <w:vAlign w:val="center"/>
+            <w:shd w:fill="FFFFFF"/>
+          </w:tcPr>
+          <w:p>
+            <w:pPr>
+              <w:spacing w:before="0" w:after="40" w:line="252" w:lineRule="auto"/>
+              <w:jc w:val="left"/>
+            </w:pPr>
+            <w:r>
+              <w:rPr>
+                <w:rFonts w:ascii="Calibri" w:hAnsi="Calibri"/>
+                <w:b w:val="0"/>
+                <w:color w:val="111827"/>
+                <w:sz w:val="17"/>
+              </w:rPr>
+              <w:t>Service/integration</w:t>
+            </w:r>
+          </w:p>
+        </w:tc>
+      </w:tr>
+      <w:tr>
+        <w:trPr>
+          <w:cantSplit/>
+        </w:trPr>
+        <w:tc>
+          <w:tcPr>
+            <w:tcW w:type="dxa" w:w="1650"/>
+            <w:tcMar>
+              <w:top w:w="80" w:type="dxa"/>
+              <w:start w:w="120" w:type="dxa"/>
+              <w:bottom w:w="80" w:type="dxa"/>
+              <w:end w:w="120" w:type="dxa"/>
+            </w:tcMar>
+            <w:vAlign w:val="center"/>
+            <w:shd w:fill="FFFFFF"/>
+          </w:tcPr>
+          <w:p>
+            <w:pPr>
+              <w:spacing w:before="0" w:after="40" w:line="252" w:lineRule="auto"/>
+              <w:jc w:val="center"/>
+            </w:pPr>
+            <w:r>
+              <w:rPr>
+                <w:rFonts w:ascii="Calibri" w:hAnsi="Calibri"/>
+                <w:b w:val="0"/>
+                <w:color w:val="111827"/>
+                <w:sz w:val="17"/>
+              </w:rPr>
+              <w:t>Valid key</w:t>
+            </w:r>
+          </w:p>
+        </w:tc>
+        <w:tc>
+          <w:tcPr>
+            <w:tcW w:type="dxa" w:w="4450"/>
+            <w:tcMar>
+              <w:top w:w="80" w:type="dxa"/>
+              <w:start w:w="120" w:type="dxa"/>
+              <w:bottom w:w="80" w:type="dxa"/>
+              <w:end w:w="120" w:type="dxa"/>
+            </w:tcMar>
+            <w:vAlign w:val="center"/>
+            <w:shd w:fill="FFFFFF"/>
+          </w:tcPr>
+          <w:p>
+            <w:pPr>
+              <w:spacing w:before="0" w:after="40" w:line="252" w:lineRule="auto"/>
+              <w:jc w:val="left"/>
+            </w:pPr>
+            <w:r>
+              <w:rPr>
+                <w:rFonts w:ascii="Calibri" w:hAnsi="Calibri"/>
+                <w:b w:val="0"/>
+                <w:color w:val="111827"/>
+                <w:sz w:val="17"/>
+              </w:rPr>
+              <w:t>Unlock level 1, clear challenge state, and increment session/security versions.</w:t>
+            </w:r>
+          </w:p>
+        </w:tc>
+        <w:tc>
+          <w:tcPr>
+            <w:tcW w:type="dxa" w:w="3260"/>
+            <w:tcMar>
+              <w:top w:w="80" w:type="dxa"/>
+              <w:start w:w="120" w:type="dxa"/>
+              <w:bottom w:w="80" w:type="dxa"/>
+              <w:end w:w="120" w:type="dxa"/>
+            </w:tcMar>
+            <w:vAlign w:val="center"/>
+            <w:shd w:fill="FFFFFF"/>
+          </w:tcPr>
+          <w:p>
+            <w:pPr>
+              <w:spacing w:before="0" w:after="40" w:line="252" w:lineRule="auto"/>
+              <w:jc w:val="left"/>
+            </w:pPr>
+            <w:r>
+              <w:rPr>
+                <w:rFonts w:ascii="Calibri" w:hAnsi="Calibri"/>
+                <w:b w:val="0"/>
+                <w:color w:val="111827"/>
+                <w:sz w:val="17"/>
+              </w:rPr>
+              <w:t>Service/integration</w:t>
+            </w:r>
+          </w:p>
+        </w:tc>
+      </w:tr>
+      <w:tr>
+        <w:trPr>
+          <w:cantSplit/>
+        </w:trPr>
+        <w:tc>
+          <w:tcPr>
+            <w:tcW w:type="dxa" w:w="1650"/>
+            <w:tcMar>
+              <w:top w:w="80" w:type="dxa"/>
+              <w:start w:w="120" w:type="dxa"/>
+              <w:bottom w:w="80" w:type="dxa"/>
+              <w:end w:w="120" w:type="dxa"/>
+            </w:tcMar>
+            <w:vAlign w:val="center"/>
+            <w:shd w:fill="FFFFFF"/>
+          </w:tcPr>
+          <w:p>
+            <w:pPr>
+              <w:spacing w:before="0" w:after="40" w:line="252" w:lineRule="auto"/>
+              <w:jc w:val="center"/>
+            </w:pPr>
+            <w:r>
+              <w:rPr>
+                <w:rFonts w:ascii="Calibri" w:hAnsi="Calibri"/>
+                <w:b w:val="0"/>
+                <w:color w:val="111827"/>
+                <w:sz w:val="17"/>
+              </w:rPr>
+              <w:t>Missing/expired seed</w:t>
+            </w:r>
+          </w:p>
+        </w:tc>
+        <w:tc>
+          <w:tcPr>
+            <w:tcW w:type="dxa" w:w="4450"/>
+            <w:tcMar>
+              <w:top w:w="80" w:type="dxa"/>
+              <w:start w:w="120" w:type="dxa"/>
+              <w:bottom w:w="80" w:type="dxa"/>
+              <w:end w:w="120" w:type="dxa"/>
+            </w:tcMar>
+            <w:vAlign w:val="center"/>
+            <w:shd w:fill="FFFFFF"/>
+          </w:tcPr>
+          <w:p>
+            <w:pPr>
+              <w:spacing w:before="0" w:after="40" w:line="252" w:lineRule="auto"/>
+              <w:jc w:val="left"/>
+            </w:pPr>
+            <w:r>
+              <w:rPr>
+                <w:rFonts w:ascii="Calibri" w:hAnsi="Calibri"/>
+                <w:b w:val="0"/>
+                <w:color w:val="111827"/>
+                <w:sz w:val="17"/>
+              </w:rPr>
+              <w:t xml:space="preserve">Reject sendKey with NRC </w:t>
+            </w:r>
+            <w:r>
+              <w:rPr>
+                <w:rFonts w:ascii="Calibri" w:hAnsi="Calibri"/>
+                <w:b w:val="0"/>
+                <w:color w:val="111827"/>
+                <w:sz w:val="17"/>
+              </w:rPr>
+              <w:t>0x24</w:t>
+            </w:r>
+            <w:r>
+              <w:rPr>
+                <w:rFonts w:ascii="Calibri" w:hAnsi="Calibri"/>
+                <w:b w:val="0"/>
+                <w:color w:val="111827"/>
+                <w:sz w:val="17"/>
+              </w:rPr>
+              <w:t xml:space="preserve"> without unlocking.</w:t>
+            </w:r>
+          </w:p>
+        </w:tc>
+        <w:tc>
+          <w:tcPr>
+            <w:tcW w:type="dxa" w:w="3260"/>
+            <w:tcMar>
+              <w:top w:w="80" w:type="dxa"/>
+              <w:start w:w="120" w:type="dxa"/>
+              <w:bottom w:w="80" w:type="dxa"/>
+              <w:end w:w="120" w:type="dxa"/>
+            </w:tcMar>
+            <w:vAlign w:val="center"/>
+            <w:shd w:fill="FFFFFF"/>
+          </w:tcPr>
+          <w:p>
+            <w:pPr>
+              <w:spacing w:before="0" w:after="40" w:line="252" w:lineRule="auto"/>
+              <w:jc w:val="left"/>
+            </w:pPr>
+            <w:r>
+              <w:rPr>
+                <w:rFonts w:ascii="Calibri" w:hAnsi="Calibri"/>
+                <w:b w:val="0"/>
+                <w:color w:val="111827"/>
+                <w:sz w:val="17"/>
+              </w:rPr>
+              <w:t>Service/API</w:t>
+            </w:r>
+          </w:p>
+        </w:tc>
+      </w:tr>
+      <w:tr>
+        <w:trPr>
+          <w:cantSplit/>
+        </w:trPr>
+        <w:tc>
+          <w:tcPr>
+            <w:tcW w:type="dxa" w:w="1650"/>
+            <w:tcMar>
+              <w:top w:w="80" w:type="dxa"/>
+              <w:start w:w="120" w:type="dxa"/>
+              <w:bottom w:w="80" w:type="dxa"/>
+              <w:end w:w="120" w:type="dxa"/>
+            </w:tcMar>
+            <w:vAlign w:val="center"/>
+            <w:shd w:fill="FFFFFF"/>
+          </w:tcPr>
+          <w:p>
+            <w:pPr>
+              <w:spacing w:before="0" w:after="40" w:line="252" w:lineRule="auto"/>
+              <w:jc w:val="center"/>
+            </w:pPr>
+            <w:r>
+              <w:rPr>
+                <w:rFonts w:ascii="Calibri" w:hAnsi="Calibri"/>
+                <w:b w:val="0"/>
+                <w:color w:val="111827"/>
+                <w:sz w:val="17"/>
+              </w:rPr>
+              <w:t>Invalid key</w:t>
+            </w:r>
+          </w:p>
+        </w:tc>
+        <w:tc>
+          <w:tcPr>
+            <w:tcW w:type="dxa" w:w="4450"/>
+            <w:tcMar>
+              <w:top w:w="80" w:type="dxa"/>
+              <w:start w:w="120" w:type="dxa"/>
+              <w:bottom w:w="80" w:type="dxa"/>
+              <w:end w:w="120" w:type="dxa"/>
+            </w:tcMar>
+            <w:vAlign w:val="center"/>
+            <w:shd w:fill="FFFFFF"/>
+          </w:tcPr>
+          <w:p>
+            <w:pPr>
+              <w:spacing w:before="0" w:after="40" w:line="252" w:lineRule="auto"/>
+              <w:jc w:val="left"/>
+            </w:pPr>
+            <w:r>
+              <w:rPr>
+                <w:rFonts w:ascii="Calibri" w:hAnsi="Calibri"/>
+                <w:b w:val="0"/>
+                <w:color w:val="111827"/>
+                <w:sz w:val="17"/>
+              </w:rPr>
+              <w:t xml:space="preserve">Persist a failed attempt and return NRC </w:t>
+            </w:r>
+            <w:r>
+              <w:rPr>
+                <w:rFonts w:ascii="Calibri" w:hAnsi="Calibri"/>
+                <w:b w:val="0"/>
+                <w:color w:val="111827"/>
+                <w:sz w:val="17"/>
+              </w:rPr>
+              <w:t>0x35</w:t>
+            </w:r>
+            <w:r>
+              <w:rPr>
+                <w:rFonts w:ascii="Calibri" w:hAnsi="Calibri"/>
+                <w:b w:val="0"/>
+                <w:color w:val="111827"/>
+                <w:sz w:val="17"/>
+              </w:rPr>
+              <w:t>.</w:t>
+            </w:r>
+          </w:p>
+        </w:tc>
+        <w:tc>
+          <w:tcPr>
+            <w:tcW w:type="dxa" w:w="3260"/>
+            <w:tcMar>
+              <w:top w:w="80" w:type="dxa"/>
+              <w:start w:w="120" w:type="dxa"/>
+              <w:bottom w:w="80" w:type="dxa"/>
+              <w:end w:w="120" w:type="dxa"/>
+            </w:tcMar>
+            <w:vAlign w:val="center"/>
+            <w:shd w:fill="FFFFFF"/>
+          </w:tcPr>
+          <w:p>
+            <w:pPr>
+              <w:spacing w:before="0" w:after="40" w:line="252" w:lineRule="auto"/>
+              <w:jc w:val="left"/>
+            </w:pPr>
+            <w:r>
+              <w:rPr>
+                <w:rFonts w:ascii="Calibri" w:hAnsi="Calibri"/>
+                <w:b w:val="0"/>
+                <w:color w:val="111827"/>
+                <w:sz w:val="17"/>
+              </w:rPr>
+              <w:t>Service/API</w:t>
+            </w:r>
+          </w:p>
+        </w:tc>
+      </w:tr>
+      <w:tr>
+        <w:trPr>
+          <w:cantSplit/>
+        </w:trPr>
+        <w:tc>
+          <w:tcPr>
+            <w:tcW w:type="dxa" w:w="1650"/>
+            <w:tcMar>
+              <w:top w:w="80" w:type="dxa"/>
+              <w:start w:w="120" w:type="dxa"/>
+              <w:bottom w:w="80" w:type="dxa"/>
+              <w:end w:w="120" w:type="dxa"/>
+            </w:tcMar>
+            <w:vAlign w:val="center"/>
+            <w:shd w:fill="FFFFFF"/>
+          </w:tcPr>
+          <w:p>
+            <w:pPr>
+              <w:spacing w:before="0" w:after="40" w:line="252" w:lineRule="auto"/>
+              <w:jc w:val="center"/>
+            </w:pPr>
+            <w:r>
+              <w:rPr>
+                <w:rFonts w:ascii="Calibri" w:hAnsi="Calibri"/>
+                <w:b w:val="0"/>
+                <w:color w:val="111827"/>
+                <w:sz w:val="17"/>
+              </w:rPr>
+              <w:t>Attempt ceiling</w:t>
+            </w:r>
+          </w:p>
+        </w:tc>
+        <w:tc>
+          <w:tcPr>
+            <w:tcW w:type="dxa" w:w="4450"/>
+            <w:tcMar>
+              <w:top w:w="80" w:type="dxa"/>
+              <w:start w:w="120" w:type="dxa"/>
+              <w:bottom w:w="80" w:type="dxa"/>
+              <w:end w:w="120" w:type="dxa"/>
+            </w:tcMar>
+            <w:vAlign w:val="center"/>
+            <w:shd w:fill="FFFFFF"/>
+          </w:tcPr>
+          <w:p>
+            <w:pPr>
+              <w:spacing w:before="0" w:after="40" w:line="252" w:lineRule="auto"/>
+              <w:jc w:val="left"/>
+            </w:pPr>
+            <w:r>
+              <w:rPr>
+                <w:rFonts w:ascii="Calibri" w:hAnsi="Calibri"/>
+                <w:b w:val="0"/>
+                <w:color w:val="111827"/>
+                <w:sz w:val="17"/>
+              </w:rPr>
+              <w:t xml:space="preserve">Third invalid key returns NRC </w:t>
+            </w:r>
+            <w:r>
+              <w:rPr>
+                <w:rFonts w:ascii="Calibri" w:hAnsi="Calibri"/>
+                <w:b w:val="0"/>
+                <w:color w:val="111827"/>
+                <w:sz w:val="17"/>
+              </w:rPr>
+              <w:t>0x36</w:t>
+            </w:r>
+            <w:r>
+              <w:rPr>
+                <w:rFonts w:ascii="Calibri" w:hAnsi="Calibri"/>
+                <w:b w:val="0"/>
+                <w:color w:val="111827"/>
+                <w:sz w:val="17"/>
+              </w:rPr>
+              <w:t xml:space="preserve"> and starts a 10,000-ms logical delay.</w:t>
+            </w:r>
+          </w:p>
+        </w:tc>
+        <w:tc>
+          <w:tcPr>
+            <w:tcW w:type="dxa" w:w="3260"/>
+            <w:tcMar>
+              <w:top w:w="80" w:type="dxa"/>
+              <w:start w:w="120" w:type="dxa"/>
+              <w:bottom w:w="80" w:type="dxa"/>
+              <w:end w:w="120" w:type="dxa"/>
+            </w:tcMar>
+            <w:vAlign w:val="center"/>
+            <w:shd w:fill="FFFFFF"/>
+          </w:tcPr>
+          <w:p>
+            <w:pPr>
+              <w:spacing w:before="0" w:after="40" w:line="252" w:lineRule="auto"/>
+              <w:jc w:val="left"/>
+            </w:pPr>
+            <w:r>
+              <w:rPr>
+                <w:rFonts w:ascii="Calibri" w:hAnsi="Calibri"/>
+                <w:b w:val="0"/>
+                <w:color w:val="111827"/>
+                <w:sz w:val="17"/>
+              </w:rPr>
+              <w:t>Service/integration</w:t>
+            </w:r>
+          </w:p>
+        </w:tc>
+      </w:tr>
+      <w:tr>
+        <w:trPr>
+          <w:cantSplit/>
+        </w:trPr>
+        <w:tc>
+          <w:tcPr>
+            <w:tcW w:type="dxa" w:w="1650"/>
+            <w:tcMar>
+              <w:top w:w="80" w:type="dxa"/>
+              <w:start w:w="120" w:type="dxa"/>
+              <w:bottom w:w="80" w:type="dxa"/>
+              <w:end w:w="120" w:type="dxa"/>
+            </w:tcMar>
+            <w:vAlign w:val="center"/>
+            <w:shd w:fill="FFFFFF"/>
+          </w:tcPr>
+          <w:p>
+            <w:pPr>
+              <w:spacing w:before="0" w:after="40" w:line="252" w:lineRule="auto"/>
+              <w:jc w:val="center"/>
+            </w:pPr>
+            <w:r>
+              <w:rPr>
+                <w:rFonts w:ascii="Calibri" w:hAnsi="Calibri"/>
+                <w:b w:val="0"/>
+                <w:color w:val="111827"/>
+                <w:sz w:val="17"/>
+              </w:rPr>
+              <w:t>Lockout delay</w:t>
+            </w:r>
+          </w:p>
+        </w:tc>
+        <w:tc>
+          <w:tcPr>
+            <w:tcW w:type="dxa" w:w="4450"/>
+            <w:tcMar>
+              <w:top w:w="80" w:type="dxa"/>
+              <w:start w:w="120" w:type="dxa"/>
+              <w:bottom w:w="80" w:type="dxa"/>
+              <w:end w:w="120" w:type="dxa"/>
+            </w:tcMar>
+            <w:vAlign w:val="center"/>
+            <w:shd w:fill="FFFFFF"/>
+          </w:tcPr>
+          <w:p>
+            <w:pPr>
+              <w:spacing w:before="0" w:after="40" w:line="252" w:lineRule="auto"/>
+              <w:jc w:val="left"/>
+            </w:pPr>
+            <w:r>
+              <w:rPr>
+                <w:rFonts w:ascii="Calibri" w:hAnsi="Calibri"/>
+                <w:b w:val="0"/>
+                <w:color w:val="111827"/>
+                <w:sz w:val="17"/>
+              </w:rPr>
+              <w:t xml:space="preserve">Return NRC </w:t>
+            </w:r>
+            <w:r>
+              <w:rPr>
+                <w:rFonts w:ascii="Calibri" w:hAnsi="Calibri"/>
+                <w:b w:val="0"/>
+                <w:color w:val="111827"/>
+                <w:sz w:val="17"/>
+              </w:rPr>
+              <w:t>0x37</w:t>
+            </w:r>
+            <w:r>
+              <w:rPr>
+                <w:rFonts w:ascii="Calibri" w:hAnsi="Calibri"/>
+                <w:b w:val="0"/>
+                <w:color w:val="111827"/>
+                <w:sz w:val="17"/>
+              </w:rPr>
+              <w:t xml:space="preserve"> before the deadline and permit a new seed exactly at expiry.</w:t>
+            </w:r>
+          </w:p>
+        </w:tc>
+        <w:tc>
+          <w:tcPr>
+            <w:tcW w:type="dxa" w:w="3260"/>
+            <w:tcMar>
+              <w:top w:w="80" w:type="dxa"/>
+              <w:start w:w="120" w:type="dxa"/>
+              <w:bottom w:w="80" w:type="dxa"/>
+              <w:end w:w="120" w:type="dxa"/>
+            </w:tcMar>
+            <w:vAlign w:val="center"/>
+            <w:shd w:fill="FFFFFF"/>
+          </w:tcPr>
+          <w:p>
+            <w:pPr>
+              <w:spacing w:before="0" w:after="40" w:line="252" w:lineRule="auto"/>
+              <w:jc w:val="left"/>
+            </w:pPr>
+            <w:r>
+              <w:rPr>
+                <w:rFonts w:ascii="Calibri" w:hAnsi="Calibri"/>
+                <w:b w:val="0"/>
+                <w:color w:val="111827"/>
+                <w:sz w:val="17"/>
+              </w:rPr>
+              <w:t>Service/integration</w:t>
+            </w:r>
+          </w:p>
+        </w:tc>
+      </w:tr>
+      <w:tr>
+        <w:trPr>
+          <w:cantSplit/>
+        </w:trPr>
+        <w:tc>
+          <w:tcPr>
+            <w:tcW w:type="dxa" w:w="1650"/>
+            <w:tcMar>
+              <w:top w:w="80" w:type="dxa"/>
+              <w:start w:w="120" w:type="dxa"/>
+              <w:bottom w:w="80" w:type="dxa"/>
+              <w:end w:w="120" w:type="dxa"/>
+            </w:tcMar>
+            <w:vAlign w:val="center"/>
+            <w:shd w:fill="FFFFFF"/>
+          </w:tcPr>
+          <w:p>
+            <w:pPr>
+              <w:spacing w:before="0" w:after="40" w:line="252" w:lineRule="auto"/>
+              <w:jc w:val="center"/>
+            </w:pPr>
+            <w:r>
+              <w:rPr>
+                <w:rFonts w:ascii="Calibri" w:hAnsi="Calibri"/>
+                <w:b w:val="0"/>
+                <w:color w:val="111827"/>
+                <w:sz w:val="17"/>
+              </w:rPr>
+              <w:t>Negative replay</w:t>
+            </w:r>
+          </w:p>
+        </w:tc>
+        <w:tc>
+          <w:tcPr>
+            <w:tcW w:type="dxa" w:w="4450"/>
+            <w:tcMar>
+              <w:top w:w="80" w:type="dxa"/>
+              <w:start w:w="120" w:type="dxa"/>
+              <w:bottom w:w="80" w:type="dxa"/>
+              <w:end w:w="120" w:type="dxa"/>
+            </w:tcMar>
+            <w:vAlign w:val="center"/>
+            <w:shd w:fill="FFFFFF"/>
+          </w:tcPr>
+          <w:p>
+            <w:pPr>
+              <w:spacing w:before="0" w:after="40" w:line="252" w:lineRule="auto"/>
+              <w:jc w:val="left"/>
+            </w:pPr>
+            <w:r>
+              <w:rPr>
+                <w:rFonts w:ascii="Calibri" w:hAnsi="Calibri"/>
+                <w:b w:val="0"/>
+                <w:color w:val="111827"/>
+                <w:sz w:val="17"/>
+              </w:rPr>
+              <w:t>Repeat a persisted denial without another failed-attempt increment.</w:t>
+            </w:r>
+          </w:p>
+        </w:tc>
+        <w:tc>
+          <w:tcPr>
+            <w:tcW w:type="dxa" w:w="3260"/>
+            <w:tcMar>
+              <w:top w:w="80" w:type="dxa"/>
+              <w:start w:w="120" w:type="dxa"/>
+              <w:bottom w:w="80" w:type="dxa"/>
+              <w:end w:w="120" w:type="dxa"/>
+            </w:tcMar>
+            <w:vAlign w:val="center"/>
+            <w:shd w:fill="FFFFFF"/>
+          </w:tcPr>
+          <w:p>
+            <w:pPr>
+              <w:spacing w:before="0" w:after="40" w:line="252" w:lineRule="auto"/>
+              <w:jc w:val="left"/>
+            </w:pPr>
+            <w:r>
+              <w:rPr>
+                <w:rFonts w:ascii="Calibri" w:hAnsi="Calibri"/>
+                <w:b w:val="0"/>
+                <w:color w:val="111827"/>
+                <w:sz w:val="17"/>
+              </w:rPr>
+              <w:t>Service/integration</w:t>
+            </w:r>
+          </w:p>
+        </w:tc>
+      </w:tr>
+      <w:tr>
+        <w:trPr>
+          <w:cantSplit/>
+        </w:trPr>
+        <w:tc>
+          <w:tcPr>
+            <w:tcW w:type="dxa" w:w="1650"/>
+            <w:tcMar>
+              <w:top w:w="80" w:type="dxa"/>
+              <w:start w:w="120" w:type="dxa"/>
+              <w:bottom w:w="80" w:type="dxa"/>
+              <w:end w:w="120" w:type="dxa"/>
+            </w:tcMar>
+            <w:vAlign w:val="center"/>
+            <w:shd w:fill="FFFFFF"/>
+          </w:tcPr>
+          <w:p>
+            <w:pPr>
+              <w:spacing w:before="0" w:after="40" w:line="252" w:lineRule="auto"/>
+              <w:jc w:val="center"/>
+            </w:pPr>
+            <w:r>
+              <w:rPr>
+                <w:rFonts w:ascii="Calibri" w:hAnsi="Calibri"/>
+                <w:b w:val="0"/>
+                <w:color w:val="111827"/>
+                <w:sz w:val="17"/>
+              </w:rPr>
+              <w:t>Secret minimization</w:t>
+            </w:r>
+          </w:p>
+        </w:tc>
+        <w:tc>
+          <w:tcPr>
+            <w:tcW w:type="dxa" w:w="4450"/>
+            <w:tcMar>
+              <w:top w:w="80" w:type="dxa"/>
+              <w:start w:w="120" w:type="dxa"/>
+              <w:bottom w:w="80" w:type="dxa"/>
+              <w:end w:w="120" w:type="dxa"/>
+            </w:tcMar>
+            <w:vAlign w:val="center"/>
+            <w:shd w:fill="FFFFFF"/>
+          </w:tcPr>
+          <w:p>
+            <w:pPr>
+              <w:spacing w:before="0" w:after="40" w:line="252" w:lineRule="auto"/>
+              <w:jc w:val="left"/>
+            </w:pPr>
+            <w:r>
+              <w:rPr>
+                <w:rFonts w:ascii="Calibri" w:hAnsi="Calibri"/>
+                <w:b w:val="0"/>
+                <w:color w:val="111827"/>
+                <w:sz w:val="17"/>
+              </w:rPr>
+              <w:t>Prove raw key, seed, and key digest never enter audit or outbox evidence.</w:t>
+            </w:r>
+          </w:p>
+        </w:tc>
+        <w:tc>
+          <w:tcPr>
+            <w:tcW w:type="dxa" w:w="3260"/>
+            <w:tcMar>
+              <w:top w:w="80" w:type="dxa"/>
+              <w:start w:w="120" w:type="dxa"/>
+              <w:bottom w:w="80" w:type="dxa"/>
+              <w:end w:w="120" w:type="dxa"/>
+            </w:tcMar>
+            <w:vAlign w:val="center"/>
+            <w:shd w:fill="FFFFFF"/>
+          </w:tcPr>
+          <w:p>
+            <w:pPr>
+              <w:spacing w:before="0" w:after="40" w:line="252" w:lineRule="auto"/>
+              <w:jc w:val="left"/>
+            </w:pPr>
+            <w:r>
+              <w:rPr>
+                <w:rFonts w:ascii="Calibri" w:hAnsi="Calibri"/>
+                <w:b w:val="0"/>
+                <w:color w:val="111827"/>
+                <w:sz w:val="17"/>
+              </w:rPr>
+              <w:t>Service/security</w:t>
+            </w:r>
+          </w:p>
+        </w:tc>
+      </w:tr>
+      <w:tr>
+        <w:trPr>
+          <w:cantSplit/>
+        </w:trPr>
+        <w:tc>
+          <w:tcPr>
+            <w:tcW w:type="dxa" w:w="1650"/>
+            <w:tcMar>
+              <w:top w:w="80" w:type="dxa"/>
+              <w:start w:w="120" w:type="dxa"/>
+              <w:bottom w:w="80" w:type="dxa"/>
+              <w:end w:w="120" w:type="dxa"/>
+            </w:tcMar>
+            <w:vAlign w:val="center"/>
+            <w:shd w:fill="FFFFFF"/>
+          </w:tcPr>
+          <w:p>
+            <w:pPr>
+              <w:spacing w:before="0" w:after="40" w:line="252" w:lineRule="auto"/>
+              <w:jc w:val="center"/>
+            </w:pPr>
+            <w:r>
+              <w:rPr>
+                <w:rFonts w:ascii="Calibri" w:hAnsi="Calibri"/>
+                <w:b w:val="0"/>
+                <w:color w:val="111827"/>
+                <w:sz w:val="17"/>
+              </w:rPr>
+              <w:t>Safe state query</w:t>
+            </w:r>
+          </w:p>
+        </w:tc>
+        <w:tc>
+          <w:tcPr>
+            <w:tcW w:type="dxa" w:w="4450"/>
+            <w:tcMar>
+              <w:top w:w="80" w:type="dxa"/>
+              <w:start w:w="120" w:type="dxa"/>
+              <w:bottom w:w="80" w:type="dxa"/>
+              <w:end w:w="120" w:type="dxa"/>
+            </w:tcMar>
+            <w:vAlign w:val="center"/>
+            <w:shd w:fill="FFFFFF"/>
+          </w:tcPr>
+          <w:p>
+            <w:pPr>
+              <w:spacing w:before="0" w:after="40" w:line="252" w:lineRule="auto"/>
+              <w:jc w:val="left"/>
+            </w:pPr>
+            <w:r>
+              <w:rPr>
+                <w:rFonts w:ascii="Calibri" w:hAnsi="Calibri"/>
+                <w:b w:val="0"/>
+                <w:color w:val="111827"/>
+                <w:sz w:val="17"/>
+              </w:rPr>
+              <w:t>Expose versions, attempt count, lockout, and challenge presence without secret material.</w:t>
+            </w:r>
+          </w:p>
+        </w:tc>
+        <w:tc>
+          <w:tcPr>
+            <w:tcW w:type="dxa" w:w="3260"/>
+            <w:tcMar>
+              <w:top w:w="80" w:type="dxa"/>
+              <w:start w:w="120" w:type="dxa"/>
+              <w:bottom w:w="80" w:type="dxa"/>
+              <w:end w:w="120" w:type="dxa"/>
+            </w:tcMar>
+            <w:vAlign w:val="center"/>
+            <w:shd w:fill="FFFFFF"/>
+          </w:tcPr>
+          <w:p>
+            <w:pPr>
+              <w:spacing w:before="0" w:after="40" w:line="252" w:lineRule="auto"/>
+              <w:jc w:val="left"/>
+            </w:pPr>
+            <w:r>
+              <w:rPr>
+                <w:rFonts w:ascii="Calibri" w:hAnsi="Calibri"/>
+                <w:b w:val="0"/>
+                <w:color w:val="111827"/>
+                <w:sz w:val="17"/>
+              </w:rPr>
+              <w:t>API/OpenAPI</w:t>
+            </w:r>
+          </w:p>
+        </w:tc>
+      </w:tr>
+      <w:tr>
+        <w:trPr>
+          <w:cantSplit/>
+        </w:trPr>
+        <w:tc>
+          <w:tcPr>
+            <w:tcW w:type="dxa" w:w="1650"/>
+            <w:tcMar>
+              <w:top w:w="80" w:type="dxa"/>
+              <w:start w:w="120" w:type="dxa"/>
+              <w:bottom w:w="80" w:type="dxa"/>
+              <w:end w:w="120" w:type="dxa"/>
+            </w:tcMar>
+            <w:vAlign w:val="center"/>
+            <w:shd w:fill="FFFFFF"/>
+          </w:tcPr>
+          <w:p>
+            <w:pPr>
+              <w:spacing w:before="0" w:after="40" w:line="252" w:lineRule="auto"/>
+              <w:jc w:val="center"/>
+            </w:pPr>
+            <w:r>
+              <w:rPr>
+                <w:rFonts w:ascii="Calibri" w:hAnsi="Calibri"/>
+                <w:b w:val="0"/>
+                <w:color w:val="111827"/>
+                <w:sz w:val="17"/>
+              </w:rPr>
+              <w:t>Security atomicity</w:t>
+            </w:r>
+          </w:p>
+        </w:tc>
+        <w:tc>
+          <w:tcPr>
+            <w:tcW w:type="dxa" w:w="4450"/>
+            <w:tcMar>
+              <w:top w:w="80" w:type="dxa"/>
+              <w:start w:w="120" w:type="dxa"/>
+              <w:bottom w:w="80" w:type="dxa"/>
+              <w:end w:w="120" w:type="dxa"/>
+            </w:tcMar>
+            <w:vAlign w:val="center"/>
+            <w:shd w:fill="FFFFFF"/>
+          </w:tcPr>
+          <w:p>
+            <w:pPr>
+              <w:spacing w:before="0" w:after="40" w:line="252" w:lineRule="auto"/>
+              <w:jc w:val="left"/>
+            </w:pPr>
+            <w:r>
+              <w:rPr>
+                <w:rFonts w:ascii="Calibri" w:hAnsi="Calibri"/>
+                <w:b w:val="0"/>
+                <w:color w:val="111827"/>
+                <w:sz w:val="17"/>
+              </w:rPr>
+              <w:t>Commit failed attempt, command, audit, and outbox before returning the negative response.</w:t>
             </w:r>
           </w:p>
         </w:tc>
@@ -10753,6 +13193,39 @@
           <w:sz w:val="22"/>
         </w:rPr>
         <w:t xml:space="preserve"> owns routine definitions and execution states.</w:t>
+      </w:r>
+    </w:p>
+    <w:p>
+      <w:pPr>
+        <w:pStyle w:val="ListBullet"/>
+        <w:numPr>
+          <w:ilvl w:val="0"/>
+          <w:numId w:val="13"/>
+        </w:numPr>
+      </w:pPr>
+      <w:r>
+        <w:rPr>
+          <w:rFonts w:ascii="Calibri" w:hAnsi="Calibri"/>
+          <w:color w:val="111827"/>
+          <w:sz w:val="22"/>
+        </w:rPr>
+        <w:t xml:space="preserve">Migration </w:t>
+      </w:r>
+      <w:r>
+        <w:rPr>
+          <w:rFonts w:ascii="Consolas" w:hAnsi="Consolas"/>
+          <w:color w:val="1F4D78"/>
+          <w:sz w:val="19"/>
+        </w:rPr>
+        <w:t>0034_diagnostic_security_access</w:t>
+      </w:r>
+      <w:r>
+        <w:rPr>
+          <w:rFonts w:ascii="Calibri" w:hAnsi="Calibri"/>
+          <w:color w:val="111827"/>
+          <w:sz w:val="22"/>
+        </w:rPr>
+        <w:t xml:space="preserve"> owns the ECU Security Access challenge state.</w:t>
       </w:r>
     </w:p>
     <w:p>
@@ -11027,6 +13500,39 @@
     </w:p>
     <w:p>
       <w:pPr>
+        <w:pStyle w:val="ListBullet"/>
+        <w:numPr>
+          <w:ilvl w:val="0"/>
+          <w:numId w:val="13"/>
+        </w:numPr>
+      </w:pPr>
+      <w:r>
+        <w:rPr>
+          <w:rFonts w:ascii="Calibri" w:hAnsi="Calibri"/>
+          <w:color w:val="111827"/>
+          <w:sz w:val="22"/>
+        </w:rPr>
+        <w:t xml:space="preserve">Security Access events use </w:t>
+      </w:r>
+      <w:r>
+        <w:rPr>
+          <w:rFonts w:ascii="Consolas" w:hAnsi="Consolas"/>
+          <w:color w:val="1F4D78"/>
+          <w:sz w:val="19"/>
+        </w:rPr>
+        <w:t>atep.diagnostics.security.accessed.v1</w:t>
+      </w:r>
+      <w:r>
+        <w:rPr>
+          <w:rFonts w:ascii="Calibri" w:hAnsi="Calibri"/>
+          <w:color w:val="111827"/>
+          <w:sz w:val="22"/>
+        </w:rPr>
+        <w:t xml:space="preserve"> without seed/key material.</w:t>
+      </w:r>
+    </w:p>
+    <w:p>
+      <w:pPr>
         <w:pStyle w:val="Heading1"/>
         <w:keepNext/>
         <w:keepLines/>
@@ -11049,7 +13555,7 @@
           <w:color w:val="111827"/>
           <w:sz w:val="22"/>
         </w:rPr>
-        <w:t>V-1 through V-3 expose semantic UDS operations but do not yet encode wire PDUs.</w:t>
+        <w:t>V-1 through V-4 expose semantic UDS operations but do not yet encode wire PDUs.</w:t>
       </w:r>
     </w:p>
     <w:p>
@@ -11117,7 +13623,7 @@
           <w:color w:val="111827"/>
           <w:sz w:val="22"/>
         </w:rPr>
-        <w:t>Security level is reserved but remains zero until Security Access is implemented.</w:t>
+        <w:t>Security level 1 is implemented; additional OEM levels and protected production algorithms remain future work.</w:t>
       </w:r>
     </w:p>
     <w:p>
@@ -11156,6 +13662,23 @@
     </w:p>
     <w:p>
       <w:pPr>
+        <w:pStyle w:val="ListBullet"/>
+        <w:numPr>
+          <w:ilvl w:val="0"/>
+          <w:numId w:val="14"/>
+        </w:numPr>
+      </w:pPr>
+      <w:r>
+        <w:rPr>
+          <w:rFonts w:ascii="Calibri" w:hAnsi="Calibri"/>
+          <w:color w:val="111827"/>
+          <w:sz w:val="22"/>
+        </w:rPr>
+        <w:t>V-4 key derivation is transparent and deterministic for simulation; production security requires OEM algorithms, protected key material, hardware-backed execution, and threat analysis.</w:t>
+      </w:r>
+    </w:p>
+    <w:p>
+      <w:pPr>
         <w:pStyle w:val="Heading1"/>
         <w:keepNext/>
         <w:keepLines/>
@@ -11171,7 +13694,7 @@
           <w:color w:val="111827"/>
           <w:sz w:val="22"/>
         </w:rPr>
-        <w:t>V-1 through V-3 are implemented. The recommended next development is V-4: Security Access (</w:t>
+        <w:t>V-1 through V-4 are implemented. The recommended next development is V-5: ECU Reset (</w:t>
       </w:r>
       <w:r>
         <w:rPr>
@@ -11179,7 +13702,7 @@
           <w:color w:val="1F4D78"/>
           <w:sz w:val="19"/>
         </w:rPr>
-        <w:t>0x27</w:t>
+        <w:t>0x11</w:t>
       </w:r>
       <w:r>
         <w:rPr>
@@ -11187,7 +13710,7 @@
           <w:color w:val="111827"/>
           <w:sz w:val="22"/>
         </w:rPr>
-        <w:t>) with deterministic seeds, bounded key attempts, logical-time lockout, exact replay, and strict exclusion of secrets from logs, audit, events, and responses beyond the authorized exchange.</w:t>
+        <w:t>) integrated with the ECU lifecycle, diagnostic-session/security reset, deterministic logical time, exact replay, RBAC, audit, outbox, and failure-safe evidence.</w:t>
       </w:r>
     </w:p>
     <w:p>
@@ -11884,6 +14407,222 @@
         <w:t>Design a battery-balancing routine and its allowed diagnostic sessions.</w:t>
       </w:r>
     </w:p>
+    <w:p>
+      <w:pPr>
+        <w:pStyle w:val="ListNumber"/>
+        <w:numPr>
+          <w:ilvl w:val="0"/>
+          <w:numId w:val="15"/>
+        </w:numPr>
+      </w:pPr>
+      <w:r>
+        <w:rPr>
+          <w:rFonts w:ascii="Calibri" w:hAnsi="Calibri"/>
+          <w:color w:val="111827"/>
+          <w:sz w:val="22"/>
+        </w:rPr>
+        <w:t xml:space="preserve">Calculate the positive response identity for Security Access </w:t>
+      </w:r>
+      <w:r>
+        <w:rPr>
+          <w:rFonts w:ascii="Consolas" w:hAnsi="Consolas"/>
+          <w:color w:val="1F4D78"/>
+          <w:sz w:val="19"/>
+        </w:rPr>
+        <w:t>0x27</w:t>
+      </w:r>
+      <w:r>
+        <w:rPr>
+          <w:rFonts w:ascii="Calibri" w:hAnsi="Calibri"/>
+          <w:color w:val="111827"/>
+          <w:sz w:val="22"/>
+        </w:rPr>
+        <w:t>.</w:t>
+      </w:r>
+    </w:p>
+    <w:p>
+      <w:pPr>
+        <w:pStyle w:val="ListNumber"/>
+        <w:numPr>
+          <w:ilvl w:val="0"/>
+          <w:numId w:val="15"/>
+        </w:numPr>
+      </w:pPr>
+      <w:r>
+        <w:rPr>
+          <w:rFonts w:ascii="Calibri" w:hAnsi="Calibri"/>
+          <w:color w:val="111827"/>
+          <w:sz w:val="22"/>
+        </w:rPr>
+        <w:t>Trace requestSeed and identify where the seed may and may not appear.</w:t>
+      </w:r>
+    </w:p>
+    <w:p>
+      <w:pPr>
+        <w:pStyle w:val="ListNumber"/>
+        <w:numPr>
+          <w:ilvl w:val="0"/>
+          <w:numId w:val="15"/>
+        </w:numPr>
+      </w:pPr>
+      <w:r>
+        <w:rPr>
+          <w:rFonts w:ascii="Calibri" w:hAnsi="Calibri"/>
+          <w:color w:val="111827"/>
+          <w:sz w:val="22"/>
+        </w:rPr>
+        <w:t>Derive the simulator key for a sample seed and explain why the algorithm is not production-safe.</w:t>
+      </w:r>
+    </w:p>
+    <w:p>
+      <w:pPr>
+        <w:pStyle w:val="ListNumber"/>
+        <w:numPr>
+          <w:ilvl w:val="0"/>
+          <w:numId w:val="15"/>
+        </w:numPr>
+      </w:pPr>
+      <w:r>
+        <w:rPr>
+          <w:rFonts w:ascii="Calibri" w:hAnsi="Calibri"/>
+          <w:color w:val="111827"/>
+          <w:sz w:val="22"/>
+        </w:rPr>
+        <w:t>Design a test proving raw keys never enter command results, audit, outbox, or logs.</w:t>
+      </w:r>
+    </w:p>
+    <w:p>
+      <w:pPr>
+        <w:pStyle w:val="ListNumber"/>
+        <w:numPr>
+          <w:ilvl w:val="0"/>
+          <w:numId w:val="15"/>
+        </w:numPr>
+      </w:pPr>
+      <w:r>
+        <w:rPr>
+          <w:rFonts w:ascii="Calibri" w:hAnsi="Calibri"/>
+          <w:color w:val="111827"/>
+          <w:sz w:val="22"/>
+        </w:rPr>
+        <w:t xml:space="preserve">Compare NRC </w:t>
+      </w:r>
+      <w:r>
+        <w:rPr>
+          <w:rFonts w:ascii="Consolas" w:hAnsi="Consolas"/>
+          <w:color w:val="1F4D78"/>
+          <w:sz w:val="19"/>
+        </w:rPr>
+        <w:t>0x24</w:t>
+      </w:r>
+      <w:r>
+        <w:rPr>
+          <w:rFonts w:ascii="Calibri" w:hAnsi="Calibri"/>
+          <w:color w:val="111827"/>
+          <w:sz w:val="22"/>
+        </w:rPr>
+        <w:t xml:space="preserve">, </w:t>
+      </w:r>
+      <w:r>
+        <w:rPr>
+          <w:rFonts w:ascii="Consolas" w:hAnsi="Consolas"/>
+          <w:color w:val="1F4D78"/>
+          <w:sz w:val="19"/>
+        </w:rPr>
+        <w:t>0x35</w:t>
+      </w:r>
+      <w:r>
+        <w:rPr>
+          <w:rFonts w:ascii="Calibri" w:hAnsi="Calibri"/>
+          <w:color w:val="111827"/>
+          <w:sz w:val="22"/>
+        </w:rPr>
+        <w:t xml:space="preserve">, </w:t>
+      </w:r>
+      <w:r>
+        <w:rPr>
+          <w:rFonts w:ascii="Consolas" w:hAnsi="Consolas"/>
+          <w:color w:val="1F4D78"/>
+          <w:sz w:val="19"/>
+        </w:rPr>
+        <w:t>0x36</w:t>
+      </w:r>
+      <w:r>
+        <w:rPr>
+          <w:rFonts w:ascii="Calibri" w:hAnsi="Calibri"/>
+          <w:color w:val="111827"/>
+          <w:sz w:val="22"/>
+        </w:rPr>
+        <w:t xml:space="preserve">, and </w:t>
+      </w:r>
+      <w:r>
+        <w:rPr>
+          <w:rFonts w:ascii="Consolas" w:hAnsi="Consolas"/>
+          <w:color w:val="1F4D78"/>
+          <w:sz w:val="19"/>
+        </w:rPr>
+        <w:t>0x37</w:t>
+      </w:r>
+      <w:r>
+        <w:rPr>
+          <w:rFonts w:ascii="Calibri" w:hAnsi="Calibri"/>
+          <w:color w:val="111827"/>
+          <w:sz w:val="22"/>
+        </w:rPr>
+        <w:t xml:space="preserve"> in the implemented flow.</w:t>
+      </w:r>
+    </w:p>
+    <w:p>
+      <w:pPr>
+        <w:pStyle w:val="ListNumber"/>
+        <w:numPr>
+          <w:ilvl w:val="0"/>
+          <w:numId w:val="15"/>
+        </w:numPr>
+      </w:pPr>
+      <w:r>
+        <w:rPr>
+          <w:rFonts w:ascii="Calibri" w:hAnsi="Calibri"/>
+          <w:color w:val="111827"/>
+          <w:sz w:val="22"/>
+        </w:rPr>
+        <w:t>Prove an exact invalid-key retry does not increment failed attempts twice.</w:t>
+      </w:r>
+    </w:p>
+    <w:p>
+      <w:pPr>
+        <w:pStyle w:val="ListNumber"/>
+        <w:numPr>
+          <w:ilvl w:val="0"/>
+          <w:numId w:val="15"/>
+        </w:numPr>
+      </w:pPr>
+      <w:r>
+        <w:rPr>
+          <w:rFonts w:ascii="Calibri" w:hAnsi="Calibri"/>
+          <w:color w:val="111827"/>
+          <w:sz w:val="22"/>
+        </w:rPr>
+        <w:t>Advance ECU logical time to one millisecond before and exactly at lockout expiry.</w:t>
+      </w:r>
+    </w:p>
+    <w:p>
+      <w:pPr>
+        <w:pStyle w:val="ListNumber"/>
+        <w:numPr>
+          <w:ilvl w:val="0"/>
+          <w:numId w:val="15"/>
+        </w:numPr>
+      </w:pPr>
+      <w:r>
+        <w:rPr>
+          <w:rFonts w:ascii="Calibri" w:hAnsi="Calibri"/>
+          <w:color w:val="111827"/>
+          <w:sz w:val="22"/>
+        </w:rPr>
+        <w:t>Explain why Security Access state and diagnostic-session security level use separate versions.</w:t>
+      </w:r>
+    </w:p>
     <w:sectPr>
       <w:headerReference w:type="default" r:id="rId9"/>
       <w:footerReference w:type="default" r:id="rId10"/>
@@ -11913,7 +14652,7 @@
         <w:color w:val="667085"/>
         <w:sz w:val="17"/>
       </w:rPr>
-      <w:t>ATEP Volume V Workbook  |  Version 0.3.0</w:t>
+      <w:t>ATEP Volume V Workbook  |  Version 0.4.0</w:t>
     </w:r>
     <w:r>
       <w:rPr>

</xml_diff>

<commit_message>
feat(diagnostics): implement UDS ECU reset
</commit_message>
<xml_diff>
--- a/docs/ATEP_Volume_V_Diagnostics_Engineering_Workbook.docx
+++ b/docs/ATEP_Volume_V_Diagnostics_Engineering_Workbook.docx
@@ -143,7 +143,7 @@
                 <w:color w:val="0B2545"/>
                 <w:sz w:val="19"/>
               </w:rPr>
-              <w:t>0.4.0</w:t>
+              <w:t>0.5.0</w:t>
             </w:r>
           </w:p>
         </w:tc>
@@ -204,7 +204,7 @@
                 <w:color w:val="111827"/>
                 <w:sz w:val="19"/>
               </w:rPr>
-              <w:t>28 August 2026</w:t>
+              <w:t>29 August 2026</w:t>
             </w:r>
           </w:p>
         </w:tc>
@@ -265,7 +265,7 @@
                 <w:color w:val="111827"/>
                 <w:sz w:val="19"/>
               </w:rPr>
-              <w:t>Implemented increments: V-1 through V-4</w:t>
+              <w:t>Implemented increments: V-1 through V-5</w:t>
             </w:r>
           </w:p>
         </w:tc>
@@ -893,7 +893,7 @@
                 <w:color w:val="111827"/>
                 <w:sz w:val="17"/>
               </w:rPr>
-              <w:t>Increments V-1 through V-4</w:t>
+              <w:t>Increments V-1 through V-5</w:t>
             </w:r>
           </w:p>
         </w:tc>
@@ -1686,6 +1686,113 @@
                 <w:sz w:val="17"/>
               </w:rPr>
               <w:t>, deterministic level-1 seed/key exchange, logical-time expiry and lockout, idempotent negative evidence, secret minimization, migration, APIs, and tests.</w:t>
+            </w:r>
+          </w:p>
+        </w:tc>
+      </w:tr>
+      <w:tr>
+        <w:trPr>
+          <w:cantSplit/>
+        </w:trPr>
+        <w:tc>
+          <w:tcPr>
+            <w:tcW w:type="dxa" w:w="1650"/>
+            <w:tcMar>
+              <w:top w:w="80" w:type="dxa"/>
+              <w:start w:w="120" w:type="dxa"/>
+              <w:bottom w:w="80" w:type="dxa"/>
+              <w:end w:w="120" w:type="dxa"/>
+            </w:tcMar>
+            <w:vAlign w:val="center"/>
+            <w:shd w:fill="FFFFFF"/>
+          </w:tcPr>
+          <w:p>
+            <w:pPr>
+              <w:spacing w:before="0" w:after="40" w:line="252" w:lineRule="auto"/>
+              <w:jc w:val="center"/>
+            </w:pPr>
+            <w:r>
+              <w:rPr>
+                <w:rFonts w:ascii="Calibri" w:hAnsi="Calibri"/>
+                <w:b w:val="0"/>
+                <w:color w:val="111827"/>
+                <w:sz w:val="17"/>
+              </w:rPr>
+              <w:t>0.5.0</w:t>
+            </w:r>
+          </w:p>
+        </w:tc>
+        <w:tc>
+          <w:tcPr>
+            <w:tcW w:type="dxa" w:w="4450"/>
+            <w:tcMar>
+              <w:top w:w="80" w:type="dxa"/>
+              <w:start w:w="120" w:type="dxa"/>
+              <w:bottom w:w="80" w:type="dxa"/>
+              <w:end w:w="120" w:type="dxa"/>
+            </w:tcMar>
+            <w:vAlign w:val="center"/>
+            <w:shd w:fill="FFFFFF"/>
+          </w:tcPr>
+          <w:p>
+            <w:pPr>
+              <w:spacing w:before="0" w:after="40" w:line="252" w:lineRule="auto"/>
+              <w:jc w:val="left"/>
+            </w:pPr>
+            <w:r>
+              <w:rPr>
+                <w:rFonts w:ascii="Calibri" w:hAnsi="Calibri"/>
+                <w:b w:val="0"/>
+                <w:color w:val="111827"/>
+                <w:sz w:val="17"/>
+              </w:rPr>
+              <w:t>2026-08-29</w:t>
+            </w:r>
+          </w:p>
+        </w:tc>
+        <w:tc>
+          <w:tcPr>
+            <w:tcW w:type="dxa" w:w="3260"/>
+            <w:tcMar>
+              <w:top w:w="80" w:type="dxa"/>
+              <w:start w:w="120" w:type="dxa"/>
+              <w:bottom w:w="80" w:type="dxa"/>
+              <w:end w:w="120" w:type="dxa"/>
+            </w:tcMar>
+            <w:vAlign w:val="center"/>
+            <w:shd w:fill="FFFFFF"/>
+          </w:tcPr>
+          <w:p>
+            <w:pPr>
+              <w:spacing w:before="0" w:after="40" w:line="252" w:lineRule="auto"/>
+              <w:jc w:val="left"/>
+            </w:pPr>
+            <w:r>
+              <w:rPr>
+                <w:rFonts w:ascii="Calibri" w:hAnsi="Calibri"/>
+                <w:b w:val="0"/>
+                <w:color w:val="111827"/>
+                <w:sz w:val="17"/>
+              </w:rPr>
+              <w:t xml:space="preserve">Added UDS ECU Reset </w:t>
+            </w:r>
+            <w:r>
+              <w:rPr>
+                <w:rFonts w:ascii="Calibri" w:hAnsi="Calibri"/>
+                <w:b w:val="0"/>
+                <w:color w:val="111827"/>
+                <w:sz w:val="17"/>
+              </w:rPr>
+              <w:t>0x11</w:t>
+            </w:r>
+            <w:r>
+              <w:rPr>
+                <w:rFonts w:ascii="Calibri" w:hAnsi="Calibri"/>
+                <w:b w:val="0"/>
+                <w:color w:val="111827"/>
+                <w:sz w:val="17"/>
+              </w:rPr>
+              <w:t>, cross-volume ECU lifecycle orchestration, reset/session/security version checks, deterministic logical time, exact replay, RBAC, atomic audit/outbox evidence, API, and tests.</w:t>
             </w:r>
           </w:p>
         </w:tc>
@@ -2106,6 +2213,57 @@
     </w:p>
     <w:p>
       <w:pPr>
+        <w:pStyle w:val="ListBullet"/>
+        <w:numPr>
+          <w:ilvl w:val="0"/>
+          <w:numId w:val="11"/>
+        </w:numPr>
+      </w:pPr>
+      <w:r>
+        <w:rPr>
+          <w:rFonts w:ascii="Calibri" w:hAnsi="Calibri"/>
+          <w:color w:val="111827"/>
+          <w:sz w:val="22"/>
+        </w:rPr>
+        <w:t>UDS ECU Reset hard, key-off/on, and soft subfunctions through the existing ECU lifecycle.</w:t>
+      </w:r>
+    </w:p>
+    <w:p>
+      <w:pPr>
+        <w:pStyle w:val="ListBullet"/>
+        <w:numPr>
+          <w:ilvl w:val="0"/>
+          <w:numId w:val="11"/>
+        </w:numPr>
+      </w:pPr>
+      <w:r>
+        <w:rPr>
+          <w:rFonts w:ascii="Calibri" w:hAnsi="Calibri"/>
+          <w:color w:val="111827"/>
+          <w:sz w:val="22"/>
+        </w:rPr>
+        <w:t>Atomic restoration of default session, security level zero, and empty challenge/lockout state.</w:t>
+      </w:r>
+    </w:p>
+    <w:p>
+      <w:pPr>
+        <w:pStyle w:val="ListBullet"/>
+        <w:numPr>
+          <w:ilvl w:val="0"/>
+          <w:numId w:val="11"/>
+        </w:numPr>
+      </w:pPr>
+      <w:r>
+        <w:rPr>
+          <w:rFonts w:ascii="Calibri" w:hAnsi="Calibri"/>
+          <w:color w:val="111827"/>
+          <w:sz w:val="22"/>
+        </w:rPr>
+        <w:t>Reset/session/security optimistic versions, session/security policy, and exact reset replay.</w:t>
+      </w:r>
+    </w:p>
+    <w:p>
+      <w:pPr>
         <w:pStyle w:val="Heading2"/>
         <w:keepNext/>
         <w:keepLines/>
@@ -2145,7 +2303,7 @@
           <w:color w:val="111827"/>
           <w:sz w:val="22"/>
         </w:rPr>
-        <w:t>ECU Reset and flash transfer services.</w:t>
+        <w:t>Flash transfer services.</w:t>
       </w:r>
     </w:p>
     <w:p>
@@ -4640,6 +4798,141 @@
                 <w:sz w:val="16"/>
               </w:rPr>
               <w:t xml:space="preserve"> requestSeed or sendKey.</w:t>
+            </w:r>
+          </w:p>
+        </w:tc>
+      </w:tr>
+      <w:tr>
+        <w:trPr>
+          <w:cantSplit/>
+        </w:trPr>
+        <w:tc>
+          <w:tcPr>
+            <w:tcW w:type="dxa" w:w="1150"/>
+            <w:tcMar>
+              <w:top w:w="80" w:type="dxa"/>
+              <w:start w:w="120" w:type="dxa"/>
+              <w:bottom w:w="80" w:type="dxa"/>
+              <w:end w:w="120" w:type="dxa"/>
+            </w:tcMar>
+            <w:vAlign w:val="center"/>
+            <w:shd w:fill="FFFFFF"/>
+          </w:tcPr>
+          <w:p>
+            <w:pPr>
+              <w:spacing w:before="0" w:after="40" w:line="252" w:lineRule="auto"/>
+              <w:jc w:val="center"/>
+            </w:pPr>
+            <w:r>
+              <w:rPr>
+                <w:rFonts w:ascii="Calibri" w:hAnsi="Calibri"/>
+                <w:b w:val="0"/>
+                <w:color w:val="111827"/>
+                <w:sz w:val="16"/>
+              </w:rPr>
+              <w:t>POST</w:t>
+            </w:r>
+          </w:p>
+        </w:tc>
+        <w:tc>
+          <w:tcPr>
+            <w:tcW w:type="dxa" w:w="3700"/>
+            <w:tcMar>
+              <w:top w:w="80" w:type="dxa"/>
+              <w:start w:w="120" w:type="dxa"/>
+              <w:bottom w:w="80" w:type="dxa"/>
+              <w:end w:w="120" w:type="dxa"/>
+            </w:tcMar>
+            <w:vAlign w:val="center"/>
+            <w:shd w:fill="FFFFFF"/>
+          </w:tcPr>
+          <w:p>
+            <w:pPr>
+              <w:spacing w:before="0" w:after="40" w:line="252" w:lineRule="auto"/>
+              <w:jc w:val="left"/>
+            </w:pPr>
+            <w:r>
+              <w:rPr>
+                <w:rFonts w:ascii="Calibri" w:hAnsi="Calibri"/>
+                <w:b w:val="0"/>
+                <w:color w:val="111827"/>
+                <w:sz w:val="16"/>
+              </w:rPr>
+              <w:t>/api/v1/vehicles/{vehicle_id}/ecus/{ecu_id}/diagnostics/ecu-reset</w:t>
+            </w:r>
+          </w:p>
+        </w:tc>
+        <w:tc>
+          <w:tcPr>
+            <w:tcW w:type="dxa" w:w="3100"/>
+            <w:tcMar>
+              <w:top w:w="80" w:type="dxa"/>
+              <w:start w:w="120" w:type="dxa"/>
+              <w:bottom w:w="80" w:type="dxa"/>
+              <w:end w:w="120" w:type="dxa"/>
+            </w:tcMar>
+            <w:vAlign w:val="center"/>
+            <w:shd w:fill="FFFFFF"/>
+          </w:tcPr>
+          <w:p>
+            <w:pPr>
+              <w:spacing w:before="0" w:after="40" w:line="252" w:lineRule="auto"/>
+              <w:jc w:val="left"/>
+            </w:pPr>
+            <w:r>
+              <w:rPr>
+                <w:rFonts w:ascii="Calibri" w:hAnsi="Calibri"/>
+                <w:b w:val="0"/>
+                <w:color w:val="111827"/>
+                <w:sz w:val="16"/>
+              </w:rPr>
+              <w:t>diagnostics:manage</w:t>
+            </w:r>
+          </w:p>
+        </w:tc>
+        <w:tc>
+          <w:tcPr>
+            <w:tcW w:type="dxa" w:w="1410"/>
+            <w:tcMar>
+              <w:top w:w="80" w:type="dxa"/>
+              <w:start w:w="120" w:type="dxa"/>
+              <w:bottom w:w="80" w:type="dxa"/>
+              <w:end w:w="120" w:type="dxa"/>
+            </w:tcMar>
+            <w:vAlign w:val="center"/>
+            <w:shd w:fill="FFFFFF"/>
+          </w:tcPr>
+          <w:p>
+            <w:pPr>
+              <w:spacing w:before="0" w:after="40" w:line="252" w:lineRule="auto"/>
+              <w:jc w:val="left"/>
+            </w:pPr>
+            <w:r>
+              <w:rPr>
+                <w:rFonts w:ascii="Calibri" w:hAnsi="Calibri"/>
+                <w:b w:val="0"/>
+                <w:color w:val="111827"/>
+                <w:sz w:val="16"/>
+              </w:rPr>
+              <w:t xml:space="preserve">Execute UDS </w:t>
+            </w:r>
+            <w:r>
+              <w:rPr>
+                <w:rFonts w:ascii="Calibri" w:hAnsi="Calibri"/>
+                <w:b w:val="0"/>
+                <w:color w:val="111827"/>
+                <w:sz w:val="16"/>
+              </w:rPr>
+              <w:t>0x11</w:t>
+            </w:r>
+            <w:r>
+              <w:rPr>
+                <w:rFonts w:ascii="Calibri" w:hAnsi="Calibri"/>
+                <w:b w:val="0"/>
+                <w:color w:val="111827"/>
+                <w:sz w:val="16"/>
+              </w:rPr>
+              <w:t xml:space="preserve"> through the ECU lifecycle.</w:t>
             </w:r>
           </w:p>
         </w:tc>
@@ -5090,6 +5383,90 @@
     </w:p>
     <w:p>
       <w:pPr>
+        <w:pStyle w:val="Heading2"/>
+        <w:keepNext/>
+        <w:keepLines/>
+      </w:pPr>
+      <w:r>
+        <w:t>8.8 ECU Reset (`0x11`)</w:t>
+      </w:r>
+    </w:p>
+    <w:p>
+      <w:r>
+        <w:rPr>
+          <w:rFonts w:ascii="Calibri" w:hAnsi="Calibri"/>
+          <w:color w:val="111827"/>
+          <w:sz w:val="22"/>
+        </w:rPr>
+        <w:t>V-5 supports hardReset (</w:t>
+      </w:r>
+      <w:r>
+        <w:rPr>
+          <w:rFonts w:ascii="Consolas" w:hAnsi="Consolas"/>
+          <w:color w:val="1F4D78"/>
+          <w:sz w:val="19"/>
+        </w:rPr>
+        <w:t>0x01</w:t>
+      </w:r>
+      <w:r>
+        <w:rPr>
+          <w:rFonts w:ascii="Calibri" w:hAnsi="Calibri"/>
+          <w:color w:val="111827"/>
+          <w:sz w:val="22"/>
+        </w:rPr>
+        <w:t>), keyOffOnReset (</w:t>
+      </w:r>
+      <w:r>
+        <w:rPr>
+          <w:rFonts w:ascii="Consolas" w:hAnsi="Consolas"/>
+          <w:color w:val="1F4D78"/>
+          <w:sz w:val="19"/>
+        </w:rPr>
+        <w:t>0x02</w:t>
+      </w:r>
+      <w:r>
+        <w:rPr>
+          <w:rFonts w:ascii="Calibri" w:hAnsi="Calibri"/>
+          <w:color w:val="111827"/>
+          <w:sz w:val="22"/>
+        </w:rPr>
+        <w:t>), and softReset (</w:t>
+      </w:r>
+      <w:r>
+        <w:rPr>
+          <w:rFonts w:ascii="Consolas" w:hAnsi="Consolas"/>
+          <w:color w:val="1F4D78"/>
+          <w:sz w:val="19"/>
+        </w:rPr>
+        <w:t>0x03</w:t>
+      </w:r>
+      <w:r>
+        <w:rPr>
+          <w:rFonts w:ascii="Calibri" w:hAnsi="Calibri"/>
+          <w:color w:val="111827"/>
+          <w:sz w:val="22"/>
+        </w:rPr>
+        <w:t xml:space="preserve">). Every request requires programming or extended session; hard and key-off/on reset additionally require security level 1. The command checks ECU, session, and Security Access versions before invoking the existing Volume III ECU reset lifecycle. The lifecycle owns operational state, memory policy, fault preservation, boot count, ECU version, reset duration, and logical-time advancement. Within the same transaction, the diagnostic layer restores default session and security level zero, invalidates seed/attempt/lockout state, increments diagnostic versions, and records UDS evidence. The positive response identity is </w:t>
+      </w:r>
+      <w:r>
+        <w:rPr>
+          <w:rFonts w:ascii="Consolas" w:hAnsi="Consolas"/>
+          <w:color w:val="1F4D78"/>
+          <w:sz w:val="19"/>
+        </w:rPr>
+        <w:t>0x51</w:t>
+      </w:r>
+      <w:r>
+        <w:rPr>
+          <w:rFonts w:ascii="Calibri" w:hAnsi="Calibri"/>
+          <w:color w:val="111827"/>
+          <w:sz w:val="22"/>
+        </w:rPr>
+        <w:t>. Exact retry replays stored results without a second reset.</w:t>
+      </w:r>
+    </w:p>
+    <w:p>
+      <w:pPr>
         <w:pStyle w:val="Heading1"/>
         <w:keepNext/>
         <w:keepLines/>
@@ -6971,6 +7348,411 @@
                 <w:sz w:val="16"/>
               </w:rPr>
               <w:t xml:space="preserve"> required time delay not expired</w:t>
+            </w:r>
+          </w:p>
+        </w:tc>
+      </w:tr>
+      <w:tr>
+        <w:trPr>
+          <w:cantSplit/>
+        </w:trPr>
+        <w:tc>
+          <w:tcPr>
+            <w:tcW w:type="dxa" w:w="1150"/>
+            <w:tcMar>
+              <w:top w:w="80" w:type="dxa"/>
+              <w:start w:w="120" w:type="dxa"/>
+              <w:bottom w:w="80" w:type="dxa"/>
+              <w:end w:w="120" w:type="dxa"/>
+            </w:tcMar>
+            <w:vAlign w:val="center"/>
+            <w:shd w:fill="FFFFFF"/>
+          </w:tcPr>
+          <w:p>
+            <w:pPr>
+              <w:spacing w:before="0" w:after="40" w:line="252" w:lineRule="auto"/>
+              <w:jc w:val="center"/>
+            </w:pPr>
+            <w:r>
+              <w:rPr>
+                <w:rFonts w:ascii="Calibri" w:hAnsi="Calibri"/>
+                <w:b w:val="0"/>
+                <w:color w:val="111827"/>
+                <w:sz w:val="16"/>
+              </w:rPr>
+              <w:t>Reset in default session</w:t>
+            </w:r>
+          </w:p>
+        </w:tc>
+        <w:tc>
+          <w:tcPr>
+            <w:tcW w:type="dxa" w:w="3700"/>
+            <w:tcMar>
+              <w:top w:w="80" w:type="dxa"/>
+              <w:start w:w="120" w:type="dxa"/>
+              <w:bottom w:w="80" w:type="dxa"/>
+              <w:end w:w="120" w:type="dxa"/>
+            </w:tcMar>
+            <w:vAlign w:val="center"/>
+            <w:shd w:fill="FFFFFF"/>
+          </w:tcPr>
+          <w:p>
+            <w:pPr>
+              <w:spacing w:before="0" w:after="40" w:line="252" w:lineRule="auto"/>
+              <w:jc w:val="left"/>
+            </w:pPr>
+            <w:r>
+              <w:rPr>
+                <w:rFonts w:ascii="Calibri" w:hAnsi="Calibri"/>
+                <w:b w:val="0"/>
+                <w:color w:val="111827"/>
+                <w:sz w:val="16"/>
+              </w:rPr>
+              <w:t>diagnostic_contract_invalid</w:t>
+            </w:r>
+          </w:p>
+        </w:tc>
+        <w:tc>
+          <w:tcPr>
+            <w:tcW w:type="dxa" w:w="3100"/>
+            <w:tcMar>
+              <w:top w:w="80" w:type="dxa"/>
+              <w:start w:w="120" w:type="dxa"/>
+              <w:bottom w:w="80" w:type="dxa"/>
+              <w:end w:w="120" w:type="dxa"/>
+            </w:tcMar>
+            <w:vAlign w:val="center"/>
+            <w:shd w:fill="FFFFFF"/>
+          </w:tcPr>
+          <w:p>
+            <w:pPr>
+              <w:spacing w:before="0" w:after="40" w:line="252" w:lineRule="auto"/>
+              <w:jc w:val="left"/>
+            </w:pPr>
+            <w:r>
+              <w:rPr>
+                <w:rFonts w:ascii="Calibri" w:hAnsi="Calibri"/>
+                <w:b w:val="0"/>
+                <w:color w:val="111827"/>
+                <w:sz w:val="16"/>
+              </w:rPr>
+              <w:t>422</w:t>
+            </w:r>
+          </w:p>
+        </w:tc>
+        <w:tc>
+          <w:tcPr>
+            <w:tcW w:type="dxa" w:w="1410"/>
+            <w:tcMar>
+              <w:top w:w="80" w:type="dxa"/>
+              <w:start w:w="120" w:type="dxa"/>
+              <w:bottom w:w="80" w:type="dxa"/>
+              <w:end w:w="120" w:type="dxa"/>
+            </w:tcMar>
+            <w:vAlign w:val="center"/>
+            <w:shd w:fill="FFFFFF"/>
+          </w:tcPr>
+          <w:p>
+            <w:pPr>
+              <w:spacing w:before="0" w:after="40" w:line="252" w:lineRule="auto"/>
+              <w:jc w:val="left"/>
+            </w:pPr>
+            <w:r>
+              <w:rPr>
+                <w:rFonts w:ascii="Calibri" w:hAnsi="Calibri"/>
+                <w:b w:val="0"/>
+                <w:color w:val="111827"/>
+                <w:sz w:val="16"/>
+              </w:rPr>
+              <w:t xml:space="preserve">NRC </w:t>
+            </w:r>
+            <w:r>
+              <w:rPr>
+                <w:rFonts w:ascii="Calibri" w:hAnsi="Calibri"/>
+                <w:b w:val="0"/>
+                <w:color w:val="111827"/>
+                <w:sz w:val="16"/>
+              </w:rPr>
+              <w:t>0x7F</w:t>
+            </w:r>
+            <w:r>
+              <w:rPr>
+                <w:rFonts w:ascii="Calibri" w:hAnsi="Calibri"/>
+                <w:b w:val="0"/>
+                <w:color w:val="111827"/>
+                <w:sz w:val="16"/>
+              </w:rPr>
+              <w:t xml:space="preserve"> service not supported in active session</w:t>
+            </w:r>
+          </w:p>
+        </w:tc>
+      </w:tr>
+      <w:tr>
+        <w:trPr>
+          <w:cantSplit/>
+        </w:trPr>
+        <w:tc>
+          <w:tcPr>
+            <w:tcW w:type="dxa" w:w="1150"/>
+            <w:tcMar>
+              <w:top w:w="80" w:type="dxa"/>
+              <w:start w:w="120" w:type="dxa"/>
+              <w:bottom w:w="80" w:type="dxa"/>
+              <w:end w:w="120" w:type="dxa"/>
+            </w:tcMar>
+            <w:vAlign w:val="center"/>
+            <w:shd w:fill="FFFFFF"/>
+          </w:tcPr>
+          <w:p>
+            <w:pPr>
+              <w:spacing w:before="0" w:after="40" w:line="252" w:lineRule="auto"/>
+              <w:jc w:val="center"/>
+            </w:pPr>
+            <w:r>
+              <w:rPr>
+                <w:rFonts w:ascii="Calibri" w:hAnsi="Calibri"/>
+                <w:b w:val="0"/>
+                <w:color w:val="111827"/>
+                <w:sz w:val="16"/>
+              </w:rPr>
+              <w:t>Hard or key-off/on reset without level 1</w:t>
+            </w:r>
+          </w:p>
+        </w:tc>
+        <w:tc>
+          <w:tcPr>
+            <w:tcW w:type="dxa" w:w="3700"/>
+            <w:tcMar>
+              <w:top w:w="80" w:type="dxa"/>
+              <w:start w:w="120" w:type="dxa"/>
+              <w:bottom w:w="80" w:type="dxa"/>
+              <w:end w:w="120" w:type="dxa"/>
+            </w:tcMar>
+            <w:vAlign w:val="center"/>
+            <w:shd w:fill="FFFFFF"/>
+          </w:tcPr>
+          <w:p>
+            <w:pPr>
+              <w:spacing w:before="0" w:after="40" w:line="252" w:lineRule="auto"/>
+              <w:jc w:val="left"/>
+            </w:pPr>
+            <w:r>
+              <w:rPr>
+                <w:rFonts w:ascii="Calibri" w:hAnsi="Calibri"/>
+                <w:b w:val="0"/>
+                <w:color w:val="111827"/>
+                <w:sz w:val="16"/>
+              </w:rPr>
+              <w:t>diagnostic_contract_invalid</w:t>
+            </w:r>
+          </w:p>
+        </w:tc>
+        <w:tc>
+          <w:tcPr>
+            <w:tcW w:type="dxa" w:w="3100"/>
+            <w:tcMar>
+              <w:top w:w="80" w:type="dxa"/>
+              <w:start w:w="120" w:type="dxa"/>
+              <w:bottom w:w="80" w:type="dxa"/>
+              <w:end w:w="120" w:type="dxa"/>
+            </w:tcMar>
+            <w:vAlign w:val="center"/>
+            <w:shd w:fill="FFFFFF"/>
+          </w:tcPr>
+          <w:p>
+            <w:pPr>
+              <w:spacing w:before="0" w:after="40" w:line="252" w:lineRule="auto"/>
+              <w:jc w:val="left"/>
+            </w:pPr>
+            <w:r>
+              <w:rPr>
+                <w:rFonts w:ascii="Calibri" w:hAnsi="Calibri"/>
+                <w:b w:val="0"/>
+                <w:color w:val="111827"/>
+                <w:sz w:val="16"/>
+              </w:rPr>
+              <w:t>422</w:t>
+            </w:r>
+          </w:p>
+        </w:tc>
+        <w:tc>
+          <w:tcPr>
+            <w:tcW w:type="dxa" w:w="1410"/>
+            <w:tcMar>
+              <w:top w:w="80" w:type="dxa"/>
+              <w:start w:w="120" w:type="dxa"/>
+              <w:bottom w:w="80" w:type="dxa"/>
+              <w:end w:w="120" w:type="dxa"/>
+            </w:tcMar>
+            <w:vAlign w:val="center"/>
+            <w:shd w:fill="FFFFFF"/>
+          </w:tcPr>
+          <w:p>
+            <w:pPr>
+              <w:spacing w:before="0" w:after="40" w:line="252" w:lineRule="auto"/>
+              <w:jc w:val="left"/>
+            </w:pPr>
+            <w:r>
+              <w:rPr>
+                <w:rFonts w:ascii="Calibri" w:hAnsi="Calibri"/>
+                <w:b w:val="0"/>
+                <w:color w:val="111827"/>
+                <w:sz w:val="16"/>
+              </w:rPr>
+              <w:t xml:space="preserve">NRC </w:t>
+            </w:r>
+            <w:r>
+              <w:rPr>
+                <w:rFonts w:ascii="Calibri" w:hAnsi="Calibri"/>
+                <w:b w:val="0"/>
+                <w:color w:val="111827"/>
+                <w:sz w:val="16"/>
+              </w:rPr>
+              <w:t>0x33</w:t>
+            </w:r>
+            <w:r>
+              <w:rPr>
+                <w:rFonts w:ascii="Calibri" w:hAnsi="Calibri"/>
+                <w:b w:val="0"/>
+                <w:color w:val="111827"/>
+                <w:sz w:val="16"/>
+              </w:rPr>
+              <w:t xml:space="preserve"> security access denied</w:t>
+            </w:r>
+          </w:p>
+        </w:tc>
+      </w:tr>
+      <w:tr>
+        <w:trPr>
+          <w:cantSplit/>
+        </w:trPr>
+        <w:tc>
+          <w:tcPr>
+            <w:tcW w:type="dxa" w:w="1150"/>
+            <w:tcMar>
+              <w:top w:w="80" w:type="dxa"/>
+              <w:start w:w="120" w:type="dxa"/>
+              <w:bottom w:w="80" w:type="dxa"/>
+              <w:end w:w="120" w:type="dxa"/>
+            </w:tcMar>
+            <w:vAlign w:val="center"/>
+            <w:shd w:fill="FFFFFF"/>
+          </w:tcPr>
+          <w:p>
+            <w:pPr>
+              <w:spacing w:before="0" w:after="40" w:line="252" w:lineRule="auto"/>
+              <w:jc w:val="center"/>
+            </w:pPr>
+            <w:r>
+              <w:rPr>
+                <w:rFonts w:ascii="Calibri" w:hAnsi="Calibri"/>
+                <w:b w:val="0"/>
+                <w:color w:val="111827"/>
+                <w:sz w:val="16"/>
+              </w:rPr>
+              <w:t>Stale ECU, session, or security reset version</w:t>
+            </w:r>
+          </w:p>
+        </w:tc>
+        <w:tc>
+          <w:tcPr>
+            <w:tcW w:type="dxa" w:w="3700"/>
+            <w:tcMar>
+              <w:top w:w="80" w:type="dxa"/>
+              <w:start w:w="120" w:type="dxa"/>
+              <w:bottom w:w="80" w:type="dxa"/>
+              <w:end w:w="120" w:type="dxa"/>
+            </w:tcMar>
+            <w:vAlign w:val="center"/>
+            <w:shd w:fill="FFFFFF"/>
+          </w:tcPr>
+          <w:p>
+            <w:pPr>
+              <w:spacing w:before="0" w:after="40" w:line="252" w:lineRule="auto"/>
+              <w:jc w:val="left"/>
+            </w:pPr>
+            <w:r>
+              <w:rPr>
+                <w:rFonts w:ascii="Calibri" w:hAnsi="Calibri"/>
+                <w:b w:val="0"/>
+                <w:color w:val="111827"/>
+                <w:sz w:val="16"/>
+              </w:rPr>
+              <w:t>diagnostic_contract_invalid</w:t>
+            </w:r>
+          </w:p>
+        </w:tc>
+        <w:tc>
+          <w:tcPr>
+            <w:tcW w:type="dxa" w:w="3100"/>
+            <w:tcMar>
+              <w:top w:w="80" w:type="dxa"/>
+              <w:start w:w="120" w:type="dxa"/>
+              <w:bottom w:w="80" w:type="dxa"/>
+              <w:end w:w="120" w:type="dxa"/>
+            </w:tcMar>
+            <w:vAlign w:val="center"/>
+            <w:shd w:fill="FFFFFF"/>
+          </w:tcPr>
+          <w:p>
+            <w:pPr>
+              <w:spacing w:before="0" w:after="40" w:line="252" w:lineRule="auto"/>
+              <w:jc w:val="left"/>
+            </w:pPr>
+            <w:r>
+              <w:rPr>
+                <w:rFonts w:ascii="Calibri" w:hAnsi="Calibri"/>
+                <w:b w:val="0"/>
+                <w:color w:val="111827"/>
+                <w:sz w:val="16"/>
+              </w:rPr>
+              <w:t>422</w:t>
+            </w:r>
+          </w:p>
+        </w:tc>
+        <w:tc>
+          <w:tcPr>
+            <w:tcW w:type="dxa" w:w="1410"/>
+            <w:tcMar>
+              <w:top w:w="80" w:type="dxa"/>
+              <w:start w:w="120" w:type="dxa"/>
+              <w:bottom w:w="80" w:type="dxa"/>
+              <w:end w:w="120" w:type="dxa"/>
+            </w:tcMar>
+            <w:vAlign w:val="center"/>
+            <w:shd w:fill="FFFFFF"/>
+          </w:tcPr>
+          <w:p>
+            <w:pPr>
+              <w:spacing w:before="0" w:after="40" w:line="252" w:lineRule="auto"/>
+              <w:jc w:val="left"/>
+            </w:pPr>
+            <w:r>
+              <w:rPr>
+                <w:rFonts w:ascii="Calibri" w:hAnsi="Calibri"/>
+                <w:b w:val="0"/>
+                <w:color w:val="111827"/>
+                <w:sz w:val="16"/>
+              </w:rPr>
+              <w:t xml:space="preserve">NRC </w:t>
+            </w:r>
+            <w:r>
+              <w:rPr>
+                <w:rFonts w:ascii="Calibri" w:hAnsi="Calibri"/>
+                <w:b w:val="0"/>
+                <w:color w:val="111827"/>
+                <w:sz w:val="16"/>
+              </w:rPr>
+              <w:t>0x22</w:t>
+            </w:r>
+            <w:r>
+              <w:rPr>
+                <w:rFonts w:ascii="Calibri" w:hAnsi="Calibri"/>
+                <w:b w:val="0"/>
+                <w:color w:val="111827"/>
+                <w:sz w:val="16"/>
+              </w:rPr>
+              <w:t xml:space="preserve"> conditions not correct</w:t>
             </w:r>
           </w:p>
         </w:tc>
@@ -7467,6 +8249,62 @@
     </w:p>
     <w:p>
       <w:pPr>
+        <w:pStyle w:val="Heading2"/>
+        <w:keepNext/>
+        <w:keepLines/>
+      </w:pPr>
+      <w:r>
+        <w:t>ADR-DG-013 - Orchestrate One ECU Reset Lifecycle Across Volumes</w:t>
+      </w:r>
+    </w:p>
+    <w:p>
+      <w:r>
+        <w:rPr>
+          <w:rFonts w:ascii="Calibri" w:hAnsi="Calibri"/>
+          <w:color w:val="111827"/>
+          <w:sz w:val="22"/>
+        </w:rPr>
+        <w:t xml:space="preserve">UDS </w:t>
+      </w:r>
+      <w:r>
+        <w:rPr>
+          <w:rFonts w:ascii="Consolas" w:hAnsi="Consolas"/>
+          <w:color w:val="1F4D78"/>
+          <w:sz w:val="19"/>
+        </w:rPr>
+        <w:t>0x11</w:t>
+      </w:r>
+      <w:r>
+        <w:rPr>
+          <w:rFonts w:ascii="Calibri" w:hAnsi="Calibri"/>
+          <w:color w:val="111827"/>
+          <w:sz w:val="22"/>
+        </w:rPr>
+        <w:t xml:space="preserve"> calls the reset behavior already owned by Volume III rather than reimplementing memory, boot, fault, timing, or operational-state rules. One database transaction contains both ECU-native and diagnostic evidence, followed by the session/security reset. This keeps the simulated ECU and external tester view consistent and makes rollback reliable.</w:t>
+      </w:r>
+    </w:p>
+    <w:p>
+      <w:pPr>
+        <w:pStyle w:val="Heading2"/>
+        <w:keepNext/>
+        <w:keepLines/>
+      </w:pPr>
+      <w:r>
+        <w:t>ADR-DG-014 - Apply Reset Authorization Before Lifecycle Mutation</w:t>
+      </w:r>
+    </w:p>
+    <w:p>
+      <w:r>
+        <w:rPr>
+          <w:rFonts w:ascii="Calibri" w:hAnsi="Calibri"/>
+          <w:color w:val="111827"/>
+          <w:sz w:val="22"/>
+        </w:rPr>
+        <w:t>Default-session reset is rejected. Hard and key-off/on reset additionally require level-1 Security Access; soft reset requires only programming or extended session. ECU, diagnostic-session, and security-state versions are validated so a stale tester cannot reset newer aggregate state.</w:t>
+      </w:r>
+    </w:p>
+    <w:p>
+      <w:pPr>
         <w:pStyle w:val="Heading1"/>
         <w:keepNext/>
         <w:keepLines/>
@@ -13023,6 +13861,844 @@
                 <w:sz w:val="17"/>
               </w:rPr>
               <w:t>Commit failed attempt, command, audit, and outbox before returning the negative response.</w:t>
+            </w:r>
+          </w:p>
+        </w:tc>
+        <w:tc>
+          <w:tcPr>
+            <w:tcW w:type="dxa" w:w="3260"/>
+            <w:tcMar>
+              <w:top w:w="80" w:type="dxa"/>
+              <w:start w:w="120" w:type="dxa"/>
+              <w:bottom w:w="80" w:type="dxa"/>
+              <w:end w:w="120" w:type="dxa"/>
+            </w:tcMar>
+            <w:vAlign w:val="center"/>
+            <w:shd w:fill="FFFFFF"/>
+          </w:tcPr>
+          <w:p>
+            <w:pPr>
+              <w:spacing w:before="0" w:after="40" w:line="252" w:lineRule="auto"/>
+              <w:jc w:val="left"/>
+            </w:pPr>
+            <w:r>
+              <w:rPr>
+                <w:rFonts w:ascii="Calibri" w:hAnsi="Calibri"/>
+                <w:b w:val="0"/>
+                <w:color w:val="111827"/>
+                <w:sz w:val="17"/>
+              </w:rPr>
+              <w:t>Integration</w:t>
+            </w:r>
+          </w:p>
+        </w:tc>
+      </w:tr>
+      <w:tr>
+        <w:trPr>
+          <w:cantSplit/>
+        </w:trPr>
+        <w:tc>
+          <w:tcPr>
+            <w:tcW w:type="dxa" w:w="1650"/>
+            <w:tcMar>
+              <w:top w:w="80" w:type="dxa"/>
+              <w:start w:w="120" w:type="dxa"/>
+              <w:bottom w:w="80" w:type="dxa"/>
+              <w:end w:w="120" w:type="dxa"/>
+            </w:tcMar>
+            <w:vAlign w:val="center"/>
+            <w:shd w:fill="FFFFFF"/>
+          </w:tcPr>
+          <w:p>
+            <w:pPr>
+              <w:spacing w:before="0" w:after="40" w:line="252" w:lineRule="auto"/>
+              <w:jc w:val="center"/>
+            </w:pPr>
+            <w:r>
+              <w:rPr>
+                <w:rFonts w:ascii="Calibri" w:hAnsi="Calibri"/>
+                <w:b w:val="0"/>
+                <w:color w:val="111827"/>
+                <w:sz w:val="17"/>
+              </w:rPr>
+              <w:t>Reset command shape</w:t>
+            </w:r>
+          </w:p>
+        </w:tc>
+        <w:tc>
+          <w:tcPr>
+            <w:tcW w:type="dxa" w:w="4450"/>
+            <w:tcMar>
+              <w:top w:w="80" w:type="dxa"/>
+              <w:start w:w="120" w:type="dxa"/>
+              <w:bottom w:w="80" w:type="dxa"/>
+              <w:end w:w="120" w:type="dxa"/>
+            </w:tcMar>
+            <w:vAlign w:val="center"/>
+            <w:shd w:fill="FFFFFF"/>
+          </w:tcPr>
+          <w:p>
+            <w:pPr>
+              <w:spacing w:before="0" w:after="40" w:line="252" w:lineRule="auto"/>
+              <w:jc w:val="left"/>
+            </w:pPr>
+            <w:r>
+              <w:rPr>
+                <w:rFonts w:ascii="Calibri" w:hAnsi="Calibri"/>
+                <w:b w:val="0"/>
+                <w:color w:val="111827"/>
+                <w:sz w:val="17"/>
+              </w:rPr>
+              <w:t xml:space="preserve">Publish subfunctions </w:t>
+            </w:r>
+            <w:r>
+              <w:rPr>
+                <w:rFonts w:ascii="Calibri" w:hAnsi="Calibri"/>
+                <w:b w:val="0"/>
+                <w:color w:val="111827"/>
+                <w:sz w:val="17"/>
+              </w:rPr>
+              <w:t>0x01</w:t>
+            </w:r>
+            <w:r>
+              <w:rPr>
+                <w:rFonts w:ascii="Calibri" w:hAnsi="Calibri"/>
+                <w:b w:val="0"/>
+                <w:color w:val="111827"/>
+                <w:sz w:val="17"/>
+              </w:rPr>
+              <w:t xml:space="preserve">, </w:t>
+            </w:r>
+            <w:r>
+              <w:rPr>
+                <w:rFonts w:ascii="Calibri" w:hAnsi="Calibri"/>
+                <w:b w:val="0"/>
+                <w:color w:val="111827"/>
+                <w:sz w:val="17"/>
+              </w:rPr>
+              <w:t>0x02</w:t>
+            </w:r>
+            <w:r>
+              <w:rPr>
+                <w:rFonts w:ascii="Calibri" w:hAnsi="Calibri"/>
+                <w:b w:val="0"/>
+                <w:color w:val="111827"/>
+                <w:sz w:val="17"/>
+              </w:rPr>
+              <w:t xml:space="preserve">, and </w:t>
+            </w:r>
+            <w:r>
+              <w:rPr>
+                <w:rFonts w:ascii="Calibri" w:hAnsi="Calibri"/>
+                <w:b w:val="0"/>
+                <w:color w:val="111827"/>
+                <w:sz w:val="17"/>
+              </w:rPr>
+              <w:t>0x03</w:t>
+            </w:r>
+            <w:r>
+              <w:rPr>
+                <w:rFonts w:ascii="Calibri" w:hAnsi="Calibri"/>
+                <w:b w:val="0"/>
+                <w:color w:val="111827"/>
+                <w:sz w:val="17"/>
+              </w:rPr>
+              <w:t xml:space="preserve"> plus three bounded expected versions.</w:t>
+            </w:r>
+          </w:p>
+        </w:tc>
+        <w:tc>
+          <w:tcPr>
+            <w:tcW w:type="dxa" w:w="3260"/>
+            <w:tcMar>
+              <w:top w:w="80" w:type="dxa"/>
+              <w:start w:w="120" w:type="dxa"/>
+              <w:bottom w:w="80" w:type="dxa"/>
+              <w:end w:w="120" w:type="dxa"/>
+            </w:tcMar>
+            <w:vAlign w:val="center"/>
+            <w:shd w:fill="FFFFFF"/>
+          </w:tcPr>
+          <w:p>
+            <w:pPr>
+              <w:spacing w:before="0" w:after="40" w:line="252" w:lineRule="auto"/>
+              <w:jc w:val="left"/>
+            </w:pPr>
+            <w:r>
+              <w:rPr>
+                <w:rFonts w:ascii="Calibri" w:hAnsi="Calibri"/>
+                <w:b w:val="0"/>
+                <w:color w:val="111827"/>
+                <w:sz w:val="17"/>
+              </w:rPr>
+              <w:t>Schema/OpenAPI</w:t>
+            </w:r>
+          </w:p>
+        </w:tc>
+      </w:tr>
+      <w:tr>
+        <w:trPr>
+          <w:cantSplit/>
+        </w:trPr>
+        <w:tc>
+          <w:tcPr>
+            <w:tcW w:type="dxa" w:w="1650"/>
+            <w:tcMar>
+              <w:top w:w="80" w:type="dxa"/>
+              <w:start w:w="120" w:type="dxa"/>
+              <w:bottom w:w="80" w:type="dxa"/>
+              <w:end w:w="120" w:type="dxa"/>
+            </w:tcMar>
+            <w:vAlign w:val="center"/>
+            <w:shd w:fill="FFFFFF"/>
+          </w:tcPr>
+          <w:p>
+            <w:pPr>
+              <w:spacing w:before="0" w:after="40" w:line="252" w:lineRule="auto"/>
+              <w:jc w:val="center"/>
+            </w:pPr>
+            <w:r>
+              <w:rPr>
+                <w:rFonts w:ascii="Calibri" w:hAnsi="Calibri"/>
+                <w:b w:val="0"/>
+                <w:color w:val="111827"/>
+                <w:sz w:val="17"/>
+              </w:rPr>
+              <w:t>Reset session policy</w:t>
+            </w:r>
+          </w:p>
+        </w:tc>
+        <w:tc>
+          <w:tcPr>
+            <w:tcW w:type="dxa" w:w="4450"/>
+            <w:tcMar>
+              <w:top w:w="80" w:type="dxa"/>
+              <w:start w:w="120" w:type="dxa"/>
+              <w:bottom w:w="80" w:type="dxa"/>
+              <w:end w:w="120" w:type="dxa"/>
+            </w:tcMar>
+            <w:vAlign w:val="center"/>
+            <w:shd w:fill="FFFFFF"/>
+          </w:tcPr>
+          <w:p>
+            <w:pPr>
+              <w:spacing w:before="0" w:after="40" w:line="252" w:lineRule="auto"/>
+              <w:jc w:val="left"/>
+            </w:pPr>
+            <w:r>
+              <w:rPr>
+                <w:rFonts w:ascii="Calibri" w:hAnsi="Calibri"/>
+                <w:b w:val="0"/>
+                <w:color w:val="111827"/>
+                <w:sz w:val="17"/>
+              </w:rPr>
+              <w:t xml:space="preserve">Reject every reset in default session with NRC </w:t>
+            </w:r>
+            <w:r>
+              <w:rPr>
+                <w:rFonts w:ascii="Calibri" w:hAnsi="Calibri"/>
+                <w:b w:val="0"/>
+                <w:color w:val="111827"/>
+                <w:sz w:val="17"/>
+              </w:rPr>
+              <w:t>0x7F</w:t>
+            </w:r>
+            <w:r>
+              <w:rPr>
+                <w:rFonts w:ascii="Calibri" w:hAnsi="Calibri"/>
+                <w:b w:val="0"/>
+                <w:color w:val="111827"/>
+                <w:sz w:val="17"/>
+              </w:rPr>
+              <w:t>.</w:t>
+            </w:r>
+          </w:p>
+        </w:tc>
+        <w:tc>
+          <w:tcPr>
+            <w:tcW w:type="dxa" w:w="3260"/>
+            <w:tcMar>
+              <w:top w:w="80" w:type="dxa"/>
+              <w:start w:w="120" w:type="dxa"/>
+              <w:bottom w:w="80" w:type="dxa"/>
+              <w:end w:w="120" w:type="dxa"/>
+            </w:tcMar>
+            <w:vAlign w:val="center"/>
+            <w:shd w:fill="FFFFFF"/>
+          </w:tcPr>
+          <w:p>
+            <w:pPr>
+              <w:spacing w:before="0" w:after="40" w:line="252" w:lineRule="auto"/>
+              <w:jc w:val="left"/>
+            </w:pPr>
+            <w:r>
+              <w:rPr>
+                <w:rFonts w:ascii="Calibri" w:hAnsi="Calibri"/>
+                <w:b w:val="0"/>
+                <w:color w:val="111827"/>
+                <w:sz w:val="17"/>
+              </w:rPr>
+              <w:t>Service/API</w:t>
+            </w:r>
+          </w:p>
+        </w:tc>
+      </w:tr>
+      <w:tr>
+        <w:trPr>
+          <w:cantSplit/>
+        </w:trPr>
+        <w:tc>
+          <w:tcPr>
+            <w:tcW w:type="dxa" w:w="1650"/>
+            <w:tcMar>
+              <w:top w:w="80" w:type="dxa"/>
+              <w:start w:w="120" w:type="dxa"/>
+              <w:bottom w:w="80" w:type="dxa"/>
+              <w:end w:w="120" w:type="dxa"/>
+            </w:tcMar>
+            <w:vAlign w:val="center"/>
+            <w:shd w:fill="FFFFFF"/>
+          </w:tcPr>
+          <w:p>
+            <w:pPr>
+              <w:spacing w:before="0" w:after="40" w:line="252" w:lineRule="auto"/>
+              <w:jc w:val="center"/>
+            </w:pPr>
+            <w:r>
+              <w:rPr>
+                <w:rFonts w:ascii="Calibri" w:hAnsi="Calibri"/>
+                <w:b w:val="0"/>
+                <w:color w:val="111827"/>
+                <w:sz w:val="17"/>
+              </w:rPr>
+              <w:t>Reset security policy</w:t>
+            </w:r>
+          </w:p>
+        </w:tc>
+        <w:tc>
+          <w:tcPr>
+            <w:tcW w:type="dxa" w:w="4450"/>
+            <w:tcMar>
+              <w:top w:w="80" w:type="dxa"/>
+              <w:start w:w="120" w:type="dxa"/>
+              <w:bottom w:w="80" w:type="dxa"/>
+              <w:end w:w="120" w:type="dxa"/>
+            </w:tcMar>
+            <w:vAlign w:val="center"/>
+            <w:shd w:fill="FFFFFF"/>
+          </w:tcPr>
+          <w:p>
+            <w:pPr>
+              <w:spacing w:before="0" w:after="40" w:line="252" w:lineRule="auto"/>
+              <w:jc w:val="left"/>
+            </w:pPr>
+            <w:r>
+              <w:rPr>
+                <w:rFonts w:ascii="Calibri" w:hAnsi="Calibri"/>
+                <w:b w:val="0"/>
+                <w:color w:val="111827"/>
+                <w:sz w:val="17"/>
+              </w:rPr>
+              <w:t xml:space="preserve">Reject hard and key-off/on reset below level 1 with NRC </w:t>
+            </w:r>
+            <w:r>
+              <w:rPr>
+                <w:rFonts w:ascii="Calibri" w:hAnsi="Calibri"/>
+                <w:b w:val="0"/>
+                <w:color w:val="111827"/>
+                <w:sz w:val="17"/>
+              </w:rPr>
+              <w:t>0x33</w:t>
+            </w:r>
+            <w:r>
+              <w:rPr>
+                <w:rFonts w:ascii="Calibri" w:hAnsi="Calibri"/>
+                <w:b w:val="0"/>
+                <w:color w:val="111827"/>
+                <w:sz w:val="17"/>
+              </w:rPr>
+              <w:t>.</w:t>
+            </w:r>
+          </w:p>
+        </w:tc>
+        <w:tc>
+          <w:tcPr>
+            <w:tcW w:type="dxa" w:w="3260"/>
+            <w:tcMar>
+              <w:top w:w="80" w:type="dxa"/>
+              <w:start w:w="120" w:type="dxa"/>
+              <w:bottom w:w="80" w:type="dxa"/>
+              <w:end w:w="120" w:type="dxa"/>
+            </w:tcMar>
+            <w:vAlign w:val="center"/>
+            <w:shd w:fill="FFFFFF"/>
+          </w:tcPr>
+          <w:p>
+            <w:pPr>
+              <w:spacing w:before="0" w:after="40" w:line="252" w:lineRule="auto"/>
+              <w:jc w:val="left"/>
+            </w:pPr>
+            <w:r>
+              <w:rPr>
+                <w:rFonts w:ascii="Calibri" w:hAnsi="Calibri"/>
+                <w:b w:val="0"/>
+                <w:color w:val="111827"/>
+                <w:sz w:val="17"/>
+              </w:rPr>
+              <w:t>Service/API</w:t>
+            </w:r>
+          </w:p>
+        </w:tc>
+      </w:tr>
+      <w:tr>
+        <w:trPr>
+          <w:cantSplit/>
+        </w:trPr>
+        <w:tc>
+          <w:tcPr>
+            <w:tcW w:type="dxa" w:w="1650"/>
+            <w:tcMar>
+              <w:top w:w="80" w:type="dxa"/>
+              <w:start w:w="120" w:type="dxa"/>
+              <w:bottom w:w="80" w:type="dxa"/>
+              <w:end w:w="120" w:type="dxa"/>
+            </w:tcMar>
+            <w:vAlign w:val="center"/>
+            <w:shd w:fill="FFFFFF"/>
+          </w:tcPr>
+          <w:p>
+            <w:pPr>
+              <w:spacing w:before="0" w:after="40" w:line="252" w:lineRule="auto"/>
+              <w:jc w:val="center"/>
+            </w:pPr>
+            <w:r>
+              <w:rPr>
+                <w:rFonts w:ascii="Calibri" w:hAnsi="Calibri"/>
+                <w:b w:val="0"/>
+                <w:color w:val="111827"/>
+                <w:sz w:val="17"/>
+              </w:rPr>
+              <w:t>Cross-volume reset</w:t>
+            </w:r>
+          </w:p>
+        </w:tc>
+        <w:tc>
+          <w:tcPr>
+            <w:tcW w:type="dxa" w:w="4450"/>
+            <w:tcMar>
+              <w:top w:w="80" w:type="dxa"/>
+              <w:start w:w="120" w:type="dxa"/>
+              <w:bottom w:w="80" w:type="dxa"/>
+              <w:end w:w="120" w:type="dxa"/>
+            </w:tcMar>
+            <w:vAlign w:val="center"/>
+            <w:shd w:fill="FFFFFF"/>
+          </w:tcPr>
+          <w:p>
+            <w:pPr>
+              <w:spacing w:before="0" w:after="40" w:line="252" w:lineRule="auto"/>
+              <w:jc w:val="left"/>
+            </w:pPr>
+            <w:r>
+              <w:rPr>
+                <w:rFonts w:ascii="Calibri" w:hAnsi="Calibri"/>
+                <w:b w:val="0"/>
+                <w:color w:val="111827"/>
+                <w:sz w:val="17"/>
+              </w:rPr>
+              <w:t>Prove UDS reset invokes ECU memory/boot/fault/time rules instead of duplicating them.</w:t>
+            </w:r>
+          </w:p>
+        </w:tc>
+        <w:tc>
+          <w:tcPr>
+            <w:tcW w:type="dxa" w:w="3260"/>
+            <w:tcMar>
+              <w:top w:w="80" w:type="dxa"/>
+              <w:start w:w="120" w:type="dxa"/>
+              <w:bottom w:w="80" w:type="dxa"/>
+              <w:end w:w="120" w:type="dxa"/>
+            </w:tcMar>
+            <w:vAlign w:val="center"/>
+            <w:shd w:fill="FFFFFF"/>
+          </w:tcPr>
+          <w:p>
+            <w:pPr>
+              <w:spacing w:before="0" w:after="40" w:line="252" w:lineRule="auto"/>
+              <w:jc w:val="left"/>
+            </w:pPr>
+            <w:r>
+              <w:rPr>
+                <w:rFonts w:ascii="Calibri" w:hAnsi="Calibri"/>
+                <w:b w:val="0"/>
+                <w:color w:val="111827"/>
+                <w:sz w:val="17"/>
+              </w:rPr>
+              <w:t>Service/integration</w:t>
+            </w:r>
+          </w:p>
+        </w:tc>
+      </w:tr>
+      <w:tr>
+        <w:trPr>
+          <w:cantSplit/>
+        </w:trPr>
+        <w:tc>
+          <w:tcPr>
+            <w:tcW w:type="dxa" w:w="1650"/>
+            <w:tcMar>
+              <w:top w:w="80" w:type="dxa"/>
+              <w:start w:w="120" w:type="dxa"/>
+              <w:bottom w:w="80" w:type="dxa"/>
+              <w:end w:w="120" w:type="dxa"/>
+            </w:tcMar>
+            <w:vAlign w:val="center"/>
+            <w:shd w:fill="FFFFFF"/>
+          </w:tcPr>
+          <w:p>
+            <w:pPr>
+              <w:spacing w:before="0" w:after="40" w:line="252" w:lineRule="auto"/>
+              <w:jc w:val="center"/>
+            </w:pPr>
+            <w:r>
+              <w:rPr>
+                <w:rFonts w:ascii="Calibri" w:hAnsi="Calibri"/>
+                <w:b w:val="0"/>
+                <w:color w:val="111827"/>
+                <w:sz w:val="17"/>
+              </w:rPr>
+              <w:t>Diagnostic restoration</w:t>
+            </w:r>
+          </w:p>
+        </w:tc>
+        <w:tc>
+          <w:tcPr>
+            <w:tcW w:type="dxa" w:w="4450"/>
+            <w:tcMar>
+              <w:top w:w="80" w:type="dxa"/>
+              <w:start w:w="120" w:type="dxa"/>
+              <w:bottom w:w="80" w:type="dxa"/>
+              <w:end w:w="120" w:type="dxa"/>
+            </w:tcMar>
+            <w:vAlign w:val="center"/>
+            <w:shd w:fill="FFFFFF"/>
+          </w:tcPr>
+          <w:p>
+            <w:pPr>
+              <w:spacing w:before="0" w:after="40" w:line="252" w:lineRule="auto"/>
+              <w:jc w:val="left"/>
+            </w:pPr>
+            <w:r>
+              <w:rPr>
+                <w:rFonts w:ascii="Calibri" w:hAnsi="Calibri"/>
+                <w:b w:val="0"/>
+                <w:color w:val="111827"/>
+                <w:sz w:val="17"/>
+              </w:rPr>
+              <w:t>Restore default session, security zero, and empty challenge/lockout state.</w:t>
+            </w:r>
+          </w:p>
+        </w:tc>
+        <w:tc>
+          <w:tcPr>
+            <w:tcW w:type="dxa" w:w="3260"/>
+            <w:tcMar>
+              <w:top w:w="80" w:type="dxa"/>
+              <w:start w:w="120" w:type="dxa"/>
+              <w:bottom w:w="80" w:type="dxa"/>
+              <w:end w:w="120" w:type="dxa"/>
+            </w:tcMar>
+            <w:vAlign w:val="center"/>
+            <w:shd w:fill="FFFFFF"/>
+          </w:tcPr>
+          <w:p>
+            <w:pPr>
+              <w:spacing w:before="0" w:after="40" w:line="252" w:lineRule="auto"/>
+              <w:jc w:val="left"/>
+            </w:pPr>
+            <w:r>
+              <w:rPr>
+                <w:rFonts w:ascii="Calibri" w:hAnsi="Calibri"/>
+                <w:b w:val="0"/>
+                <w:color w:val="111827"/>
+                <w:sz w:val="17"/>
+              </w:rPr>
+              <w:t>Service/integration</w:t>
+            </w:r>
+          </w:p>
+        </w:tc>
+      </w:tr>
+      <w:tr>
+        <w:trPr>
+          <w:cantSplit/>
+        </w:trPr>
+        <w:tc>
+          <w:tcPr>
+            <w:tcW w:type="dxa" w:w="1650"/>
+            <w:tcMar>
+              <w:top w:w="80" w:type="dxa"/>
+              <w:start w:w="120" w:type="dxa"/>
+              <w:bottom w:w="80" w:type="dxa"/>
+              <w:end w:w="120" w:type="dxa"/>
+            </w:tcMar>
+            <w:vAlign w:val="center"/>
+            <w:shd w:fill="FFFFFF"/>
+          </w:tcPr>
+          <w:p>
+            <w:pPr>
+              <w:spacing w:before="0" w:after="40" w:line="252" w:lineRule="auto"/>
+              <w:jc w:val="center"/>
+            </w:pPr>
+            <w:r>
+              <w:rPr>
+                <w:rFonts w:ascii="Calibri" w:hAnsi="Calibri"/>
+                <w:b w:val="0"/>
+                <w:color w:val="111827"/>
+                <w:sz w:val="17"/>
+              </w:rPr>
+              <w:t>Reset concurrency</w:t>
+            </w:r>
+          </w:p>
+        </w:tc>
+        <w:tc>
+          <w:tcPr>
+            <w:tcW w:type="dxa" w:w="4450"/>
+            <w:tcMar>
+              <w:top w:w="80" w:type="dxa"/>
+              <w:start w:w="120" w:type="dxa"/>
+              <w:bottom w:w="80" w:type="dxa"/>
+              <w:end w:w="120" w:type="dxa"/>
+            </w:tcMar>
+            <w:vAlign w:val="center"/>
+            <w:shd w:fill="FFFFFF"/>
+          </w:tcPr>
+          <w:p>
+            <w:pPr>
+              <w:spacing w:before="0" w:after="40" w:line="252" w:lineRule="auto"/>
+              <w:jc w:val="left"/>
+            </w:pPr>
+            <w:r>
+              <w:rPr>
+                <w:rFonts w:ascii="Calibri" w:hAnsi="Calibri"/>
+                <w:b w:val="0"/>
+                <w:color w:val="111827"/>
+                <w:sz w:val="17"/>
+              </w:rPr>
+              <w:t xml:space="preserve">Reject stale ECU, session, or security versions with NRC </w:t>
+            </w:r>
+            <w:r>
+              <w:rPr>
+                <w:rFonts w:ascii="Calibri" w:hAnsi="Calibri"/>
+                <w:b w:val="0"/>
+                <w:color w:val="111827"/>
+                <w:sz w:val="17"/>
+              </w:rPr>
+              <w:t>0x22</w:t>
+            </w:r>
+            <w:r>
+              <w:rPr>
+                <w:rFonts w:ascii="Calibri" w:hAnsi="Calibri"/>
+                <w:b w:val="0"/>
+                <w:color w:val="111827"/>
+                <w:sz w:val="17"/>
+              </w:rPr>
+              <w:t>.</w:t>
+            </w:r>
+          </w:p>
+        </w:tc>
+        <w:tc>
+          <w:tcPr>
+            <w:tcW w:type="dxa" w:w="3260"/>
+            <w:tcMar>
+              <w:top w:w="80" w:type="dxa"/>
+              <w:start w:w="120" w:type="dxa"/>
+              <w:bottom w:w="80" w:type="dxa"/>
+              <w:end w:w="120" w:type="dxa"/>
+            </w:tcMar>
+            <w:vAlign w:val="center"/>
+            <w:shd w:fill="FFFFFF"/>
+          </w:tcPr>
+          <w:p>
+            <w:pPr>
+              <w:spacing w:before="0" w:after="40" w:line="252" w:lineRule="auto"/>
+              <w:jc w:val="left"/>
+            </w:pPr>
+            <w:r>
+              <w:rPr>
+                <w:rFonts w:ascii="Calibri" w:hAnsi="Calibri"/>
+                <w:b w:val="0"/>
+                <w:color w:val="111827"/>
+                <w:sz w:val="17"/>
+              </w:rPr>
+              <w:t>Service/API</w:t>
+            </w:r>
+          </w:p>
+        </w:tc>
+      </w:tr>
+      <w:tr>
+        <w:trPr>
+          <w:cantSplit/>
+        </w:trPr>
+        <w:tc>
+          <w:tcPr>
+            <w:tcW w:type="dxa" w:w="1650"/>
+            <w:tcMar>
+              <w:top w:w="80" w:type="dxa"/>
+              <w:start w:w="120" w:type="dxa"/>
+              <w:bottom w:w="80" w:type="dxa"/>
+              <w:end w:w="120" w:type="dxa"/>
+            </w:tcMar>
+            <w:vAlign w:val="center"/>
+            <w:shd w:fill="FFFFFF"/>
+          </w:tcPr>
+          <w:p>
+            <w:pPr>
+              <w:spacing w:before="0" w:after="40" w:line="252" w:lineRule="auto"/>
+              <w:jc w:val="center"/>
+            </w:pPr>
+            <w:r>
+              <w:rPr>
+                <w:rFonts w:ascii="Calibri" w:hAnsi="Calibri"/>
+                <w:b w:val="0"/>
+                <w:color w:val="111827"/>
+                <w:sz w:val="17"/>
+              </w:rPr>
+              <w:t>Reset replay</w:t>
+            </w:r>
+          </w:p>
+        </w:tc>
+        <w:tc>
+          <w:tcPr>
+            <w:tcW w:type="dxa" w:w="4450"/>
+            <w:tcMar>
+              <w:top w:w="80" w:type="dxa"/>
+              <w:start w:w="120" w:type="dxa"/>
+              <w:bottom w:w="80" w:type="dxa"/>
+              <w:end w:w="120" w:type="dxa"/>
+            </w:tcMar>
+            <w:vAlign w:val="center"/>
+            <w:shd w:fill="FFFFFF"/>
+          </w:tcPr>
+          <w:p>
+            <w:pPr>
+              <w:spacing w:before="0" w:after="40" w:line="252" w:lineRule="auto"/>
+              <w:jc w:val="left"/>
+            </w:pPr>
+            <w:r>
+              <w:rPr>
+                <w:rFonts w:ascii="Calibri" w:hAnsi="Calibri"/>
+                <w:b w:val="0"/>
+                <w:color w:val="111827"/>
+                <w:sz w:val="17"/>
+              </w:rPr>
+              <w:t xml:space="preserve">Return stored </w:t>
+            </w:r>
+            <w:r>
+              <w:rPr>
+                <w:rFonts w:ascii="Calibri" w:hAnsi="Calibri"/>
+                <w:b w:val="0"/>
+                <w:color w:val="111827"/>
+                <w:sz w:val="17"/>
+              </w:rPr>
+              <w:t>0x11</w:t>
+            </w:r>
+            <w:r>
+              <w:rPr>
+                <w:rFonts w:ascii="Calibri" w:hAnsi="Calibri"/>
+                <w:b w:val="0"/>
+                <w:color w:val="111827"/>
+                <w:sz w:val="17"/>
+              </w:rPr>
+              <w:t xml:space="preserve"> evidence without another boot, time advance, or version increment.</w:t>
+            </w:r>
+          </w:p>
+        </w:tc>
+        <w:tc>
+          <w:tcPr>
+            <w:tcW w:type="dxa" w:w="3260"/>
+            <w:tcMar>
+              <w:top w:w="80" w:type="dxa"/>
+              <w:start w:w="120" w:type="dxa"/>
+              <w:bottom w:w="80" w:type="dxa"/>
+              <w:end w:w="120" w:type="dxa"/>
+            </w:tcMar>
+            <w:vAlign w:val="center"/>
+            <w:shd w:fill="FFFFFF"/>
+          </w:tcPr>
+          <w:p>
+            <w:pPr>
+              <w:spacing w:before="0" w:after="40" w:line="252" w:lineRule="auto"/>
+              <w:jc w:val="left"/>
+            </w:pPr>
+            <w:r>
+              <w:rPr>
+                <w:rFonts w:ascii="Calibri" w:hAnsi="Calibri"/>
+                <w:b w:val="0"/>
+                <w:color w:val="111827"/>
+                <w:sz w:val="17"/>
+              </w:rPr>
+              <w:t>Service/integration</w:t>
+            </w:r>
+          </w:p>
+        </w:tc>
+      </w:tr>
+      <w:tr>
+        <w:trPr>
+          <w:cantSplit/>
+        </w:trPr>
+        <w:tc>
+          <w:tcPr>
+            <w:tcW w:type="dxa" w:w="1650"/>
+            <w:tcMar>
+              <w:top w:w="80" w:type="dxa"/>
+              <w:start w:w="120" w:type="dxa"/>
+              <w:bottom w:w="80" w:type="dxa"/>
+              <w:end w:w="120" w:type="dxa"/>
+            </w:tcMar>
+            <w:vAlign w:val="center"/>
+            <w:shd w:fill="FFFFFF"/>
+          </w:tcPr>
+          <w:p>
+            <w:pPr>
+              <w:spacing w:before="0" w:after="40" w:line="252" w:lineRule="auto"/>
+              <w:jc w:val="center"/>
+            </w:pPr>
+            <w:r>
+              <w:rPr>
+                <w:rFonts w:ascii="Calibri" w:hAnsi="Calibri"/>
+                <w:b w:val="0"/>
+                <w:color w:val="111827"/>
+                <w:sz w:val="17"/>
+              </w:rPr>
+              <w:t>Reset atomicity</w:t>
+            </w:r>
+          </w:p>
+        </w:tc>
+        <w:tc>
+          <w:tcPr>
+            <w:tcW w:type="dxa" w:w="4450"/>
+            <w:tcMar>
+              <w:top w:w="80" w:type="dxa"/>
+              <w:start w:w="120" w:type="dxa"/>
+              <w:bottom w:w="80" w:type="dxa"/>
+              <w:end w:w="120" w:type="dxa"/>
+            </w:tcMar>
+            <w:vAlign w:val="center"/>
+            <w:shd w:fill="FFFFFF"/>
+          </w:tcPr>
+          <w:p>
+            <w:pPr>
+              <w:spacing w:before="0" w:after="40" w:line="252" w:lineRule="auto"/>
+              <w:jc w:val="left"/>
+            </w:pPr>
+            <w:r>
+              <w:rPr>
+                <w:rFonts w:ascii="Calibri" w:hAnsi="Calibri"/>
+                <w:b w:val="0"/>
+                <w:color w:val="111827"/>
+                <w:sz w:val="17"/>
+              </w:rPr>
+              <w:t>Commit ECU mutation, both evidence streams, diagnostic state, audit, and outbox together.</w:t>
             </w:r>
           </w:p>
         </w:tc>
@@ -13533,6 +15209,55 @@
     </w:p>
     <w:p>
       <w:pPr>
+        <w:pStyle w:val="ListBullet"/>
+        <w:numPr>
+          <w:ilvl w:val="0"/>
+          <w:numId w:val="13"/>
+        </w:numPr>
+      </w:pPr>
+      <w:r>
+        <w:rPr>
+          <w:rFonts w:ascii="Calibri" w:hAnsi="Calibri"/>
+          <w:color w:val="111827"/>
+          <w:sz w:val="22"/>
+        </w:rPr>
+        <w:t xml:space="preserve">UDS ECU Reset reuses </w:t>
+      </w:r>
+      <w:r>
+        <w:rPr>
+          <w:rFonts w:ascii="Consolas" w:hAnsi="Consolas"/>
+          <w:color w:val="1F4D78"/>
+          <w:sz w:val="19"/>
+        </w:rPr>
+        <w:t>atep.ecu.reset.completed.v1</w:t>
+      </w:r>
+      <w:r>
+        <w:rPr>
+          <w:rFonts w:ascii="Calibri" w:hAnsi="Calibri"/>
+          <w:color w:val="111827"/>
+          <w:sz w:val="22"/>
+        </w:rPr>
+        <w:t xml:space="preserve"> and adds </w:t>
+      </w:r>
+      <w:r>
+        <w:rPr>
+          <w:rFonts w:ascii="Consolas" w:hAnsi="Consolas"/>
+          <w:color w:val="1F4D78"/>
+          <w:sz w:val="19"/>
+        </w:rPr>
+        <w:t>atep.diagnostics.ecu.reset.v1</w:t>
+      </w:r>
+      <w:r>
+        <w:rPr>
+          <w:rFonts w:ascii="Calibri" w:hAnsi="Calibri"/>
+          <w:color w:val="111827"/>
+          <w:sz w:val="22"/>
+        </w:rPr>
+        <w:t xml:space="preserve"> in the same transaction.</w:t>
+      </w:r>
+    </w:p>
+    <w:p>
+      <w:pPr>
         <w:pStyle w:val="Heading1"/>
         <w:keepNext/>
         <w:keepLines/>
@@ -13555,7 +15280,7 @@
           <w:color w:val="111827"/>
           <w:sz w:val="22"/>
         </w:rPr>
-        <w:t>V-1 through V-4 expose semantic UDS operations but do not yet encode wire PDUs.</w:t>
+        <w:t>V-1 through V-5 expose semantic UDS operations but do not yet encode wire PDUs.</w:t>
       </w:r>
     </w:p>
     <w:p>
@@ -13679,6 +15404,23 @@
     </w:p>
     <w:p>
       <w:pPr>
+        <w:pStyle w:val="ListBullet"/>
+        <w:numPr>
+          <w:ilvl w:val="0"/>
+          <w:numId w:val="14"/>
+        </w:numPr>
+      </w:pPr>
+      <w:r>
+        <w:rPr>
+          <w:rFonts w:ascii="Calibri" w:hAnsi="Calibri"/>
+          <w:color w:val="111827"/>
+          <w:sz w:val="22"/>
+        </w:rPr>
+        <w:t>V-5 returns a completed semantic reset response; transport adapters must later model response timing and ECU communication loss around physical reset execution.</w:t>
+      </w:r>
+    </w:p>
+    <w:p>
+      <w:pPr>
         <w:pStyle w:val="Heading1"/>
         <w:keepNext/>
         <w:keepLines/>
@@ -13694,7 +15436,7 @@
           <w:color w:val="111827"/>
           <w:sz w:val="22"/>
         </w:rPr>
-        <w:t>V-1 through V-4 are implemented. The recommended next development is V-5: ECU Reset (</w:t>
+        <w:t>V-1 through V-5 are implemented. The recommended next development is V-6: Request Download, Transfer Data, and Request Transfer Exit (</w:t>
       </w:r>
       <w:r>
         <w:rPr>
@@ -13702,7 +15444,7 @@
           <w:color w:val="1F4D78"/>
           <w:sz w:val="19"/>
         </w:rPr>
-        <w:t>0x11</w:t>
+        <w:t>0x34</w:t>
       </w:r>
       <w:r>
         <w:rPr>
@@ -13710,7 +15452,39 @@
           <w:color w:val="111827"/>
           <w:sz w:val="22"/>
         </w:rPr>
-        <w:t>) integrated with the ECU lifecycle, diagnostic-session/security reset, deterministic logical time, exact replay, RBAC, audit, outbox, and failure-safe evidence.</w:t>
+        <w:t xml:space="preserve">, </w:t>
+      </w:r>
+      <w:r>
+        <w:rPr>
+          <w:rFonts w:ascii="Consolas" w:hAnsi="Consolas"/>
+          <w:color w:val="1F4D78"/>
+          <w:sz w:val="19"/>
+        </w:rPr>
+        <w:t>0x36</w:t>
+      </w:r>
+      <w:r>
+        <w:rPr>
+          <w:rFonts w:ascii="Calibri" w:hAnsi="Calibri"/>
+          <w:color w:val="111827"/>
+          <w:sz w:val="22"/>
+        </w:rPr>
+        <w:t xml:space="preserve">, and </w:t>
+      </w:r>
+      <w:r>
+        <w:rPr>
+          <w:rFonts w:ascii="Consolas" w:hAnsi="Consolas"/>
+          <w:color w:val="1F4D78"/>
+          <w:sz w:val="19"/>
+        </w:rPr>
+        <w:t>0x37</w:t>
+      </w:r>
+      <w:r>
+        <w:rPr>
+          <w:rFonts w:ascii="Calibri" w:hAnsi="Calibri"/>
+          <w:color w:val="111827"/>
+          <w:sz w:val="22"/>
+        </w:rPr>
+        <w:t>) as a bounded, resumable flash pipeline with security/session policy, block sequencing, checksums, rollback, and exact replay.</w:t>
       </w:r>
     </w:p>
     <w:p>
@@ -14623,6 +16397,124 @@
         <w:t>Explain why Security Access state and diagnostic-session security level use separate versions.</w:t>
       </w:r>
     </w:p>
+    <w:p>
+      <w:pPr>
+        <w:pStyle w:val="ListNumber"/>
+        <w:numPr>
+          <w:ilvl w:val="0"/>
+          <w:numId w:val="15"/>
+        </w:numPr>
+      </w:pPr>
+      <w:r>
+        <w:rPr>
+          <w:rFonts w:ascii="Calibri" w:hAnsi="Calibri"/>
+          <w:color w:val="111827"/>
+          <w:sz w:val="22"/>
+        </w:rPr>
+        <w:t xml:space="preserve">Calculate the positive response identity for ECU Reset </w:t>
+      </w:r>
+      <w:r>
+        <w:rPr>
+          <w:rFonts w:ascii="Consolas" w:hAnsi="Consolas"/>
+          <w:color w:val="1F4D78"/>
+          <w:sz w:val="19"/>
+        </w:rPr>
+        <w:t>0x11</w:t>
+      </w:r>
+      <w:r>
+        <w:rPr>
+          <w:rFonts w:ascii="Calibri" w:hAnsi="Calibri"/>
+          <w:color w:val="111827"/>
+          <w:sz w:val="22"/>
+        </w:rPr>
+        <w:t>.</w:t>
+      </w:r>
+    </w:p>
+    <w:p>
+      <w:pPr>
+        <w:pStyle w:val="ListNumber"/>
+        <w:numPr>
+          <w:ilvl w:val="0"/>
+          <w:numId w:val="15"/>
+        </w:numPr>
+      </w:pPr>
+      <w:r>
+        <w:rPr>
+          <w:rFonts w:ascii="Calibri" w:hAnsi="Calibri"/>
+          <w:color w:val="111827"/>
+          <w:sz w:val="22"/>
+        </w:rPr>
+        <w:t>Compare hardReset, keyOffOnReset, and softReset authorization in the implemented policy.</w:t>
+      </w:r>
+    </w:p>
+    <w:p>
+      <w:pPr>
+        <w:pStyle w:val="ListNumber"/>
+        <w:numPr>
+          <w:ilvl w:val="0"/>
+          <w:numId w:val="15"/>
+        </w:numPr>
+      </w:pPr>
+      <w:r>
+        <w:rPr>
+          <w:rFonts w:ascii="Calibri" w:hAnsi="Calibri"/>
+          <w:color w:val="111827"/>
+          <w:sz w:val="22"/>
+        </w:rPr>
+        <w:t>Trace one accepted reset across ECU version/time/boot mutation and diagnostic state restoration.</w:t>
+      </w:r>
+    </w:p>
+    <w:p>
+      <w:pPr>
+        <w:pStyle w:val="ListNumber"/>
+        <w:numPr>
+          <w:ilvl w:val="0"/>
+          <w:numId w:val="15"/>
+        </w:numPr>
+      </w:pPr>
+      <w:r>
+        <w:rPr>
+          <w:rFonts w:ascii="Calibri" w:hAnsi="Calibri"/>
+          <w:color w:val="111827"/>
+          <w:sz w:val="22"/>
+        </w:rPr>
+        <w:t>Prove an exact reset replay cannot increment boot count or simulation time twice.</w:t>
+      </w:r>
+    </w:p>
+    <w:p>
+      <w:pPr>
+        <w:pStyle w:val="ListNumber"/>
+        <w:numPr>
+          <w:ilvl w:val="0"/>
+          <w:numId w:val="15"/>
+        </w:numPr>
+      </w:pPr>
+      <w:r>
+        <w:rPr>
+          <w:rFonts w:ascii="Calibri" w:hAnsi="Calibri"/>
+          <w:color w:val="111827"/>
+          <w:sz w:val="22"/>
+        </w:rPr>
+        <w:t>Explain why Volume V orchestrates rather than duplicates the Volume III reset lifecycle.</w:t>
+      </w:r>
+    </w:p>
+    <w:p>
+      <w:pPr>
+        <w:pStyle w:val="ListNumber"/>
+        <w:numPr>
+          <w:ilvl w:val="0"/>
+          <w:numId w:val="15"/>
+        </w:numPr>
+      </w:pPr>
+      <w:r>
+        <w:rPr>
+          <w:rFonts w:ascii="Calibri" w:hAnsi="Calibri"/>
+          <w:color w:val="111827"/>
+          <w:sz w:val="22"/>
+        </w:rPr>
+        <w:t>Design rollback evidence for a failure after ECU mutation but before diagnostic evidence commit.</w:t>
+      </w:r>
+    </w:p>
     <w:sectPr>
       <w:headerReference w:type="default" r:id="rId9"/>
       <w:footerReference w:type="default" r:id="rId10"/>
@@ -14652,7 +16544,7 @@
         <w:color w:val="667085"/>
         <w:sz w:val="17"/>
       </w:rPr>
-      <w:t>ATEP Volume V Workbook  |  Version 0.4.0</w:t>
+      <w:t>ATEP Volume V Workbook  |  Version 0.5.0</w:t>
     </w:r>
     <w:r>
       <w:rPr>

</xml_diff>

<commit_message>
feat(diagnostics): add bounded UDS flash pipeline
</commit_message>
<xml_diff>
--- a/docs/ATEP_Volume_V_Diagnostics_Engineering_Workbook.docx
+++ b/docs/ATEP_Volume_V_Diagnostics_Engineering_Workbook.docx
@@ -143,7 +143,7 @@
                 <w:color w:val="0B2545"/>
                 <w:sz w:val="19"/>
               </w:rPr>
-              <w:t>0.5.0</w:t>
+              <w:t>0.6.0</w:t>
             </w:r>
           </w:p>
         </w:tc>
@@ -204,7 +204,7 @@
                 <w:color w:val="111827"/>
                 <w:sz w:val="19"/>
               </w:rPr>
-              <w:t>29 August 2026</w:t>
+              <w:t>3 September 2026</w:t>
             </w:r>
           </w:p>
         </w:tc>
@@ -265,7 +265,7 @@
                 <w:color w:val="111827"/>
                 <w:sz w:val="19"/>
               </w:rPr>
-              <w:t>Implemented increments: V-1 through V-5</w:t>
+              <w:t>Implemented increments: V-1 through V-6</w:t>
             </w:r>
           </w:p>
         </w:tc>
@@ -660,6 +660,25 @@
       </w:r>
     </w:p>
     <w:p>
+      <w:pPr>
+        <w:pStyle w:val="ListNumber"/>
+        <w:numPr>
+          <w:ilvl w:val="0"/>
+          <w:numId w:val="10"/>
+        </w:numPr>
+        <w:ind w:left="216" w:firstLine="0"/>
+      </w:pPr>
+      <w:r>
+        <w:rPr>
+          <w:rFonts w:ascii="Calibri" w:hAnsi="Calibri"/>
+          <w:b/>
+          <w:color w:val="0B2545"/>
+          <w:sz w:val="21"/>
+        </w:rPr>
+        <w:t>V-6 Review Worksheet</w:t>
+      </w:r>
+    </w:p>
+    <w:p>
       <w:r>
         <w:br w:type="page"/>
       </w:r>
@@ -893,7 +912,7 @@
                 <w:color w:val="111827"/>
                 <w:sz w:val="17"/>
               </w:rPr>
-              <w:t>Increments V-1 through V-5</w:t>
+              <w:t>Increments V-1 through V-6</w:t>
             </w:r>
           </w:p>
         </w:tc>
@@ -1793,6 +1812,149 @@
                 <w:sz w:val="17"/>
               </w:rPr>
               <w:t>, cross-volume ECU lifecycle orchestration, reset/session/security version checks, deterministic logical time, exact replay, RBAC, atomic audit/outbox evidence, API, and tests.</w:t>
+            </w:r>
+          </w:p>
+        </w:tc>
+      </w:tr>
+      <w:tr>
+        <w:trPr>
+          <w:cantSplit/>
+        </w:trPr>
+        <w:tc>
+          <w:tcPr>
+            <w:tcW w:type="dxa" w:w="1650"/>
+            <w:tcMar>
+              <w:top w:w="80" w:type="dxa"/>
+              <w:start w:w="120" w:type="dxa"/>
+              <w:bottom w:w="80" w:type="dxa"/>
+              <w:end w:w="120" w:type="dxa"/>
+            </w:tcMar>
+            <w:vAlign w:val="center"/>
+            <w:shd w:fill="FFFFFF"/>
+          </w:tcPr>
+          <w:p>
+            <w:pPr>
+              <w:spacing w:before="0" w:after="40" w:line="252" w:lineRule="auto"/>
+              <w:jc w:val="center"/>
+            </w:pPr>
+            <w:r>
+              <w:rPr>
+                <w:rFonts w:ascii="Calibri" w:hAnsi="Calibri"/>
+                <w:b w:val="0"/>
+                <w:color w:val="111827"/>
+                <w:sz w:val="17"/>
+              </w:rPr>
+              <w:t>0.6.0</w:t>
+            </w:r>
+          </w:p>
+        </w:tc>
+        <w:tc>
+          <w:tcPr>
+            <w:tcW w:type="dxa" w:w="4450"/>
+            <w:tcMar>
+              <w:top w:w="80" w:type="dxa"/>
+              <w:start w:w="120" w:type="dxa"/>
+              <w:bottom w:w="80" w:type="dxa"/>
+              <w:end w:w="120" w:type="dxa"/>
+            </w:tcMar>
+            <w:vAlign w:val="center"/>
+            <w:shd w:fill="FFFFFF"/>
+          </w:tcPr>
+          <w:p>
+            <w:pPr>
+              <w:spacing w:before="0" w:after="40" w:line="252" w:lineRule="auto"/>
+              <w:jc w:val="left"/>
+            </w:pPr>
+            <w:r>
+              <w:rPr>
+                <w:rFonts w:ascii="Calibri" w:hAnsi="Calibri"/>
+                <w:b w:val="0"/>
+                <w:color w:val="111827"/>
+                <w:sz w:val="17"/>
+              </w:rPr>
+              <w:t>2026-09-03</w:t>
+            </w:r>
+          </w:p>
+        </w:tc>
+        <w:tc>
+          <w:tcPr>
+            <w:tcW w:type="dxa" w:w="3260"/>
+            <w:tcMar>
+              <w:top w:w="80" w:type="dxa"/>
+              <w:start w:w="120" w:type="dxa"/>
+              <w:bottom w:w="80" w:type="dxa"/>
+              <w:end w:w="120" w:type="dxa"/>
+            </w:tcMar>
+            <w:vAlign w:val="center"/>
+            <w:shd w:fill="FFFFFF"/>
+          </w:tcPr>
+          <w:p>
+            <w:pPr>
+              <w:spacing w:before="0" w:after="40" w:line="252" w:lineRule="auto"/>
+              <w:jc w:val="left"/>
+            </w:pPr>
+            <w:r>
+              <w:rPr>
+                <w:rFonts w:ascii="Calibri" w:hAnsi="Calibri"/>
+                <w:b w:val="0"/>
+                <w:color w:val="111827"/>
+                <w:sz w:val="17"/>
+              </w:rPr>
+              <w:t xml:space="preserve">Added bounded UDS firmware download </w:t>
+            </w:r>
+            <w:r>
+              <w:rPr>
+                <w:rFonts w:ascii="Calibri" w:hAnsi="Calibri"/>
+                <w:b w:val="0"/>
+                <w:color w:val="111827"/>
+                <w:sz w:val="17"/>
+              </w:rPr>
+              <w:t>0x34</w:t>
+            </w:r>
+            <w:r>
+              <w:rPr>
+                <w:rFonts w:ascii="Calibri" w:hAnsi="Calibri"/>
+                <w:b w:val="0"/>
+                <w:color w:val="111827"/>
+                <w:sz w:val="17"/>
+              </w:rPr>
+              <w:t>/</w:t>
+            </w:r>
+            <w:r>
+              <w:rPr>
+                <w:rFonts w:ascii="Calibri" w:hAnsi="Calibri"/>
+                <w:b w:val="0"/>
+                <w:color w:val="111827"/>
+                <w:sz w:val="17"/>
+              </w:rPr>
+              <w:t>0x36</w:t>
+            </w:r>
+            <w:r>
+              <w:rPr>
+                <w:rFonts w:ascii="Calibri" w:hAnsi="Calibri"/>
+                <w:b w:val="0"/>
+                <w:color w:val="111827"/>
+                <w:sz w:val="17"/>
+              </w:rPr>
+              <w:t>/</w:t>
+            </w:r>
+            <w:r>
+              <w:rPr>
+                <w:rFonts w:ascii="Calibri" w:hAnsi="Calibri"/>
+                <w:b w:val="0"/>
+                <w:color w:val="111827"/>
+                <w:sz w:val="17"/>
+              </w:rPr>
+              <w:t>0x37</w:t>
+            </w:r>
+            <w:r>
+              <w:rPr>
+                <w:rFonts w:ascii="Calibri" w:hAnsi="Calibri"/>
+                <w:b w:val="0"/>
+                <w:color w:val="111827"/>
+                <w:sz w:val="17"/>
+              </w:rPr>
+              <w:t>, ordered block transfer, SHA-256 verification, firmware activation, payload minimization, migration, APIs, and tests.</w:t>
             </w:r>
           </w:p>
         </w:tc>
@@ -2264,6 +2426,57 @@
     </w:p>
     <w:p>
       <w:pPr>
+        <w:pStyle w:val="ListBullet"/>
+        <w:numPr>
+          <w:ilvl w:val="0"/>
+          <w:numId w:val="11"/>
+        </w:numPr>
+      </w:pPr>
+      <w:r>
+        <w:rPr>
+          <w:rFonts w:ascii="Calibri" w:hAnsi="Calibri"/>
+          <w:color w:val="111827"/>
+          <w:sz w:val="22"/>
+        </w:rPr>
+        <w:t>ECU-scoped firmware-transfer state and UDS Request Download, Transfer Data, and Request Transfer Exit.</w:t>
+      </w:r>
+    </w:p>
+    <w:p>
+      <w:pPr>
+        <w:pStyle w:val="ListBullet"/>
+        <w:numPr>
+          <w:ilvl w:val="0"/>
+          <w:numId w:val="11"/>
+        </w:numPr>
+      </w:pPr>
+      <w:r>
+        <w:rPr>
+          <w:rFonts w:ascii="Calibri" w:hAnsi="Calibri"/>
+          <w:color w:val="111827"/>
+          <w:sz w:val="22"/>
+        </w:rPr>
+        <w:t>Programming-session and level-1 security policy, 64-KiB image and 256-byte block bounds.</w:t>
+      </w:r>
+    </w:p>
+    <w:p>
+      <w:pPr>
+        <w:pStyle w:val="ListBullet"/>
+        <w:numPr>
+          <w:ilvl w:val="0"/>
+          <w:numId w:val="11"/>
+        </w:numPr>
+      </w:pPr>
+      <w:r>
+        <w:rPr>
+          <w:rFonts w:ascii="Calibri" w:hAnsi="Calibri"/>
+          <w:color w:val="111827"/>
+          <w:sz w:val="22"/>
+        </w:rPr>
+        <w:t>Ordered block counters, SHA-256 image verification, atomic firmware activation, and exact replay.</w:t>
+      </w:r>
+    </w:p>
+    <w:p>
+      <w:pPr>
         <w:pStyle w:val="Heading2"/>
         <w:keepNext/>
         <w:keepLines/>
@@ -2287,23 +2500,6 @@
           <w:sz w:val="22"/>
         </w:rPr>
         <w:t>ISO-TP segmentation, CAN transport binding, DoIP, and physical adapters.</w:t>
-      </w:r>
-    </w:p>
-    <w:p>
-      <w:pPr>
-        <w:pStyle w:val="ListBullet"/>
-        <w:numPr>
-          <w:ilvl w:val="0"/>
-          <w:numId w:val="12"/>
-        </w:numPr>
-      </w:pPr>
-      <w:r>
-        <w:rPr>
-          <w:rFonts w:ascii="Calibri" w:hAnsi="Calibri"/>
-          <w:color w:val="111827"/>
-          <w:sz w:val="22"/>
-        </w:rPr>
-        <w:t>Flash transfer services.</w:t>
       </w:r>
     </w:p>
     <w:p>
@@ -2520,6 +2716,24 @@
       </w:r>
     </w:p>
     <w:p>
+      <w:r>
+        <w:rPr>
+          <w:rFonts w:ascii="Consolas" w:hAnsi="Consolas"/>
+          <w:color w:val="1F4D78"/>
+          <w:sz w:val="19"/>
+        </w:rPr>
+        <w:t>DiagnosticFlashState</w:t>
+      </w:r>
+      <w:r>
+        <w:rPr>
+          <w:rFonts w:ascii="Calibri" w:hAnsi="Calibri"/>
+          <w:color w:val="111827"/>
+          <w:sz w:val="22"/>
+        </w:rPr>
+        <w:t xml:space="preserve"> stores one ECU-local transfer lifecycle: address/size negotiation, target firmware and ECU version, maximum block length, next sequence counter, received byte count, protected transient image bytes, final SHA-256 digest, status, and optimistic version. Completed transfers purge raw bytes after verification.</w:t>
+      </w:r>
+    </w:p>
+    <w:p>
       <w:pPr>
         <w:pStyle w:val="Heading1"/>
         <w:keepNext/>
@@ -4933,6 +5147,528 @@
                 <w:sz w:val="16"/>
               </w:rPr>
               <w:t xml:space="preserve"> through the ECU lifecycle.</w:t>
+            </w:r>
+          </w:p>
+        </w:tc>
+      </w:tr>
+      <w:tr>
+        <w:trPr>
+          <w:cantSplit/>
+        </w:trPr>
+        <w:tc>
+          <w:tcPr>
+            <w:tcW w:type="dxa" w:w="1150"/>
+            <w:tcMar>
+              <w:top w:w="80" w:type="dxa"/>
+              <w:start w:w="120" w:type="dxa"/>
+              <w:bottom w:w="80" w:type="dxa"/>
+              <w:end w:w="120" w:type="dxa"/>
+            </w:tcMar>
+            <w:vAlign w:val="center"/>
+            <w:shd w:fill="FFFFFF"/>
+          </w:tcPr>
+          <w:p>
+            <w:pPr>
+              <w:spacing w:before="0" w:after="40" w:line="252" w:lineRule="auto"/>
+              <w:jc w:val="center"/>
+            </w:pPr>
+            <w:r>
+              <w:rPr>
+                <w:rFonts w:ascii="Calibri" w:hAnsi="Calibri"/>
+                <w:b w:val="0"/>
+                <w:color w:val="111827"/>
+                <w:sz w:val="16"/>
+              </w:rPr>
+              <w:t>GET</w:t>
+            </w:r>
+          </w:p>
+        </w:tc>
+        <w:tc>
+          <w:tcPr>
+            <w:tcW w:type="dxa" w:w="3700"/>
+            <w:tcMar>
+              <w:top w:w="80" w:type="dxa"/>
+              <w:start w:w="120" w:type="dxa"/>
+              <w:bottom w:w="80" w:type="dxa"/>
+              <w:end w:w="120" w:type="dxa"/>
+            </w:tcMar>
+            <w:vAlign w:val="center"/>
+            <w:shd w:fill="FFFFFF"/>
+          </w:tcPr>
+          <w:p>
+            <w:pPr>
+              <w:spacing w:before="0" w:after="40" w:line="252" w:lineRule="auto"/>
+              <w:jc w:val="left"/>
+            </w:pPr>
+            <w:r>
+              <w:rPr>
+                <w:rFonts w:ascii="Calibri" w:hAnsi="Calibri"/>
+                <w:b w:val="0"/>
+                <w:color w:val="111827"/>
+                <w:sz w:val="16"/>
+              </w:rPr>
+              <w:t>/api/v1/vehicles/{vehicle_id}/ecus/{ecu_id}/diagnostics/flash/state</w:t>
+            </w:r>
+          </w:p>
+        </w:tc>
+        <w:tc>
+          <w:tcPr>
+            <w:tcW w:type="dxa" w:w="3100"/>
+            <w:tcMar>
+              <w:top w:w="80" w:type="dxa"/>
+              <w:start w:w="120" w:type="dxa"/>
+              <w:bottom w:w="80" w:type="dxa"/>
+              <w:end w:w="120" w:type="dxa"/>
+            </w:tcMar>
+            <w:vAlign w:val="center"/>
+            <w:shd w:fill="FFFFFF"/>
+          </w:tcPr>
+          <w:p>
+            <w:pPr>
+              <w:spacing w:before="0" w:after="40" w:line="252" w:lineRule="auto"/>
+              <w:jc w:val="left"/>
+            </w:pPr>
+            <w:r>
+              <w:rPr>
+                <w:rFonts w:ascii="Calibri" w:hAnsi="Calibri"/>
+                <w:b w:val="0"/>
+                <w:color w:val="111827"/>
+                <w:sz w:val="16"/>
+              </w:rPr>
+              <w:t>diagnostics:read</w:t>
+            </w:r>
+          </w:p>
+        </w:tc>
+        <w:tc>
+          <w:tcPr>
+            <w:tcW w:type="dxa" w:w="1410"/>
+            <w:tcMar>
+              <w:top w:w="80" w:type="dxa"/>
+              <w:start w:w="120" w:type="dxa"/>
+              <w:bottom w:w="80" w:type="dxa"/>
+              <w:end w:w="120" w:type="dxa"/>
+            </w:tcMar>
+            <w:vAlign w:val="center"/>
+            <w:shd w:fill="FFFFFF"/>
+          </w:tcPr>
+          <w:p>
+            <w:pPr>
+              <w:spacing w:before="0" w:after="40" w:line="252" w:lineRule="auto"/>
+              <w:jc w:val="left"/>
+            </w:pPr>
+            <w:r>
+              <w:rPr>
+                <w:rFonts w:ascii="Calibri" w:hAnsi="Calibri"/>
+                <w:b w:val="0"/>
+                <w:color w:val="111827"/>
+                <w:sz w:val="16"/>
+              </w:rPr>
+              <w:t>Retrieve bounded transfer progress and digest metadata.</w:t>
+            </w:r>
+          </w:p>
+        </w:tc>
+      </w:tr>
+      <w:tr>
+        <w:trPr>
+          <w:cantSplit/>
+        </w:trPr>
+        <w:tc>
+          <w:tcPr>
+            <w:tcW w:type="dxa" w:w="1150"/>
+            <w:tcMar>
+              <w:top w:w="80" w:type="dxa"/>
+              <w:start w:w="120" w:type="dxa"/>
+              <w:bottom w:w="80" w:type="dxa"/>
+              <w:end w:w="120" w:type="dxa"/>
+            </w:tcMar>
+            <w:vAlign w:val="center"/>
+            <w:shd w:fill="FFFFFF"/>
+          </w:tcPr>
+          <w:p>
+            <w:pPr>
+              <w:spacing w:before="0" w:after="40" w:line="252" w:lineRule="auto"/>
+              <w:jc w:val="center"/>
+            </w:pPr>
+            <w:r>
+              <w:rPr>
+                <w:rFonts w:ascii="Calibri" w:hAnsi="Calibri"/>
+                <w:b w:val="0"/>
+                <w:color w:val="111827"/>
+                <w:sz w:val="16"/>
+              </w:rPr>
+              <w:t>POST</w:t>
+            </w:r>
+          </w:p>
+        </w:tc>
+        <w:tc>
+          <w:tcPr>
+            <w:tcW w:type="dxa" w:w="3700"/>
+            <w:tcMar>
+              <w:top w:w="80" w:type="dxa"/>
+              <w:start w:w="120" w:type="dxa"/>
+              <w:bottom w:w="80" w:type="dxa"/>
+              <w:end w:w="120" w:type="dxa"/>
+            </w:tcMar>
+            <w:vAlign w:val="center"/>
+            <w:shd w:fill="FFFFFF"/>
+          </w:tcPr>
+          <w:p>
+            <w:pPr>
+              <w:spacing w:before="0" w:after="40" w:line="252" w:lineRule="auto"/>
+              <w:jc w:val="left"/>
+            </w:pPr>
+            <w:r>
+              <w:rPr>
+                <w:rFonts w:ascii="Calibri" w:hAnsi="Calibri"/>
+                <w:b w:val="0"/>
+                <w:color w:val="111827"/>
+                <w:sz w:val="16"/>
+              </w:rPr>
+              <w:t>/api/v1/vehicles/{vehicle_id}/ecus/{ecu_id}/diagnostics/flash/request-download</w:t>
+            </w:r>
+          </w:p>
+        </w:tc>
+        <w:tc>
+          <w:tcPr>
+            <w:tcW w:type="dxa" w:w="3100"/>
+            <w:tcMar>
+              <w:top w:w="80" w:type="dxa"/>
+              <w:start w:w="120" w:type="dxa"/>
+              <w:bottom w:w="80" w:type="dxa"/>
+              <w:end w:w="120" w:type="dxa"/>
+            </w:tcMar>
+            <w:vAlign w:val="center"/>
+            <w:shd w:fill="FFFFFF"/>
+          </w:tcPr>
+          <w:p>
+            <w:pPr>
+              <w:spacing w:before="0" w:after="40" w:line="252" w:lineRule="auto"/>
+              <w:jc w:val="left"/>
+            </w:pPr>
+            <w:r>
+              <w:rPr>
+                <w:rFonts w:ascii="Calibri" w:hAnsi="Calibri"/>
+                <w:b w:val="0"/>
+                <w:color w:val="111827"/>
+                <w:sz w:val="16"/>
+              </w:rPr>
+              <w:t>diagnostics:manage</w:t>
+            </w:r>
+          </w:p>
+        </w:tc>
+        <w:tc>
+          <w:tcPr>
+            <w:tcW w:type="dxa" w:w="1410"/>
+            <w:tcMar>
+              <w:top w:w="80" w:type="dxa"/>
+              <w:start w:w="120" w:type="dxa"/>
+              <w:bottom w:w="80" w:type="dxa"/>
+              <w:end w:w="120" w:type="dxa"/>
+            </w:tcMar>
+            <w:vAlign w:val="center"/>
+            <w:shd w:fill="FFFFFF"/>
+          </w:tcPr>
+          <w:p>
+            <w:pPr>
+              <w:spacing w:before="0" w:after="40" w:line="252" w:lineRule="auto"/>
+              <w:jc w:val="left"/>
+            </w:pPr>
+            <w:r>
+              <w:rPr>
+                <w:rFonts w:ascii="Calibri" w:hAnsi="Calibri"/>
+                <w:b w:val="0"/>
+                <w:color w:val="111827"/>
+                <w:sz w:val="16"/>
+              </w:rPr>
+              <w:t xml:space="preserve">Negotiate UDS </w:t>
+            </w:r>
+            <w:r>
+              <w:rPr>
+                <w:rFonts w:ascii="Calibri" w:hAnsi="Calibri"/>
+                <w:b w:val="0"/>
+                <w:color w:val="111827"/>
+                <w:sz w:val="16"/>
+              </w:rPr>
+              <w:t>0x34</w:t>
+            </w:r>
+            <w:r>
+              <w:rPr>
+                <w:rFonts w:ascii="Calibri" w:hAnsi="Calibri"/>
+                <w:b w:val="0"/>
+                <w:color w:val="111827"/>
+                <w:sz w:val="16"/>
+              </w:rPr>
+              <w:t xml:space="preserve"> firmware transfer.</w:t>
+            </w:r>
+          </w:p>
+        </w:tc>
+      </w:tr>
+      <w:tr>
+        <w:trPr>
+          <w:cantSplit/>
+        </w:trPr>
+        <w:tc>
+          <w:tcPr>
+            <w:tcW w:type="dxa" w:w="1150"/>
+            <w:tcMar>
+              <w:top w:w="80" w:type="dxa"/>
+              <w:start w:w="120" w:type="dxa"/>
+              <w:bottom w:w="80" w:type="dxa"/>
+              <w:end w:w="120" w:type="dxa"/>
+            </w:tcMar>
+            <w:vAlign w:val="center"/>
+            <w:shd w:fill="FFFFFF"/>
+          </w:tcPr>
+          <w:p>
+            <w:pPr>
+              <w:spacing w:before="0" w:after="40" w:line="252" w:lineRule="auto"/>
+              <w:jc w:val="center"/>
+            </w:pPr>
+            <w:r>
+              <w:rPr>
+                <w:rFonts w:ascii="Calibri" w:hAnsi="Calibri"/>
+                <w:b w:val="0"/>
+                <w:color w:val="111827"/>
+                <w:sz w:val="16"/>
+              </w:rPr>
+              <w:t>POST</w:t>
+            </w:r>
+          </w:p>
+        </w:tc>
+        <w:tc>
+          <w:tcPr>
+            <w:tcW w:type="dxa" w:w="3700"/>
+            <w:tcMar>
+              <w:top w:w="80" w:type="dxa"/>
+              <w:start w:w="120" w:type="dxa"/>
+              <w:bottom w:w="80" w:type="dxa"/>
+              <w:end w:w="120" w:type="dxa"/>
+            </w:tcMar>
+            <w:vAlign w:val="center"/>
+            <w:shd w:fill="FFFFFF"/>
+          </w:tcPr>
+          <w:p>
+            <w:pPr>
+              <w:spacing w:before="0" w:after="40" w:line="252" w:lineRule="auto"/>
+              <w:jc w:val="left"/>
+            </w:pPr>
+            <w:r>
+              <w:rPr>
+                <w:rFonts w:ascii="Calibri" w:hAnsi="Calibri"/>
+                <w:b w:val="0"/>
+                <w:color w:val="111827"/>
+                <w:sz w:val="16"/>
+              </w:rPr>
+              <w:t>/api/v1/vehicles/{vehicle_id}/ecus/{ecu_id}/diagnostics/flash/transfer-data</w:t>
+            </w:r>
+          </w:p>
+        </w:tc>
+        <w:tc>
+          <w:tcPr>
+            <w:tcW w:type="dxa" w:w="3100"/>
+            <w:tcMar>
+              <w:top w:w="80" w:type="dxa"/>
+              <w:start w:w="120" w:type="dxa"/>
+              <w:bottom w:w="80" w:type="dxa"/>
+              <w:end w:w="120" w:type="dxa"/>
+            </w:tcMar>
+            <w:vAlign w:val="center"/>
+            <w:shd w:fill="FFFFFF"/>
+          </w:tcPr>
+          <w:p>
+            <w:pPr>
+              <w:spacing w:before="0" w:after="40" w:line="252" w:lineRule="auto"/>
+              <w:jc w:val="left"/>
+            </w:pPr>
+            <w:r>
+              <w:rPr>
+                <w:rFonts w:ascii="Calibri" w:hAnsi="Calibri"/>
+                <w:b w:val="0"/>
+                <w:color w:val="111827"/>
+                <w:sz w:val="16"/>
+              </w:rPr>
+              <w:t>diagnostics:manage</w:t>
+            </w:r>
+          </w:p>
+        </w:tc>
+        <w:tc>
+          <w:tcPr>
+            <w:tcW w:type="dxa" w:w="1410"/>
+            <w:tcMar>
+              <w:top w:w="80" w:type="dxa"/>
+              <w:start w:w="120" w:type="dxa"/>
+              <w:bottom w:w="80" w:type="dxa"/>
+              <w:end w:w="120" w:type="dxa"/>
+            </w:tcMar>
+            <w:vAlign w:val="center"/>
+            <w:shd w:fill="FFFFFF"/>
+          </w:tcPr>
+          <w:p>
+            <w:pPr>
+              <w:spacing w:before="0" w:after="40" w:line="252" w:lineRule="auto"/>
+              <w:jc w:val="left"/>
+            </w:pPr>
+            <w:r>
+              <w:rPr>
+                <w:rFonts w:ascii="Calibri" w:hAnsi="Calibri"/>
+                <w:b w:val="0"/>
+                <w:color w:val="111827"/>
+                <w:sz w:val="16"/>
+              </w:rPr>
+              <w:t xml:space="preserve">Submit one ordered UDS </w:t>
+            </w:r>
+            <w:r>
+              <w:rPr>
+                <w:rFonts w:ascii="Calibri" w:hAnsi="Calibri"/>
+                <w:b w:val="0"/>
+                <w:color w:val="111827"/>
+                <w:sz w:val="16"/>
+              </w:rPr>
+              <w:t>0x36</w:t>
+            </w:r>
+            <w:r>
+              <w:rPr>
+                <w:rFonts w:ascii="Calibri" w:hAnsi="Calibri"/>
+                <w:b w:val="0"/>
+                <w:color w:val="111827"/>
+                <w:sz w:val="16"/>
+              </w:rPr>
+              <w:t xml:space="preserve"> block.</w:t>
+            </w:r>
+          </w:p>
+        </w:tc>
+      </w:tr>
+      <w:tr>
+        <w:trPr>
+          <w:cantSplit/>
+        </w:trPr>
+        <w:tc>
+          <w:tcPr>
+            <w:tcW w:type="dxa" w:w="1150"/>
+            <w:tcMar>
+              <w:top w:w="80" w:type="dxa"/>
+              <w:start w:w="120" w:type="dxa"/>
+              <w:bottom w:w="80" w:type="dxa"/>
+              <w:end w:w="120" w:type="dxa"/>
+            </w:tcMar>
+            <w:vAlign w:val="center"/>
+            <w:shd w:fill="FFFFFF"/>
+          </w:tcPr>
+          <w:p>
+            <w:pPr>
+              <w:spacing w:before="0" w:after="40" w:line="252" w:lineRule="auto"/>
+              <w:jc w:val="center"/>
+            </w:pPr>
+            <w:r>
+              <w:rPr>
+                <w:rFonts w:ascii="Calibri" w:hAnsi="Calibri"/>
+                <w:b w:val="0"/>
+                <w:color w:val="111827"/>
+                <w:sz w:val="16"/>
+              </w:rPr>
+              <w:t>POST</w:t>
+            </w:r>
+          </w:p>
+        </w:tc>
+        <w:tc>
+          <w:tcPr>
+            <w:tcW w:type="dxa" w:w="3700"/>
+            <w:tcMar>
+              <w:top w:w="80" w:type="dxa"/>
+              <w:start w:w="120" w:type="dxa"/>
+              <w:bottom w:w="80" w:type="dxa"/>
+              <w:end w:w="120" w:type="dxa"/>
+            </w:tcMar>
+            <w:vAlign w:val="center"/>
+            <w:shd w:fill="FFFFFF"/>
+          </w:tcPr>
+          <w:p>
+            <w:pPr>
+              <w:spacing w:before="0" w:after="40" w:line="252" w:lineRule="auto"/>
+              <w:jc w:val="left"/>
+            </w:pPr>
+            <w:r>
+              <w:rPr>
+                <w:rFonts w:ascii="Calibri" w:hAnsi="Calibri"/>
+                <w:b w:val="0"/>
+                <w:color w:val="111827"/>
+                <w:sz w:val="16"/>
+              </w:rPr>
+              <w:t>/api/v1/vehicles/{vehicle_id}/ecus/{ecu_id}/diagnostics/flash/request-transfer-exit</w:t>
+            </w:r>
+          </w:p>
+        </w:tc>
+        <w:tc>
+          <w:tcPr>
+            <w:tcW w:type="dxa" w:w="3100"/>
+            <w:tcMar>
+              <w:top w:w="80" w:type="dxa"/>
+              <w:start w:w="120" w:type="dxa"/>
+              <w:bottom w:w="80" w:type="dxa"/>
+              <w:end w:w="120" w:type="dxa"/>
+            </w:tcMar>
+            <w:vAlign w:val="center"/>
+            <w:shd w:fill="FFFFFF"/>
+          </w:tcPr>
+          <w:p>
+            <w:pPr>
+              <w:spacing w:before="0" w:after="40" w:line="252" w:lineRule="auto"/>
+              <w:jc w:val="left"/>
+            </w:pPr>
+            <w:r>
+              <w:rPr>
+                <w:rFonts w:ascii="Calibri" w:hAnsi="Calibri"/>
+                <w:b w:val="0"/>
+                <w:color w:val="111827"/>
+                <w:sz w:val="16"/>
+              </w:rPr>
+              <w:t>diagnostics:manage</w:t>
+            </w:r>
+          </w:p>
+        </w:tc>
+        <w:tc>
+          <w:tcPr>
+            <w:tcW w:type="dxa" w:w="1410"/>
+            <w:tcMar>
+              <w:top w:w="80" w:type="dxa"/>
+              <w:start w:w="120" w:type="dxa"/>
+              <w:bottom w:w="80" w:type="dxa"/>
+              <w:end w:w="120" w:type="dxa"/>
+            </w:tcMar>
+            <w:vAlign w:val="center"/>
+            <w:shd w:fill="FFFFFF"/>
+          </w:tcPr>
+          <w:p>
+            <w:pPr>
+              <w:spacing w:before="0" w:after="40" w:line="252" w:lineRule="auto"/>
+              <w:jc w:val="left"/>
+            </w:pPr>
+            <w:r>
+              <w:rPr>
+                <w:rFonts w:ascii="Calibri" w:hAnsi="Calibri"/>
+                <w:b w:val="0"/>
+                <w:color w:val="111827"/>
+                <w:sz w:val="16"/>
+              </w:rPr>
+              <w:t xml:space="preserve">Verify and activate through UDS </w:t>
+            </w:r>
+            <w:r>
+              <w:rPr>
+                <w:rFonts w:ascii="Calibri" w:hAnsi="Calibri"/>
+                <w:b w:val="0"/>
+                <w:color w:val="111827"/>
+                <w:sz w:val="16"/>
+              </w:rPr>
+              <w:t>0x37</w:t>
+            </w:r>
+            <w:r>
+              <w:rPr>
+                <w:rFonts w:ascii="Calibri" w:hAnsi="Calibri"/>
+                <w:b w:val="0"/>
+                <w:color w:val="111827"/>
+                <w:sz w:val="16"/>
+              </w:rPr>
+              <w:t>.</w:t>
             </w:r>
           </w:p>
         </w:tc>
@@ -5467,6 +6203,74 @@
     </w:p>
     <w:p>
       <w:pPr>
+        <w:pStyle w:val="Heading2"/>
+        <w:keepNext/>
+        <w:keepLines/>
+      </w:pPr>
+      <w:r>
+        <w:t>8.9 ECU Flash (`0x34`, `0x36`, `0x37`)</w:t>
+      </w:r>
+    </w:p>
+    <w:p>
+      <w:r>
+        <w:rPr>
+          <w:rFonts w:ascii="Calibri" w:hAnsi="Calibri"/>
+          <w:color w:val="111827"/>
+          <w:sz w:val="22"/>
+        </w:rPr>
+        <w:t xml:space="preserve">V-6 models flashing as a semantic, transport-neutral pipeline. Request Download requires the programming session, security level 1, matching ECU/session/security versions, an address range inside the 16-bit ECU space, and an image no larger than 65,536 bytes. Its positive response is </w:t>
+      </w:r>
+      <w:r>
+        <w:rPr>
+          <w:rFonts w:ascii="Consolas" w:hAnsi="Consolas"/>
+          <w:color w:val="1F4D78"/>
+          <w:sz w:val="19"/>
+        </w:rPr>
+        <w:t>0x74</w:t>
+      </w:r>
+      <w:r>
+        <w:rPr>
+          <w:rFonts w:ascii="Calibri" w:hAnsi="Calibri"/>
+          <w:color w:val="111827"/>
+          <w:sz w:val="22"/>
+        </w:rPr>
+        <w:t xml:space="preserve"> and negotiates a 256-byte maximum block length. Transfer Data (</w:t>
+      </w:r>
+      <w:r>
+        <w:rPr>
+          <w:rFonts w:ascii="Consolas" w:hAnsi="Consolas"/>
+          <w:color w:val="1F4D78"/>
+          <w:sz w:val="19"/>
+        </w:rPr>
+        <w:t>0x76</w:t>
+      </w:r>
+      <w:r>
+        <w:rPr>
+          <w:rFonts w:ascii="Calibri" w:hAnsi="Calibri"/>
+          <w:color w:val="111827"/>
+          <w:sz w:val="22"/>
+        </w:rPr>
+        <w:t>) accepts only the expected byte counter, wraps 255 to 0, prevents overflow, and advances an independent transfer version. Command and shared evidence retain block size and SHA-256, never raw firmware bytes. Request Transfer Exit (</w:t>
+      </w:r>
+      <w:r>
+        <w:rPr>
+          <w:rFonts w:ascii="Consolas" w:hAnsi="Consolas"/>
+          <w:color w:val="1F4D78"/>
+          <w:sz w:val="19"/>
+        </w:rPr>
+        <w:t>0x77</w:t>
+      </w:r>
+      <w:r>
+        <w:rPr>
+          <w:rFonts w:ascii="Calibri" w:hAnsi="Calibri"/>
+          <w:color w:val="111827"/>
+          <w:sz w:val="22"/>
+        </w:rPr>
+        <w:t>) requires the exact byte count, matching transfer/ECU versions, and constant-time SHA-256 verification before changing the ECU profile version and ECU optimistic version. Completion purges the assembled image bytes while retaining digest and bounded metadata. Every accepted mutation, command record, audit record, and outbox event shares one transaction.</w:t>
+      </w:r>
+    </w:p>
+    <w:p>
+      <w:pPr>
         <w:pStyle w:val="Heading1"/>
         <w:keepNext/>
         <w:keepLines/>
@@ -7651,6 +8455,816 @@
                 <w:sz w:val="16"/>
               </w:rPr>
               <w:t>Stale ECU, session, or security reset version</w:t>
+            </w:r>
+          </w:p>
+        </w:tc>
+        <w:tc>
+          <w:tcPr>
+            <w:tcW w:type="dxa" w:w="3700"/>
+            <w:tcMar>
+              <w:top w:w="80" w:type="dxa"/>
+              <w:start w:w="120" w:type="dxa"/>
+              <w:bottom w:w="80" w:type="dxa"/>
+              <w:end w:w="120" w:type="dxa"/>
+            </w:tcMar>
+            <w:vAlign w:val="center"/>
+            <w:shd w:fill="FFFFFF"/>
+          </w:tcPr>
+          <w:p>
+            <w:pPr>
+              <w:spacing w:before="0" w:after="40" w:line="252" w:lineRule="auto"/>
+              <w:jc w:val="left"/>
+            </w:pPr>
+            <w:r>
+              <w:rPr>
+                <w:rFonts w:ascii="Calibri" w:hAnsi="Calibri"/>
+                <w:b w:val="0"/>
+                <w:color w:val="111827"/>
+                <w:sz w:val="16"/>
+              </w:rPr>
+              <w:t>diagnostic_contract_invalid</w:t>
+            </w:r>
+          </w:p>
+        </w:tc>
+        <w:tc>
+          <w:tcPr>
+            <w:tcW w:type="dxa" w:w="3100"/>
+            <w:tcMar>
+              <w:top w:w="80" w:type="dxa"/>
+              <w:start w:w="120" w:type="dxa"/>
+              <w:bottom w:w="80" w:type="dxa"/>
+              <w:end w:w="120" w:type="dxa"/>
+            </w:tcMar>
+            <w:vAlign w:val="center"/>
+            <w:shd w:fill="FFFFFF"/>
+          </w:tcPr>
+          <w:p>
+            <w:pPr>
+              <w:spacing w:before="0" w:after="40" w:line="252" w:lineRule="auto"/>
+              <w:jc w:val="left"/>
+            </w:pPr>
+            <w:r>
+              <w:rPr>
+                <w:rFonts w:ascii="Calibri" w:hAnsi="Calibri"/>
+                <w:b w:val="0"/>
+                <w:color w:val="111827"/>
+                <w:sz w:val="16"/>
+              </w:rPr>
+              <w:t>422</w:t>
+            </w:r>
+          </w:p>
+        </w:tc>
+        <w:tc>
+          <w:tcPr>
+            <w:tcW w:type="dxa" w:w="1410"/>
+            <w:tcMar>
+              <w:top w:w="80" w:type="dxa"/>
+              <w:start w:w="120" w:type="dxa"/>
+              <w:bottom w:w="80" w:type="dxa"/>
+              <w:end w:w="120" w:type="dxa"/>
+            </w:tcMar>
+            <w:vAlign w:val="center"/>
+            <w:shd w:fill="FFFFFF"/>
+          </w:tcPr>
+          <w:p>
+            <w:pPr>
+              <w:spacing w:before="0" w:after="40" w:line="252" w:lineRule="auto"/>
+              <w:jc w:val="left"/>
+            </w:pPr>
+            <w:r>
+              <w:rPr>
+                <w:rFonts w:ascii="Calibri" w:hAnsi="Calibri"/>
+                <w:b w:val="0"/>
+                <w:color w:val="111827"/>
+                <w:sz w:val="16"/>
+              </w:rPr>
+              <w:t xml:space="preserve">NRC </w:t>
+            </w:r>
+            <w:r>
+              <w:rPr>
+                <w:rFonts w:ascii="Calibri" w:hAnsi="Calibri"/>
+                <w:b w:val="0"/>
+                <w:color w:val="111827"/>
+                <w:sz w:val="16"/>
+              </w:rPr>
+              <w:t>0x22</w:t>
+            </w:r>
+            <w:r>
+              <w:rPr>
+                <w:rFonts w:ascii="Calibri" w:hAnsi="Calibri"/>
+                <w:b w:val="0"/>
+                <w:color w:val="111827"/>
+                <w:sz w:val="16"/>
+              </w:rPr>
+              <w:t xml:space="preserve"> conditions not correct</w:t>
+            </w:r>
+          </w:p>
+        </w:tc>
+      </w:tr>
+      <w:tr>
+        <w:trPr>
+          <w:cantSplit/>
+        </w:trPr>
+        <w:tc>
+          <w:tcPr>
+            <w:tcW w:type="dxa" w:w="1150"/>
+            <w:tcMar>
+              <w:top w:w="80" w:type="dxa"/>
+              <w:start w:w="120" w:type="dxa"/>
+              <w:bottom w:w="80" w:type="dxa"/>
+              <w:end w:w="120" w:type="dxa"/>
+            </w:tcMar>
+            <w:vAlign w:val="center"/>
+            <w:shd w:fill="FFFFFF"/>
+          </w:tcPr>
+          <w:p>
+            <w:pPr>
+              <w:spacing w:before="0" w:after="40" w:line="252" w:lineRule="auto"/>
+              <w:jc w:val="center"/>
+            </w:pPr>
+            <w:r>
+              <w:rPr>
+                <w:rFonts w:ascii="Calibri" w:hAnsi="Calibri"/>
+                <w:b w:val="0"/>
+                <w:color w:val="111827"/>
+                <w:sz w:val="16"/>
+              </w:rPr>
+              <w:t>Flash outside programming session</w:t>
+            </w:r>
+          </w:p>
+        </w:tc>
+        <w:tc>
+          <w:tcPr>
+            <w:tcW w:type="dxa" w:w="3700"/>
+            <w:tcMar>
+              <w:top w:w="80" w:type="dxa"/>
+              <w:start w:w="120" w:type="dxa"/>
+              <w:bottom w:w="80" w:type="dxa"/>
+              <w:end w:w="120" w:type="dxa"/>
+            </w:tcMar>
+            <w:vAlign w:val="center"/>
+            <w:shd w:fill="FFFFFF"/>
+          </w:tcPr>
+          <w:p>
+            <w:pPr>
+              <w:spacing w:before="0" w:after="40" w:line="252" w:lineRule="auto"/>
+              <w:jc w:val="left"/>
+            </w:pPr>
+            <w:r>
+              <w:rPr>
+                <w:rFonts w:ascii="Calibri" w:hAnsi="Calibri"/>
+                <w:b w:val="0"/>
+                <w:color w:val="111827"/>
+                <w:sz w:val="16"/>
+              </w:rPr>
+              <w:t>diagnostic_contract_invalid</w:t>
+            </w:r>
+          </w:p>
+        </w:tc>
+        <w:tc>
+          <w:tcPr>
+            <w:tcW w:type="dxa" w:w="3100"/>
+            <w:tcMar>
+              <w:top w:w="80" w:type="dxa"/>
+              <w:start w:w="120" w:type="dxa"/>
+              <w:bottom w:w="80" w:type="dxa"/>
+              <w:end w:w="120" w:type="dxa"/>
+            </w:tcMar>
+            <w:vAlign w:val="center"/>
+            <w:shd w:fill="FFFFFF"/>
+          </w:tcPr>
+          <w:p>
+            <w:pPr>
+              <w:spacing w:before="0" w:after="40" w:line="252" w:lineRule="auto"/>
+              <w:jc w:val="left"/>
+            </w:pPr>
+            <w:r>
+              <w:rPr>
+                <w:rFonts w:ascii="Calibri" w:hAnsi="Calibri"/>
+                <w:b w:val="0"/>
+                <w:color w:val="111827"/>
+                <w:sz w:val="16"/>
+              </w:rPr>
+              <w:t>422</w:t>
+            </w:r>
+          </w:p>
+        </w:tc>
+        <w:tc>
+          <w:tcPr>
+            <w:tcW w:type="dxa" w:w="1410"/>
+            <w:tcMar>
+              <w:top w:w="80" w:type="dxa"/>
+              <w:start w:w="120" w:type="dxa"/>
+              <w:bottom w:w="80" w:type="dxa"/>
+              <w:end w:w="120" w:type="dxa"/>
+            </w:tcMar>
+            <w:vAlign w:val="center"/>
+            <w:shd w:fill="FFFFFF"/>
+          </w:tcPr>
+          <w:p>
+            <w:pPr>
+              <w:spacing w:before="0" w:after="40" w:line="252" w:lineRule="auto"/>
+              <w:jc w:val="left"/>
+            </w:pPr>
+            <w:r>
+              <w:rPr>
+                <w:rFonts w:ascii="Calibri" w:hAnsi="Calibri"/>
+                <w:b w:val="0"/>
+                <w:color w:val="111827"/>
+                <w:sz w:val="16"/>
+              </w:rPr>
+              <w:t xml:space="preserve">NRC </w:t>
+            </w:r>
+            <w:r>
+              <w:rPr>
+                <w:rFonts w:ascii="Calibri" w:hAnsi="Calibri"/>
+                <w:b w:val="0"/>
+                <w:color w:val="111827"/>
+                <w:sz w:val="16"/>
+              </w:rPr>
+              <w:t>0x7F</w:t>
+            </w:r>
+            <w:r>
+              <w:rPr>
+                <w:rFonts w:ascii="Calibri" w:hAnsi="Calibri"/>
+                <w:b w:val="0"/>
+                <w:color w:val="111827"/>
+                <w:sz w:val="16"/>
+              </w:rPr>
+              <w:t xml:space="preserve"> service not supported in active session</w:t>
+            </w:r>
+          </w:p>
+        </w:tc>
+      </w:tr>
+      <w:tr>
+        <w:trPr>
+          <w:cantSplit/>
+        </w:trPr>
+        <w:tc>
+          <w:tcPr>
+            <w:tcW w:type="dxa" w:w="1150"/>
+            <w:tcMar>
+              <w:top w:w="80" w:type="dxa"/>
+              <w:start w:w="120" w:type="dxa"/>
+              <w:bottom w:w="80" w:type="dxa"/>
+              <w:end w:w="120" w:type="dxa"/>
+            </w:tcMar>
+            <w:vAlign w:val="center"/>
+            <w:shd w:fill="FFFFFF"/>
+          </w:tcPr>
+          <w:p>
+            <w:pPr>
+              <w:spacing w:before="0" w:after="40" w:line="252" w:lineRule="auto"/>
+              <w:jc w:val="center"/>
+            </w:pPr>
+            <w:r>
+              <w:rPr>
+                <w:rFonts w:ascii="Calibri" w:hAnsi="Calibri"/>
+                <w:b w:val="0"/>
+                <w:color w:val="111827"/>
+                <w:sz w:val="16"/>
+              </w:rPr>
+              <w:t>Flash without security level 1</w:t>
+            </w:r>
+          </w:p>
+        </w:tc>
+        <w:tc>
+          <w:tcPr>
+            <w:tcW w:type="dxa" w:w="3700"/>
+            <w:tcMar>
+              <w:top w:w="80" w:type="dxa"/>
+              <w:start w:w="120" w:type="dxa"/>
+              <w:bottom w:w="80" w:type="dxa"/>
+              <w:end w:w="120" w:type="dxa"/>
+            </w:tcMar>
+            <w:vAlign w:val="center"/>
+            <w:shd w:fill="FFFFFF"/>
+          </w:tcPr>
+          <w:p>
+            <w:pPr>
+              <w:spacing w:before="0" w:after="40" w:line="252" w:lineRule="auto"/>
+              <w:jc w:val="left"/>
+            </w:pPr>
+            <w:r>
+              <w:rPr>
+                <w:rFonts w:ascii="Calibri" w:hAnsi="Calibri"/>
+                <w:b w:val="0"/>
+                <w:color w:val="111827"/>
+                <w:sz w:val="16"/>
+              </w:rPr>
+              <w:t>diagnostic_contract_invalid</w:t>
+            </w:r>
+          </w:p>
+        </w:tc>
+        <w:tc>
+          <w:tcPr>
+            <w:tcW w:type="dxa" w:w="3100"/>
+            <w:tcMar>
+              <w:top w:w="80" w:type="dxa"/>
+              <w:start w:w="120" w:type="dxa"/>
+              <w:bottom w:w="80" w:type="dxa"/>
+              <w:end w:w="120" w:type="dxa"/>
+            </w:tcMar>
+            <w:vAlign w:val="center"/>
+            <w:shd w:fill="FFFFFF"/>
+          </w:tcPr>
+          <w:p>
+            <w:pPr>
+              <w:spacing w:before="0" w:after="40" w:line="252" w:lineRule="auto"/>
+              <w:jc w:val="left"/>
+            </w:pPr>
+            <w:r>
+              <w:rPr>
+                <w:rFonts w:ascii="Calibri" w:hAnsi="Calibri"/>
+                <w:b w:val="0"/>
+                <w:color w:val="111827"/>
+                <w:sz w:val="16"/>
+              </w:rPr>
+              <w:t>422</w:t>
+            </w:r>
+          </w:p>
+        </w:tc>
+        <w:tc>
+          <w:tcPr>
+            <w:tcW w:type="dxa" w:w="1410"/>
+            <w:tcMar>
+              <w:top w:w="80" w:type="dxa"/>
+              <w:start w:w="120" w:type="dxa"/>
+              <w:bottom w:w="80" w:type="dxa"/>
+              <w:end w:w="120" w:type="dxa"/>
+            </w:tcMar>
+            <w:vAlign w:val="center"/>
+            <w:shd w:fill="FFFFFF"/>
+          </w:tcPr>
+          <w:p>
+            <w:pPr>
+              <w:spacing w:before="0" w:after="40" w:line="252" w:lineRule="auto"/>
+              <w:jc w:val="left"/>
+            </w:pPr>
+            <w:r>
+              <w:rPr>
+                <w:rFonts w:ascii="Calibri" w:hAnsi="Calibri"/>
+                <w:b w:val="0"/>
+                <w:color w:val="111827"/>
+                <w:sz w:val="16"/>
+              </w:rPr>
+              <w:t xml:space="preserve">NRC </w:t>
+            </w:r>
+            <w:r>
+              <w:rPr>
+                <w:rFonts w:ascii="Calibri" w:hAnsi="Calibri"/>
+                <w:b w:val="0"/>
+                <w:color w:val="111827"/>
+                <w:sz w:val="16"/>
+              </w:rPr>
+              <w:t>0x33</w:t>
+            </w:r>
+            <w:r>
+              <w:rPr>
+                <w:rFonts w:ascii="Calibri" w:hAnsi="Calibri"/>
+                <w:b w:val="0"/>
+                <w:color w:val="111827"/>
+                <w:sz w:val="16"/>
+              </w:rPr>
+              <w:t xml:space="preserve"> security access denied</w:t>
+            </w:r>
+          </w:p>
+        </w:tc>
+      </w:tr>
+      <w:tr>
+        <w:trPr>
+          <w:cantSplit/>
+        </w:trPr>
+        <w:tc>
+          <w:tcPr>
+            <w:tcW w:type="dxa" w:w="1150"/>
+            <w:tcMar>
+              <w:top w:w="80" w:type="dxa"/>
+              <w:start w:w="120" w:type="dxa"/>
+              <w:bottom w:w="80" w:type="dxa"/>
+              <w:end w:w="120" w:type="dxa"/>
+            </w:tcMar>
+            <w:vAlign w:val="center"/>
+            <w:shd w:fill="FFFFFF"/>
+          </w:tcPr>
+          <w:p>
+            <w:pPr>
+              <w:spacing w:before="0" w:after="40" w:line="252" w:lineRule="auto"/>
+              <w:jc w:val="center"/>
+            </w:pPr>
+            <w:r>
+              <w:rPr>
+                <w:rFonts w:ascii="Calibri" w:hAnsi="Calibri"/>
+                <w:b w:val="0"/>
+                <w:color w:val="111827"/>
+                <w:sz w:val="16"/>
+              </w:rPr>
+              <w:t>Transfer before download or exit before complete image</w:t>
+            </w:r>
+          </w:p>
+        </w:tc>
+        <w:tc>
+          <w:tcPr>
+            <w:tcW w:type="dxa" w:w="3700"/>
+            <w:tcMar>
+              <w:top w:w="80" w:type="dxa"/>
+              <w:start w:w="120" w:type="dxa"/>
+              <w:bottom w:w="80" w:type="dxa"/>
+              <w:end w:w="120" w:type="dxa"/>
+            </w:tcMar>
+            <w:vAlign w:val="center"/>
+            <w:shd w:fill="FFFFFF"/>
+          </w:tcPr>
+          <w:p>
+            <w:pPr>
+              <w:spacing w:before="0" w:after="40" w:line="252" w:lineRule="auto"/>
+              <w:jc w:val="left"/>
+            </w:pPr>
+            <w:r>
+              <w:rPr>
+                <w:rFonts w:ascii="Calibri" w:hAnsi="Calibri"/>
+                <w:b w:val="0"/>
+                <w:color w:val="111827"/>
+                <w:sz w:val="16"/>
+              </w:rPr>
+              <w:t>diagnostic_contract_invalid</w:t>
+            </w:r>
+          </w:p>
+        </w:tc>
+        <w:tc>
+          <w:tcPr>
+            <w:tcW w:type="dxa" w:w="3100"/>
+            <w:tcMar>
+              <w:top w:w="80" w:type="dxa"/>
+              <w:start w:w="120" w:type="dxa"/>
+              <w:bottom w:w="80" w:type="dxa"/>
+              <w:end w:w="120" w:type="dxa"/>
+            </w:tcMar>
+            <w:vAlign w:val="center"/>
+            <w:shd w:fill="FFFFFF"/>
+          </w:tcPr>
+          <w:p>
+            <w:pPr>
+              <w:spacing w:before="0" w:after="40" w:line="252" w:lineRule="auto"/>
+              <w:jc w:val="left"/>
+            </w:pPr>
+            <w:r>
+              <w:rPr>
+                <w:rFonts w:ascii="Calibri" w:hAnsi="Calibri"/>
+                <w:b w:val="0"/>
+                <w:color w:val="111827"/>
+                <w:sz w:val="16"/>
+              </w:rPr>
+              <w:t>422</w:t>
+            </w:r>
+          </w:p>
+        </w:tc>
+        <w:tc>
+          <w:tcPr>
+            <w:tcW w:type="dxa" w:w="1410"/>
+            <w:tcMar>
+              <w:top w:w="80" w:type="dxa"/>
+              <w:start w:w="120" w:type="dxa"/>
+              <w:bottom w:w="80" w:type="dxa"/>
+              <w:end w:w="120" w:type="dxa"/>
+            </w:tcMar>
+            <w:vAlign w:val="center"/>
+            <w:shd w:fill="FFFFFF"/>
+          </w:tcPr>
+          <w:p>
+            <w:pPr>
+              <w:spacing w:before="0" w:after="40" w:line="252" w:lineRule="auto"/>
+              <w:jc w:val="left"/>
+            </w:pPr>
+            <w:r>
+              <w:rPr>
+                <w:rFonts w:ascii="Calibri" w:hAnsi="Calibri"/>
+                <w:b w:val="0"/>
+                <w:color w:val="111827"/>
+                <w:sz w:val="16"/>
+              </w:rPr>
+              <w:t xml:space="preserve">NRC </w:t>
+            </w:r>
+            <w:r>
+              <w:rPr>
+                <w:rFonts w:ascii="Calibri" w:hAnsi="Calibri"/>
+                <w:b w:val="0"/>
+                <w:color w:val="111827"/>
+                <w:sz w:val="16"/>
+              </w:rPr>
+              <w:t>0x24</w:t>
+            </w:r>
+            <w:r>
+              <w:rPr>
+                <w:rFonts w:ascii="Calibri" w:hAnsi="Calibri"/>
+                <w:b w:val="0"/>
+                <w:color w:val="111827"/>
+                <w:sz w:val="16"/>
+              </w:rPr>
+              <w:t xml:space="preserve"> request sequence error</w:t>
+            </w:r>
+          </w:p>
+        </w:tc>
+      </w:tr>
+      <w:tr>
+        <w:trPr>
+          <w:cantSplit/>
+        </w:trPr>
+        <w:tc>
+          <w:tcPr>
+            <w:tcW w:type="dxa" w:w="1150"/>
+            <w:tcMar>
+              <w:top w:w="80" w:type="dxa"/>
+              <w:start w:w="120" w:type="dxa"/>
+              <w:bottom w:w="80" w:type="dxa"/>
+              <w:end w:w="120" w:type="dxa"/>
+            </w:tcMar>
+            <w:vAlign w:val="center"/>
+            <w:shd w:fill="FFFFFF"/>
+          </w:tcPr>
+          <w:p>
+            <w:pPr>
+              <w:spacing w:before="0" w:after="40" w:line="252" w:lineRule="auto"/>
+              <w:jc w:val="center"/>
+            </w:pPr>
+            <w:r>
+              <w:rPr>
+                <w:rFonts w:ascii="Calibri" w:hAnsi="Calibri"/>
+                <w:b w:val="0"/>
+                <w:color w:val="111827"/>
+                <w:sz w:val="16"/>
+              </w:rPr>
+              <w:t>Wrong block sequence counter</w:t>
+            </w:r>
+          </w:p>
+        </w:tc>
+        <w:tc>
+          <w:tcPr>
+            <w:tcW w:type="dxa" w:w="3700"/>
+            <w:tcMar>
+              <w:top w:w="80" w:type="dxa"/>
+              <w:start w:w="120" w:type="dxa"/>
+              <w:bottom w:w="80" w:type="dxa"/>
+              <w:end w:w="120" w:type="dxa"/>
+            </w:tcMar>
+            <w:vAlign w:val="center"/>
+            <w:shd w:fill="FFFFFF"/>
+          </w:tcPr>
+          <w:p>
+            <w:pPr>
+              <w:spacing w:before="0" w:after="40" w:line="252" w:lineRule="auto"/>
+              <w:jc w:val="left"/>
+            </w:pPr>
+            <w:r>
+              <w:rPr>
+                <w:rFonts w:ascii="Calibri" w:hAnsi="Calibri"/>
+                <w:b w:val="0"/>
+                <w:color w:val="111827"/>
+                <w:sz w:val="16"/>
+              </w:rPr>
+              <w:t>diagnostic_contract_invalid</w:t>
+            </w:r>
+          </w:p>
+        </w:tc>
+        <w:tc>
+          <w:tcPr>
+            <w:tcW w:type="dxa" w:w="3100"/>
+            <w:tcMar>
+              <w:top w:w="80" w:type="dxa"/>
+              <w:start w:w="120" w:type="dxa"/>
+              <w:bottom w:w="80" w:type="dxa"/>
+              <w:end w:w="120" w:type="dxa"/>
+            </w:tcMar>
+            <w:vAlign w:val="center"/>
+            <w:shd w:fill="FFFFFF"/>
+          </w:tcPr>
+          <w:p>
+            <w:pPr>
+              <w:spacing w:before="0" w:after="40" w:line="252" w:lineRule="auto"/>
+              <w:jc w:val="left"/>
+            </w:pPr>
+            <w:r>
+              <w:rPr>
+                <w:rFonts w:ascii="Calibri" w:hAnsi="Calibri"/>
+                <w:b w:val="0"/>
+                <w:color w:val="111827"/>
+                <w:sz w:val="16"/>
+              </w:rPr>
+              <w:t>422</w:t>
+            </w:r>
+          </w:p>
+        </w:tc>
+        <w:tc>
+          <w:tcPr>
+            <w:tcW w:type="dxa" w:w="1410"/>
+            <w:tcMar>
+              <w:top w:w="80" w:type="dxa"/>
+              <w:start w:w="120" w:type="dxa"/>
+              <w:bottom w:w="80" w:type="dxa"/>
+              <w:end w:w="120" w:type="dxa"/>
+            </w:tcMar>
+            <w:vAlign w:val="center"/>
+            <w:shd w:fill="FFFFFF"/>
+          </w:tcPr>
+          <w:p>
+            <w:pPr>
+              <w:spacing w:before="0" w:after="40" w:line="252" w:lineRule="auto"/>
+              <w:jc w:val="left"/>
+            </w:pPr>
+            <w:r>
+              <w:rPr>
+                <w:rFonts w:ascii="Calibri" w:hAnsi="Calibri"/>
+                <w:b w:val="0"/>
+                <w:color w:val="111827"/>
+                <w:sz w:val="16"/>
+              </w:rPr>
+              <w:t xml:space="preserve">NRC </w:t>
+            </w:r>
+            <w:r>
+              <w:rPr>
+                <w:rFonts w:ascii="Calibri" w:hAnsi="Calibri"/>
+                <w:b w:val="0"/>
+                <w:color w:val="111827"/>
+                <w:sz w:val="16"/>
+              </w:rPr>
+              <w:t>0x73</w:t>
+            </w:r>
+            <w:r>
+              <w:rPr>
+                <w:rFonts w:ascii="Calibri" w:hAnsi="Calibri"/>
+                <w:b w:val="0"/>
+                <w:color w:val="111827"/>
+                <w:sz w:val="16"/>
+              </w:rPr>
+              <w:t xml:space="preserve"> wrong block sequence counter</w:t>
+            </w:r>
+          </w:p>
+        </w:tc>
+      </w:tr>
+      <w:tr>
+        <w:trPr>
+          <w:cantSplit/>
+        </w:trPr>
+        <w:tc>
+          <w:tcPr>
+            <w:tcW w:type="dxa" w:w="1150"/>
+            <w:tcMar>
+              <w:top w:w="80" w:type="dxa"/>
+              <w:start w:w="120" w:type="dxa"/>
+              <w:bottom w:w="80" w:type="dxa"/>
+              <w:end w:w="120" w:type="dxa"/>
+            </w:tcMar>
+            <w:vAlign w:val="center"/>
+            <w:shd w:fill="FFFFFF"/>
+          </w:tcPr>
+          <w:p>
+            <w:pPr>
+              <w:spacing w:before="0" w:after="40" w:line="252" w:lineRule="auto"/>
+              <w:jc w:val="center"/>
+            </w:pPr>
+            <w:r>
+              <w:rPr>
+                <w:rFonts w:ascii="Calibri" w:hAnsi="Calibri"/>
+                <w:b w:val="0"/>
+                <w:color w:val="111827"/>
+                <w:sz w:val="16"/>
+              </w:rPr>
+              <w:t>Oversized block or image overflow</w:t>
+            </w:r>
+          </w:p>
+        </w:tc>
+        <w:tc>
+          <w:tcPr>
+            <w:tcW w:type="dxa" w:w="3700"/>
+            <w:tcMar>
+              <w:top w:w="80" w:type="dxa"/>
+              <w:start w:w="120" w:type="dxa"/>
+              <w:bottom w:w="80" w:type="dxa"/>
+              <w:end w:w="120" w:type="dxa"/>
+            </w:tcMar>
+            <w:vAlign w:val="center"/>
+            <w:shd w:fill="FFFFFF"/>
+          </w:tcPr>
+          <w:p>
+            <w:pPr>
+              <w:spacing w:before="0" w:after="40" w:line="252" w:lineRule="auto"/>
+              <w:jc w:val="left"/>
+            </w:pPr>
+            <w:r>
+              <w:rPr>
+                <w:rFonts w:ascii="Calibri" w:hAnsi="Calibri"/>
+                <w:b w:val="0"/>
+                <w:color w:val="111827"/>
+                <w:sz w:val="16"/>
+              </w:rPr>
+              <w:t>diagnostic_contract_invalid</w:t>
+            </w:r>
+          </w:p>
+        </w:tc>
+        <w:tc>
+          <w:tcPr>
+            <w:tcW w:type="dxa" w:w="3100"/>
+            <w:tcMar>
+              <w:top w:w="80" w:type="dxa"/>
+              <w:start w:w="120" w:type="dxa"/>
+              <w:bottom w:w="80" w:type="dxa"/>
+              <w:end w:w="120" w:type="dxa"/>
+            </w:tcMar>
+            <w:vAlign w:val="center"/>
+            <w:shd w:fill="FFFFFF"/>
+          </w:tcPr>
+          <w:p>
+            <w:pPr>
+              <w:spacing w:before="0" w:after="40" w:line="252" w:lineRule="auto"/>
+              <w:jc w:val="left"/>
+            </w:pPr>
+            <w:r>
+              <w:rPr>
+                <w:rFonts w:ascii="Calibri" w:hAnsi="Calibri"/>
+                <w:b w:val="0"/>
+                <w:color w:val="111827"/>
+                <w:sz w:val="16"/>
+              </w:rPr>
+              <w:t>422</w:t>
+            </w:r>
+          </w:p>
+        </w:tc>
+        <w:tc>
+          <w:tcPr>
+            <w:tcW w:type="dxa" w:w="1410"/>
+            <w:tcMar>
+              <w:top w:w="80" w:type="dxa"/>
+              <w:start w:w="120" w:type="dxa"/>
+              <w:bottom w:w="80" w:type="dxa"/>
+              <w:end w:w="120" w:type="dxa"/>
+            </w:tcMar>
+            <w:vAlign w:val="center"/>
+            <w:shd w:fill="FFFFFF"/>
+          </w:tcPr>
+          <w:p>
+            <w:pPr>
+              <w:spacing w:before="0" w:after="40" w:line="252" w:lineRule="auto"/>
+              <w:jc w:val="left"/>
+            </w:pPr>
+            <w:r>
+              <w:rPr>
+                <w:rFonts w:ascii="Calibri" w:hAnsi="Calibri"/>
+                <w:b w:val="0"/>
+                <w:color w:val="111827"/>
+                <w:sz w:val="16"/>
+              </w:rPr>
+              <w:t xml:space="preserve">NRC </w:t>
+            </w:r>
+            <w:r>
+              <w:rPr>
+                <w:rFonts w:ascii="Calibri" w:hAnsi="Calibri"/>
+                <w:b w:val="0"/>
+                <w:color w:val="111827"/>
+                <w:sz w:val="16"/>
+              </w:rPr>
+              <w:t>0x13</w:t>
+            </w:r>
+            <w:r>
+              <w:rPr>
+                <w:rFonts w:ascii="Calibri" w:hAnsi="Calibri"/>
+                <w:b w:val="0"/>
+                <w:color w:val="111827"/>
+                <w:sz w:val="16"/>
+              </w:rPr>
+              <w:t xml:space="preserve"> invalid format/length</w:t>
+            </w:r>
+          </w:p>
+        </w:tc>
+      </w:tr>
+      <w:tr>
+        <w:trPr>
+          <w:cantSplit/>
+        </w:trPr>
+        <w:tc>
+          <w:tcPr>
+            <w:tcW w:type="dxa" w:w="1150"/>
+            <w:tcMar>
+              <w:top w:w="80" w:type="dxa"/>
+              <w:start w:w="120" w:type="dxa"/>
+              <w:bottom w:w="80" w:type="dxa"/>
+              <w:end w:w="120" w:type="dxa"/>
+            </w:tcMar>
+            <w:vAlign w:val="center"/>
+            <w:shd w:fill="FFFFFF"/>
+          </w:tcPr>
+          <w:p>
+            <w:pPr>
+              <w:spacing w:before="0" w:after="40" w:line="252" w:lineRule="auto"/>
+              <w:jc w:val="center"/>
+            </w:pPr>
+            <w:r>
+              <w:rPr>
+                <w:rFonts w:ascii="Calibri" w:hAnsi="Calibri"/>
+                <w:b w:val="0"/>
+                <w:color w:val="111827"/>
+                <w:sz w:val="16"/>
+              </w:rPr>
+              <w:t>Stale transfer/ECU version or digest mismatch</w:t>
             </w:r>
           </w:p>
         </w:tc>
@@ -8305,6 +9919,46 @@
     </w:p>
     <w:p>
       <w:pPr>
+        <w:pStyle w:val="Heading2"/>
+        <w:keepNext/>
+        <w:keepLines/>
+      </w:pPr>
+      <w:r>
+        <w:t>ADR-DG-015 - Keep Firmware Payloads Out of Shared Evidence</w:t>
+      </w:r>
+    </w:p>
+    <w:p>
+      <w:r>
+        <w:rPr>
+          <w:rFonts w:ascii="Calibri" w:hAnsi="Calibri"/>
+          <w:color w:val="111827"/>
+          <w:sz w:val="22"/>
+        </w:rPr>
+        <w:t>Raw firmware is required only while assembling an active transfer. Diagnostic command requests, audit, outbox, and logs contain block length and SHA-256 rather than payload bytes. Successful completion purges the assembled image and retains only bounded metadata and its digest.</w:t>
+      </w:r>
+    </w:p>
+    <w:p>
+      <w:pPr>
+        <w:pStyle w:val="Heading2"/>
+        <w:keepNext/>
+        <w:keepLines/>
+      </w:pPr>
+      <w:r>
+        <w:t>ADR-DG-016 - Activate Firmware Only at a Verified Transaction Boundary</w:t>
+      </w:r>
+    </w:p>
+    <w:p>
+      <w:r>
+        <w:rPr>
+          <w:rFonts w:ascii="Calibri" w:hAnsi="Calibri"/>
+          <w:color w:val="111827"/>
+          <w:sz w:val="22"/>
+        </w:rPr>
+        <w:t>Transfer blocks update only the flash aggregate. The ECU profile/version changes only when Request Transfer Exit verifies the declared byte count, transfer/ECU versions, and full-image SHA-256. Firmware activation, transfer completion, command evidence, audit, and outbox then commit together.</w:t>
+      </w:r>
+    </w:p>
+    <w:p>
+      <w:pPr>
         <w:pStyle w:val="Heading1"/>
         <w:keepNext/>
         <w:keepLines/>
@@ -14699,6 +16353,986 @@
                 <w:sz w:val="17"/>
               </w:rPr>
               <w:t>Commit ECU mutation, both evidence streams, diagnostic state, audit, and outbox together.</w:t>
+            </w:r>
+          </w:p>
+        </w:tc>
+        <w:tc>
+          <w:tcPr>
+            <w:tcW w:type="dxa" w:w="3260"/>
+            <w:tcMar>
+              <w:top w:w="80" w:type="dxa"/>
+              <w:start w:w="120" w:type="dxa"/>
+              <w:bottom w:w="80" w:type="dxa"/>
+              <w:end w:w="120" w:type="dxa"/>
+            </w:tcMar>
+            <w:vAlign w:val="center"/>
+            <w:shd w:fill="FFFFFF"/>
+          </w:tcPr>
+          <w:p>
+            <w:pPr>
+              <w:spacing w:before="0" w:after="40" w:line="252" w:lineRule="auto"/>
+              <w:jc w:val="left"/>
+            </w:pPr>
+            <w:r>
+              <w:rPr>
+                <w:rFonts w:ascii="Calibri" w:hAnsi="Calibri"/>
+                <w:b w:val="0"/>
+                <w:color w:val="111827"/>
+                <w:sz w:val="17"/>
+              </w:rPr>
+              <w:t>Integration</w:t>
+            </w:r>
+          </w:p>
+        </w:tc>
+      </w:tr>
+      <w:tr>
+        <w:trPr>
+          <w:cantSplit/>
+        </w:trPr>
+        <w:tc>
+          <w:tcPr>
+            <w:tcW w:type="dxa" w:w="1650"/>
+            <w:tcMar>
+              <w:top w:w="80" w:type="dxa"/>
+              <w:start w:w="120" w:type="dxa"/>
+              <w:bottom w:w="80" w:type="dxa"/>
+              <w:end w:w="120" w:type="dxa"/>
+            </w:tcMar>
+            <w:vAlign w:val="center"/>
+            <w:shd w:fill="FFFFFF"/>
+          </w:tcPr>
+          <w:p>
+            <w:pPr>
+              <w:spacing w:before="0" w:after="40" w:line="252" w:lineRule="auto"/>
+              <w:jc w:val="center"/>
+            </w:pPr>
+            <w:r>
+              <w:rPr>
+                <w:rFonts w:ascii="Calibri" w:hAnsi="Calibri"/>
+                <w:b w:val="0"/>
+                <w:color w:val="111827"/>
+                <w:sz w:val="17"/>
+              </w:rPr>
+              <w:t>Download negotiation</w:t>
+            </w:r>
+          </w:p>
+        </w:tc>
+        <w:tc>
+          <w:tcPr>
+            <w:tcW w:type="dxa" w:w="4450"/>
+            <w:tcMar>
+              <w:top w:w="80" w:type="dxa"/>
+              <w:start w:w="120" w:type="dxa"/>
+              <w:bottom w:w="80" w:type="dxa"/>
+              <w:end w:w="120" w:type="dxa"/>
+            </w:tcMar>
+            <w:vAlign w:val="center"/>
+            <w:shd w:fill="FFFFFF"/>
+          </w:tcPr>
+          <w:p>
+            <w:pPr>
+              <w:spacing w:before="0" w:after="40" w:line="252" w:lineRule="auto"/>
+              <w:jc w:val="left"/>
+            </w:pPr>
+            <w:r>
+              <w:rPr>
+                <w:rFonts w:ascii="Calibri" w:hAnsi="Calibri"/>
+                <w:b w:val="0"/>
+                <w:color w:val="111827"/>
+                <w:sz w:val="17"/>
+              </w:rPr>
+              <w:t>Require programming session, level 1, matching versions, 16-bit range, and &lt;=65,536 bytes.</w:t>
+            </w:r>
+          </w:p>
+        </w:tc>
+        <w:tc>
+          <w:tcPr>
+            <w:tcW w:type="dxa" w:w="3260"/>
+            <w:tcMar>
+              <w:top w:w="80" w:type="dxa"/>
+              <w:start w:w="120" w:type="dxa"/>
+              <w:bottom w:w="80" w:type="dxa"/>
+              <w:end w:w="120" w:type="dxa"/>
+            </w:tcMar>
+            <w:vAlign w:val="center"/>
+            <w:shd w:fill="FFFFFF"/>
+          </w:tcPr>
+          <w:p>
+            <w:pPr>
+              <w:spacing w:before="0" w:after="40" w:line="252" w:lineRule="auto"/>
+              <w:jc w:val="left"/>
+            </w:pPr>
+            <w:r>
+              <w:rPr>
+                <w:rFonts w:ascii="Calibri" w:hAnsi="Calibri"/>
+                <w:b w:val="0"/>
+                <w:color w:val="111827"/>
+                <w:sz w:val="17"/>
+              </w:rPr>
+              <w:t>Schema/service/API</w:t>
+            </w:r>
+          </w:p>
+        </w:tc>
+      </w:tr>
+      <w:tr>
+        <w:trPr>
+          <w:cantSplit/>
+        </w:trPr>
+        <w:tc>
+          <w:tcPr>
+            <w:tcW w:type="dxa" w:w="1650"/>
+            <w:tcMar>
+              <w:top w:w="80" w:type="dxa"/>
+              <w:start w:w="120" w:type="dxa"/>
+              <w:bottom w:w="80" w:type="dxa"/>
+              <w:end w:w="120" w:type="dxa"/>
+            </w:tcMar>
+            <w:vAlign w:val="center"/>
+            <w:shd w:fill="FFFFFF"/>
+          </w:tcPr>
+          <w:p>
+            <w:pPr>
+              <w:spacing w:before="0" w:after="40" w:line="252" w:lineRule="auto"/>
+              <w:jc w:val="center"/>
+            </w:pPr>
+            <w:r>
+              <w:rPr>
+                <w:rFonts w:ascii="Calibri" w:hAnsi="Calibri"/>
+                <w:b w:val="0"/>
+                <w:color w:val="111827"/>
+                <w:sz w:val="17"/>
+              </w:rPr>
+              <w:t>Block bounds</w:t>
+            </w:r>
+          </w:p>
+        </w:tc>
+        <w:tc>
+          <w:tcPr>
+            <w:tcW w:type="dxa" w:w="4450"/>
+            <w:tcMar>
+              <w:top w:w="80" w:type="dxa"/>
+              <w:start w:w="120" w:type="dxa"/>
+              <w:bottom w:w="80" w:type="dxa"/>
+              <w:end w:w="120" w:type="dxa"/>
+            </w:tcMar>
+            <w:vAlign w:val="center"/>
+            <w:shd w:fill="FFFFFF"/>
+          </w:tcPr>
+          <w:p>
+            <w:pPr>
+              <w:spacing w:before="0" w:after="40" w:line="252" w:lineRule="auto"/>
+              <w:jc w:val="left"/>
+            </w:pPr>
+            <w:r>
+              <w:rPr>
+                <w:rFonts w:ascii="Calibri" w:hAnsi="Calibri"/>
+                <w:b w:val="0"/>
+                <w:color w:val="111827"/>
+                <w:sz w:val="17"/>
+              </w:rPr>
+              <w:t>Reject empty, malformed, larger-than-256-byte, or overflowing blocks.</w:t>
+            </w:r>
+          </w:p>
+        </w:tc>
+        <w:tc>
+          <w:tcPr>
+            <w:tcW w:type="dxa" w:w="3260"/>
+            <w:tcMar>
+              <w:top w:w="80" w:type="dxa"/>
+              <w:start w:w="120" w:type="dxa"/>
+              <w:bottom w:w="80" w:type="dxa"/>
+              <w:end w:w="120" w:type="dxa"/>
+            </w:tcMar>
+            <w:vAlign w:val="center"/>
+            <w:shd w:fill="FFFFFF"/>
+          </w:tcPr>
+          <w:p>
+            <w:pPr>
+              <w:spacing w:before="0" w:after="40" w:line="252" w:lineRule="auto"/>
+              <w:jc w:val="left"/>
+            </w:pPr>
+            <w:r>
+              <w:rPr>
+                <w:rFonts w:ascii="Calibri" w:hAnsi="Calibri"/>
+                <w:b w:val="0"/>
+                <w:color w:val="111827"/>
+                <w:sz w:val="17"/>
+              </w:rPr>
+              <w:t>Schema/service</w:t>
+            </w:r>
+          </w:p>
+        </w:tc>
+      </w:tr>
+      <w:tr>
+        <w:trPr>
+          <w:cantSplit/>
+        </w:trPr>
+        <w:tc>
+          <w:tcPr>
+            <w:tcW w:type="dxa" w:w="1650"/>
+            <w:tcMar>
+              <w:top w:w="80" w:type="dxa"/>
+              <w:start w:w="120" w:type="dxa"/>
+              <w:bottom w:w="80" w:type="dxa"/>
+              <w:end w:w="120" w:type="dxa"/>
+            </w:tcMar>
+            <w:vAlign w:val="center"/>
+            <w:shd w:fill="FFFFFF"/>
+          </w:tcPr>
+          <w:p>
+            <w:pPr>
+              <w:spacing w:before="0" w:after="40" w:line="252" w:lineRule="auto"/>
+              <w:jc w:val="center"/>
+            </w:pPr>
+            <w:r>
+              <w:rPr>
+                <w:rFonts w:ascii="Calibri" w:hAnsi="Calibri"/>
+                <w:b w:val="0"/>
+                <w:color w:val="111827"/>
+                <w:sz w:val="17"/>
+              </w:rPr>
+              <w:t>Block sequence</w:t>
+            </w:r>
+          </w:p>
+        </w:tc>
+        <w:tc>
+          <w:tcPr>
+            <w:tcW w:type="dxa" w:w="4450"/>
+            <w:tcMar>
+              <w:top w:w="80" w:type="dxa"/>
+              <w:start w:w="120" w:type="dxa"/>
+              <w:bottom w:w="80" w:type="dxa"/>
+              <w:end w:w="120" w:type="dxa"/>
+            </w:tcMar>
+            <w:vAlign w:val="center"/>
+            <w:shd w:fill="FFFFFF"/>
+          </w:tcPr>
+          <w:p>
+            <w:pPr>
+              <w:spacing w:before="0" w:after="40" w:line="252" w:lineRule="auto"/>
+              <w:jc w:val="left"/>
+            </w:pPr>
+            <w:r>
+              <w:rPr>
+                <w:rFonts w:ascii="Calibri" w:hAnsi="Calibri"/>
+                <w:b w:val="0"/>
+                <w:color w:val="111827"/>
+                <w:sz w:val="17"/>
+              </w:rPr>
+              <w:t>Accept only the expected 0-255 byte counter and wrap 255 to 0.</w:t>
+            </w:r>
+          </w:p>
+        </w:tc>
+        <w:tc>
+          <w:tcPr>
+            <w:tcW w:type="dxa" w:w="3260"/>
+            <w:tcMar>
+              <w:top w:w="80" w:type="dxa"/>
+              <w:start w:w="120" w:type="dxa"/>
+              <w:bottom w:w="80" w:type="dxa"/>
+              <w:end w:w="120" w:type="dxa"/>
+            </w:tcMar>
+            <w:vAlign w:val="center"/>
+            <w:shd w:fill="FFFFFF"/>
+          </w:tcPr>
+          <w:p>
+            <w:pPr>
+              <w:spacing w:before="0" w:after="40" w:line="252" w:lineRule="auto"/>
+              <w:jc w:val="left"/>
+            </w:pPr>
+            <w:r>
+              <w:rPr>
+                <w:rFonts w:ascii="Calibri" w:hAnsi="Calibri"/>
+                <w:b w:val="0"/>
+                <w:color w:val="111827"/>
+                <w:sz w:val="17"/>
+              </w:rPr>
+              <w:t>Service/integration</w:t>
+            </w:r>
+          </w:p>
+        </w:tc>
+      </w:tr>
+      <w:tr>
+        <w:trPr>
+          <w:cantSplit/>
+        </w:trPr>
+        <w:tc>
+          <w:tcPr>
+            <w:tcW w:type="dxa" w:w="1650"/>
+            <w:tcMar>
+              <w:top w:w="80" w:type="dxa"/>
+              <w:start w:w="120" w:type="dxa"/>
+              <w:bottom w:w="80" w:type="dxa"/>
+              <w:end w:w="120" w:type="dxa"/>
+            </w:tcMar>
+            <w:vAlign w:val="center"/>
+            <w:shd w:fill="FFFFFF"/>
+          </w:tcPr>
+          <w:p>
+            <w:pPr>
+              <w:spacing w:before="0" w:after="40" w:line="252" w:lineRule="auto"/>
+              <w:jc w:val="center"/>
+            </w:pPr>
+            <w:r>
+              <w:rPr>
+                <w:rFonts w:ascii="Calibri" w:hAnsi="Calibri"/>
+                <w:b w:val="0"/>
+                <w:color w:val="111827"/>
+                <w:sz w:val="17"/>
+              </w:rPr>
+              <w:t>Transfer concurrency</w:t>
+            </w:r>
+          </w:p>
+        </w:tc>
+        <w:tc>
+          <w:tcPr>
+            <w:tcW w:type="dxa" w:w="4450"/>
+            <w:tcMar>
+              <w:top w:w="80" w:type="dxa"/>
+              <w:start w:w="120" w:type="dxa"/>
+              <w:bottom w:w="80" w:type="dxa"/>
+              <w:end w:w="120" w:type="dxa"/>
+            </w:tcMar>
+            <w:vAlign w:val="center"/>
+            <w:shd w:fill="FFFFFF"/>
+          </w:tcPr>
+          <w:p>
+            <w:pPr>
+              <w:spacing w:before="0" w:after="40" w:line="252" w:lineRule="auto"/>
+              <w:jc w:val="left"/>
+            </w:pPr>
+            <w:r>
+              <w:rPr>
+                <w:rFonts w:ascii="Calibri" w:hAnsi="Calibri"/>
+                <w:b w:val="0"/>
+                <w:color w:val="111827"/>
+                <w:sz w:val="17"/>
+              </w:rPr>
+              <w:t xml:space="preserve">Reject stale transfer or ECU versions with NRC </w:t>
+            </w:r>
+            <w:r>
+              <w:rPr>
+                <w:rFonts w:ascii="Calibri" w:hAnsi="Calibri"/>
+                <w:b w:val="0"/>
+                <w:color w:val="111827"/>
+                <w:sz w:val="17"/>
+              </w:rPr>
+              <w:t>0x22</w:t>
+            </w:r>
+            <w:r>
+              <w:rPr>
+                <w:rFonts w:ascii="Calibri" w:hAnsi="Calibri"/>
+                <w:b w:val="0"/>
+                <w:color w:val="111827"/>
+                <w:sz w:val="17"/>
+              </w:rPr>
+              <w:t>.</w:t>
+            </w:r>
+          </w:p>
+        </w:tc>
+        <w:tc>
+          <w:tcPr>
+            <w:tcW w:type="dxa" w:w="3260"/>
+            <w:tcMar>
+              <w:top w:w="80" w:type="dxa"/>
+              <w:start w:w="120" w:type="dxa"/>
+              <w:bottom w:w="80" w:type="dxa"/>
+              <w:end w:w="120" w:type="dxa"/>
+            </w:tcMar>
+            <w:vAlign w:val="center"/>
+            <w:shd w:fill="FFFFFF"/>
+          </w:tcPr>
+          <w:p>
+            <w:pPr>
+              <w:spacing w:before="0" w:after="40" w:line="252" w:lineRule="auto"/>
+              <w:jc w:val="left"/>
+            </w:pPr>
+            <w:r>
+              <w:rPr>
+                <w:rFonts w:ascii="Calibri" w:hAnsi="Calibri"/>
+                <w:b w:val="0"/>
+                <w:color w:val="111827"/>
+                <w:sz w:val="17"/>
+              </w:rPr>
+              <w:t>Service/API</w:t>
+            </w:r>
+          </w:p>
+        </w:tc>
+      </w:tr>
+      <w:tr>
+        <w:trPr>
+          <w:cantSplit/>
+        </w:trPr>
+        <w:tc>
+          <w:tcPr>
+            <w:tcW w:type="dxa" w:w="1650"/>
+            <w:tcMar>
+              <w:top w:w="80" w:type="dxa"/>
+              <w:start w:w="120" w:type="dxa"/>
+              <w:bottom w:w="80" w:type="dxa"/>
+              <w:end w:w="120" w:type="dxa"/>
+            </w:tcMar>
+            <w:vAlign w:val="center"/>
+            <w:shd w:fill="FFFFFF"/>
+          </w:tcPr>
+          <w:p>
+            <w:pPr>
+              <w:spacing w:before="0" w:after="40" w:line="252" w:lineRule="auto"/>
+              <w:jc w:val="center"/>
+            </w:pPr>
+            <w:r>
+              <w:rPr>
+                <w:rFonts w:ascii="Calibri" w:hAnsi="Calibri"/>
+                <w:b w:val="0"/>
+                <w:color w:val="111827"/>
+                <w:sz w:val="17"/>
+              </w:rPr>
+              <w:t>Incomplete exit</w:t>
+            </w:r>
+          </w:p>
+        </w:tc>
+        <w:tc>
+          <w:tcPr>
+            <w:tcW w:type="dxa" w:w="4450"/>
+            <w:tcMar>
+              <w:top w:w="80" w:type="dxa"/>
+              <w:start w:w="120" w:type="dxa"/>
+              <w:bottom w:w="80" w:type="dxa"/>
+              <w:end w:w="120" w:type="dxa"/>
+            </w:tcMar>
+            <w:vAlign w:val="center"/>
+            <w:shd w:fill="FFFFFF"/>
+          </w:tcPr>
+          <w:p>
+            <w:pPr>
+              <w:spacing w:before="0" w:after="40" w:line="252" w:lineRule="auto"/>
+              <w:jc w:val="left"/>
+            </w:pPr>
+            <w:r>
+              <w:rPr>
+                <w:rFonts w:ascii="Calibri" w:hAnsi="Calibri"/>
+                <w:b w:val="0"/>
+                <w:color w:val="111827"/>
+                <w:sz w:val="17"/>
+              </w:rPr>
+              <w:t xml:space="preserve">Reject Transfer Exit before the declared byte count with NRC </w:t>
+            </w:r>
+            <w:r>
+              <w:rPr>
+                <w:rFonts w:ascii="Calibri" w:hAnsi="Calibri"/>
+                <w:b w:val="0"/>
+                <w:color w:val="111827"/>
+                <w:sz w:val="17"/>
+              </w:rPr>
+              <w:t>0x24</w:t>
+            </w:r>
+            <w:r>
+              <w:rPr>
+                <w:rFonts w:ascii="Calibri" w:hAnsi="Calibri"/>
+                <w:b w:val="0"/>
+                <w:color w:val="111827"/>
+                <w:sz w:val="17"/>
+              </w:rPr>
+              <w:t>.</w:t>
+            </w:r>
+          </w:p>
+        </w:tc>
+        <w:tc>
+          <w:tcPr>
+            <w:tcW w:type="dxa" w:w="3260"/>
+            <w:tcMar>
+              <w:top w:w="80" w:type="dxa"/>
+              <w:start w:w="120" w:type="dxa"/>
+              <w:bottom w:w="80" w:type="dxa"/>
+              <w:end w:w="120" w:type="dxa"/>
+            </w:tcMar>
+            <w:vAlign w:val="center"/>
+            <w:shd w:fill="FFFFFF"/>
+          </w:tcPr>
+          <w:p>
+            <w:pPr>
+              <w:spacing w:before="0" w:after="40" w:line="252" w:lineRule="auto"/>
+              <w:jc w:val="left"/>
+            </w:pPr>
+            <w:r>
+              <w:rPr>
+                <w:rFonts w:ascii="Calibri" w:hAnsi="Calibri"/>
+                <w:b w:val="0"/>
+                <w:color w:val="111827"/>
+                <w:sz w:val="17"/>
+              </w:rPr>
+              <w:t>Service/API</w:t>
+            </w:r>
+          </w:p>
+        </w:tc>
+      </w:tr>
+      <w:tr>
+        <w:trPr>
+          <w:cantSplit/>
+        </w:trPr>
+        <w:tc>
+          <w:tcPr>
+            <w:tcW w:type="dxa" w:w="1650"/>
+            <w:tcMar>
+              <w:top w:w="80" w:type="dxa"/>
+              <w:start w:w="120" w:type="dxa"/>
+              <w:bottom w:w="80" w:type="dxa"/>
+              <w:end w:w="120" w:type="dxa"/>
+            </w:tcMar>
+            <w:vAlign w:val="center"/>
+            <w:shd w:fill="FFFFFF"/>
+          </w:tcPr>
+          <w:p>
+            <w:pPr>
+              <w:spacing w:before="0" w:after="40" w:line="252" w:lineRule="auto"/>
+              <w:jc w:val="center"/>
+            </w:pPr>
+            <w:r>
+              <w:rPr>
+                <w:rFonts w:ascii="Calibri" w:hAnsi="Calibri"/>
+                <w:b w:val="0"/>
+                <w:color w:val="111827"/>
+                <w:sz w:val="17"/>
+              </w:rPr>
+              <w:t>Digest verification</w:t>
+            </w:r>
+          </w:p>
+        </w:tc>
+        <w:tc>
+          <w:tcPr>
+            <w:tcW w:type="dxa" w:w="4450"/>
+            <w:tcMar>
+              <w:top w:w="80" w:type="dxa"/>
+              <w:start w:w="120" w:type="dxa"/>
+              <w:bottom w:w="80" w:type="dxa"/>
+              <w:end w:w="120" w:type="dxa"/>
+            </w:tcMar>
+            <w:vAlign w:val="center"/>
+            <w:shd w:fill="FFFFFF"/>
+          </w:tcPr>
+          <w:p>
+            <w:pPr>
+              <w:spacing w:before="0" w:after="40" w:line="252" w:lineRule="auto"/>
+              <w:jc w:val="left"/>
+            </w:pPr>
+            <w:r>
+              <w:rPr>
+                <w:rFonts w:ascii="Calibri" w:hAnsi="Calibri"/>
+                <w:b w:val="0"/>
+                <w:color w:val="111827"/>
+                <w:sz w:val="17"/>
+              </w:rPr>
+              <w:t>Reject a mismatched SHA-256 without changing the ECU firmware version.</w:t>
+            </w:r>
+          </w:p>
+        </w:tc>
+        <w:tc>
+          <w:tcPr>
+            <w:tcW w:type="dxa" w:w="3260"/>
+            <w:tcMar>
+              <w:top w:w="80" w:type="dxa"/>
+              <w:start w:w="120" w:type="dxa"/>
+              <w:bottom w:w="80" w:type="dxa"/>
+              <w:end w:w="120" w:type="dxa"/>
+            </w:tcMar>
+            <w:vAlign w:val="center"/>
+            <w:shd w:fill="FFFFFF"/>
+          </w:tcPr>
+          <w:p>
+            <w:pPr>
+              <w:spacing w:before="0" w:after="40" w:line="252" w:lineRule="auto"/>
+              <w:jc w:val="left"/>
+            </w:pPr>
+            <w:r>
+              <w:rPr>
+                <w:rFonts w:ascii="Calibri" w:hAnsi="Calibri"/>
+                <w:b w:val="0"/>
+                <w:color w:val="111827"/>
+                <w:sz w:val="17"/>
+              </w:rPr>
+              <w:t>Service/integration</w:t>
+            </w:r>
+          </w:p>
+        </w:tc>
+      </w:tr>
+      <w:tr>
+        <w:trPr>
+          <w:cantSplit/>
+        </w:trPr>
+        <w:tc>
+          <w:tcPr>
+            <w:tcW w:type="dxa" w:w="1650"/>
+            <w:tcMar>
+              <w:top w:w="80" w:type="dxa"/>
+              <w:start w:w="120" w:type="dxa"/>
+              <w:bottom w:w="80" w:type="dxa"/>
+              <w:end w:w="120" w:type="dxa"/>
+            </w:tcMar>
+            <w:vAlign w:val="center"/>
+            <w:shd w:fill="FFFFFF"/>
+          </w:tcPr>
+          <w:p>
+            <w:pPr>
+              <w:spacing w:before="0" w:after="40" w:line="252" w:lineRule="auto"/>
+              <w:jc w:val="center"/>
+            </w:pPr>
+            <w:r>
+              <w:rPr>
+                <w:rFonts w:ascii="Calibri" w:hAnsi="Calibri"/>
+                <w:b w:val="0"/>
+                <w:color w:val="111827"/>
+                <w:sz w:val="17"/>
+              </w:rPr>
+              <w:t>Flash activation</w:t>
+            </w:r>
+          </w:p>
+        </w:tc>
+        <w:tc>
+          <w:tcPr>
+            <w:tcW w:type="dxa" w:w="4450"/>
+            <w:tcMar>
+              <w:top w:w="80" w:type="dxa"/>
+              <w:start w:w="120" w:type="dxa"/>
+              <w:bottom w:w="80" w:type="dxa"/>
+              <w:end w:w="120" w:type="dxa"/>
+            </w:tcMar>
+            <w:vAlign w:val="center"/>
+            <w:shd w:fill="FFFFFF"/>
+          </w:tcPr>
+          <w:p>
+            <w:pPr>
+              <w:spacing w:before="0" w:after="40" w:line="252" w:lineRule="auto"/>
+              <w:jc w:val="left"/>
+            </w:pPr>
+            <w:r>
+              <w:rPr>
+                <w:rFonts w:ascii="Calibri" w:hAnsi="Calibri"/>
+                <w:b w:val="0"/>
+                <w:color w:val="111827"/>
+                <w:sz w:val="17"/>
+              </w:rPr>
+              <w:t>Update firmware profile and ECU version only after full verification.</w:t>
+            </w:r>
+          </w:p>
+        </w:tc>
+        <w:tc>
+          <w:tcPr>
+            <w:tcW w:type="dxa" w:w="3260"/>
+            <w:tcMar>
+              <w:top w:w="80" w:type="dxa"/>
+              <w:start w:w="120" w:type="dxa"/>
+              <w:bottom w:w="80" w:type="dxa"/>
+              <w:end w:w="120" w:type="dxa"/>
+            </w:tcMar>
+            <w:vAlign w:val="center"/>
+            <w:shd w:fill="FFFFFF"/>
+          </w:tcPr>
+          <w:p>
+            <w:pPr>
+              <w:spacing w:before="0" w:after="40" w:line="252" w:lineRule="auto"/>
+              <w:jc w:val="left"/>
+            </w:pPr>
+            <w:r>
+              <w:rPr>
+                <w:rFonts w:ascii="Calibri" w:hAnsi="Calibri"/>
+                <w:b w:val="0"/>
+                <w:color w:val="111827"/>
+                <w:sz w:val="17"/>
+              </w:rPr>
+              <w:t>Service/integration</w:t>
+            </w:r>
+          </w:p>
+        </w:tc>
+      </w:tr>
+      <w:tr>
+        <w:trPr>
+          <w:cantSplit/>
+        </w:trPr>
+        <w:tc>
+          <w:tcPr>
+            <w:tcW w:type="dxa" w:w="1650"/>
+            <w:tcMar>
+              <w:top w:w="80" w:type="dxa"/>
+              <w:start w:w="120" w:type="dxa"/>
+              <w:bottom w:w="80" w:type="dxa"/>
+              <w:end w:w="120" w:type="dxa"/>
+            </w:tcMar>
+            <w:vAlign w:val="center"/>
+            <w:shd w:fill="FFFFFF"/>
+          </w:tcPr>
+          <w:p>
+            <w:pPr>
+              <w:spacing w:before="0" w:after="40" w:line="252" w:lineRule="auto"/>
+              <w:jc w:val="center"/>
+            </w:pPr>
+            <w:r>
+              <w:rPr>
+                <w:rFonts w:ascii="Calibri" w:hAnsi="Calibri"/>
+                <w:b w:val="0"/>
+                <w:color w:val="111827"/>
+                <w:sz w:val="17"/>
+              </w:rPr>
+              <w:t>Flash replay</w:t>
+            </w:r>
+          </w:p>
+        </w:tc>
+        <w:tc>
+          <w:tcPr>
+            <w:tcW w:type="dxa" w:w="4450"/>
+            <w:tcMar>
+              <w:top w:w="80" w:type="dxa"/>
+              <w:start w:w="120" w:type="dxa"/>
+              <w:bottom w:w="80" w:type="dxa"/>
+              <w:end w:w="120" w:type="dxa"/>
+            </w:tcMar>
+            <w:vAlign w:val="center"/>
+            <w:shd w:fill="FFFFFF"/>
+          </w:tcPr>
+          <w:p>
+            <w:pPr>
+              <w:spacing w:before="0" w:after="40" w:line="252" w:lineRule="auto"/>
+              <w:jc w:val="left"/>
+            </w:pPr>
+            <w:r>
+              <w:rPr>
+                <w:rFonts w:ascii="Calibri" w:hAnsi="Calibri"/>
+                <w:b w:val="0"/>
+                <w:color w:val="111827"/>
+                <w:sz w:val="17"/>
+              </w:rPr>
+              <w:t xml:space="preserve">Replay </w:t>
+            </w:r>
+            <w:r>
+              <w:rPr>
+                <w:rFonts w:ascii="Calibri" w:hAnsi="Calibri"/>
+                <w:b w:val="0"/>
+                <w:color w:val="111827"/>
+                <w:sz w:val="17"/>
+              </w:rPr>
+              <w:t>0x34</w:t>
+            </w:r>
+            <w:r>
+              <w:rPr>
+                <w:rFonts w:ascii="Calibri" w:hAnsi="Calibri"/>
+                <w:b w:val="0"/>
+                <w:color w:val="111827"/>
+                <w:sz w:val="17"/>
+              </w:rPr>
+              <w:t>/</w:t>
+            </w:r>
+            <w:r>
+              <w:rPr>
+                <w:rFonts w:ascii="Calibri" w:hAnsi="Calibri"/>
+                <w:b w:val="0"/>
+                <w:color w:val="111827"/>
+                <w:sz w:val="17"/>
+              </w:rPr>
+              <w:t>0x36</w:t>
+            </w:r>
+            <w:r>
+              <w:rPr>
+                <w:rFonts w:ascii="Calibri" w:hAnsi="Calibri"/>
+                <w:b w:val="0"/>
+                <w:color w:val="111827"/>
+                <w:sz w:val="17"/>
+              </w:rPr>
+              <w:t>/</w:t>
+            </w:r>
+            <w:r>
+              <w:rPr>
+                <w:rFonts w:ascii="Calibri" w:hAnsi="Calibri"/>
+                <w:b w:val="0"/>
+                <w:color w:val="111827"/>
+                <w:sz w:val="17"/>
+              </w:rPr>
+              <w:t>0x37</w:t>
+            </w:r>
+            <w:r>
+              <w:rPr>
+                <w:rFonts w:ascii="Calibri" w:hAnsi="Calibri"/>
+                <w:b w:val="0"/>
+                <w:color w:val="111827"/>
+                <w:sz w:val="17"/>
+              </w:rPr>
+              <w:t xml:space="preserve"> without appending a block or activating twice.</w:t>
+            </w:r>
+          </w:p>
+        </w:tc>
+        <w:tc>
+          <w:tcPr>
+            <w:tcW w:type="dxa" w:w="3260"/>
+            <w:tcMar>
+              <w:top w:w="80" w:type="dxa"/>
+              <w:start w:w="120" w:type="dxa"/>
+              <w:bottom w:w="80" w:type="dxa"/>
+              <w:end w:w="120" w:type="dxa"/>
+            </w:tcMar>
+            <w:vAlign w:val="center"/>
+            <w:shd w:fill="FFFFFF"/>
+          </w:tcPr>
+          <w:p>
+            <w:pPr>
+              <w:spacing w:before="0" w:after="40" w:line="252" w:lineRule="auto"/>
+              <w:jc w:val="left"/>
+            </w:pPr>
+            <w:r>
+              <w:rPr>
+                <w:rFonts w:ascii="Calibri" w:hAnsi="Calibri"/>
+                <w:b w:val="0"/>
+                <w:color w:val="111827"/>
+                <w:sz w:val="17"/>
+              </w:rPr>
+              <w:t>Service/integration</w:t>
+            </w:r>
+          </w:p>
+        </w:tc>
+      </w:tr>
+      <w:tr>
+        <w:trPr>
+          <w:cantSplit/>
+        </w:trPr>
+        <w:tc>
+          <w:tcPr>
+            <w:tcW w:type="dxa" w:w="1650"/>
+            <w:tcMar>
+              <w:top w:w="80" w:type="dxa"/>
+              <w:start w:w="120" w:type="dxa"/>
+              <w:bottom w:w="80" w:type="dxa"/>
+              <w:end w:w="120" w:type="dxa"/>
+            </w:tcMar>
+            <w:vAlign w:val="center"/>
+            <w:shd w:fill="FFFFFF"/>
+          </w:tcPr>
+          <w:p>
+            <w:pPr>
+              <w:spacing w:before="0" w:after="40" w:line="252" w:lineRule="auto"/>
+              <w:jc w:val="center"/>
+            </w:pPr>
+            <w:r>
+              <w:rPr>
+                <w:rFonts w:ascii="Calibri" w:hAnsi="Calibri"/>
+                <w:b w:val="0"/>
+                <w:color w:val="111827"/>
+                <w:sz w:val="17"/>
+              </w:rPr>
+              <w:t>Payload minimization</w:t>
+            </w:r>
+          </w:p>
+        </w:tc>
+        <w:tc>
+          <w:tcPr>
+            <w:tcW w:type="dxa" w:w="4450"/>
+            <w:tcMar>
+              <w:top w:w="80" w:type="dxa"/>
+              <w:start w:w="120" w:type="dxa"/>
+              <w:bottom w:w="80" w:type="dxa"/>
+              <w:end w:w="120" w:type="dxa"/>
+            </w:tcMar>
+            <w:vAlign w:val="center"/>
+            <w:shd w:fill="FFFFFF"/>
+          </w:tcPr>
+          <w:p>
+            <w:pPr>
+              <w:spacing w:before="0" w:after="40" w:line="252" w:lineRule="auto"/>
+              <w:jc w:val="left"/>
+            </w:pPr>
+            <w:r>
+              <w:rPr>
+                <w:rFonts w:ascii="Calibri" w:hAnsi="Calibri"/>
+                <w:b w:val="0"/>
+                <w:color w:val="111827"/>
+                <w:sz w:val="17"/>
+              </w:rPr>
+              <w:t>Prove raw image/block bytes never enter commands, logs, audit, or outbox.</w:t>
+            </w:r>
+          </w:p>
+        </w:tc>
+        <w:tc>
+          <w:tcPr>
+            <w:tcW w:type="dxa" w:w="3260"/>
+            <w:tcMar>
+              <w:top w:w="80" w:type="dxa"/>
+              <w:start w:w="120" w:type="dxa"/>
+              <w:bottom w:w="80" w:type="dxa"/>
+              <w:end w:w="120" w:type="dxa"/>
+            </w:tcMar>
+            <w:vAlign w:val="center"/>
+            <w:shd w:fill="FFFFFF"/>
+          </w:tcPr>
+          <w:p>
+            <w:pPr>
+              <w:spacing w:before="0" w:after="40" w:line="252" w:lineRule="auto"/>
+              <w:jc w:val="left"/>
+            </w:pPr>
+            <w:r>
+              <w:rPr>
+                <w:rFonts w:ascii="Calibri" w:hAnsi="Calibri"/>
+                <w:b w:val="0"/>
+                <w:color w:val="111827"/>
+                <w:sz w:val="17"/>
+              </w:rPr>
+              <w:t>Service/security</w:t>
+            </w:r>
+          </w:p>
+        </w:tc>
+      </w:tr>
+      <w:tr>
+        <w:trPr>
+          <w:cantSplit/>
+        </w:trPr>
+        <w:tc>
+          <w:tcPr>
+            <w:tcW w:type="dxa" w:w="1650"/>
+            <w:tcMar>
+              <w:top w:w="80" w:type="dxa"/>
+              <w:start w:w="120" w:type="dxa"/>
+              <w:bottom w:w="80" w:type="dxa"/>
+              <w:end w:w="120" w:type="dxa"/>
+            </w:tcMar>
+            <w:vAlign w:val="center"/>
+            <w:shd w:fill="FFFFFF"/>
+          </w:tcPr>
+          <w:p>
+            <w:pPr>
+              <w:spacing w:before="0" w:after="40" w:line="252" w:lineRule="auto"/>
+              <w:jc w:val="center"/>
+            </w:pPr>
+            <w:r>
+              <w:rPr>
+                <w:rFonts w:ascii="Calibri" w:hAnsi="Calibri"/>
+                <w:b w:val="0"/>
+                <w:color w:val="111827"/>
+                <w:sz w:val="17"/>
+              </w:rPr>
+              <w:t>Flash atomicity</w:t>
+            </w:r>
+          </w:p>
+        </w:tc>
+        <w:tc>
+          <w:tcPr>
+            <w:tcW w:type="dxa" w:w="4450"/>
+            <w:tcMar>
+              <w:top w:w="80" w:type="dxa"/>
+              <w:start w:w="120" w:type="dxa"/>
+              <w:bottom w:w="80" w:type="dxa"/>
+              <w:end w:w="120" w:type="dxa"/>
+            </w:tcMar>
+            <w:vAlign w:val="center"/>
+            <w:shd w:fill="FFFFFF"/>
+          </w:tcPr>
+          <w:p>
+            <w:pPr>
+              <w:spacing w:before="0" w:after="40" w:line="252" w:lineRule="auto"/>
+              <w:jc w:val="left"/>
+            </w:pPr>
+            <w:r>
+              <w:rPr>
+                <w:rFonts w:ascii="Calibri" w:hAnsi="Calibri"/>
+                <w:b w:val="0"/>
+                <w:color w:val="111827"/>
+                <w:sz w:val="17"/>
+              </w:rPr>
+              <w:t>Commit transfer, firmware activation, command, audit, and outbox together.</w:t>
             </w:r>
           </w:p>
         </w:tc>
@@ -14902,6 +17536,39 @@
           <w:sz w:val="22"/>
         </w:rPr>
         <w:t xml:space="preserve"> owns the ECU Security Access challenge state.</w:t>
+      </w:r>
+    </w:p>
+    <w:p>
+      <w:pPr>
+        <w:pStyle w:val="ListBullet"/>
+        <w:numPr>
+          <w:ilvl w:val="0"/>
+          <w:numId w:val="13"/>
+        </w:numPr>
+      </w:pPr>
+      <w:r>
+        <w:rPr>
+          <w:rFonts w:ascii="Calibri" w:hAnsi="Calibri"/>
+          <w:color w:val="111827"/>
+          <w:sz w:val="22"/>
+        </w:rPr>
+        <w:t xml:space="preserve">Migration </w:t>
+      </w:r>
+      <w:r>
+        <w:rPr>
+          <w:rFonts w:ascii="Consolas" w:hAnsi="Consolas"/>
+          <w:color w:val="1F4D78"/>
+          <w:sz w:val="19"/>
+        </w:rPr>
+        <w:t>0035_diagnostic_flash</w:t>
+      </w:r>
+      <w:r>
+        <w:rPr>
+          <w:rFonts w:ascii="Calibri" w:hAnsi="Calibri"/>
+          <w:color w:val="111827"/>
+          <w:sz w:val="22"/>
+        </w:rPr>
+        <w:t xml:space="preserve"> owns the ECU firmware-transfer state.</w:t>
       </w:r>
     </w:p>
     <w:p>
@@ -15258,6 +17925,71 @@
     </w:p>
     <w:p>
       <w:pPr>
+        <w:pStyle w:val="ListBullet"/>
+        <w:numPr>
+          <w:ilvl w:val="0"/>
+          <w:numId w:val="13"/>
+        </w:numPr>
+      </w:pPr>
+      <w:r>
+        <w:rPr>
+          <w:rFonts w:ascii="Calibri" w:hAnsi="Calibri"/>
+          <w:color w:val="111827"/>
+          <w:sz w:val="22"/>
+        </w:rPr>
+        <w:t xml:space="preserve">Flash events are </w:t>
+      </w:r>
+      <w:r>
+        <w:rPr>
+          <w:rFonts w:ascii="Consolas" w:hAnsi="Consolas"/>
+          <w:color w:val="1F4D78"/>
+          <w:sz w:val="19"/>
+        </w:rPr>
+        <w:t>atep.diagnostics.flash.download.requested.v1</w:t>
+      </w:r>
+      <w:r>
+        <w:rPr>
+          <w:rFonts w:ascii="Calibri" w:hAnsi="Calibri"/>
+          <w:color w:val="111827"/>
+          <w:sz w:val="22"/>
+        </w:rPr>
+        <w:t xml:space="preserve">, </w:t>
+      </w:r>
+      <w:r>
+        <w:rPr>
+          <w:rFonts w:ascii="Consolas" w:hAnsi="Consolas"/>
+          <w:color w:val="1F4D78"/>
+          <w:sz w:val="19"/>
+        </w:rPr>
+        <w:t>atep.diagnostics.flash.block.transferred.v1</w:t>
+      </w:r>
+      <w:r>
+        <w:rPr>
+          <w:rFonts w:ascii="Calibri" w:hAnsi="Calibri"/>
+          <w:color w:val="111827"/>
+          <w:sz w:val="22"/>
+        </w:rPr>
+        <w:t xml:space="preserve">, and </w:t>
+      </w:r>
+      <w:r>
+        <w:rPr>
+          <w:rFonts w:ascii="Consolas" w:hAnsi="Consolas"/>
+          <w:color w:val="1F4D78"/>
+          <w:sz w:val="19"/>
+        </w:rPr>
+        <w:t>atep.diagnostics.flash.completed.v1</w:t>
+      </w:r>
+      <w:r>
+        <w:rPr>
+          <w:rFonts w:ascii="Calibri" w:hAnsi="Calibri"/>
+          <w:color w:val="111827"/>
+          <w:sz w:val="22"/>
+        </w:rPr>
+        <w:t>; none contains raw firmware bytes.</w:t>
+      </w:r>
+    </w:p>
+    <w:p>
+      <w:pPr>
         <w:pStyle w:val="Heading1"/>
         <w:keepNext/>
         <w:keepLines/>
@@ -15280,7 +18012,7 @@
           <w:color w:val="111827"/>
           <w:sz w:val="22"/>
         </w:rPr>
-        <w:t>V-1 through V-5 expose semantic UDS operations but do not yet encode wire PDUs.</w:t>
+        <w:t>V-1 through V-6 expose semantic UDS operations but do not yet encode wire PDUs.</w:t>
       </w:r>
     </w:p>
     <w:p>
@@ -15421,6 +18153,23 @@
     </w:p>
     <w:p>
       <w:pPr>
+        <w:pStyle w:val="ListBullet"/>
+        <w:numPr>
+          <w:ilvl w:val="0"/>
+          <w:numId w:val="14"/>
+        </w:numPr>
+      </w:pPr>
+      <w:r>
+        <w:rPr>
+          <w:rFonts w:ascii="Calibri" w:hAnsi="Calibri"/>
+          <w:color w:val="111827"/>
+          <w:sz w:val="22"/>
+        </w:rPr>
+        <w:t>V-6 is a bounded simulator pipeline, not a bootloader or production flasher; signing, anti-rollback, erase/program routines, power-loss recovery, and OEM secure-boot policy remain future hardening.</w:t>
+      </w:r>
+    </w:p>
+    <w:p>
+      <w:pPr>
         <w:pStyle w:val="Heading1"/>
         <w:keepNext/>
         <w:keepLines/>
@@ -15436,55 +18185,7 @@
           <w:color w:val="111827"/>
           <w:sz w:val="22"/>
         </w:rPr>
-        <w:t>V-1 through V-5 are implemented. The recommended next development is V-6: Request Download, Transfer Data, and Request Transfer Exit (</w:t>
-      </w:r>
-      <w:r>
-        <w:rPr>
-          <w:rFonts w:ascii="Consolas" w:hAnsi="Consolas"/>
-          <w:color w:val="1F4D78"/>
-          <w:sz w:val="19"/>
-        </w:rPr>
-        <w:t>0x34</w:t>
-      </w:r>
-      <w:r>
-        <w:rPr>
-          <w:rFonts w:ascii="Calibri" w:hAnsi="Calibri"/>
-          <w:color w:val="111827"/>
-          <w:sz w:val="22"/>
-        </w:rPr>
-        <w:t xml:space="preserve">, </w:t>
-      </w:r>
-      <w:r>
-        <w:rPr>
-          <w:rFonts w:ascii="Consolas" w:hAnsi="Consolas"/>
-          <w:color w:val="1F4D78"/>
-          <w:sz w:val="19"/>
-        </w:rPr>
-        <w:t>0x36</w:t>
-      </w:r>
-      <w:r>
-        <w:rPr>
-          <w:rFonts w:ascii="Calibri" w:hAnsi="Calibri"/>
-          <w:color w:val="111827"/>
-          <w:sz w:val="22"/>
-        </w:rPr>
-        <w:t xml:space="preserve">, and </w:t>
-      </w:r>
-      <w:r>
-        <w:rPr>
-          <w:rFonts w:ascii="Consolas" w:hAnsi="Consolas"/>
-          <w:color w:val="1F4D78"/>
-          <w:sz w:val="19"/>
-        </w:rPr>
-        <w:t>0x37</w:t>
-      </w:r>
-      <w:r>
-        <w:rPr>
-          <w:rFonts w:ascii="Calibri" w:hAnsi="Calibri"/>
-          <w:color w:val="111827"/>
-          <w:sz w:val="22"/>
-        </w:rPr>
-        <w:t>) as a bounded, resumable flash pipeline with security/session policy, block sequencing, checksums, rollback, and exact replay.</w:t>
+        <w:t>V-1 through V-6 are implemented. The recommended next development is V-7: OBD-II compatibility, the DoIP transport boundary, diagnostic campaigns, and end-to-end scenarios that connect Digital Vehicle, ECU, CAN, Diagnostics, test execution, evidence, and Android Automotive visibility.</w:t>
       </w:r>
     </w:p>
     <w:p>
@@ -16515,6 +19216,343 @@
         <w:t>Design rollback evidence for a failure after ECU mutation but before diagnostic evidence commit.</w:t>
       </w:r>
     </w:p>
+    <w:p>
+      <w:pPr>
+        <w:pStyle w:val="ListNumber"/>
+        <w:numPr>
+          <w:ilvl w:val="0"/>
+          <w:numId w:val="15"/>
+        </w:numPr>
+      </w:pPr>
+      <w:r>
+        <w:rPr>
+          <w:rFonts w:ascii="Calibri" w:hAnsi="Calibri"/>
+          <w:color w:val="111827"/>
+          <w:sz w:val="22"/>
+        </w:rPr>
+        <w:t xml:space="preserve">Calculate the positive response identities for </w:t>
+      </w:r>
+      <w:r>
+        <w:rPr>
+          <w:rFonts w:ascii="Consolas" w:hAnsi="Consolas"/>
+          <w:color w:val="1F4D78"/>
+          <w:sz w:val="19"/>
+        </w:rPr>
+        <w:t>0x34</w:t>
+      </w:r>
+      <w:r>
+        <w:rPr>
+          <w:rFonts w:ascii="Calibri" w:hAnsi="Calibri"/>
+          <w:color w:val="111827"/>
+          <w:sz w:val="22"/>
+        </w:rPr>
+        <w:t xml:space="preserve">, </w:t>
+      </w:r>
+      <w:r>
+        <w:rPr>
+          <w:rFonts w:ascii="Consolas" w:hAnsi="Consolas"/>
+          <w:color w:val="1F4D78"/>
+          <w:sz w:val="19"/>
+        </w:rPr>
+        <w:t>0x36</w:t>
+      </w:r>
+      <w:r>
+        <w:rPr>
+          <w:rFonts w:ascii="Calibri" w:hAnsi="Calibri"/>
+          <w:color w:val="111827"/>
+          <w:sz w:val="22"/>
+        </w:rPr>
+        <w:t xml:space="preserve">, and </w:t>
+      </w:r>
+      <w:r>
+        <w:rPr>
+          <w:rFonts w:ascii="Consolas" w:hAnsi="Consolas"/>
+          <w:color w:val="1F4D78"/>
+          <w:sz w:val="19"/>
+        </w:rPr>
+        <w:t>0x37</w:t>
+      </w:r>
+      <w:r>
+        <w:rPr>
+          <w:rFonts w:ascii="Calibri" w:hAnsi="Calibri"/>
+          <w:color w:val="111827"/>
+          <w:sz w:val="22"/>
+        </w:rPr>
+        <w:t>.</w:t>
+      </w:r>
+    </w:p>
+    <w:p>
+      <w:pPr>
+        <w:pStyle w:val="ListNumber"/>
+        <w:numPr>
+          <w:ilvl w:val="0"/>
+          <w:numId w:val="15"/>
+        </w:numPr>
+      </w:pPr>
+      <w:r>
+        <w:rPr>
+          <w:rFonts w:ascii="Calibri" w:hAnsi="Calibri"/>
+          <w:color w:val="111827"/>
+          <w:sz w:val="22"/>
+        </w:rPr>
+        <w:t>Explain why Request Download requires both programming session and Security Access level 1.</w:t>
+      </w:r>
+    </w:p>
+    <w:p>
+      <w:pPr>
+        <w:pStyle w:val="ListNumber"/>
+        <w:numPr>
+          <w:ilvl w:val="0"/>
+          <w:numId w:val="15"/>
+        </w:numPr>
+      </w:pPr>
+      <w:r>
+        <w:rPr>
+          <w:rFonts w:ascii="Calibri" w:hAnsi="Calibri"/>
+          <w:color w:val="111827"/>
+          <w:sz w:val="22"/>
+        </w:rPr>
+        <w:t>Design block-sequence tests for duplicate, skipped, stale-version, and 255-to-0 wrap cases.</w:t>
+      </w:r>
+    </w:p>
+    <w:p>
+      <w:pPr>
+        <w:pStyle w:val="ListNumber"/>
+        <w:numPr>
+          <w:ilvl w:val="0"/>
+          <w:numId w:val="15"/>
+        </w:numPr>
+      </w:pPr>
+      <w:r>
+        <w:rPr>
+          <w:rFonts w:ascii="Calibri" w:hAnsi="Calibri"/>
+          <w:color w:val="111827"/>
+          <w:sz w:val="22"/>
+        </w:rPr>
+        <w:t>Prove that raw firmware bytes do not appear in command, audit, outbox, or log evidence.</w:t>
+      </w:r>
+    </w:p>
+    <w:p>
+      <w:pPr>
+        <w:pStyle w:val="ListNumber"/>
+        <w:numPr>
+          <w:ilvl w:val="0"/>
+          <w:numId w:val="15"/>
+        </w:numPr>
+      </w:pPr>
+      <w:r>
+        <w:rPr>
+          <w:rFonts w:ascii="Calibri" w:hAnsi="Calibri"/>
+          <w:color w:val="111827"/>
+          <w:sz w:val="22"/>
+        </w:rPr>
+        <w:t>Compare block SHA-256 evidence with the full-image digest verified at Transfer Exit.</w:t>
+      </w:r>
+    </w:p>
+    <w:p>
+      <w:pPr>
+        <w:pStyle w:val="ListNumber"/>
+        <w:numPr>
+          <w:ilvl w:val="0"/>
+          <w:numId w:val="15"/>
+        </w:numPr>
+      </w:pPr>
+      <w:r>
+        <w:rPr>
+          <w:rFonts w:ascii="Calibri" w:hAnsi="Calibri"/>
+          <w:color w:val="111827"/>
+          <w:sz w:val="22"/>
+        </w:rPr>
+        <w:t>Trace a successful flash from negotiation through ECU profile/version activation.</w:t>
+      </w:r>
+    </w:p>
+    <w:p>
+      <w:pPr>
+        <w:pStyle w:val="ListNumber"/>
+        <w:numPr>
+          <w:ilvl w:val="0"/>
+          <w:numId w:val="15"/>
+        </w:numPr>
+      </w:pPr>
+      <w:r>
+        <w:rPr>
+          <w:rFonts w:ascii="Calibri" w:hAnsi="Calibri"/>
+          <w:color w:val="111827"/>
+          <w:sz w:val="22"/>
+        </w:rPr>
+        <w:t>Design negative tests for incomplete images, overflow, digest mismatch, and stale ECU version.</w:t>
+      </w:r>
+    </w:p>
+    <w:p>
+      <w:pPr>
+        <w:pStyle w:val="ListNumber"/>
+        <w:numPr>
+          <w:ilvl w:val="0"/>
+          <w:numId w:val="15"/>
+        </w:numPr>
+      </w:pPr>
+      <w:r>
+        <w:rPr>
+          <w:rFonts w:ascii="Calibri" w:hAnsi="Calibri"/>
+          <w:color w:val="111827"/>
+          <w:sz w:val="22"/>
+        </w:rPr>
+        <w:t>Explain which production concerns remain outside this simulator pipeline.</w:t>
+      </w:r>
+    </w:p>
+    <w:p>
+      <w:pPr>
+        <w:pStyle w:val="Heading1"/>
+        <w:keepNext/>
+        <w:keepLines/>
+      </w:pPr>
+      <w:r>
+        <w:t>16. V-6 Review Worksheet</w:t>
+      </w:r>
+    </w:p>
+    <w:p>
+      <w:r>
+        <w:rPr>
+          <w:rFonts w:ascii="Calibri" w:hAnsi="Calibri"/>
+          <w:color w:val="111827"/>
+          <w:sz w:val="22"/>
+        </w:rPr>
+        <w:t>Use this worksheet after studying or demonstrating the increment:</w:t>
+      </w:r>
+    </w:p>
+    <w:p>
+      <w:pPr>
+        <w:pStyle w:val="ListNumber"/>
+        <w:numPr>
+          <w:ilvl w:val="0"/>
+          <w:numId w:val="16"/>
+        </w:numPr>
+      </w:pPr>
+      <w:r>
+        <w:rPr>
+          <w:rFonts w:ascii="Calibri" w:hAnsi="Calibri"/>
+          <w:color w:val="111827"/>
+          <w:sz w:val="22"/>
+        </w:rPr>
+        <w:t>Record the tested firmware size, block size, number of blocks, and final SHA-256.</w:t>
+      </w:r>
+    </w:p>
+    <w:p>
+      <w:pPr>
+        <w:pStyle w:val="ListNumber"/>
+        <w:numPr>
+          <w:ilvl w:val="0"/>
+          <w:numId w:val="16"/>
+        </w:numPr>
+      </w:pPr>
+      <w:r>
+        <w:rPr>
+          <w:rFonts w:ascii="Calibri" w:hAnsi="Calibri"/>
+          <w:color w:val="111827"/>
+          <w:sz w:val="22"/>
+        </w:rPr>
+        <w:t xml:space="preserve">Capture one successful </w:t>
+      </w:r>
+      <w:r>
+        <w:rPr>
+          <w:rFonts w:ascii="Consolas" w:hAnsi="Consolas"/>
+          <w:color w:val="1F4D78"/>
+          <w:sz w:val="19"/>
+        </w:rPr>
+        <w:t>0x34</w:t>
+      </w:r>
+      <w:r>
+        <w:rPr>
+          <w:rFonts w:ascii="Calibri" w:hAnsi="Calibri"/>
+          <w:color w:val="111827"/>
+          <w:sz w:val="22"/>
+        </w:rPr>
+        <w:t xml:space="preserve"> -&gt; </w:t>
+      </w:r>
+      <w:r>
+        <w:rPr>
+          <w:rFonts w:ascii="Consolas" w:hAnsi="Consolas"/>
+          <w:color w:val="1F4D78"/>
+          <w:sz w:val="19"/>
+        </w:rPr>
+        <w:t>0x36</w:t>
+      </w:r>
+      <w:r>
+        <w:rPr>
+          <w:rFonts w:ascii="Calibri" w:hAnsi="Calibri"/>
+          <w:color w:val="111827"/>
+          <w:sz w:val="22"/>
+        </w:rPr>
+        <w:t xml:space="preserve"> -&gt; </w:t>
+      </w:r>
+      <w:r>
+        <w:rPr>
+          <w:rFonts w:ascii="Consolas" w:hAnsi="Consolas"/>
+          <w:color w:val="1F4D78"/>
+          <w:sz w:val="19"/>
+        </w:rPr>
+        <w:t>0x37</w:t>
+      </w:r>
+      <w:r>
+        <w:rPr>
+          <w:rFonts w:ascii="Calibri" w:hAnsi="Calibri"/>
+          <w:color w:val="111827"/>
+          <w:sz w:val="22"/>
+        </w:rPr>
+        <w:t xml:space="preserve"> trace and its command/event identities.</w:t>
+      </w:r>
+    </w:p>
+    <w:p>
+      <w:pPr>
+        <w:pStyle w:val="ListNumber"/>
+        <w:numPr>
+          <w:ilvl w:val="0"/>
+          <w:numId w:val="16"/>
+        </w:numPr>
+      </w:pPr>
+      <w:r>
+        <w:rPr>
+          <w:rFonts w:ascii="Calibri" w:hAnsi="Calibri"/>
+          <w:color w:val="111827"/>
+          <w:sz w:val="22"/>
+        </w:rPr>
+        <w:t>Capture one wrong-sequence, one incomplete-image, and one digest-mismatch result with NRC evidence.</w:t>
+      </w:r>
+    </w:p>
+    <w:p>
+      <w:pPr>
+        <w:pStyle w:val="ListNumber"/>
+        <w:numPr>
+          <w:ilvl w:val="0"/>
+          <w:numId w:val="16"/>
+        </w:numPr>
+      </w:pPr>
+      <w:r>
+        <w:rPr>
+          <w:rFonts w:ascii="Calibri" w:hAnsi="Calibri"/>
+          <w:color w:val="111827"/>
+          <w:sz w:val="22"/>
+        </w:rPr>
+        <w:t>Verify that no raw firmware hex appears in logs, diagnostic commands, audit, or outbox records.</w:t>
+      </w:r>
+    </w:p>
+    <w:p>
+      <w:pPr>
+        <w:pStyle w:val="ListNumber"/>
+        <w:numPr>
+          <w:ilvl w:val="0"/>
+          <w:numId w:val="16"/>
+        </w:numPr>
+      </w:pPr>
+      <w:r>
+        <w:rPr>
+          <w:rFonts w:ascii="Calibri" w:hAnsi="Calibri"/>
+          <w:color w:val="111827"/>
+          <w:sz w:val="22"/>
+        </w:rPr>
+        <w:t>Explain whether the observed result is sufficient for a simulator baseline and which production bootloader controls are still absent.</w:t>
+      </w:r>
+    </w:p>
     <w:sectPr>
       <w:headerReference w:type="default" r:id="rId9"/>
       <w:footerReference w:type="default" r:id="rId10"/>
@@ -16544,7 +19582,7 @@
         <w:color w:val="667085"/>
         <w:sz w:val="17"/>
       </w:rPr>
-      <w:t>ATEP Volume V Workbook  |  Version 0.5.0</w:t>
+      <w:t>ATEP Volume V Workbook  |  Version 0.6.0</w:t>
     </w:r>
     <w:r>
       <w:rPr>
@@ -16856,6 +19894,12 @@
     </w:lvlOverride>
   </w:num>
   <w:num w:numId="15">
+    <w:abstractNumId w:val="9"/>
+    <w:lvlOverride w:ilvl="0">
+      <w:startOverride w:val="1"/>
+    </w:lvlOverride>
+  </w:num>
+  <w:num w:numId="16">
     <w:abstractNumId w:val="9"/>
     <w:lvlOverride w:ilvl="0">
       <w:startOverride w:val="1"/>

</xml_diff>